<commit_message>
Adding a references chapter to my dissertation doc, and additing a delete method to my TrainingSessionsController
</commit_message>
<xml_diff>
--- a/Documents/Final Dissertation Doc.docx
+++ b/Documents/Final Dissertation Doc.docx
@@ -1160,10 +1160,12 @@
           <w:r>
             <w:fldChar w:fldCharType="separate"/>
           </w:r>
-          <w:hyperlink w:anchor="_Toc221181035" w:history="1">
+          <w:hyperlink w:anchor="_Toc222237660" w:history="1">
             <w:r>
               <w:rPr>
                 <w:rStyle w:val="Hyperlink"/>
+                <w:b/>
+                <w:bCs/>
                 <w:noProof/>
               </w:rPr>
               <w:t>Chapter 1 Spec Revamp and Analysis</w:t>
@@ -1187,7 +1189,7 @@
                 <w:noProof/>
                 <w:webHidden/>
               </w:rPr>
-              <w:instrText xml:space="preserve"> PAGEREF _Toc221181035 \h </w:instrText>
+              <w:instrText xml:space="preserve"> PAGEREF _Toc222237660 \h </w:instrText>
             </w:r>
             <w:r>
               <w:rPr>
@@ -1232,7 +1234,7 @@
               <w:lang w:eastAsia="en-GB"/>
             </w:rPr>
           </w:pPr>
-          <w:hyperlink w:anchor="_Toc221181036" w:history="1">
+          <w:hyperlink w:anchor="_Toc222237661" w:history="1">
             <w:r>
               <w:rPr>
                 <w:rStyle w:val="Hyperlink"/>
@@ -1259,7 +1261,7 @@
                 <w:noProof/>
                 <w:webHidden/>
               </w:rPr>
-              <w:instrText xml:space="preserve"> PAGEREF _Toc221181036 \h </w:instrText>
+              <w:instrText xml:space="preserve"> PAGEREF _Toc222237661 \h </w:instrText>
             </w:r>
             <w:r>
               <w:rPr>
@@ -1304,7 +1306,7 @@
               <w:lang w:eastAsia="en-GB"/>
             </w:rPr>
           </w:pPr>
-          <w:hyperlink w:anchor="_Toc221181037" w:history="1">
+          <w:hyperlink w:anchor="_Toc222237662" w:history="1">
             <w:r>
               <w:rPr>
                 <w:rStyle w:val="Hyperlink"/>
@@ -1331,7 +1333,7 @@
                 <w:noProof/>
                 <w:webHidden/>
               </w:rPr>
-              <w:instrText xml:space="preserve"> PAGEREF _Toc221181037 \h </w:instrText>
+              <w:instrText xml:space="preserve"> PAGEREF _Toc222237662 \h </w:instrText>
             </w:r>
             <w:r>
               <w:rPr>
@@ -1376,7 +1378,7 @@
               <w:lang w:eastAsia="en-GB"/>
             </w:rPr>
           </w:pPr>
-          <w:hyperlink w:anchor="_Toc221181038" w:history="1">
+          <w:hyperlink w:anchor="_Toc222237663" w:history="1">
             <w:r>
               <w:rPr>
                 <w:rStyle w:val="Hyperlink"/>
@@ -1403,7 +1405,7 @@
                 <w:noProof/>
                 <w:webHidden/>
               </w:rPr>
-              <w:instrText xml:space="preserve"> PAGEREF _Toc221181038 \h </w:instrText>
+              <w:instrText xml:space="preserve"> PAGEREF _Toc222237663 \h </w:instrText>
             </w:r>
             <w:r>
               <w:rPr>
@@ -1448,7 +1450,7 @@
               <w:lang w:eastAsia="en-GB"/>
             </w:rPr>
           </w:pPr>
-          <w:hyperlink w:anchor="_Toc221181039" w:history="1">
+          <w:hyperlink w:anchor="_Toc222237664" w:history="1">
             <w:r>
               <w:rPr>
                 <w:rStyle w:val="Hyperlink"/>
@@ -1475,7 +1477,7 @@
                 <w:noProof/>
                 <w:webHidden/>
               </w:rPr>
-              <w:instrText xml:space="preserve"> PAGEREF _Toc221181039 \h </w:instrText>
+              <w:instrText xml:space="preserve"> PAGEREF _Toc222237664 \h </w:instrText>
             </w:r>
             <w:r>
               <w:rPr>
@@ -1520,7 +1522,7 @@
               <w:lang w:eastAsia="en-GB"/>
             </w:rPr>
           </w:pPr>
-          <w:hyperlink w:anchor="_Toc221181040" w:history="1">
+          <w:hyperlink w:anchor="_Toc222237665" w:history="1">
             <w:r>
               <w:rPr>
                 <w:rStyle w:val="Hyperlink"/>
@@ -1547,7 +1549,7 @@
                 <w:noProof/>
                 <w:webHidden/>
               </w:rPr>
-              <w:instrText xml:space="preserve"> PAGEREF _Toc221181040 \h </w:instrText>
+              <w:instrText xml:space="preserve"> PAGEREF _Toc222237665 \h </w:instrText>
             </w:r>
             <w:r>
               <w:rPr>
@@ -1592,10 +1594,12 @@
               <w:lang w:eastAsia="en-GB"/>
             </w:rPr>
           </w:pPr>
-          <w:hyperlink w:anchor="_Toc221181041" w:history="1">
+          <w:hyperlink w:anchor="_Toc222237666" w:history="1">
             <w:r>
               <w:rPr>
                 <w:rStyle w:val="Hyperlink"/>
+                <w:b/>
+                <w:bCs/>
                 <w:noProof/>
               </w:rPr>
               <w:t>Chapter Testing</w:t>
@@ -1619,7 +1623,7 @@
                 <w:noProof/>
                 <w:webHidden/>
               </w:rPr>
-              <w:instrText xml:space="preserve"> PAGEREF _Toc221181041 \h </w:instrText>
+              <w:instrText xml:space="preserve"> PAGEREF _Toc222237666 \h </w:instrText>
             </w:r>
             <w:r>
               <w:rPr>
@@ -1664,7 +1668,7 @@
               <w:lang w:eastAsia="en-GB"/>
             </w:rPr>
           </w:pPr>
-          <w:hyperlink w:anchor="_Toc221181042" w:history="1">
+          <w:hyperlink w:anchor="_Toc222237667" w:history="1">
             <w:r>
               <w:rPr>
                 <w:rStyle w:val="Hyperlink"/>
@@ -1691,7 +1695,7 @@
                 <w:noProof/>
                 <w:webHidden/>
               </w:rPr>
-              <w:instrText xml:space="preserve"> PAGEREF _Toc221181042 \h </w:instrText>
+              <w:instrText xml:space="preserve"> PAGEREF _Toc222237667 \h </w:instrText>
             </w:r>
             <w:r>
               <w:rPr>
@@ -1736,7 +1740,7 @@
               <w:lang w:eastAsia="en-GB"/>
             </w:rPr>
           </w:pPr>
-          <w:hyperlink w:anchor="_Toc221181043" w:history="1">
+          <w:hyperlink w:anchor="_Toc222237668" w:history="1">
             <w:r>
               <w:rPr>
                 <w:rStyle w:val="Hyperlink"/>
@@ -1763,7 +1767,7 @@
                 <w:noProof/>
                 <w:webHidden/>
               </w:rPr>
-              <w:instrText xml:space="preserve"> PAGEREF _Toc221181043 \h </w:instrText>
+              <w:instrText xml:space="preserve"> PAGEREF _Toc222237668 \h </w:instrText>
             </w:r>
             <w:r>
               <w:rPr>
@@ -1808,7 +1812,7 @@
               <w:lang w:eastAsia="en-GB"/>
             </w:rPr>
           </w:pPr>
-          <w:hyperlink w:anchor="_Toc221181044" w:history="1">
+          <w:hyperlink w:anchor="_Toc222237669" w:history="1">
             <w:r>
               <w:rPr>
                 <w:rStyle w:val="Hyperlink"/>
@@ -1835,7 +1839,7 @@
                 <w:noProof/>
                 <w:webHidden/>
               </w:rPr>
-              <w:instrText xml:space="preserve"> PAGEREF _Toc221181044 \h </w:instrText>
+              <w:instrText xml:space="preserve"> PAGEREF _Toc222237669 \h </w:instrText>
             </w:r>
             <w:r>
               <w:rPr>
@@ -1880,7 +1884,7 @@
               <w:lang w:eastAsia="en-GB"/>
             </w:rPr>
           </w:pPr>
-          <w:hyperlink w:anchor="_Toc221181045" w:history="1">
+          <w:hyperlink w:anchor="_Toc222237670" w:history="1">
             <w:r>
               <w:rPr>
                 <w:rStyle w:val="Hyperlink"/>
@@ -1907,7 +1911,7 @@
                 <w:noProof/>
                 <w:webHidden/>
               </w:rPr>
-              <w:instrText xml:space="preserve"> PAGEREF _Toc221181045 \h </w:instrText>
+              <w:instrText xml:space="preserve"> PAGEREF _Toc222237670 \h </w:instrText>
             </w:r>
             <w:r>
               <w:rPr>
@@ -1952,10 +1956,12 @@
               <w:lang w:eastAsia="en-GB"/>
             </w:rPr>
           </w:pPr>
-          <w:hyperlink w:anchor="_Toc221181046" w:history="1">
+          <w:hyperlink w:anchor="_Toc222237671" w:history="1">
             <w:r>
               <w:rPr>
                 <w:rStyle w:val="Hyperlink"/>
+                <w:b/>
+                <w:bCs/>
                 <w:noProof/>
               </w:rPr>
               <w:t>Chapter Evaluation</w:t>
@@ -1979,7 +1985,81 @@
                 <w:noProof/>
                 <w:webHidden/>
               </w:rPr>
-              <w:instrText xml:space="preserve"> PAGEREF _Toc221181046 \h </w:instrText>
+              <w:instrText xml:space="preserve"> PAGEREF _Toc222237671 \h </w:instrText>
+            </w:r>
+            <w:r>
+              <w:rPr>
+                <w:noProof/>
+                <w:webHidden/>
+              </w:rPr>
+            </w:r>
+            <w:r>
+              <w:rPr>
+                <w:noProof/>
+                <w:webHidden/>
+              </w:rPr>
+              <w:fldChar w:fldCharType="separate"/>
+            </w:r>
+            <w:r>
+              <w:rPr>
+                <w:noProof/>
+                <w:webHidden/>
+              </w:rPr>
+              <w:t>7</w:t>
+            </w:r>
+            <w:r>
+              <w:rPr>
+                <w:noProof/>
+                <w:webHidden/>
+              </w:rPr>
+              <w:fldChar w:fldCharType="end"/>
+            </w:r>
+          </w:hyperlink>
+        </w:p>
+        <w:p>
+          <w:pPr>
+            <w:pStyle w:val="TOC1"/>
+            <w:tabs>
+              <w:tab w:val="right" w:leader="dot" w:pos="9016"/>
+            </w:tabs>
+            <w:rPr>
+              <w:rFonts w:eastAsiaTheme="minorEastAsia"/>
+              <w:noProof/>
+              <w:sz w:val="24"/>
+              <w:szCs w:val="24"/>
+              <w:lang w:eastAsia="en-GB"/>
+            </w:rPr>
+          </w:pPr>
+          <w:hyperlink w:anchor="_Toc222237672" w:history="1">
+            <w:r>
+              <w:rPr>
+                <w:rStyle w:val="Hyperlink"/>
+                <w:b/>
+                <w:bCs/>
+                <w:noProof/>
+              </w:rPr>
+              <w:t>Chapter references for creation of webapp</w:t>
+            </w:r>
+            <w:r>
+              <w:rPr>
+                <w:noProof/>
+                <w:webHidden/>
+              </w:rPr>
+              <w:tab/>
+            </w:r>
+            <w:r>
+              <w:rPr>
+                <w:noProof/>
+                <w:webHidden/>
+              </w:rPr>
+              <w:fldChar w:fldCharType="begin"/>
+            </w:r>
+            <w:r>
+              <w:rPr>
+                <w:noProof/>
+                <w:webHidden/>
+              </w:rPr>
+              <w:instrText xml:space="preserve"> PAGEREF _Toc222237672 \h </w:instrText>
             </w:r>
             <w:r>
               <w:rPr>
@@ -2085,21 +2165,23 @@
     </w:p>
     <w:p>
       <w:pPr>
+        <w:tabs>
+          <w:tab w:val="left" w:pos="2649"/>
+        </w:tabs>
         <w:rPr>
           <w:b/>
           <w:bCs/>
           <w:noProof/>
         </w:rPr>
       </w:pPr>
-    </w:p>
-    <w:p>
-      <w:pPr>
+      <w:r>
         <w:rPr>
           <w:b/>
           <w:bCs/>
           <w:noProof/>
         </w:rPr>
-      </w:pPr>
+        <w:tab/>
+      </w:r>
     </w:p>
     <w:p>
       <w:pPr>
@@ -2182,30 +2264,60 @@
         </w:rPr>
       </w:pPr>
     </w:p>
+    <w:p>
+      <w:pPr>
+        <w:rPr>
+          <w:b/>
+          <w:bCs/>
+          <w:noProof/>
+        </w:rPr>
+      </w:pPr>
+    </w:p>
     <w:p/>
     <w:p>
       <w:pPr>
         <w:pStyle w:val="Heading1"/>
-      </w:pPr>
-      <w:bookmarkStart w:id="0" w:name="_Toc221181035"/>
+        <w:rPr>
+          <w:b/>
+          <w:bCs/>
+        </w:rPr>
+      </w:pPr>
+      <w:bookmarkStart w:id="0" w:name="_Toc222237660"/>
       <w:r>
+        <w:rPr>
+          <w:b/>
+          <w:bCs/>
+        </w:rPr>
         <w:lastRenderedPageBreak/>
         <w:t>Chapter</w:t>
       </w:r>
       <w:r>
+        <w:rPr>
+          <w:b/>
+          <w:bCs/>
+        </w:rPr>
         <w:t xml:space="preserve"> </w:t>
       </w:r>
       <w:r>
+        <w:rPr>
+          <w:b/>
+          <w:bCs/>
+        </w:rPr>
         <w:t>1</w:t>
       </w:r>
       <w:r>
+        <w:rPr>
+          <w:b/>
+          <w:bCs/>
+        </w:rPr>
         <w:t xml:space="preserve"> Spec Revamp and </w:t>
       </w:r>
       <w:r>
-        <w:t>A</w:t>
-      </w:r>
-      <w:r>
-        <w:t>nalysis</w:t>
+        <w:rPr>
+          <w:b/>
+          <w:bCs/>
+        </w:rPr>
+        <w:t>Analysis</w:t>
       </w:r>
       <w:bookmarkEnd w:id="0"/>
     </w:p>
@@ -2213,7 +2325,7 @@
       <w:pPr>
         <w:pStyle w:val="Heading2"/>
       </w:pPr>
-      <w:bookmarkStart w:id="1" w:name="_Toc221181036"/>
+      <w:bookmarkStart w:id="1" w:name="_Toc222237661"/>
       <w:r>
         <w:t>1.Project Definition and Users (~0.5 pages)</w:t>
       </w:r>
@@ -2383,7 +2495,7 @@
       <w:pPr>
         <w:pStyle w:val="Heading2"/>
       </w:pPr>
-      <w:bookmarkStart w:id="2" w:name="_Toc221181037"/>
+      <w:bookmarkStart w:id="2" w:name="_Toc222237662"/>
       <w:r>
         <w:t>2.Contexuals Analysis and Project Rationale (~1 page)</w:t>
       </w:r>
@@ -2664,7 +2776,7 @@
       <w:pPr>
         <w:pStyle w:val="Heading2"/>
       </w:pPr>
-      <w:bookmarkStart w:id="3" w:name="_Toc221181038"/>
+      <w:bookmarkStart w:id="3" w:name="_Toc222237663"/>
       <w:r>
         <w:t>3.1 Technical Strategy and Requirements (~1.5 pages)</w:t>
       </w:r>
@@ -4073,7 +4185,7 @@
       <w:pPr>
         <w:pStyle w:val="Heading2"/>
       </w:pPr>
-      <w:bookmarkStart w:id="4" w:name="_Toc221181039"/>
+      <w:bookmarkStart w:id="4" w:name="_Toc222237664"/>
       <w:r>
         <w:t>4. High-Level Work Plan (~1 page)</w:t>
       </w:r>
@@ -4097,7 +4209,7 @@
           <w:noProof/>
         </w:rPr>
         <w:drawing>
-          <wp:inline distT="0" distB="0" distL="0" distR="0" wp14:anchorId="16DDD3A0" wp14:editId="5E5B0FC1">
+          <wp:inline distT="0" distB="0" distL="0" distR="0" wp14:anchorId="16DDD3A0" wp14:editId="5F7D3555">
             <wp:extent cx="5731510" cy="1630018"/>
             <wp:effectExtent l="0" t="0" r="2540" b="8890"/>
             <wp:docPr id="1100710146" name="Picture 1" descr="A graph with blue and gray bars&#10;&#10;AI-generated content may be incorrect."/>
@@ -5078,7 +5190,7 @@
       <w:pPr>
         <w:pStyle w:val="Heading2"/>
       </w:pPr>
-      <w:bookmarkStart w:id="5" w:name="_Toc221181040"/>
+      <w:bookmarkStart w:id="5" w:name="_Toc222237665"/>
       <w:r>
         <w:t>Appendix:</w:t>
       </w:r>
@@ -5910,16 +6022,25 @@
     <w:p>
       <w:pPr>
         <w:pStyle w:val="Heading1"/>
-      </w:pPr>
-      <w:bookmarkStart w:id="6" w:name="_Toc221181041"/>
+        <w:rPr>
+          <w:b/>
+          <w:bCs/>
+        </w:rPr>
+      </w:pPr>
+      <w:bookmarkStart w:id="6" w:name="_Toc222237666"/>
       <w:r>
+        <w:rPr>
+          <w:b/>
+          <w:bCs/>
+        </w:rPr>
         <w:t xml:space="preserve">Chapter </w:t>
       </w:r>
       <w:r>
-        <w:t>Test</w:t>
-      </w:r>
-      <w:r>
-        <w:t>ing</w:t>
+        <w:rPr>
+          <w:b/>
+          <w:bCs/>
+        </w:rPr>
+        <w:t>Testing</w:t>
       </w:r>
       <w:bookmarkEnd w:id="6"/>
     </w:p>
@@ -5948,7 +6069,7 @@
       <w:pPr>
         <w:pStyle w:val="Heading2"/>
       </w:pPr>
-      <w:bookmarkStart w:id="7" w:name="_Toc221181042"/>
+      <w:bookmarkStart w:id="7" w:name="_Toc222237667"/>
       <w:r>
         <w:t>Test Strategy</w:t>
       </w:r>
@@ -5958,7 +6079,7 @@
       <w:pPr>
         <w:pStyle w:val="Heading2"/>
       </w:pPr>
-      <w:bookmarkStart w:id="8" w:name="_Toc221181043"/>
+      <w:bookmarkStart w:id="8" w:name="_Toc222237668"/>
       <w:r>
         <w:t>Test cases</w:t>
       </w:r>
@@ -5968,7 +6089,7 @@
       <w:pPr>
         <w:pStyle w:val="Heading2"/>
       </w:pPr>
-      <w:bookmarkStart w:id="9" w:name="_Toc221181044"/>
+      <w:bookmarkStart w:id="9" w:name="_Toc222237669"/>
       <w:r>
         <w:t>R</w:t>
       </w:r>
@@ -5981,7 +6102,7 @@
       <w:pPr>
         <w:pStyle w:val="Heading2"/>
       </w:pPr>
-      <w:bookmarkStart w:id="10" w:name="_Toc221181045"/>
+      <w:bookmarkStart w:id="10" w:name="_Toc222237670"/>
       <w:r>
         <w:t>Summary of testcases</w:t>
       </w:r>
@@ -5999,9 +6120,17 @@
     <w:p>
       <w:pPr>
         <w:pStyle w:val="Heading1"/>
-      </w:pPr>
-      <w:bookmarkStart w:id="11" w:name="_Toc221181046"/>
+        <w:rPr>
+          <w:b/>
+          <w:bCs/>
+        </w:rPr>
+      </w:pPr>
+      <w:bookmarkStart w:id="11" w:name="_Toc222237671"/>
       <w:r>
+        <w:rPr>
+          <w:b/>
+          <w:bCs/>
+        </w:rPr>
         <w:t>Chapter Evaluation</w:t>
       </w:r>
       <w:bookmarkEnd w:id="11"/>
@@ -6011,6 +6140,41 @@
         <w:t>What you would do in the future if you could and how you would go about doing it.</w:t>
       </w:r>
     </w:p>
+    <w:p/>
+    <w:p>
+      <w:pPr>
+        <w:pStyle w:val="Heading1"/>
+        <w:rPr>
+          <w:b/>
+          <w:bCs/>
+        </w:rPr>
+      </w:pPr>
+      <w:bookmarkStart w:id="12" w:name="_Toc222237672"/>
+      <w:r>
+        <w:rPr>
+          <w:b/>
+          <w:bCs/>
+        </w:rPr>
+        <w:t>Chapter references for creation of webapp</w:t>
+      </w:r>
+      <w:bookmarkEnd w:id="12"/>
+    </w:p>
+    <w:p>
+      <w:r>
+        <w:t>General architecture and understanding of web development</w:t>
+      </w:r>
+    </w:p>
+    <w:p>
+      <w:hyperlink r:id="rId10" w:history="1">
+        <w:r>
+          <w:rPr>
+            <w:rStyle w:val="Hyperlink"/>
+          </w:rPr>
+          <w:t>https://youtu.be/i_j9-vQPCpk?si=_Sin5K46mbF7_PR6</w:t>
+        </w:r>
+      </w:hyperlink>
+    </w:p>
+    <w:p/>
     <w:sectPr>
       <w:pgSz w:w="11906" w:h="16838"/>
       <w:pgMar w:top="1440" w:right="1440" w:bottom="1440" w:left="1440" w:header="708" w:footer="708" w:gutter="0"/>
@@ -6189,9 +6353,9 @@
     </w:lvl>
   </w:abstractNum>
   <w:abstractNum w:abstractNumId="1" w15:restartNumberingAfterBreak="0">
-    <w:nsid w:val="37C70AEF"/>
+    <w:nsid w:val="2EB810B8"/>
     <w:multiLevelType w:val="hybridMultilevel"/>
-    <w:tmpl w:val="6B9CDF78"/>
+    <w:tmpl w:val="25F453FA"/>
     <w:lvl w:ilvl="0" w:tplc="08090001">
       <w:start w:val="1"/>
       <w:numFmt w:val="bullet"/>
@@ -6302,9 +6466,9 @@
     </w:lvl>
   </w:abstractNum>
   <w:abstractNum w:abstractNumId="2" w15:restartNumberingAfterBreak="0">
-    <w:nsid w:val="43C522B4"/>
+    <w:nsid w:val="37C70AEF"/>
     <w:multiLevelType w:val="hybridMultilevel"/>
-    <w:tmpl w:val="2968ED54"/>
+    <w:tmpl w:val="6B9CDF78"/>
     <w:lvl w:ilvl="0" w:tplc="08090001">
       <w:start w:val="1"/>
       <w:numFmt w:val="bullet"/>
@@ -6415,6 +6579,119 @@
     </w:lvl>
   </w:abstractNum>
   <w:abstractNum w:abstractNumId="3" w15:restartNumberingAfterBreak="0">
+    <w:nsid w:val="43C522B4"/>
+    <w:multiLevelType w:val="hybridMultilevel"/>
+    <w:tmpl w:val="2968ED54"/>
+    <w:lvl w:ilvl="0" w:tplc="08090001">
+      <w:start w:val="1"/>
+      <w:numFmt w:val="bullet"/>
+      <w:lvlText w:val=""/>
+      <w:lvlJc w:val="left"/>
+      <w:pPr>
+        <w:ind w:left="720" w:hanging="360"/>
+      </w:pPr>
+      <w:rPr>
+        <w:rFonts w:ascii="Symbol" w:hAnsi="Symbol" w:hint="default"/>
+      </w:rPr>
+    </w:lvl>
+    <w:lvl w:ilvl="1" w:tplc="08090003" w:tentative="1">
+      <w:start w:val="1"/>
+      <w:numFmt w:val="bullet"/>
+      <w:lvlText w:val="o"/>
+      <w:lvlJc w:val="left"/>
+      <w:pPr>
+        <w:ind w:left="1440" w:hanging="360"/>
+      </w:pPr>
+      <w:rPr>
+        <w:rFonts w:ascii="Courier New" w:hAnsi="Courier New" w:cs="Courier New" w:hint="default"/>
+      </w:rPr>
+    </w:lvl>
+    <w:lvl w:ilvl="2" w:tplc="08090005" w:tentative="1">
+      <w:start w:val="1"/>
+      <w:numFmt w:val="bullet"/>
+      <w:lvlText w:val=""/>
+      <w:lvlJc w:val="left"/>
+      <w:pPr>
+        <w:ind w:left="2160" w:hanging="360"/>
+      </w:pPr>
+      <w:rPr>
+        <w:rFonts w:ascii="Wingdings" w:hAnsi="Wingdings" w:hint="default"/>
+      </w:rPr>
+    </w:lvl>
+    <w:lvl w:ilvl="3" w:tplc="08090001" w:tentative="1">
+      <w:start w:val="1"/>
+      <w:numFmt w:val="bullet"/>
+      <w:lvlText w:val=""/>
+      <w:lvlJc w:val="left"/>
+      <w:pPr>
+        <w:ind w:left="2880" w:hanging="360"/>
+      </w:pPr>
+      <w:rPr>
+        <w:rFonts w:ascii="Symbol" w:hAnsi="Symbol" w:hint="default"/>
+      </w:rPr>
+    </w:lvl>
+    <w:lvl w:ilvl="4" w:tplc="08090003" w:tentative="1">
+      <w:start w:val="1"/>
+      <w:numFmt w:val="bullet"/>
+      <w:lvlText w:val="o"/>
+      <w:lvlJc w:val="left"/>
+      <w:pPr>
+        <w:ind w:left="3600" w:hanging="360"/>
+      </w:pPr>
+      <w:rPr>
+        <w:rFonts w:ascii="Courier New" w:hAnsi="Courier New" w:cs="Courier New" w:hint="default"/>
+      </w:rPr>
+    </w:lvl>
+    <w:lvl w:ilvl="5" w:tplc="08090005" w:tentative="1">
+      <w:start w:val="1"/>
+      <w:numFmt w:val="bullet"/>
+      <w:lvlText w:val=""/>
+      <w:lvlJc w:val="left"/>
+      <w:pPr>
+        <w:ind w:left="4320" w:hanging="360"/>
+      </w:pPr>
+      <w:rPr>
+        <w:rFonts w:ascii="Wingdings" w:hAnsi="Wingdings" w:hint="default"/>
+      </w:rPr>
+    </w:lvl>
+    <w:lvl w:ilvl="6" w:tplc="08090001" w:tentative="1">
+      <w:start w:val="1"/>
+      <w:numFmt w:val="bullet"/>
+      <w:lvlText w:val=""/>
+      <w:lvlJc w:val="left"/>
+      <w:pPr>
+        <w:ind w:left="5040" w:hanging="360"/>
+      </w:pPr>
+      <w:rPr>
+        <w:rFonts w:ascii="Symbol" w:hAnsi="Symbol" w:hint="default"/>
+      </w:rPr>
+    </w:lvl>
+    <w:lvl w:ilvl="7" w:tplc="08090003" w:tentative="1">
+      <w:start w:val="1"/>
+      <w:numFmt w:val="bullet"/>
+      <w:lvlText w:val="o"/>
+      <w:lvlJc w:val="left"/>
+      <w:pPr>
+        <w:ind w:left="5760" w:hanging="360"/>
+      </w:pPr>
+      <w:rPr>
+        <w:rFonts w:ascii="Courier New" w:hAnsi="Courier New" w:cs="Courier New" w:hint="default"/>
+      </w:rPr>
+    </w:lvl>
+    <w:lvl w:ilvl="8" w:tplc="08090005" w:tentative="1">
+      <w:start w:val="1"/>
+      <w:numFmt w:val="bullet"/>
+      <w:lvlText w:val=""/>
+      <w:lvlJc w:val="left"/>
+      <w:pPr>
+        <w:ind w:left="6480" w:hanging="360"/>
+      </w:pPr>
+      <w:rPr>
+        <w:rFonts w:ascii="Wingdings" w:hAnsi="Wingdings" w:hint="default"/>
+      </w:rPr>
+    </w:lvl>
+  </w:abstractNum>
+  <w:abstractNum w:abstractNumId="4" w15:restartNumberingAfterBreak="0">
     <w:nsid w:val="4D2B352D"/>
     <w:multiLevelType w:val="multilevel"/>
     <w:tmpl w:val="8CCCD84E"/>
@@ -6527,7 +6804,7 @@
       </w:rPr>
     </w:lvl>
   </w:abstractNum>
-  <w:abstractNum w:abstractNumId="4" w15:restartNumberingAfterBreak="0">
+  <w:abstractNum w:abstractNumId="5" w15:restartNumberingAfterBreak="0">
     <w:nsid w:val="51C25337"/>
     <w:multiLevelType w:val="hybridMultilevel"/>
     <w:tmpl w:val="C5F619BE"/>
@@ -6641,19 +6918,22 @@
     </w:lvl>
   </w:abstractNum>
   <w:num w:numId="1" w16cid:durableId="1969623289">
-    <w:abstractNumId w:val="3"/>
+    <w:abstractNumId w:val="4"/>
   </w:num>
   <w:num w:numId="2" w16cid:durableId="1446194719">
     <w:abstractNumId w:val="0"/>
   </w:num>
   <w:num w:numId="3" w16cid:durableId="815610231">
-    <w:abstractNumId w:val="4"/>
+    <w:abstractNumId w:val="5"/>
   </w:num>
   <w:num w:numId="4" w16cid:durableId="72167951">
-    <w:abstractNumId w:val="1"/>
+    <w:abstractNumId w:val="2"/>
   </w:num>
   <w:num w:numId="5" w16cid:durableId="297808430">
-    <w:abstractNumId w:val="2"/>
+    <w:abstractNumId w:val="3"/>
+  </w:num>
+  <w:num w:numId="6" w16cid:durableId="865604873">
+    <w:abstractNumId w:val="1"/>
   </w:num>
 </w:numbering>
 </file>
@@ -7725,6 +8005,18 @@
     <w:uiPriority w:val="99"/>
     <w:rsid w:val="006B073A"/>
   </w:style>
+  <w:style w:type="character" w:styleId="UnresolvedMention">
+    <w:name w:val="Unresolved Mention"/>
+    <w:basedOn w:val="DefaultParagraphFont"/>
+    <w:uiPriority w:val="99"/>
+    <w:semiHidden/>
+    <w:unhideWhenUsed/>
+    <w:rsid w:val="000A4308"/>
+    <w:rPr>
+      <w:color w:val="605E5C"/>
+      <w:shd w:val="clear" w:color="auto" w:fill="E1DFDD"/>
+    </w:rPr>
+  </w:style>
 </w:styles>
 </file>
 

</xml_diff>

<commit_message>
added some referencing to remember
</commit_message>
<xml_diff>
--- a/Documents/Final Dissertation Doc.docx
+++ b/Documents/Final Dissertation Doc.docx
@@ -2455,21 +2455,8 @@
       <w:bookmarkEnd w:id="0"/>
     </w:p>
     <w:p>
-      <w:proofErr w:type="gramStart"/>
-      <w:r>
-        <w:t>Main Focus</w:t>
-      </w:r>
-      <w:proofErr w:type="gramEnd"/>
-      <w:r>
-        <w:t xml:space="preserve">: To define the </w:t>
-      </w:r>
-      <w:proofErr w:type="gramStart"/>
-      <w:r>
-        <w:t>system</w:t>
-      </w:r>
-      <w:proofErr w:type="gramEnd"/>
-      <w:r>
-        <w:t xml:space="preserve"> you developed and align it with your initial project goals.</w:t>
+      <w:r>
+        <w:t>Main Focus: To define the system you developed and align it with your initial project goals.</w:t>
       </w:r>
     </w:p>
     <w:p>
@@ -2484,13 +2471,8 @@
     </w:p>
     <w:p>
       <w:r>
-        <w:t xml:space="preserve">• Stakeholder Analysis: Identify the target users and explain how your final solution meets </w:t>
-      </w:r>
-      <w:proofErr w:type="gramStart"/>
-      <w:r>
-        <w:t>their</w:t>
-      </w:r>
-      <w:proofErr w:type="gramEnd"/>
+        <w:t>• Stakeholder Analysis: Identify the target users and explain how your final solution meets their</w:t>
+      </w:r>
     </w:p>
     <w:p>
       <w:r>
@@ -2509,15 +2491,7 @@
     </w:p>
     <w:p>
       <w:r>
-        <w:t xml:space="preserve">• Project Progression: </w:t>
-      </w:r>
-      <w:proofErr w:type="gramStart"/>
-      <w:r>
-        <w:t>A brief summary</w:t>
-      </w:r>
-      <w:proofErr w:type="gramEnd"/>
-      <w:r>
-        <w:t xml:space="preserve"> of the journey from your Initial Plan (submitted at the start</w:t>
+        <w:t>• Project Progression: A brief summary of the journey from your Initial Plan (submitted at the start</w:t>
       </w:r>
     </w:p>
     <w:p>
@@ -2527,15 +2501,7 @@
     </w:p>
     <w:p>
       <w:r>
-        <w:t xml:space="preserve">research supported your development. If you pivoted in some respect from your initial </w:t>
-      </w:r>
-      <w:proofErr w:type="gramStart"/>
-      <w:r>
-        <w:t>plan</w:t>
-      </w:r>
-      <w:proofErr w:type="gramEnd"/>
-      <w:r>
-        <w:t xml:space="preserve"> then</w:t>
+        <w:t>research supported your development. If you pivoted in some respect from your initial plan then</w:t>
       </w:r>
     </w:p>
     <w:p>
@@ -2583,13 +2549,8 @@
       <w:bookmarkEnd w:id="1"/>
     </w:p>
     <w:p>
-      <w:proofErr w:type="gramStart"/>
-      <w:r>
-        <w:t>Main Focus</w:t>
-      </w:r>
-      <w:proofErr w:type="gramEnd"/>
-      <w:r>
-        <w:t>: To demonstrate professional engineering discipline and the "Working with Others"</w:t>
+      <w:r>
+        <w:t>Main Focus: To demonstrate professional engineering discipline and the "Working with Others"</w:t>
       </w:r>
     </w:p>
     <w:p>
@@ -2677,13 +2638,8 @@
       <w:bookmarkEnd w:id="2"/>
     </w:p>
     <w:p>
-      <w:proofErr w:type="gramStart"/>
-      <w:r>
-        <w:t>Main Focus</w:t>
-      </w:r>
-      <w:proofErr w:type="gramEnd"/>
-      <w:r>
-        <w:t>: To formally define the requirements and the resulting functional behaviour of the system.</w:t>
+      <w:r>
+        <w:t>Main Focus: To formally define the requirements and the resulting functional behaviour of the system.</w:t>
       </w:r>
     </w:p>
     <w:p>
@@ -4655,7 +4611,7 @@
           <w:noProof/>
         </w:rPr>
         <w:drawing>
-          <wp:inline distT="0" distB="0" distL="0" distR="0" wp14:anchorId="0D399BE2" wp14:editId="213EAFF6">
+          <wp:inline distT="0" distB="0" distL="0" distR="0" wp14:anchorId="0D399BE2" wp14:editId="3B19CA57">
             <wp:extent cx="5731510" cy="1630018"/>
             <wp:effectExtent l="0" t="0" r="2540" b="8890"/>
             <wp:docPr id="1100710146" name="Picture 1" descr="A graph with blue and gray bars&#10;&#10;AI-generated content may be incorrect."/>
@@ -6566,13 +6522,8 @@
       <w:bookmarkEnd w:id="8"/>
     </w:p>
     <w:p>
-      <w:proofErr w:type="gramStart"/>
-      <w:r>
-        <w:t>Main Focus</w:t>
-      </w:r>
-      <w:proofErr w:type="gramEnd"/>
-      <w:r>
-        <w:t>: To provide the technical blueprints showing how the system was structured to satisfy the</w:t>
+      <w:r>
+        <w:t>Main Focus: To provide the technical blueprints showing how the system was structured to satisfy the</w:t>
       </w:r>
     </w:p>
     <w:p>
@@ -6711,13 +6662,8 @@
       <w:bookmarkEnd w:id="9"/>
     </w:p>
     <w:p>
-      <w:proofErr w:type="gramStart"/>
-      <w:r>
-        <w:t>Main Focus</w:t>
-      </w:r>
-      <w:proofErr w:type="gramEnd"/>
-      <w:r>
-        <w:t>: To describe the development process and highlight the significant technical challenges</w:t>
+      <w:r>
+        <w:t>Main Focus: To describe the development process and highlight the significant technical challenges</w:t>
       </w:r>
     </w:p>
     <w:p>
@@ -6851,13 +6797,8 @@
       <w:bookmarkEnd w:id="10"/>
     </w:p>
     <w:p>
-      <w:proofErr w:type="gramStart"/>
-      <w:r>
-        <w:t>Main Focus</w:t>
-      </w:r>
-      <w:proofErr w:type="gramEnd"/>
-      <w:r>
-        <w:t>: To provide objective evidence of the system’s quality and to critically evaluate the final</w:t>
+      <w:r>
+        <w:t>Main Focus: To provide objective evidence of the system’s quality and to critically evaluate the final</w:t>
       </w:r>
     </w:p>
     <w:p>
@@ -6961,13 +6902,8 @@
       <w:bookmarkEnd w:id="11"/>
     </w:p>
     <w:p>
-      <w:proofErr w:type="gramStart"/>
-      <w:r>
-        <w:t>Main Focus</w:t>
-      </w:r>
-      <w:proofErr w:type="gramEnd"/>
-      <w:r>
-        <w:t>: To provide a final summary of the project’s achievements and a critical roadmap for the</w:t>
+      <w:r>
+        <w:t>Main Focus: To provide a final summary of the project’s achievements and a critical roadmap for the</w:t>
       </w:r>
     </w:p>
     <w:p>
@@ -7194,15 +7130,85 @@
       </w:r>
       <w:proofErr w:type="spellEnd"/>
       <w:r>
-        <w:t xml:space="preserve">(email) </w:t>
-      </w:r>
-      <w:proofErr w:type="gramStart"/>
-      <w:r>
-        <w:t>{ ...</w:t>
-      </w:r>
-      <w:proofErr w:type="gramEnd"/>
-      <w:r>
-        <w:t xml:space="preserve"> }</w:t>
+        <w:t>(email) { ... }</w:t>
+      </w:r>
+    </w:p>
+    <w:p/>
+    <w:p>
+      <w:pPr>
+        <w:rPr>
+          <w:b/>
+          <w:bCs/>
+        </w:rPr>
+      </w:pPr>
+      <w:r>
+        <w:rPr>
+          <w:b/>
+          <w:bCs/>
+        </w:rPr>
+        <w:t xml:space="preserve">remember to reference </w:t>
+      </w:r>
+      <w:proofErr w:type="spellStart"/>
+      <w:r>
+        <w:rPr>
+          <w:b/>
+          <w:bCs/>
+        </w:rPr>
+        <w:t>th</w:t>
+      </w:r>
+      <w:proofErr w:type="spellEnd"/>
+      <w:r>
+        <w:rPr>
+          <w:b/>
+          <w:bCs/>
+        </w:rPr>
+        <w:t xml:space="preserve"> following that </w:t>
+      </w:r>
+      <w:proofErr w:type="spellStart"/>
+      <w:r>
+        <w:rPr>
+          <w:b/>
+          <w:bCs/>
+        </w:rPr>
+        <w:t>ive</w:t>
+      </w:r>
+      <w:proofErr w:type="spellEnd"/>
+      <w:r>
+        <w:rPr>
+          <w:b/>
+          <w:bCs/>
+        </w:rPr>
+        <w:t xml:space="preserve"> used for help,</w:t>
+      </w:r>
+    </w:p>
+    <w:p>
+      <w:pPr>
+        <w:rPr>
+          <w:b/>
+          <w:bCs/>
+        </w:rPr>
+      </w:pPr>
+      <w:r>
+        <w:rPr>
+          <w:b/>
+          <w:bCs/>
+        </w:rPr>
+        <w:t>Phone responsiveness using @media</w:t>
+      </w:r>
+    </w:p>
+    <w:p>
+      <w:pPr>
+        <w:rPr>
+          <w:b/>
+          <w:bCs/>
+        </w:rPr>
+      </w:pPr>
+      <w:r>
+        <w:rPr>
+          <w:b/>
+          <w:bCs/>
+        </w:rPr>
+        <w:t xml:space="preserve">Html </w:t>
       </w:r>
     </w:p>
     <w:p/>
@@ -7275,6 +7281,7 @@
     </w:p>
     <w:p>
       <w:r>
+        <w:lastRenderedPageBreak/>
         <w:t>modify any code you use.</w:t>
       </w:r>
     </w:p>
@@ -7300,7 +7307,6 @@
     </w:p>
     <w:p>
       <w:r>
-        <w:lastRenderedPageBreak/>
         <w:t>o Replacing Core Skills (e.g., asking an AI to write entire functions or core logic).</w:t>
       </w:r>
     </w:p>
@@ -8740,6 +8746,7 @@
   <w:style w:type="character" w:default="1" w:styleId="DefaultParagraphFont">
     <w:name w:val="Default Paragraph Font"/>
     <w:uiPriority w:val="1"/>
+    <w:semiHidden/>
     <w:unhideWhenUsed/>
   </w:style>
   <w:style w:type="table" w:default="1" w:styleId="TableNormal">

</xml_diff>

<commit_message>
Adding a liscensing section with attributions to the correct vendors
</commit_message>
<xml_diff>
--- a/Documents/Final Dissertation Doc.docx
+++ b/Documents/Final Dissertation Doc.docx
@@ -2674,15 +2674,7 @@
     </w:p>
     <w:p>
       <w:r>
-        <w:t xml:space="preserve">acceptance tests. Requirements must be prioritised (e.g. using </w:t>
-      </w:r>
-      <w:proofErr w:type="spellStart"/>
-      <w:r>
-        <w:t>MoSCoW</w:t>
-      </w:r>
-      <w:proofErr w:type="spellEnd"/>
-      <w:r>
-        <w:t>).</w:t>
+        <w:t>acceptance tests. Requirements must be prioritised (e.g. using MoSCoW).</w:t>
       </w:r>
     </w:p>
     <w:p>
@@ -2928,23 +2920,7 @@
         <w:spacing w:line="240" w:lineRule="auto"/>
       </w:pPr>
       <w:r>
-        <w:t xml:space="preserve">Many Bouldering and climbing communities are increasingly using more mobile and web applications to connect with other users; log climbs they’ve done and discover new routes in nearby areas. Some Examples of apps like this include </w:t>
-      </w:r>
-      <w:proofErr w:type="spellStart"/>
-      <w:r>
-        <w:t>TheCrag</w:t>
-      </w:r>
-      <w:proofErr w:type="spellEnd"/>
-      <w:r>
-        <w:t xml:space="preserve"> and </w:t>
-      </w:r>
-      <w:proofErr w:type="spellStart"/>
-      <w:r>
-        <w:t>TopLogger</w:t>
-      </w:r>
-      <w:proofErr w:type="spellEnd"/>
-      <w:r>
-        <w:t>, these apps allow climbers to log their ascents, track their progress and engage with their communities.</w:t>
+        <w:t>Many Bouldering and climbing communities are increasingly using more mobile and web applications to connect with other users; log climbs they’ve done and discover new routes in nearby areas. Some Examples of apps like this include TheCrag and TopLogger, these apps allow climbers to log their ascents, track their progress and engage with their communities.</w:t>
       </w:r>
     </w:p>
     <w:p>
@@ -4429,7 +4405,6 @@
                 <w:szCs w:val="22"/>
               </w:rPr>
             </w:pPr>
-            <w:proofErr w:type="spellStart"/>
             <w:r>
               <w:rPr>
                 <w:sz w:val="22"/>
@@ -4437,7 +4412,6 @@
               </w:rPr>
               <w:t>Thymeleaf</w:t>
             </w:r>
-            <w:proofErr w:type="spellEnd"/>
           </w:p>
         </w:tc>
         <w:tc>
@@ -4541,23 +4515,7 @@
                 <w:sz w:val="22"/>
                 <w:szCs w:val="22"/>
               </w:rPr>
-              <w:t xml:space="preserve">Integrates well with </w:t>
-            </w:r>
-            <w:proofErr w:type="spellStart"/>
-            <w:r>
-              <w:rPr>
-                <w:sz w:val="22"/>
-                <w:szCs w:val="22"/>
-              </w:rPr>
-              <w:t>Thymeleaf</w:t>
-            </w:r>
-            <w:proofErr w:type="spellEnd"/>
-            <w:r>
-              <w:rPr>
-                <w:sz w:val="22"/>
-                <w:szCs w:val="22"/>
-              </w:rPr>
-              <w:t>, allows charts to be added to dashboards, graphs or leaderboards. (FR2, FR3)</w:t>
+              <w:t>Integrates well with Thymeleaf, allows charts to be added to dashboards, graphs or leaderboards. (FR2, FR3)</w:t>
             </w:r>
           </w:p>
         </w:tc>
@@ -4611,7 +4569,7 @@
           <w:noProof/>
         </w:rPr>
         <w:drawing>
-          <wp:inline distT="0" distB="0" distL="0" distR="0" wp14:anchorId="0D399BE2" wp14:editId="3B19CA57">
+          <wp:inline distT="0" distB="0" distL="0" distR="0" wp14:anchorId="0D399BE2" wp14:editId="63E49627">
             <wp:extent cx="5731510" cy="1630018"/>
             <wp:effectExtent l="0" t="0" r="2540" b="8890"/>
             <wp:docPr id="1100710146" name="Picture 1" descr="A graph with blue and gray bars&#10;&#10;AI-generated content may be incorrect."/>
@@ -5673,23 +5631,7 @@
                 <w:sz w:val="22"/>
                 <w:szCs w:val="22"/>
               </w:rPr>
-              <w:t xml:space="preserve">As I user, I want access to my own unique and </w:t>
-            </w:r>
-            <w:proofErr w:type="spellStart"/>
-            <w:r>
-              <w:rPr>
-                <w:sz w:val="22"/>
-                <w:szCs w:val="22"/>
-              </w:rPr>
-              <w:t>personaliseable</w:t>
-            </w:r>
-            <w:proofErr w:type="spellEnd"/>
-            <w:r>
-              <w:rPr>
-                <w:sz w:val="22"/>
-                <w:szCs w:val="22"/>
-              </w:rPr>
-              <w:t xml:space="preserve"> account so that my progress can be saved.</w:t>
+              <w:t>As I user, I want access to my own unique and personaliseable account so that my progress can be saved.</w:t>
             </w:r>
           </w:p>
         </w:tc>
@@ -7002,15 +6944,7 @@
     </w:p>
     <w:p>
       <w:r>
-        <w:t>• Official Documentation: "The system uses the React '</w:t>
-      </w:r>
-      <w:proofErr w:type="spellStart"/>
-      <w:r>
-        <w:t>UseContext</w:t>
-      </w:r>
-      <w:proofErr w:type="spellEnd"/>
-      <w:r>
-        <w:t>' hook for global state</w:t>
+        <w:t>• Official Documentation: "The system uses the React 'UseContext' hook for global state</w:t>
       </w:r>
     </w:p>
     <w:p>
@@ -7025,15 +6959,7 @@
     </w:p>
     <w:p>
       <w:r>
-        <w:t>solution by '</w:t>
-      </w:r>
-      <w:proofErr w:type="spellStart"/>
-      <w:r>
-        <w:t>DevGuru</w:t>
-      </w:r>
-      <w:proofErr w:type="spellEnd"/>
-      <w:r>
-        <w:t>' on Stack Overflow (2025)."</w:t>
+        <w:t>solution by 'DevGuru' on Stack Overflow (2025)."</w:t>
       </w:r>
     </w:p>
     <w:p>
@@ -7054,15 +6980,7 @@
     <w:p>
       <w:r>
         <w:lastRenderedPageBreak/>
-        <w:t xml:space="preserve">• Meta. (2026). React Documentation: Scaling State. [Online]. Available at: </w:t>
-      </w:r>
-      <w:proofErr w:type="spellStart"/>
-      <w:r>
-        <w:t>react.dev</w:t>
-      </w:r>
-      <w:proofErr w:type="spellEnd"/>
-      <w:r>
-        <w:t>/docs</w:t>
+        <w:t>• Meta. (2026). React Documentation: Scaling State. [Online]. Available at: react.dev/docs</w:t>
       </w:r>
     </w:p>
     <w:p>
@@ -7122,15 +7040,7 @@
     </w:p>
     <w:p>
       <w:r>
-        <w:t xml:space="preserve">function </w:t>
-      </w:r>
-      <w:proofErr w:type="spellStart"/>
-      <w:r>
-        <w:t>validateEmail</w:t>
-      </w:r>
-      <w:proofErr w:type="spellEnd"/>
-      <w:r>
-        <w:t>(email) { ... }</w:t>
+        <w:t>function validateEmail(email) { ... }</w:t>
       </w:r>
     </w:p>
     <w:p/>
@@ -7146,39 +7056,7 @@
           <w:b/>
           <w:bCs/>
         </w:rPr>
-        <w:t xml:space="preserve">remember to reference </w:t>
-      </w:r>
-      <w:proofErr w:type="spellStart"/>
-      <w:r>
-        <w:rPr>
-          <w:b/>
-          <w:bCs/>
-        </w:rPr>
-        <w:t>th</w:t>
-      </w:r>
-      <w:proofErr w:type="spellEnd"/>
-      <w:r>
-        <w:rPr>
-          <w:b/>
-          <w:bCs/>
-        </w:rPr>
-        <w:t xml:space="preserve"> following that </w:t>
-      </w:r>
-      <w:proofErr w:type="spellStart"/>
-      <w:r>
-        <w:rPr>
-          <w:b/>
-          <w:bCs/>
-        </w:rPr>
-        <w:t>ive</w:t>
-      </w:r>
-      <w:proofErr w:type="spellEnd"/>
-      <w:r>
-        <w:rPr>
-          <w:b/>
-          <w:bCs/>
-        </w:rPr>
-        <w:t xml:space="preserve"> used for help,</w:t>
+        <w:t>remember to reference th following that ive used for help,</w:t>
       </w:r>
     </w:p>
     <w:p>
@@ -7346,13 +7224,8 @@
       </w:r>
     </w:p>
     <w:p>
-      <w:proofErr w:type="spellStart"/>
-      <w:r>
-        <w:t>MoSCoW</w:t>
-      </w:r>
-      <w:proofErr w:type="spellEnd"/>
-      <w:r>
-        <w:t xml:space="preserve"> list.</w:t>
+      <w:r>
+        <w:t>MoSCoW list.</w:t>
       </w:r>
     </w:p>
     <w:p>
@@ -7380,7 +7253,33 @@
         <w:t>specific assertions and test data myself.</w:t>
       </w:r>
     </w:p>
-    <w:p/>
+    <w:p>
+      <w:pPr>
+        <w:pStyle w:val="Heading1"/>
+      </w:pPr>
+      <w:r>
+        <w:t>Licensing Attributions</w:t>
+      </w:r>
+    </w:p>
+    <w:p>
+      <w:hyperlink r:id="rId10" w:history="1">
+        <w:r>
+          <w:rPr>
+            <w:rStyle w:val="Hyperlink"/>
+          </w:rPr>
+          <w:t>https://www.vecteezy.com/vector-art/16223373-rock-climbing-icon-vector-illustration-logo</w:t>
+        </w:r>
+        <w:r>
+          <w:rPr>
+            <w:rStyle w:val="Hyperlink"/>
+          </w:rPr>
+          <w:t>-</w:t>
+        </w:r>
+      </w:hyperlink>
+      <w:r>
+        <w:t xml:space="preserve"> main logo for the website taken from this site</w:t>
+      </w:r>
+    </w:p>
     <w:sectPr>
       <w:pgSz w:w="11906" w:h="16838"/>
       <w:pgMar w:top="1440" w:right="1440" w:bottom="1440" w:left="1440" w:header="708" w:footer="708" w:gutter="0"/>

</xml_diff>

<commit_message>
adding more liscensing before i add my navigation logo
</commit_message>
<xml_diff>
--- a/Documents/Final Dissertation Doc.docx
+++ b/Documents/Final Dissertation Doc.docx
@@ -4569,7 +4569,7 @@
           <w:noProof/>
         </w:rPr>
         <w:drawing>
-          <wp:inline distT="0" distB="0" distL="0" distR="0" wp14:anchorId="0D399BE2" wp14:editId="63E49627">
+          <wp:inline distT="0" distB="0" distL="0" distR="0" wp14:anchorId="0D399BE2" wp14:editId="2209B38C">
             <wp:extent cx="5731510" cy="1630018"/>
             <wp:effectExtent l="0" t="0" r="2540" b="8890"/>
             <wp:docPr id="1100710146" name="Picture 1" descr="A graph with blue and gray bars&#10;&#10;AI-generated content may be incorrect."/>
@@ -7267,17 +7267,41 @@
           <w:rPr>
             <w:rStyle w:val="Hyperlink"/>
           </w:rPr>
-          <w:t>https://www.vecteezy.com/vector-art/16223373-rock-climbing-icon-vector-illustration-logo</w:t>
+          <w:t>https://www.vecteezy.com/vector-art/16223373-rock-climbing-icon-vector-illustration-logo-</w:t>
         </w:r>
+      </w:hyperlink>
+      <w:r>
+        <w:t xml:space="preserve"> </w:t>
+      </w:r>
+      <w:r>
+        <w:t>L</w:t>
+      </w:r>
+      <w:r>
+        <w:t>ogo for the website</w:t>
+      </w:r>
+      <w:r>
+        <w:t xml:space="preserve"> login page is</w:t>
+      </w:r>
+      <w:r>
+        <w:t xml:space="preserve"> taken from this site</w:t>
+      </w:r>
+      <w:r>
+        <w:t>, it is used under free license with proper attribution.</w:t>
+      </w:r>
+    </w:p>
+    <w:p>
+      <w:hyperlink r:id="rId11" w:history="1">
         <w:r>
           <w:rPr>
             <w:rStyle w:val="Hyperlink"/>
           </w:rPr>
-          <w:t>-</w:t>
+          <w:t>https://www.flaticon.com/free-icon/mountain_9140335?related_id=9140425&amp;origin=search</w:t>
         </w:r>
       </w:hyperlink>
-      <w:r>
-        <w:t xml:space="preserve"> main logo for the website taken from this site</w:t>
+    </w:p>
+    <w:p>
+      <w:r>
+        <w:t>Logo on my navigation bar is take from Flaticon free icon website, I am using the free license with proper attribution.</w:t>
       </w:r>
     </w:p>
     <w:sectPr>

</xml_diff>

<commit_message>
updating my dissertation doc with liscencing for my image
</commit_message>
<xml_diff>
--- a/Documents/Final Dissertation Doc.docx
+++ b/Documents/Final Dissertation Doc.docx
@@ -4569,7 +4569,7 @@
           <w:noProof/>
         </w:rPr>
         <w:drawing>
-          <wp:inline distT="0" distB="0" distL="0" distR="0" wp14:anchorId="0D399BE2" wp14:editId="2209B38C">
+          <wp:inline distT="0" distB="0" distL="0" distR="0" wp14:anchorId="0D399BE2" wp14:editId="4AB27F0F">
             <wp:extent cx="5731510" cy="1630018"/>
             <wp:effectExtent l="0" t="0" r="2540" b="8890"/>
             <wp:docPr id="1100710146" name="Picture 1" descr="A graph with blue and gray bars&#10;&#10;AI-generated content may be incorrect."/>
@@ -7301,7 +7301,29 @@
     </w:p>
     <w:p>
       <w:r>
-        <w:t>Logo on my navigation bar is take from Flaticon free icon website, I am using the free license with proper attribution.</w:t>
+        <w:t>Logo on my navigation bar is take</w:t>
+      </w:r>
+      <w:r>
+        <w:t>n</w:t>
+      </w:r>
+      <w:r>
+        <w:t xml:space="preserve"> from Flaticon free icon website, I am using the free license with proper attribution.</w:t>
+      </w:r>
+    </w:p>
+    <w:p/>
+    <w:p>
+      <w:hyperlink r:id="rId12" w:history="1">
+        <w:r>
+          <w:rPr>
+            <w:rStyle w:val="Hyperlink"/>
+          </w:rPr>
+          <w:t>https://unsplash.com/photos/a-man-holding-out-his-hand-in-the-rain-8YQIf-vUN0g?utm_source=chatgpt.com</w:t>
+        </w:r>
+      </w:hyperlink>
+    </w:p>
+    <w:p>
+      <w:r>
+        <w:t>The homepage background image is taken from Ben Moreland on unsplash.com, I am using thr free license with proper attribution.</w:t>
       </w:r>
     </w:p>
     <w:sectPr>

</xml_diff>

<commit_message>
Reminding myself what website i used for calculating metabolic rates
</commit_message>
<xml_diff>
--- a/Documents/Final Dissertation Doc.docx
+++ b/Documents/Final Dissertation Doc.docx
@@ -2674,7 +2674,15 @@
     </w:p>
     <w:p>
       <w:r>
-        <w:t>acceptance tests. Requirements must be prioritised (e.g. using MoSCoW).</w:t>
+        <w:t xml:space="preserve">acceptance tests. Requirements must be prioritised (e.g. using </w:t>
+      </w:r>
+      <w:proofErr w:type="spellStart"/>
+      <w:r>
+        <w:t>MoSCoW</w:t>
+      </w:r>
+      <w:proofErr w:type="spellEnd"/>
+      <w:r>
+        <w:t>).</w:t>
       </w:r>
     </w:p>
     <w:p>
@@ -2920,7 +2928,23 @@
         <w:spacing w:line="240" w:lineRule="auto"/>
       </w:pPr>
       <w:r>
-        <w:t>Many Bouldering and climbing communities are increasingly using more mobile and web applications to connect with other users; log climbs they’ve done and discover new routes in nearby areas. Some Examples of apps like this include TheCrag and TopLogger, these apps allow climbers to log their ascents, track their progress and engage with their communities.</w:t>
+        <w:t xml:space="preserve">Many Bouldering and climbing communities are increasingly using more mobile and web applications to connect with other users; log climbs they’ve done and discover new routes in nearby areas. Some Examples of apps like this include </w:t>
+      </w:r>
+      <w:proofErr w:type="spellStart"/>
+      <w:r>
+        <w:t>TheCrag</w:t>
+      </w:r>
+      <w:proofErr w:type="spellEnd"/>
+      <w:r>
+        <w:t xml:space="preserve"> and </w:t>
+      </w:r>
+      <w:proofErr w:type="spellStart"/>
+      <w:r>
+        <w:t>TopLogger</w:t>
+      </w:r>
+      <w:proofErr w:type="spellEnd"/>
+      <w:r>
+        <w:t>, these apps allow climbers to log their ascents, track their progress and engage with their communities.</w:t>
       </w:r>
     </w:p>
     <w:p>
@@ -4405,6 +4429,7 @@
                 <w:szCs w:val="22"/>
               </w:rPr>
             </w:pPr>
+            <w:proofErr w:type="spellStart"/>
             <w:r>
               <w:rPr>
                 <w:sz w:val="22"/>
@@ -4412,6 +4437,7 @@
               </w:rPr>
               <w:t>Thymeleaf</w:t>
             </w:r>
+            <w:proofErr w:type="spellEnd"/>
           </w:p>
         </w:tc>
         <w:tc>
@@ -4515,7 +4541,23 @@
                 <w:sz w:val="22"/>
                 <w:szCs w:val="22"/>
               </w:rPr>
-              <w:t>Integrates well with Thymeleaf, allows charts to be added to dashboards, graphs or leaderboards. (FR2, FR3)</w:t>
+              <w:t xml:space="preserve">Integrates well with </w:t>
+            </w:r>
+            <w:proofErr w:type="spellStart"/>
+            <w:r>
+              <w:rPr>
+                <w:sz w:val="22"/>
+                <w:szCs w:val="22"/>
+              </w:rPr>
+              <w:t>Thymeleaf</w:t>
+            </w:r>
+            <w:proofErr w:type="spellEnd"/>
+            <w:r>
+              <w:rPr>
+                <w:sz w:val="22"/>
+                <w:szCs w:val="22"/>
+              </w:rPr>
+              <w:t>, allows charts to be added to dashboards, graphs or leaderboards. (FR2, FR3)</w:t>
             </w:r>
           </w:p>
         </w:tc>
@@ -4569,7 +4611,7 @@
           <w:noProof/>
         </w:rPr>
         <w:drawing>
-          <wp:inline distT="0" distB="0" distL="0" distR="0" wp14:anchorId="0D399BE2" wp14:editId="4AB27F0F">
+          <wp:inline distT="0" distB="0" distL="0" distR="0" wp14:anchorId="0D399BE2" wp14:editId="0981FD69">
             <wp:extent cx="5731510" cy="1630018"/>
             <wp:effectExtent l="0" t="0" r="2540" b="8890"/>
             <wp:docPr id="1100710146" name="Picture 1" descr="A graph with blue and gray bars&#10;&#10;AI-generated content may be incorrect."/>
@@ -5631,7 +5673,23 @@
                 <w:sz w:val="22"/>
                 <w:szCs w:val="22"/>
               </w:rPr>
-              <w:t>As I user, I want access to my own unique and personaliseable account so that my progress can be saved.</w:t>
+              <w:t xml:space="preserve">As I user, I want access to my own unique and </w:t>
+            </w:r>
+            <w:proofErr w:type="spellStart"/>
+            <w:r>
+              <w:rPr>
+                <w:sz w:val="22"/>
+                <w:szCs w:val="22"/>
+              </w:rPr>
+              <w:t>personaliseable</w:t>
+            </w:r>
+            <w:proofErr w:type="spellEnd"/>
+            <w:r>
+              <w:rPr>
+                <w:sz w:val="22"/>
+                <w:szCs w:val="22"/>
+              </w:rPr>
+              <w:t xml:space="preserve"> account so that my progress can be saved.</w:t>
             </w:r>
           </w:p>
         </w:tc>
@@ -6944,7 +7002,15 @@
     </w:p>
     <w:p>
       <w:r>
-        <w:t>• Official Documentation: "The system uses the React 'UseContext' hook for global state</w:t>
+        <w:t>• Official Documentation: "The system uses the React '</w:t>
+      </w:r>
+      <w:proofErr w:type="spellStart"/>
+      <w:r>
+        <w:t>UseContext</w:t>
+      </w:r>
+      <w:proofErr w:type="spellEnd"/>
+      <w:r>
+        <w:t>' hook for global state</w:t>
       </w:r>
     </w:p>
     <w:p>
@@ -6959,7 +7025,15 @@
     </w:p>
     <w:p>
       <w:r>
-        <w:t>solution by 'DevGuru' on Stack Overflow (2025)."</w:t>
+        <w:t>solution by '</w:t>
+      </w:r>
+      <w:proofErr w:type="spellStart"/>
+      <w:r>
+        <w:t>DevGuru</w:t>
+      </w:r>
+      <w:proofErr w:type="spellEnd"/>
+      <w:r>
+        <w:t>' on Stack Overflow (2025)."</w:t>
       </w:r>
     </w:p>
     <w:p>
@@ -6980,7 +7054,15 @@
     <w:p>
       <w:r>
         <w:lastRenderedPageBreak/>
-        <w:t>• Meta. (2026). React Documentation: Scaling State. [Online]. Available at: react.dev/docs</w:t>
+        <w:t xml:space="preserve">• Meta. (2026). React Documentation: Scaling State. [Online]. Available at: </w:t>
+      </w:r>
+      <w:proofErr w:type="spellStart"/>
+      <w:r>
+        <w:t>react.dev</w:t>
+      </w:r>
+      <w:proofErr w:type="spellEnd"/>
+      <w:r>
+        <w:t>/docs</w:t>
       </w:r>
     </w:p>
     <w:p>
@@ -7040,7 +7122,15 @@
     </w:p>
     <w:p>
       <w:r>
-        <w:t>function validateEmail(email) { ... }</w:t>
+        <w:t xml:space="preserve">function </w:t>
+      </w:r>
+      <w:proofErr w:type="spellStart"/>
+      <w:r>
+        <w:t>validateEmail</w:t>
+      </w:r>
+      <w:proofErr w:type="spellEnd"/>
+      <w:r>
+        <w:t>(email) { ... }</w:t>
       </w:r>
     </w:p>
     <w:p/>
@@ -7056,7 +7146,39 @@
           <w:b/>
           <w:bCs/>
         </w:rPr>
-        <w:t>remember to reference th following that ive used for help,</w:t>
+        <w:t xml:space="preserve">remember to reference </w:t>
+      </w:r>
+      <w:proofErr w:type="spellStart"/>
+      <w:r>
+        <w:rPr>
+          <w:b/>
+          <w:bCs/>
+        </w:rPr>
+        <w:t>th</w:t>
+      </w:r>
+      <w:proofErr w:type="spellEnd"/>
+      <w:r>
+        <w:rPr>
+          <w:b/>
+          <w:bCs/>
+        </w:rPr>
+        <w:t xml:space="preserve"> following that </w:t>
+      </w:r>
+      <w:proofErr w:type="spellStart"/>
+      <w:r>
+        <w:rPr>
+          <w:b/>
+          <w:bCs/>
+        </w:rPr>
+        <w:t>ive</w:t>
+      </w:r>
+      <w:proofErr w:type="spellEnd"/>
+      <w:r>
+        <w:rPr>
+          <w:b/>
+          <w:bCs/>
+        </w:rPr>
+        <w:t xml:space="preserve"> used for help,</w:t>
       </w:r>
     </w:p>
     <w:p>
@@ -7108,7 +7230,21 @@
       </w:r>
       <w:bookmarkEnd w:id="13"/>
     </w:p>
-    <w:p/>
+    <w:p>
+      <w:hyperlink r:id="rId10" w:history="1">
+        <w:r>
+          <w:rPr>
+            <w:rStyle w:val="Hyperlink"/>
+          </w:rPr>
+          <w:t>https://reference.medscape.com/calculator/846/mifflin-st-jeor-equation</w:t>
+        </w:r>
+      </w:hyperlink>
+    </w:p>
+    <w:p>
+      <w:r>
+        <w:t>using this webpage for calculations on Metabolic rates</w:t>
+      </w:r>
+    </w:p>
     <w:p>
       <w:pPr>
         <w:pStyle w:val="Heading1"/>
@@ -7154,12 +7290,12 @@
     </w:p>
     <w:p>
       <w:r>
+        <w:lastRenderedPageBreak/>
         <w:t>o Syntax &amp; Boilerplate Code (small, specific snippets). You must fully understand and</w:t>
       </w:r>
     </w:p>
     <w:p>
       <w:r>
-        <w:lastRenderedPageBreak/>
         <w:t>modify any code you use.</w:t>
       </w:r>
     </w:p>
@@ -7224,8 +7360,13 @@
       </w:r>
     </w:p>
     <w:p>
-      <w:r>
-        <w:t>MoSCoW list.</w:t>
+      <w:proofErr w:type="spellStart"/>
+      <w:r>
+        <w:t>MoSCoW</w:t>
+      </w:r>
+      <w:proofErr w:type="spellEnd"/>
+      <w:r>
+        <w:t xml:space="preserve"> list.</w:t>
       </w:r>
     </w:p>
     <w:p>
@@ -7262,7 +7403,7 @@
       </w:r>
     </w:p>
     <w:p>
-      <w:hyperlink r:id="rId10" w:history="1">
+      <w:hyperlink r:id="rId11" w:history="1">
         <w:r>
           <w:rPr>
             <w:rStyle w:val="Hyperlink"/>
@@ -7290,7 +7431,7 @@
       </w:r>
     </w:p>
     <w:p>
-      <w:hyperlink r:id="rId11" w:history="1">
+      <w:hyperlink r:id="rId12" w:history="1">
         <w:r>
           <w:rPr>
             <w:rStyle w:val="Hyperlink"/>
@@ -7307,12 +7448,20 @@
         <w:t>n</w:t>
       </w:r>
       <w:r>
-        <w:t xml:space="preserve"> from Flaticon free icon website, I am using the free license with proper attribution.</w:t>
+        <w:t xml:space="preserve"> from </w:t>
+      </w:r>
+      <w:proofErr w:type="spellStart"/>
+      <w:r>
+        <w:t>Flaticon</w:t>
+      </w:r>
+      <w:proofErr w:type="spellEnd"/>
+      <w:r>
+        <w:t xml:space="preserve"> free icon website, I am using the free license with proper attribution.</w:t>
       </w:r>
     </w:p>
     <w:p/>
     <w:p>
-      <w:hyperlink r:id="rId12" w:history="1">
+      <w:hyperlink r:id="rId13" w:history="1">
         <w:r>
           <w:rPr>
             <w:rStyle w:val="Hyperlink"/>
@@ -7323,7 +7472,15 @@
     </w:p>
     <w:p>
       <w:r>
-        <w:t>The homepage background image is taken from Ben Moreland on unsplash.com, I am using thr free license with proper attribution.</w:t>
+        <w:t xml:space="preserve">The homepage background image is taken from Ben Moreland on unsplash.com, I am using </w:t>
+      </w:r>
+      <w:proofErr w:type="spellStart"/>
+      <w:r>
+        <w:t>thr</w:t>
+      </w:r>
+      <w:proofErr w:type="spellEnd"/>
+      <w:r>
+        <w:t xml:space="preserve"> free license with proper attribution.</w:t>
       </w:r>
     </w:p>
     <w:sectPr>

</xml_diff>

<commit_message>
uploading my doc to gitLab again to be safe
</commit_message>
<xml_diff>
--- a/Documents/Final Dissertation Doc.docx
+++ b/Documents/Final Dissertation Doc.docx
@@ -5412,7 +5412,21 @@
         <w:rPr>
           <w:rFonts w:ascii="Calibri" w:hAnsi="Calibri" w:cs="Calibri"/>
         </w:rPr>
-        <w:t xml:space="preserve"> advanced performance, nutritional tracking, AI-driven recommendations, and community interaction all under a single plateform. Whilst this initial plan founded a strong foundation, further development required additional refinement to ensure technical feasibility and to ensure it aligned with project constraints.</w:t>
+        <w:t xml:space="preserve"> advanced performance, nutritional tracking, AI-driven recommendations, and community interaction all under a single </w:t>
+      </w:r>
+      <w:proofErr w:type="spellStart"/>
+      <w:r>
+        <w:rPr>
+          <w:rFonts w:ascii="Calibri" w:hAnsi="Calibri" w:cs="Calibri"/>
+        </w:rPr>
+        <w:t>plateform</w:t>
+      </w:r>
+      <w:proofErr w:type="spellEnd"/>
+      <w:r>
+        <w:rPr>
+          <w:rFonts w:ascii="Calibri" w:hAnsi="Calibri" w:cs="Calibri"/>
+        </w:rPr>
+        <w:t>. Whilst this initial plan founded a strong foundation, further development required additional refinement to ensure technical feasibility and to ensure it aligned with project constraints.</w:t>
       </w:r>
     </w:p>
     <w:p>
@@ -5541,211 +5555,6 @@
     </w:p>
     <w:p>
       <w:pPr>
-        <w:spacing w:line="360" w:lineRule="auto"/>
-        <w:rPr>
-          <w:rFonts w:ascii="Calibri" w:hAnsi="Calibri" w:cs="Calibri"/>
-        </w:rPr>
-      </w:pPr>
-      <w:proofErr w:type="gramStart"/>
-      <w:r>
-        <w:rPr>
-          <w:rFonts w:ascii="Calibri" w:hAnsi="Calibri" w:cs="Calibri"/>
-        </w:rPr>
-        <w:t>Main Focus</w:t>
-      </w:r>
-      <w:proofErr w:type="gramEnd"/>
-      <w:r>
-        <w:rPr>
-          <w:rFonts w:ascii="Calibri" w:hAnsi="Calibri" w:cs="Calibri"/>
-        </w:rPr>
-        <w:t>: To demonstrate professional engineering discipline and the "Working with Others"</w:t>
-      </w:r>
-    </w:p>
-    <w:p>
-      <w:pPr>
-        <w:spacing w:line="360" w:lineRule="auto"/>
-        <w:rPr>
-          <w:rFonts w:ascii="Calibri" w:hAnsi="Calibri" w:cs="Calibri"/>
-        </w:rPr>
-      </w:pPr>
-      <w:r>
-        <w:rPr>
-          <w:rFonts w:ascii="Calibri" w:hAnsi="Calibri" w:cs="Calibri"/>
-        </w:rPr>
-        <w:t>learning outcome.</w:t>
-      </w:r>
-    </w:p>
-    <w:p>
-      <w:pPr>
-        <w:spacing w:line="360" w:lineRule="auto"/>
-        <w:rPr>
-          <w:rFonts w:ascii="Calibri" w:hAnsi="Calibri" w:cs="Calibri"/>
-        </w:rPr>
-      </w:pPr>
-      <w:r>
-        <w:rPr>
-          <w:rFonts w:ascii="Calibri" w:hAnsi="Calibri" w:cs="Calibri"/>
-        </w:rPr>
-        <w:t>• Process Selection &amp; Justification: Identify your development methodology (e.g., Agile, Waterfall,</w:t>
-      </w:r>
-    </w:p>
-    <w:p>
-      <w:pPr>
-        <w:spacing w:line="360" w:lineRule="auto"/>
-        <w:rPr>
-          <w:rFonts w:ascii="Calibri" w:hAnsi="Calibri" w:cs="Calibri"/>
-        </w:rPr>
-      </w:pPr>
-      <w:r>
-        <w:rPr>
-          <w:rFonts w:ascii="Calibri" w:hAnsi="Calibri" w:cs="Calibri"/>
-        </w:rPr>
-        <w:t>or a Hybrid). Do not provide a generic definition. Instead, justify why this approach was chosen for</w:t>
-      </w:r>
-    </w:p>
-    <w:p>
-      <w:pPr>
-        <w:spacing w:line="360" w:lineRule="auto"/>
-        <w:rPr>
-          <w:rFonts w:ascii="Calibri" w:hAnsi="Calibri" w:cs="Calibri"/>
-        </w:rPr>
-      </w:pPr>
-      <w:r>
-        <w:rPr>
-          <w:rFonts w:ascii="Calibri" w:hAnsi="Calibri" w:cs="Calibri"/>
-        </w:rPr>
-        <w:t>your specific project constraints and technical goals.</w:t>
-      </w:r>
-    </w:p>
-    <w:p>
-      <w:pPr>
-        <w:spacing w:line="360" w:lineRule="auto"/>
-        <w:rPr>
-          <w:rFonts w:ascii="Calibri" w:hAnsi="Calibri" w:cs="Calibri"/>
-        </w:rPr>
-      </w:pPr>
-      <w:r>
-        <w:rPr>
-          <w:rFonts w:ascii="Calibri" w:hAnsi="Calibri" w:cs="Calibri"/>
-        </w:rPr>
-        <w:t>• Engineering Practices: Describe the specific day-to-day practices you used to keep the project on</w:t>
-      </w:r>
-    </w:p>
-    <w:p>
-      <w:pPr>
-        <w:spacing w:line="360" w:lineRule="auto"/>
-        <w:rPr>
-          <w:rFonts w:ascii="Calibri" w:hAnsi="Calibri" w:cs="Calibri"/>
-        </w:rPr>
-      </w:pPr>
-      <w:r>
-        <w:rPr>
-          <w:rFonts w:ascii="Calibri" w:hAnsi="Calibri" w:cs="Calibri"/>
-        </w:rPr>
-        <w:t>track. This includes your use of Version Control (GitLab), how you handled Issue Tracking, and how</w:t>
-      </w:r>
-    </w:p>
-    <w:p>
-      <w:pPr>
-        <w:spacing w:line="360" w:lineRule="auto"/>
-        <w:rPr>
-          <w:rFonts w:ascii="Calibri" w:hAnsi="Calibri" w:cs="Calibri"/>
-        </w:rPr>
-      </w:pPr>
-      <w:r>
-        <w:rPr>
-          <w:rFonts w:ascii="Calibri" w:hAnsi="Calibri" w:cs="Calibri"/>
-        </w:rPr>
-        <w:t>you utilized Development Spikes to prototype risky or unknown features.</w:t>
-      </w:r>
-    </w:p>
-    <w:p>
-      <w:pPr>
-        <w:spacing w:line="360" w:lineRule="auto"/>
-        <w:rPr>
-          <w:rFonts w:ascii="Calibri" w:hAnsi="Calibri" w:cs="Calibri"/>
-        </w:rPr>
-      </w:pPr>
-      <w:r>
-        <w:rPr>
-          <w:rFonts w:ascii="Calibri" w:hAnsi="Calibri" w:cs="Calibri"/>
-        </w:rPr>
-        <w:t>• Risk Mitigation: Revisit the risks identified in your initial plan and explain how they were actively</w:t>
-      </w:r>
-    </w:p>
-    <w:p>
-      <w:pPr>
-        <w:spacing w:line="360" w:lineRule="auto"/>
-        <w:rPr>
-          <w:rFonts w:ascii="Calibri" w:hAnsi="Calibri" w:cs="Calibri"/>
-        </w:rPr>
-      </w:pPr>
-      <w:r>
-        <w:rPr>
-          <w:rFonts w:ascii="Calibri" w:hAnsi="Calibri" w:cs="Calibri"/>
-        </w:rPr>
-        <w:t>managed or mitigated throughout the lifecycle.</w:t>
-      </w:r>
-    </w:p>
-    <w:p>
-      <w:pPr>
-        <w:spacing w:line="360" w:lineRule="auto"/>
-        <w:rPr>
-          <w:rFonts w:ascii="Calibri" w:hAnsi="Calibri" w:cs="Calibri"/>
-        </w:rPr>
-      </w:pPr>
-      <w:r>
-        <w:rPr>
-          <w:rFonts w:ascii="Calibri" w:hAnsi="Calibri" w:cs="Calibri"/>
-        </w:rPr>
-        <w:t>• Collaboration Reflection: Reflect on how working with others and gaining external input impacted</w:t>
-      </w:r>
-    </w:p>
-    <w:p>
-      <w:pPr>
-        <w:spacing w:line="360" w:lineRule="auto"/>
-        <w:rPr>
-          <w:rFonts w:ascii="Calibri" w:hAnsi="Calibri" w:cs="Calibri"/>
-        </w:rPr>
-      </w:pPr>
-      <w:r>
-        <w:rPr>
-          <w:rFonts w:ascii="Calibri" w:hAnsi="Calibri" w:cs="Calibri"/>
-        </w:rPr>
-        <w:t>the project. This can include (but is not restricted to) feedback from Supervisor meetings, Scrum</w:t>
-      </w:r>
-    </w:p>
-    <w:p>
-      <w:pPr>
-        <w:spacing w:line="360" w:lineRule="auto"/>
-        <w:rPr>
-          <w:rFonts w:ascii="Calibri" w:hAnsi="Calibri" w:cs="Calibri"/>
-        </w:rPr>
-      </w:pPr>
-      <w:r>
-        <w:rPr>
-          <w:rFonts w:ascii="Calibri" w:hAnsi="Calibri" w:cs="Calibri"/>
-        </w:rPr>
-        <w:lastRenderedPageBreak/>
-        <w:t>meetings or discussions with your study group, any user/peer feedback on your system. If external</w:t>
-      </w:r>
-    </w:p>
-    <w:p>
-      <w:pPr>
-        <w:spacing w:line="360" w:lineRule="auto"/>
-        <w:rPr>
-          <w:rFonts w:ascii="Calibri" w:hAnsi="Calibri" w:cs="Calibri"/>
-        </w:rPr>
-      </w:pPr>
-      <w:r>
-        <w:rPr>
-          <w:rFonts w:ascii="Calibri" w:hAnsi="Calibri" w:cs="Calibri"/>
-        </w:rPr>
-        <w:t>interaction was limited, reflect on this.</w:t>
-      </w:r>
-    </w:p>
-    <w:p>
-      <w:pPr>
         <w:pStyle w:val="Heading2"/>
         <w:spacing w:line="360" w:lineRule="auto"/>
         <w:rPr>
@@ -5824,6 +5633,33 @@
           <w:rFonts w:ascii="Calibri" w:hAnsi="Calibri" w:cs="Calibri"/>
         </w:rPr>
       </w:pPr>
+      <w:r>
+        <w:rPr>
+          <w:rFonts w:ascii="Calibri" w:hAnsi="Calibri" w:cs="Calibri"/>
+        </w:rPr>
+        <w:t xml:space="preserve">The use of short development cycles enabled rapid feedback, allowing issues to be identified and resolved early on. Each feature was implemented, manually testing withing the running application, and refined before moving onto the next feature. This ensured that the system remained stable </w:t>
+      </w:r>
+      <w:r>
+        <w:rPr>
+          <w:rFonts w:ascii="Calibri" w:hAnsi="Calibri" w:cs="Calibri"/>
+        </w:rPr>
+        <w:lastRenderedPageBreak/>
+        <w:t>throughout development, allowing error to be resolved early whilst gradually increasing the applications complexity.</w:t>
+      </w:r>
+    </w:p>
+    <w:p>
+      <w:pPr>
+        <w:spacing w:line="360" w:lineRule="auto"/>
+        <w:rPr>
+          <w:rFonts w:ascii="Calibri" w:hAnsi="Calibri" w:cs="Calibri"/>
+        </w:rPr>
+      </w:pPr>
+      <w:r>
+        <w:rPr>
+          <w:rFonts w:ascii="Calibri" w:hAnsi="Calibri" w:cs="Calibri"/>
+        </w:rPr>
+        <w:t>Overall, the hybrid Agile approach was the better choice as it provided the flexibility required to respond when it came to changing the requirements and still maintaining structured progression toward the final system.</w:t>
+      </w:r>
     </w:p>
     <w:p>
       <w:pPr>
@@ -5848,6 +5684,102 @@
     </w:p>
     <w:p>
       <w:pPr>
+        <w:spacing w:line="360" w:lineRule="auto"/>
+        <w:rPr>
+          <w:rFonts w:ascii="Calibri" w:hAnsi="Calibri" w:cs="Calibri"/>
+        </w:rPr>
+      </w:pPr>
+      <w:r>
+        <w:rPr>
+          <w:rFonts w:ascii="Calibri" w:hAnsi="Calibri" w:cs="Calibri"/>
+        </w:rPr>
+        <w:t>An iterative development workflow was followed, where features were implemented incrementally through continuous manual testing. After implementation a feature, the application was manually executed locally through using the Spring Boot environment, functionality was verified through direct interaction with the user interface via a web browser.</w:t>
+      </w:r>
+    </w:p>
+    <w:p>
+      <w:pPr>
+        <w:spacing w:line="360" w:lineRule="auto"/>
+        <w:rPr>
+          <w:rFonts w:ascii="Calibri" w:hAnsi="Calibri" w:cs="Calibri"/>
+        </w:rPr>
+      </w:pPr>
+      <w:r>
+        <w:rPr>
+          <w:rFonts w:ascii="Calibri" w:hAnsi="Calibri" w:cs="Calibri"/>
+        </w:rPr>
+        <w:t>Test data would be entered into the system to confirm that functionality performed as expected. This included verifying that user inputs were correctly, stored, processed and displayed. Issues were identified immediately, and implementation was refined before progressing any further. This approach to the system provided rapid feedback on the features and ensured that errors and incompatible features were identified and changed/fixed early on.</w:t>
+      </w:r>
+    </w:p>
+    <w:p>
+      <w:pPr>
+        <w:spacing w:line="360" w:lineRule="auto"/>
+        <w:rPr>
+          <w:rFonts w:ascii="Calibri" w:hAnsi="Calibri" w:cs="Calibri"/>
+        </w:rPr>
+      </w:pPr>
+      <w:r>
+        <w:rPr>
+          <w:rFonts w:ascii="Calibri" w:hAnsi="Calibri" w:cs="Calibri"/>
+        </w:rPr>
+        <w:t xml:space="preserve">Version control of the project was managed through GitLab, allowing changes to be tracked through git commits and enabling the project to maintain a clear development history. Features and </w:t>
+      </w:r>
+      <w:r>
+        <w:rPr>
+          <w:rFonts w:ascii="Calibri" w:hAnsi="Calibri" w:cs="Calibri"/>
+        </w:rPr>
+        <w:t>improvements to the system were developed incrementally, allowing changes to be isolated and if necessary, rolled back without impacting the entire system.</w:t>
+      </w:r>
+    </w:p>
+    <w:p>
+      <w:pPr>
+        <w:spacing w:line="360" w:lineRule="auto"/>
+        <w:rPr>
+          <w:rFonts w:ascii="Calibri" w:hAnsi="Calibri" w:cs="Calibri"/>
+        </w:rPr>
+      </w:pPr>
+      <w:r>
+        <w:rPr>
+          <w:rFonts w:ascii="Calibri" w:hAnsi="Calibri" w:cs="Calibri"/>
+        </w:rPr>
+        <w:t xml:space="preserve">Issue tracking was carried out during the early stages of development </w:t>
+      </w:r>
+      <w:proofErr w:type="gramStart"/>
+      <w:r>
+        <w:rPr>
+          <w:rFonts w:ascii="Calibri" w:hAnsi="Calibri" w:cs="Calibri"/>
+        </w:rPr>
+        <w:t>in order to</w:t>
+      </w:r>
+      <w:proofErr w:type="gramEnd"/>
+      <w:r>
+        <w:rPr>
+          <w:rFonts w:ascii="Calibri" w:hAnsi="Calibri" w:cs="Calibri"/>
+        </w:rPr>
+        <w:t xml:space="preserve"> organise the core features and establish an initial structure for project backlog. </w:t>
+      </w:r>
+      <w:r>
+        <w:rPr>
+          <w:rFonts w:ascii="Calibri" w:hAnsi="Calibri" w:cs="Calibri"/>
+        </w:rPr>
+        <w:t>As development progressed and time constraints increased, the workflow became more implementation focused, with features being developed and refined iteratively rather than manged through strict issue tracking. Despite this shift, initial issue tracking was key to helping define the core components of the system and system direction.</w:t>
+      </w:r>
+    </w:p>
+    <w:p>
+      <w:pPr>
+        <w:spacing w:line="360" w:lineRule="auto"/>
+        <w:rPr>
+          <w:rFonts w:ascii="Calibri" w:hAnsi="Calibri" w:cs="Calibri"/>
+        </w:rPr>
+      </w:pPr>
+      <w:r>
+        <w:rPr>
+          <w:rFonts w:ascii="Calibri" w:hAnsi="Calibri" w:cs="Calibri"/>
+        </w:rPr>
+        <w:t>While formal automated testing frameworks such as J Unit tests were not extensively utilised, the consistent use of manual functional testing ensured that the core features were validated throughout development. Priority was given on ensuring end-to-end functionality across the system whilst less emphasis was placed on isolated unit-level testing.</w:t>
+      </w:r>
+    </w:p>
+    <w:p>
+      <w:pPr>
         <w:pStyle w:val="Heading2"/>
         <w:spacing w:line="360" w:lineRule="auto"/>
         <w:rPr>
@@ -5863,9 +5795,167 @@
           <w:b/>
           <w:bCs/>
         </w:rPr>
+        <w:lastRenderedPageBreak/>
         <w:t>2.3 Risk Mitigation</w:t>
       </w:r>
       <w:bookmarkEnd w:id="8"/>
+    </w:p>
+    <w:p>
+      <w:pPr>
+        <w:spacing w:line="360" w:lineRule="auto"/>
+        <w:rPr>
+          <w:rFonts w:ascii="Calibri" w:hAnsi="Calibri" w:cs="Calibri"/>
+        </w:rPr>
+      </w:pPr>
+      <w:r>
+        <w:rPr>
+          <w:rFonts w:ascii="Calibri" w:hAnsi="Calibri" w:cs="Calibri"/>
+        </w:rPr>
+        <w:t>Several risks were identified during the initial planning phases, in relation to technical complexity, feature feasibility and system reliability. These risks were evaluated and addressed throughout the whole development life cycle.</w:t>
+      </w:r>
+    </w:p>
+    <w:p>
+      <w:pPr>
+        <w:spacing w:line="360" w:lineRule="auto"/>
+        <w:rPr>
+          <w:rFonts w:ascii="Calibri" w:hAnsi="Calibri" w:cs="Calibri"/>
+        </w:rPr>
+      </w:pPr>
+      <w:r>
+        <w:rPr>
+          <w:rFonts w:ascii="Calibri" w:hAnsi="Calibri" w:cs="Calibri"/>
+        </w:rPr>
+        <w:t>One of the main primary risks was the proposed AI-driven recommendations. This feature introduced severe</w:t>
+      </w:r>
+      <w:r>
+        <w:rPr>
+          <w:rFonts w:ascii="Calibri" w:hAnsi="Calibri" w:cs="Calibri"/>
+        </w:rPr>
+        <w:t xml:space="preserve"> technical uncertainty, as delivering a meaningful and accurate output would require either some form of machine learning integration or complex data modelling. There was a high risk that a simplified approach of integrating this feature would result in unreliable and misleading results. This risk was mitigated by reassessing feasibility early into development and replacing this feature with rule-based insights derived from user data. Overall, this ensured that the feedback presented to the user was accurate, transparent and interpretable.</w:t>
+      </w:r>
+    </w:p>
+    <w:p>
+      <w:pPr>
+        <w:spacing w:line="360" w:lineRule="auto"/>
+        <w:rPr>
+          <w:rFonts w:ascii="Calibri" w:hAnsi="Calibri" w:cs="Calibri"/>
+        </w:rPr>
+      </w:pPr>
+      <w:r>
+        <w:rPr>
+          <w:rFonts w:ascii="Calibri" w:hAnsi="Calibri" w:cs="Calibri"/>
+        </w:rPr>
+        <w:t xml:space="preserve">Another significant risk identified involved the reliability of performance metrics. Early development plans involved using key climbing </w:t>
+      </w:r>
+      <w:proofErr w:type="spellStart"/>
+      <w:r>
+        <w:rPr>
+          <w:rFonts w:ascii="Calibri" w:hAnsi="Calibri" w:cs="Calibri"/>
+        </w:rPr>
+        <w:t>kpi’s</w:t>
+      </w:r>
+      <w:proofErr w:type="spellEnd"/>
+      <w:r>
+        <w:rPr>
+          <w:rFonts w:ascii="Calibri" w:hAnsi="Calibri" w:cs="Calibri"/>
+        </w:rPr>
+        <w:t xml:space="preserve"> such finger strength, which could not be accurately assessed without some type of external sensor </w:t>
+      </w:r>
+      <w:r>
+        <w:rPr>
+          <w:rFonts w:ascii="Calibri" w:hAnsi="Calibri" w:cs="Calibri"/>
+        </w:rPr>
+        <w:t xml:space="preserve">or hardware. This introduced the risk of varied and potentially inconsistent or inaccurate data, which would undermine the validity of the analytical outputs. To address this risk, the system was redesigned to focus or more </w:t>
+      </w:r>
+      <w:r>
+        <w:rPr>
+          <w:rFonts w:ascii="Calibri" w:hAnsi="Calibri" w:cs="Calibri"/>
+        </w:rPr>
+        <w:t>measurable</w:t>
+      </w:r>
+      <w:r>
+        <w:rPr>
+          <w:rFonts w:ascii="Calibri" w:hAnsi="Calibri" w:cs="Calibri"/>
+        </w:rPr>
+        <w:t xml:space="preserve"> metrics that could be reliable recorded through user input, such as session duration, intensity, attempts, tops and climbing grades. This helped ensure consistency across recorded data and improved the quality of dashboard analysis.</w:t>
+      </w:r>
+    </w:p>
+    <w:p>
+      <w:pPr>
+        <w:spacing w:line="360" w:lineRule="auto"/>
+        <w:rPr>
+          <w:rFonts w:ascii="Calibri" w:hAnsi="Calibri" w:cs="Calibri"/>
+        </w:rPr>
+      </w:pPr>
+      <w:r>
+        <w:rPr>
+          <w:rFonts w:ascii="Calibri" w:hAnsi="Calibri" w:cs="Calibri"/>
+        </w:rPr>
+        <w:t xml:space="preserve">A further risk was the Integrity of data inputted from users. Since the system relies on manually inputted user data there was the potential for users to purposefully enter in large amounts of incorrect data into the system on purpose with the intent affecting the reliability of leaderboard rankings and community content. This risk was mitigated by implementing input validation where appropriate and designing the system to present aggregated training trends rather than relying on only single data points. As a result, the impact of individual inaccurate entries is reduced, and users are encouraged to interpret their data over </w:t>
+      </w:r>
+      <w:proofErr w:type="gramStart"/>
+      <w:r>
+        <w:rPr>
+          <w:rFonts w:ascii="Calibri" w:hAnsi="Calibri" w:cs="Calibri"/>
+        </w:rPr>
+        <w:t>a period of time</w:t>
+      </w:r>
+      <w:proofErr w:type="gramEnd"/>
+      <w:r>
+        <w:rPr>
+          <w:rFonts w:ascii="Calibri" w:hAnsi="Calibri" w:cs="Calibri"/>
+        </w:rPr>
+        <w:t xml:space="preserve"> rather than through individual values.</w:t>
+      </w:r>
+    </w:p>
+    <w:p>
+      <w:pPr>
+        <w:spacing w:line="360" w:lineRule="auto"/>
+        <w:rPr>
+          <w:rFonts w:ascii="Calibri" w:hAnsi="Calibri" w:cs="Calibri"/>
+        </w:rPr>
+      </w:pPr>
+      <w:r>
+        <w:rPr>
+          <w:rFonts w:ascii="Calibri" w:hAnsi="Calibri" w:cs="Calibri"/>
+        </w:rPr>
+        <w:t>Time constraints also represented a key project risk,</w:t>
+      </w:r>
+      <w:r>
+        <w:rPr>
+          <w:rFonts w:ascii="Calibri" w:hAnsi="Calibri" w:cs="Calibri"/>
+        </w:rPr>
+        <w:t xml:space="preserve"> especially given the initial specification. This was managed by prioritising core system functionality and deferring less critical features such as AI-driven recommendation and advanced gamification systems. This ensured that key essential features were completed to a high standard and the web-app was </w:t>
+      </w:r>
+      <w:r>
+        <w:rPr>
+          <w:rFonts w:ascii="Calibri" w:hAnsi="Calibri" w:cs="Calibri"/>
+        </w:rPr>
+        <w:t>completely functional withing the available timeframe.</w:t>
+      </w:r>
+    </w:p>
+    <w:p>
+      <w:pPr>
+        <w:spacing w:line="360" w:lineRule="auto"/>
+        <w:rPr>
+          <w:rFonts w:ascii="Calibri" w:hAnsi="Calibri" w:cs="Calibri"/>
+        </w:rPr>
+      </w:pPr>
+      <w:r>
+        <w:rPr>
+          <w:rFonts w:ascii="Calibri" w:hAnsi="Calibri" w:cs="Calibri"/>
+        </w:rPr>
+        <w:lastRenderedPageBreak/>
+        <w:t>Overall, risks were managed through continuous iterative refinement and evaluation, with development decision guided mainly by feasibility, reliability and user value.</w:t>
+      </w:r>
+    </w:p>
+    <w:p>
+      <w:pPr>
+        <w:spacing w:line="360" w:lineRule="auto"/>
+        <w:rPr>
+          <w:rFonts w:ascii="Calibri" w:hAnsi="Calibri" w:cs="Calibri"/>
+        </w:rPr>
+      </w:pPr>
     </w:p>
     <w:p>
       <w:pPr>
@@ -5890,6 +5980,42 @@
     </w:p>
     <w:p>
       <w:pPr>
+        <w:spacing w:line="360" w:lineRule="auto"/>
+        <w:rPr>
+          <w:rFonts w:ascii="Calibri" w:hAnsi="Calibri" w:cs="Calibri"/>
+        </w:rPr>
+      </w:pPr>
+      <w:r>
+        <w:rPr>
+          <w:rFonts w:ascii="Calibri" w:hAnsi="Calibri" w:cs="Calibri"/>
+        </w:rPr>
+        <w:t>Although the project was developed individually, external input into design choices played an important role in shaping its progression. Regular biweekly meetings with my project supervisor provided critical feedback on my project, particularly highlighting the need to increase system complexity and incorporate more dynamic, data-driven features.</w:t>
+      </w:r>
+    </w:p>
+    <w:p>
+      <w:pPr>
+        <w:spacing w:line="360" w:lineRule="auto"/>
+        <w:rPr>
+          <w:rFonts w:ascii="Calibri" w:hAnsi="Calibri" w:cs="Calibri"/>
+        </w:rPr>
+      </w:pPr>
+      <w:r>
+        <w:rPr>
+          <w:rFonts w:ascii="Calibri" w:hAnsi="Calibri" w:cs="Calibri"/>
+        </w:rPr>
+        <w:t>This feedback directly influenced the evolution of the system, especially in the expansion of the dashboard functionality and the inclusion of analytical insights rather than a simple display of data. These changes ensured the system aligned more closely with real-world applications and academic expectations for the project.</w:t>
+      </w:r>
+    </w:p>
+    <w:p>
+      <w:pPr>
+        <w:spacing w:line="360" w:lineRule="auto"/>
+        <w:rPr>
+          <w:rFonts w:ascii="Calibri" w:hAnsi="Calibri" w:cs="Calibri"/>
+        </w:rPr>
+      </w:pPr>
+    </w:p>
+    <w:p>
+      <w:pPr>
         <w:pStyle w:val="Heading1"/>
         <w:spacing w:line="360" w:lineRule="auto"/>
         <w:rPr>
@@ -5955,112 +6081,124 @@
         <w:rPr>
           <w:rFonts w:ascii="Calibri" w:hAnsi="Calibri" w:cs="Calibri"/>
         </w:rPr>
-        <w:t xml:space="preserve">This specification outlined broad and ambitious plans for an integrated climbing webapp, incorporating community interaction features, advanced performance tracking and ai driven recommendations/insights into training. Whilst this scope helped provide a strong foundation for the </w:t>
+        <w:t xml:space="preserve">This specification outlined broad and ambitious plans for an integrated climbing webapp, incorporating community interaction features, advanced performance tracking and </w:t>
+      </w:r>
+      <w:r>
+        <w:rPr>
+          <w:rFonts w:ascii="Calibri" w:hAnsi="Calibri" w:cs="Calibri"/>
+        </w:rPr>
+        <w:t>AI-</w:t>
+      </w:r>
+      <w:r>
+        <w:rPr>
+          <w:rFonts w:ascii="Calibri" w:hAnsi="Calibri" w:cs="Calibri"/>
+        </w:rPr>
+        <w:t>driven recommendations/insights into training. Whilst this scope helped provide a strong foundation for the future of this webapp, several key requirements were tweaked and refined, to ensure that the development of the webapp was technically feasible and aligned with project constraints.</w:t>
+      </w:r>
+    </w:p>
+    <w:p>
+      <w:pPr>
+        <w:spacing w:line="360" w:lineRule="auto"/>
+        <w:rPr>
+          <w:rFonts w:ascii="Calibri" w:hAnsi="Calibri" w:cs="Calibri"/>
+        </w:rPr>
+      </w:pPr>
+      <w:r>
+        <w:rPr>
+          <w:rFonts w:ascii="Calibri" w:hAnsi="Calibri" w:cs="Calibri"/>
+        </w:rPr>
+        <w:t>One key functional requirement change was the overall scope of performance tracking metrics. The original</w:t>
+      </w:r>
+      <w:r>
+        <w:rPr>
+          <w:rFonts w:ascii="Calibri" w:hAnsi="Calibri" w:cs="Calibri"/>
+        </w:rPr>
+        <w:t xml:space="preserve"> specification</w:t>
+      </w:r>
+      <w:r>
+        <w:rPr>
+          <w:rFonts w:ascii="Calibri" w:hAnsi="Calibri" w:cs="Calibri"/>
+        </w:rPr>
+        <w:t xml:space="preserve"> proposed </w:t>
+      </w:r>
+      <w:r>
+        <w:rPr>
+          <w:rFonts w:ascii="Calibri" w:hAnsi="Calibri" w:cs="Calibri"/>
+        </w:rPr>
+        <w:t xml:space="preserve">the use of specialised </w:t>
+      </w:r>
+      <w:r>
+        <w:rPr>
+          <w:rFonts w:ascii="Calibri" w:hAnsi="Calibri" w:cs="Calibri"/>
+        </w:rPr>
+        <w:t xml:space="preserve">metrics such as finger strength; however, this was removed due to the difficulty in quantifying such data reliably without sensors or hardware. Instead, the system </w:t>
+      </w:r>
+      <w:r>
+        <w:rPr>
+          <w:rFonts w:ascii="Calibri" w:hAnsi="Calibri" w:cs="Calibri"/>
+        </w:rPr>
+        <w:t>re</w:t>
+      </w:r>
+      <w:r>
+        <w:rPr>
+          <w:rFonts w:ascii="Calibri" w:hAnsi="Calibri" w:cs="Calibri"/>
+        </w:rPr>
+        <w:t xml:space="preserve">focused more on equally important metrics, that could much </w:t>
+      </w:r>
+      <w:r>
+        <w:rPr>
+          <w:rFonts w:ascii="Calibri" w:hAnsi="Calibri" w:cs="Calibri"/>
+        </w:rPr>
+        <w:t>more accurately</w:t>
+      </w:r>
+      <w:r>
+        <w:rPr>
+          <w:rFonts w:ascii="Calibri" w:hAnsi="Calibri" w:cs="Calibri"/>
+        </w:rPr>
+        <w:t xml:space="preserve"> be quantified </w:t>
+      </w:r>
+      <w:r>
+        <w:rPr>
+          <w:rFonts w:ascii="Calibri" w:hAnsi="Calibri" w:cs="Calibri"/>
+        </w:rPr>
+        <w:t>within</w:t>
+      </w:r>
+      <w:r>
+        <w:rPr>
+          <w:rFonts w:ascii="Calibri" w:hAnsi="Calibri" w:cs="Calibri"/>
+        </w:rPr>
+        <w:t xml:space="preserve"> the webapp</w:t>
+      </w:r>
+      <w:r>
+        <w:rPr>
+          <w:rFonts w:ascii="Calibri" w:hAnsi="Calibri" w:cs="Calibri"/>
+        </w:rPr>
+        <w:t>. This included</w:t>
+      </w:r>
+      <w:r>
+        <w:rPr>
+          <w:rFonts w:ascii="Calibri" w:hAnsi="Calibri" w:cs="Calibri"/>
+        </w:rPr>
+        <w:t xml:space="preserve"> </w:t>
+      </w:r>
+      <w:r>
+        <w:rPr>
+          <w:rFonts w:ascii="Calibri" w:hAnsi="Calibri" w:cs="Calibri"/>
+        </w:rPr>
+        <w:t xml:space="preserve">session-based indicators such as </w:t>
+      </w:r>
+      <w:r>
+        <w:rPr>
+          <w:rFonts w:ascii="Calibri" w:hAnsi="Calibri" w:cs="Calibri"/>
+        </w:rPr>
+        <w:t xml:space="preserve">duration, attempts, </w:t>
       </w:r>
       <w:r>
         <w:rPr>
           <w:rFonts w:ascii="Calibri" w:hAnsi="Calibri" w:cs="Calibri"/>
         </w:rPr>
         <w:lastRenderedPageBreak/>
-        <w:t>future of this webapp, several key requirements were tweaked and refined, to ensure that the development of the webapp was technically feasible and aligned with project constraints.</w:t>
-      </w:r>
-    </w:p>
-    <w:p>
-      <w:pPr>
-        <w:spacing w:line="360" w:lineRule="auto"/>
-        <w:rPr>
-          <w:rFonts w:ascii="Calibri" w:hAnsi="Calibri" w:cs="Calibri"/>
-        </w:rPr>
-      </w:pPr>
-      <w:r>
-        <w:rPr>
-          <w:rFonts w:ascii="Calibri" w:hAnsi="Calibri" w:cs="Calibri"/>
-        </w:rPr>
-        <w:t>One key functional requirement change was the overall scope of performance tracking metrics. The original</w:t>
-      </w:r>
-      <w:r>
-        <w:rPr>
-          <w:rFonts w:ascii="Calibri" w:hAnsi="Calibri" w:cs="Calibri"/>
-        </w:rPr>
-        <w:t xml:space="preserve"> specification</w:t>
-      </w:r>
-      <w:r>
-        <w:rPr>
-          <w:rFonts w:ascii="Calibri" w:hAnsi="Calibri" w:cs="Calibri"/>
-        </w:rPr>
-        <w:t xml:space="preserve"> proposed </w:t>
-      </w:r>
-      <w:r>
-        <w:rPr>
-          <w:rFonts w:ascii="Calibri" w:hAnsi="Calibri" w:cs="Calibri"/>
-        </w:rPr>
-        <w:t xml:space="preserve">the use of specialised </w:t>
-      </w:r>
-      <w:r>
-        <w:rPr>
-          <w:rFonts w:ascii="Calibri" w:hAnsi="Calibri" w:cs="Calibri"/>
-        </w:rPr>
-        <w:t xml:space="preserve">metrics such as finger strength; however, this was removed due to the difficulty in quantifying such data reliably without sensors or hardware. Instead, the system </w:t>
-      </w:r>
-      <w:r>
-        <w:rPr>
-          <w:rFonts w:ascii="Calibri" w:hAnsi="Calibri" w:cs="Calibri"/>
-        </w:rPr>
-        <w:t>re</w:t>
-      </w:r>
-      <w:r>
-        <w:rPr>
-          <w:rFonts w:ascii="Calibri" w:hAnsi="Calibri" w:cs="Calibri"/>
-        </w:rPr>
-        <w:t xml:space="preserve">focused more on equally important metrics, that could much </w:t>
-      </w:r>
-      <w:r>
-        <w:rPr>
-          <w:rFonts w:ascii="Calibri" w:hAnsi="Calibri" w:cs="Calibri"/>
-        </w:rPr>
-        <w:t>more accurately</w:t>
-      </w:r>
-      <w:r>
-        <w:rPr>
-          <w:rFonts w:ascii="Calibri" w:hAnsi="Calibri" w:cs="Calibri"/>
-        </w:rPr>
-        <w:t xml:space="preserve"> be quantified </w:t>
-      </w:r>
-      <w:r>
-        <w:rPr>
-          <w:rFonts w:ascii="Calibri" w:hAnsi="Calibri" w:cs="Calibri"/>
-        </w:rPr>
-        <w:t>within</w:t>
-      </w:r>
-      <w:r>
-        <w:rPr>
-          <w:rFonts w:ascii="Calibri" w:hAnsi="Calibri" w:cs="Calibri"/>
-        </w:rPr>
-        <w:t xml:space="preserve"> the webapp</w:t>
-      </w:r>
-      <w:r>
-        <w:rPr>
-          <w:rFonts w:ascii="Calibri" w:hAnsi="Calibri" w:cs="Calibri"/>
-        </w:rPr>
-        <w:t>. This included</w:t>
-      </w:r>
-      <w:r>
-        <w:rPr>
-          <w:rFonts w:ascii="Calibri" w:hAnsi="Calibri" w:cs="Calibri"/>
-        </w:rPr>
-        <w:t xml:space="preserve"> </w:t>
-      </w:r>
-      <w:r>
-        <w:rPr>
-          <w:rFonts w:ascii="Calibri" w:hAnsi="Calibri" w:cs="Calibri"/>
-        </w:rPr>
-        <w:t xml:space="preserve">session-based indicators such as </w:t>
-      </w:r>
-      <w:r>
-        <w:rPr>
-          <w:rFonts w:ascii="Calibri" w:hAnsi="Calibri" w:cs="Calibri"/>
-        </w:rPr>
-        <w:t>duration, attempts, tops, flashes,</w:t>
+        <w:t>tops, flashes,</w:t>
       </w:r>
       <w:r>
         <w:rPr>
@@ -6194,20 +6332,26 @@
         <w:rPr>
           <w:rFonts w:ascii="Calibri" w:hAnsi="Calibri" w:cs="Calibri"/>
         </w:rPr>
+        <w:t>Finally, the account management requirement significantly evolved beyond its original proposition. Whilst the intimal specification focused on user profile creation, with basic goal setting, the final system further expanded this functionality into a central component for the application. Users are now able to define their own personal attributes, such as height, weight, activity levels and goal types (cutting. Maintain bulking etc). These attributes are then used to automatically generate nutritional targets using Mi</w:t>
+      </w:r>
+      <w:r>
+        <w:rPr>
+          <w:rFonts w:ascii="Calibri" w:hAnsi="Calibri" w:cs="Calibri"/>
+        </w:rPr>
+        <w:t>ffli</w:t>
+      </w:r>
+      <w:r>
+        <w:rPr>
+          <w:rFonts w:ascii="Calibri" w:hAnsi="Calibri" w:cs="Calibri"/>
+        </w:rPr>
+        <w:t xml:space="preserve">n-St Jeor Equation for resting metabolic rates. In addition, there is a manual override option to manually change your recommended daily calories and macronutrients, </w:t>
+      </w:r>
+      <w:r>
+        <w:rPr>
+          <w:rFonts w:ascii="Calibri" w:hAnsi="Calibri" w:cs="Calibri"/>
+        </w:rPr>
         <w:lastRenderedPageBreak/>
-        <w:t>Finally, the account management requirement significantly evolved beyond its original proposition. Whilst the intimal specification focused on user profile creation, with basic goal setting, the final system further expanded this functionality into a central component for the application. Users are now able to define their own personal attributes, such as height, weight, activity levels and goal types (cutting. Maintain bulking etc). These attributes are then used to automatically generate nutritional targets using Mi</w:t>
-      </w:r>
-      <w:r>
-        <w:rPr>
-          <w:rFonts w:ascii="Calibri" w:hAnsi="Calibri" w:cs="Calibri"/>
-        </w:rPr>
-        <w:t>ffli</w:t>
-      </w:r>
-      <w:r>
-        <w:rPr>
-          <w:rFonts w:ascii="Calibri" w:hAnsi="Calibri" w:cs="Calibri"/>
-        </w:rPr>
-        <w:t>n-St Jeor Equation for resting metabolic rates. In addition, there is a manual override option to manually change your recommended daily calories and macronutrients, allowing users to customise their targets to their individual preferences. The account system also incorporates privacy controls and social features, allowing users to hide certain sections of their profile including their whole profile entirely, allowing users to send friend requests and add friends to their account allowing users to control their level of interaction with the community. This evolution overall focuses on making the system more user-driven and ensures the account directly influences the analytical outputs and social functionality.</w:t>
+        <w:t>allowing users to customise their targets to their individual preferences. The account system also incorporates privacy controls and social features, allowing users to hide certain sections of their profile including their whole profile entirely, allowing users to send friend requests and add friends to their account allowing users to control their level of interaction with the community. This evolution overall focuses on making the system more user-driven and ensures the account directly influences the analytical outputs and social functionality.</w:t>
       </w:r>
     </w:p>
     <w:p>
@@ -6764,7 +6908,6 @@
                 <w:sz w:val="22"/>
                 <w:szCs w:val="22"/>
               </w:rPr>
-              <w:lastRenderedPageBreak/>
               <w:t>FR4</w:t>
             </w:r>
           </w:p>
@@ -6975,6 +7118,7 @@
                 <w:sz w:val="22"/>
                 <w:szCs w:val="22"/>
               </w:rPr>
+              <w:lastRenderedPageBreak/>
               <w:t>FR6</w:t>
             </w:r>
           </w:p>
@@ -7749,7 +7893,6 @@
         <w:rPr>
           <w:rFonts w:ascii="Calibri" w:hAnsi="Calibri" w:cs="Calibri"/>
         </w:rPr>
-        <w:lastRenderedPageBreak/>
         <w:t>This reflects the final system functionality and demonstrates how the initial high-level requirements were aligned with the implemented solution.</w:t>
       </w:r>
     </w:p>
@@ -7785,7 +7928,14 @@
         <w:rPr>
           <w:rFonts w:ascii="Calibri" w:hAnsi="Calibri" w:cs="Calibri"/>
         </w:rPr>
-        <w:t>The functional specifications define the behaviour of the systems core features using use case analysis. This section focusses on the principal user system interactions in the application. These use cases have been selected because they most accurately represent the most significant workflows withing the final system. Each use case includes key components such as the primary actor, trigger, main success scenario, alternative flows and any postconditions.</w:t>
+        <w:t xml:space="preserve">The functional specifications define the behaviour of the systems core features using use case analysis. This section focusses on the principal user system interactions in the application. These use cases have been selected because they most accurately represent the most significant workflows </w:t>
+      </w:r>
+      <w:r>
+        <w:rPr>
+          <w:rFonts w:ascii="Calibri" w:hAnsi="Calibri" w:cs="Calibri"/>
+        </w:rPr>
+        <w:lastRenderedPageBreak/>
+        <w:t>withing the final system. Each use case includes key components such as the primary actor, trigger, main success scenario, alternative flows and any postconditions.</w:t>
       </w:r>
     </w:p>
     <w:p>
@@ -8165,7 +8315,6 @@
         <w:rPr>
           <w:rFonts w:ascii="Calibri" w:hAnsi="Calibri" w:cs="Calibri"/>
         </w:rPr>
-        <w:lastRenderedPageBreak/>
         <w:t>If the required fields are missing, intensity, date, session type and duration, then the system will redisplay the form and prompt the user to correct the missing values.</w:t>
       </w:r>
     </w:p>
@@ -8222,6 +8371,7 @@
           <w:b/>
           <w:bCs/>
         </w:rPr>
+        <w:lastRenderedPageBreak/>
         <w:t>Postconditions:</w:t>
       </w:r>
     </w:p>
@@ -8627,7 +8777,6 @@
         <w:rPr>
           <w:rFonts w:ascii="Calibri" w:hAnsi="Calibri" w:cs="Calibri"/>
         </w:rPr>
-        <w:lastRenderedPageBreak/>
         <w:t>If the required fields are</w:t>
       </w:r>
       <w:r>
@@ -8696,6 +8845,7 @@
         <w:rPr>
           <w:rFonts w:ascii="Calibri" w:hAnsi="Calibri" w:cs="Calibri"/>
         </w:rPr>
+        <w:lastRenderedPageBreak/>
         <w:t xml:space="preserve">A valid </w:t>
       </w:r>
       <w:r>
@@ -8855,7 +9005,21 @@
         <w:rPr>
           <w:rFonts w:ascii="Calibri" w:hAnsi="Calibri" w:cs="Calibri"/>
         </w:rPr>
-        <w:t>All user passwords should be securely stored using industry standard-standard algorithms such as BCrypt.</w:t>
+        <w:t xml:space="preserve">All user passwords should be securely stored using industry standard-standard algorithms such as </w:t>
+      </w:r>
+      <w:proofErr w:type="spellStart"/>
+      <w:r>
+        <w:rPr>
+          <w:rFonts w:ascii="Calibri" w:hAnsi="Calibri" w:cs="Calibri"/>
+        </w:rPr>
+        <w:t>BCrypt</w:t>
+      </w:r>
+      <w:proofErr w:type="spellEnd"/>
+      <w:r>
+        <w:rPr>
+          <w:rFonts w:ascii="Calibri" w:hAnsi="Calibri" w:cs="Calibri"/>
+        </w:rPr>
+        <w:t>.</w:t>
       </w:r>
     </w:p>
     <w:p>
@@ -9044,7 +9208,21 @@
         <w:rPr>
           <w:rFonts w:ascii="Calibri" w:hAnsi="Calibri" w:cs="Calibri"/>
         </w:rPr>
-        <w:t>Database queries should be optimised to mnimise data retrieval.</w:t>
+        <w:t xml:space="preserve">Database queries should be optimised to </w:t>
+      </w:r>
+      <w:proofErr w:type="spellStart"/>
+      <w:r>
+        <w:rPr>
+          <w:rFonts w:ascii="Calibri" w:hAnsi="Calibri" w:cs="Calibri"/>
+        </w:rPr>
+        <w:t>mnimise</w:t>
+      </w:r>
+      <w:proofErr w:type="spellEnd"/>
+      <w:r>
+        <w:rPr>
+          <w:rFonts w:ascii="Calibri" w:hAnsi="Calibri" w:cs="Calibri"/>
+        </w:rPr>
+        <w:t xml:space="preserve"> data retrieval.</w:t>
       </w:r>
     </w:p>
     <w:p>
@@ -9062,7 +9240,6 @@
           <w:b/>
           <w:bCs/>
         </w:rPr>
-        <w:lastRenderedPageBreak/>
         <w:t>Reliability and Availability:</w:t>
       </w:r>
     </w:p>
@@ -9082,7 +9259,21 @@
         <w:rPr>
           <w:rFonts w:ascii="Calibri" w:hAnsi="Calibri" w:cs="Calibri"/>
         </w:rPr>
-        <w:t>The system should bea available at least 95% of the time.</w:t>
+        <w:t xml:space="preserve">The system should </w:t>
+      </w:r>
+      <w:proofErr w:type="spellStart"/>
+      <w:r>
+        <w:rPr>
+          <w:rFonts w:ascii="Calibri" w:hAnsi="Calibri" w:cs="Calibri"/>
+        </w:rPr>
+        <w:t>bea</w:t>
+      </w:r>
+      <w:proofErr w:type="spellEnd"/>
+      <w:r>
+        <w:rPr>
+          <w:rFonts w:ascii="Calibri" w:hAnsi="Calibri" w:cs="Calibri"/>
+        </w:rPr>
+        <w:t xml:space="preserve"> available at least 95% of the time.</w:t>
       </w:r>
     </w:p>
     <w:p>
@@ -9158,6 +9349,7 @@
         <w:rPr>
           <w:rFonts w:ascii="Calibri" w:hAnsi="Calibri" w:cs="Calibri"/>
         </w:rPr>
+        <w:lastRenderedPageBreak/>
         <w:t xml:space="preserve">Forms should prevent submission of </w:t>
       </w:r>
       <w:r>
@@ -9320,7 +9512,21 @@
         <w:rPr>
           <w:rFonts w:ascii="Calibri" w:hAnsi="Calibri" w:cs="Calibri"/>
         </w:rPr>
-        <w:t>The application should follow structured architecture such as using Controllers, Models, dto’s, services Repositories etc.</w:t>
+        <w:t xml:space="preserve">The application should follow structured architecture such as using Controllers, Models, </w:t>
+      </w:r>
+      <w:proofErr w:type="spellStart"/>
+      <w:r>
+        <w:rPr>
+          <w:rFonts w:ascii="Calibri" w:hAnsi="Calibri" w:cs="Calibri"/>
+        </w:rPr>
+        <w:t>dto’s</w:t>
+      </w:r>
+      <w:proofErr w:type="spellEnd"/>
+      <w:r>
+        <w:rPr>
+          <w:rFonts w:ascii="Calibri" w:hAnsi="Calibri" w:cs="Calibri"/>
+        </w:rPr>
+        <w:t>, services Repositories etc.</w:t>
       </w:r>
     </w:p>
     <w:p>
@@ -9467,63 +9673,63 @@
         <w:rPr>
           <w:rFonts w:ascii="Calibri" w:hAnsi="Calibri" w:cs="Calibri"/>
         </w:rPr>
+        <w:t>• System Architecture: Provide a high-level overview of the system's structure. You should describe</w:t>
+      </w:r>
+    </w:p>
+    <w:p>
+      <w:pPr>
+        <w:spacing w:line="360" w:lineRule="auto"/>
+        <w:rPr>
+          <w:rFonts w:ascii="Calibri" w:hAnsi="Calibri" w:cs="Calibri"/>
+        </w:rPr>
+      </w:pPr>
+      <w:r>
+        <w:rPr>
+          <w:rFonts w:ascii="Calibri" w:hAnsi="Calibri" w:cs="Calibri"/>
+        </w:rPr>
+        <w:t>the systems architecture (e.g., are identifiable architectural patterns involved such as MVC,</w:t>
+      </w:r>
+    </w:p>
+    <w:p>
+      <w:pPr>
+        <w:spacing w:line="360" w:lineRule="auto"/>
+        <w:rPr>
+          <w:rFonts w:ascii="Calibri" w:hAnsi="Calibri" w:cs="Calibri"/>
+        </w:rPr>
+      </w:pPr>
+      <w:r>
+        <w:rPr>
+          <w:rFonts w:ascii="Calibri" w:hAnsi="Calibri" w:cs="Calibri"/>
+        </w:rPr>
+        <w:t>Microservices, Three-Tier, Client-Server). Provide a diagram showing the interaction between the</w:t>
+      </w:r>
+    </w:p>
+    <w:p>
+      <w:pPr>
+        <w:spacing w:line="360" w:lineRule="auto"/>
+        <w:rPr>
+          <w:rFonts w:ascii="Calibri" w:hAnsi="Calibri" w:cs="Calibri"/>
+        </w:rPr>
+      </w:pPr>
+      <w:r>
+        <w:rPr>
+          <w:rFonts w:ascii="Calibri" w:hAnsi="Calibri" w:cs="Calibri"/>
+        </w:rPr>
+        <w:t>major components (e.g. Frontend, Backend, Database, and any external APIs).</w:t>
+      </w:r>
+    </w:p>
+    <w:p>
+      <w:pPr>
+        <w:spacing w:line="360" w:lineRule="auto"/>
+        <w:rPr>
+          <w:rFonts w:ascii="Calibri" w:hAnsi="Calibri" w:cs="Calibri"/>
+        </w:rPr>
+      </w:pPr>
+      <w:r>
+        <w:rPr>
+          <w:rFonts w:ascii="Calibri" w:hAnsi="Calibri" w:cs="Calibri"/>
+        </w:rPr>
         <w:lastRenderedPageBreak/>
-        <w:t>• System Architecture: Provide a high-level overview of the system's structure. You should describe</w:t>
-      </w:r>
-    </w:p>
-    <w:p>
-      <w:pPr>
-        <w:spacing w:line="360" w:lineRule="auto"/>
-        <w:rPr>
-          <w:rFonts w:ascii="Calibri" w:hAnsi="Calibri" w:cs="Calibri"/>
-        </w:rPr>
-      </w:pPr>
-      <w:r>
-        <w:rPr>
-          <w:rFonts w:ascii="Calibri" w:hAnsi="Calibri" w:cs="Calibri"/>
-        </w:rPr>
-        <w:t>the systems architecture (e.g., are identifiable architectural patterns involved such as MVC,</w:t>
-      </w:r>
-    </w:p>
-    <w:p>
-      <w:pPr>
-        <w:spacing w:line="360" w:lineRule="auto"/>
-        <w:rPr>
-          <w:rFonts w:ascii="Calibri" w:hAnsi="Calibri" w:cs="Calibri"/>
-        </w:rPr>
-      </w:pPr>
-      <w:r>
-        <w:rPr>
-          <w:rFonts w:ascii="Calibri" w:hAnsi="Calibri" w:cs="Calibri"/>
-        </w:rPr>
-        <w:t>Microservices, Three-Tier, Client-Server). Provide a diagram showing the interaction between the</w:t>
-      </w:r>
-    </w:p>
-    <w:p>
-      <w:pPr>
-        <w:spacing w:line="360" w:lineRule="auto"/>
-        <w:rPr>
-          <w:rFonts w:ascii="Calibri" w:hAnsi="Calibri" w:cs="Calibri"/>
-        </w:rPr>
-      </w:pPr>
-      <w:r>
-        <w:rPr>
-          <w:rFonts w:ascii="Calibri" w:hAnsi="Calibri" w:cs="Calibri"/>
-        </w:rPr>
-        <w:t>major components (e.g. Frontend, Backend, Database, and any external APIs).</w:t>
-      </w:r>
-    </w:p>
-    <w:p>
-      <w:pPr>
-        <w:spacing w:line="360" w:lineRule="auto"/>
-        <w:rPr>
-          <w:rFonts w:ascii="Calibri" w:hAnsi="Calibri" w:cs="Calibri"/>
-        </w:rPr>
-      </w:pPr>
-      <w:r>
-        <w:rPr>
-          <w:rFonts w:ascii="Calibri" w:hAnsi="Calibri" w:cs="Calibri"/>
-        </w:rPr>
         <w:t>• Database Design: If your system manages data, provide a formal Entity Relationship Diagram (ERD)</w:t>
       </w:r>
     </w:p>
@@ -13894,7 +14100,7 @@
         </w:rPr>
         <w:lastRenderedPageBreak/>
         <w:drawing>
-          <wp:inline distT="0" distB="0" distL="0" distR="0" wp14:anchorId="42BA402F" wp14:editId="0B1959F0">
+          <wp:inline distT="0" distB="0" distL="0" distR="0" wp14:anchorId="42BA402F" wp14:editId="4B9157CA">
             <wp:extent cx="5731510" cy="1630018"/>
             <wp:effectExtent l="0" t="0" r="2540" b="8890"/>
             <wp:docPr id="895670306" name="Picture 1" descr="A graph with blue and gray bars&#10;&#10;AI-generated content may be incorrect."/>
@@ -17039,7 +17245,21 @@
         <w:rPr>
           <w:rFonts w:ascii="Calibri" w:hAnsi="Calibri" w:cs="Calibri"/>
         </w:rPr>
-        <w:t>The system retrives the user’s existing profile information, attributes and current settings</w:t>
+        <w:t xml:space="preserve">The system </w:t>
+      </w:r>
+      <w:proofErr w:type="spellStart"/>
+      <w:r>
+        <w:rPr>
+          <w:rFonts w:ascii="Calibri" w:hAnsi="Calibri" w:cs="Calibri"/>
+        </w:rPr>
+        <w:t>retrives</w:t>
+      </w:r>
+      <w:proofErr w:type="spellEnd"/>
+      <w:r>
+        <w:rPr>
+          <w:rFonts w:ascii="Calibri" w:hAnsi="Calibri" w:cs="Calibri"/>
+        </w:rPr>
+        <w:t xml:space="preserve"> the user’s existing profile information, attributes and current settings</w:t>
       </w:r>
     </w:p>
     <w:p>
@@ -17172,7 +17392,21 @@
         <w:rPr>
           <w:rFonts w:ascii="Calibri" w:hAnsi="Calibri" w:cs="Calibri"/>
         </w:rPr>
-        <w:t>The updated account setting sare saved and applied.</w:t>
+        <w:t xml:space="preserve">The updated account setting </w:t>
+      </w:r>
+      <w:proofErr w:type="spellStart"/>
+      <w:r>
+        <w:rPr>
+          <w:rFonts w:ascii="Calibri" w:hAnsi="Calibri" w:cs="Calibri"/>
+        </w:rPr>
+        <w:t>sare</w:t>
+      </w:r>
+      <w:proofErr w:type="spellEnd"/>
+      <w:r>
+        <w:rPr>
+          <w:rFonts w:ascii="Calibri" w:hAnsi="Calibri" w:cs="Calibri"/>
+        </w:rPr>
+        <w:t xml:space="preserve"> saved and applied.</w:t>
       </w:r>
     </w:p>
     <w:p>
@@ -17496,7 +17730,21 @@
         <w:rPr>
           <w:rFonts w:ascii="Calibri" w:hAnsi="Calibri" w:cs="Calibri"/>
         </w:rPr>
-        <w:t>The user selects a metric to rank by, avg intensity, session duration, highest grade and number of sessions.</w:t>
+        <w:t xml:space="preserve">The user selects a metric to rank by, </w:t>
+      </w:r>
+      <w:proofErr w:type="spellStart"/>
+      <w:r>
+        <w:rPr>
+          <w:rFonts w:ascii="Calibri" w:hAnsi="Calibri" w:cs="Calibri"/>
+        </w:rPr>
+        <w:t>avg</w:t>
+      </w:r>
+      <w:proofErr w:type="spellEnd"/>
+      <w:r>
+        <w:rPr>
+          <w:rFonts w:ascii="Calibri" w:hAnsi="Calibri" w:cs="Calibri"/>
+        </w:rPr>
+        <w:t xml:space="preserve"> intensity, session duration, highest grade and number of sessions.</w:t>
       </w:r>
     </w:p>
     <w:p>

</xml_diff>

<commit_message>
saving again to repo
</commit_message>
<xml_diff>
--- a/Documents/Final Dissertation Doc.docx
+++ b/Documents/Final Dissertation Doc.docx
@@ -5054,7 +5054,21 @@
         <w:rPr>
           <w:rFonts w:ascii="Calibri" w:hAnsi="Calibri" w:cs="Calibri"/>
         </w:rPr>
-        <w:t>Additionally, many existing platforms provide very limited support for user engagement. The overall absence of social and community features in a lot fo climbing apps, reduces the motivation for users to continue to use the application long-term and the lack of competitive elements reduces the incentive to improve.</w:t>
+        <w:t xml:space="preserve">Additionally, many existing platforms provide very limited support for user engagement. The overall absence of social and community features in a lot </w:t>
+      </w:r>
+      <w:proofErr w:type="spellStart"/>
+      <w:r>
+        <w:rPr>
+          <w:rFonts w:ascii="Calibri" w:hAnsi="Calibri" w:cs="Calibri"/>
+        </w:rPr>
+        <w:t>fo</w:t>
+      </w:r>
+      <w:proofErr w:type="spellEnd"/>
+      <w:r>
+        <w:rPr>
+          <w:rFonts w:ascii="Calibri" w:hAnsi="Calibri" w:cs="Calibri"/>
+        </w:rPr>
+        <w:t xml:space="preserve"> climbing apps, reduces the motivation for users to continue to use the application long-term and the lack of competitive elements reduces the incentive to improve.</w:t>
       </w:r>
     </w:p>
     <w:p>
@@ -5180,7 +5194,21 @@
         <w:rPr>
           <w:rFonts w:ascii="Calibri" w:hAnsi="Calibri" w:cs="Calibri"/>
         </w:rPr>
-        <w:t>Finally, some users engage with the system systematically, combining training, nutrition, and social features. For users like this, the value of the system lies in the ability to have a fully integrated web-app that allows them to engage with all of these systems in a single platform instead of managing multiple different web-apps or applications.</w:t>
+        <w:t xml:space="preserve">Finally, some users engage with the system systematically, combining training, nutrition, and social features. For users like this, the value of the system lies in the ability to have a fully integrated web-app that allows them to engage with </w:t>
+      </w:r>
+      <w:proofErr w:type="gramStart"/>
+      <w:r>
+        <w:rPr>
+          <w:rFonts w:ascii="Calibri" w:hAnsi="Calibri" w:cs="Calibri"/>
+        </w:rPr>
+        <w:t>all of</w:t>
+      </w:r>
+      <w:proofErr w:type="gramEnd"/>
+      <w:r>
+        <w:rPr>
+          <w:rFonts w:ascii="Calibri" w:hAnsi="Calibri" w:cs="Calibri"/>
+        </w:rPr>
+        <w:t xml:space="preserve"> these systems in a single platform instead of managing multiple different web-apps or applications.</w:t>
       </w:r>
     </w:p>
     <w:p>
@@ -5347,7 +5375,21 @@
         <w:rPr>
           <w:rFonts w:ascii="Calibri" w:hAnsi="Calibri" w:cs="Calibri"/>
         </w:rPr>
-        <w:t xml:space="preserve"> advanced performance, nutritional tracking, AI-driven recommendations, and community interaction all under a single plateform. Whilst this initial plan founded a strong foundation, further development required additional refinement to ensure technical feasibility and to ensure it aligned with project constraints.</w:t>
+        <w:t xml:space="preserve"> advanced performance, nutritional tracking, AI-driven recommendations, and community interaction all under a single </w:t>
+      </w:r>
+      <w:proofErr w:type="spellStart"/>
+      <w:r>
+        <w:rPr>
+          <w:rFonts w:ascii="Calibri" w:hAnsi="Calibri" w:cs="Calibri"/>
+        </w:rPr>
+        <w:t>plateform</w:t>
+      </w:r>
+      <w:proofErr w:type="spellEnd"/>
+      <w:r>
+        <w:rPr>
+          <w:rFonts w:ascii="Calibri" w:hAnsi="Calibri" w:cs="Calibri"/>
+        </w:rPr>
+        <w:t>. Whilst this initial plan founded a strong foundation, further development required additional refinement to ensure technical feasibility and to ensure it aligned with project constraints.</w:t>
       </w:r>
     </w:p>
     <w:p>
@@ -5415,7 +5457,21 @@
         <w:rPr>
           <w:rFonts w:ascii="Calibri" w:hAnsi="Calibri" w:cs="Calibri"/>
         </w:rPr>
-        <w:t xml:space="preserve">In addition to functional changes, the technical approach to database interaction was also evolved during the development. Whilst the initial plan was to use direct SQL queries, the final implementation focused on utilising Object-Relational Mapping (ORM) approach through entity models and repository abstraction from withing the Spring Boot framework. This approach allowed </w:t>
+        <w:t xml:space="preserve">In addition to functional changes, the technical approach to database interaction </w:t>
+      </w:r>
+      <w:proofErr w:type="gramStart"/>
+      <w:r>
+        <w:rPr>
+          <w:rFonts w:ascii="Calibri" w:hAnsi="Calibri" w:cs="Calibri"/>
+        </w:rPr>
+        <w:t>was also evolved</w:t>
+      </w:r>
+      <w:proofErr w:type="gramEnd"/>
+      <w:r>
+        <w:rPr>
+          <w:rFonts w:ascii="Calibri" w:hAnsi="Calibri" w:cs="Calibri"/>
+        </w:rPr>
+        <w:t xml:space="preserve"> during the development. Whilst the initial plan was to use direct SQL queries, the final implementation focused on utilising Object-Relational Mapping (ORM) approach through entity models and repository abstraction from withing the Spring Boot framework. This approach allowed </w:t>
       </w:r>
       <w:r>
         <w:rPr>
@@ -5642,7 +5698,21 @@
         <w:rPr>
           <w:rFonts w:ascii="Calibri" w:hAnsi="Calibri" w:cs="Calibri"/>
         </w:rPr>
-        <w:t xml:space="preserve">Issue tracking was carried out during the early stages of development in order to organise the core features and establish an initial structure for project backlog. </w:t>
+        <w:t xml:space="preserve">Issue tracking was carried out during the early stages of development </w:t>
+      </w:r>
+      <w:proofErr w:type="gramStart"/>
+      <w:r>
+        <w:rPr>
+          <w:rFonts w:ascii="Calibri" w:hAnsi="Calibri" w:cs="Calibri"/>
+        </w:rPr>
+        <w:t>in order to</w:t>
+      </w:r>
+      <w:proofErr w:type="gramEnd"/>
+      <w:r>
+        <w:rPr>
+          <w:rFonts w:ascii="Calibri" w:hAnsi="Calibri" w:cs="Calibri"/>
+        </w:rPr>
+        <w:t xml:space="preserve"> organise the core features and establish an initial structure for project backlog. </w:t>
       </w:r>
       <w:r>
         <w:rPr>
@@ -5738,7 +5808,21 @@
         <w:rPr>
           <w:rFonts w:ascii="Calibri" w:hAnsi="Calibri" w:cs="Calibri"/>
         </w:rPr>
-        <w:t xml:space="preserve">Another significant risk identified involved the reliability of performance metrics. Early development plans involved using key climbing kpi’s such finger strength, which could not be accurately assessed without some type of external sensor </w:t>
+        <w:t xml:space="preserve">Another significant risk identified involved the reliability of performance metrics. Early development plans involved using key climbing </w:t>
+      </w:r>
+      <w:proofErr w:type="spellStart"/>
+      <w:r>
+        <w:rPr>
+          <w:rFonts w:ascii="Calibri" w:hAnsi="Calibri" w:cs="Calibri"/>
+        </w:rPr>
+        <w:t>kpi’s</w:t>
+      </w:r>
+      <w:proofErr w:type="spellEnd"/>
+      <w:r>
+        <w:rPr>
+          <w:rFonts w:ascii="Calibri" w:hAnsi="Calibri" w:cs="Calibri"/>
+        </w:rPr>
+        <w:t xml:space="preserve"> such finger strength, which could not be accurately assessed without some type of external sensor </w:t>
       </w:r>
       <w:r>
         <w:rPr>
@@ -5770,7 +5854,21 @@
         <w:rPr>
           <w:rFonts w:ascii="Calibri" w:hAnsi="Calibri" w:cs="Calibri"/>
         </w:rPr>
-        <w:t>A further risk was the Integrity of data inputted from users. Since the system relies on manually inputted user data there was the potential for users to purposefully enter in large amounts of incorrect data into the system on purpose with the intent affecting the reliability of leaderboard rankings and community content. This risk was mitigated by implementing input validation where appropriate and designing the system to present aggregated training trends rather than relying on only single data points. As a result, the impact of individual inaccurate entries is reduced, and users are encouraged to interpret their data over a period of time rather than through individual values.</w:t>
+        <w:t xml:space="preserve">A further risk was the Integrity of data inputted from users. Since the system relies on manually inputted user data there was the potential for users to purposefully enter in large amounts of incorrect data into the system on purpose with the intent affecting the reliability of leaderboard rankings and community content. This risk was mitigated by implementing input validation where appropriate and designing the system to present aggregated training trends rather than relying on only single data points. As a result, the impact of individual inaccurate entries is reduced, and users are encouraged to interpret their data over </w:t>
+      </w:r>
+      <w:proofErr w:type="gramStart"/>
+      <w:r>
+        <w:rPr>
+          <w:rFonts w:ascii="Calibri" w:hAnsi="Calibri" w:cs="Calibri"/>
+        </w:rPr>
+        <w:t>a period of time</w:t>
+      </w:r>
+      <w:proofErr w:type="gramEnd"/>
+      <w:r>
+        <w:rPr>
+          <w:rFonts w:ascii="Calibri" w:hAnsi="Calibri" w:cs="Calibri"/>
+        </w:rPr>
+        <w:t xml:space="preserve"> rather than through individual values.</w:t>
       </w:r>
     </w:p>
     <w:p>
@@ -6243,7 +6341,21 @@
         <w:rPr>
           <w:rFonts w:ascii="Calibri" w:hAnsi="Calibri" w:cs="Calibri"/>
         </w:rPr>
-        <w:t>The final product backlog defines the set of functional requirements delivered within the system. Requirements are expressed as user stories and are prioritised using the MoSCoW method (Must have, should have, could have, won’t have). Each requirement had an acceptance criterion.</w:t>
+        <w:t xml:space="preserve">The final product backlog defines the set of functional requirements delivered within the system. Requirements are expressed as user stories and are prioritised using the </w:t>
+      </w:r>
+      <w:proofErr w:type="spellStart"/>
+      <w:r>
+        <w:rPr>
+          <w:rFonts w:ascii="Calibri" w:hAnsi="Calibri" w:cs="Calibri"/>
+        </w:rPr>
+        <w:t>MoSCoW</w:t>
+      </w:r>
+      <w:proofErr w:type="spellEnd"/>
+      <w:r>
+        <w:rPr>
+          <w:rFonts w:ascii="Calibri" w:hAnsi="Calibri" w:cs="Calibri"/>
+        </w:rPr>
+        <w:t xml:space="preserve"> method (Must have, should have, could have, won’t have). Each requirement had an acceptance criterion.</w:t>
       </w:r>
     </w:p>
     <w:tbl>
@@ -8727,83 +8839,930 @@
         <w:spacing w:line="360" w:lineRule="auto"/>
         <w:rPr>
           <w:rFonts w:ascii="Calibri" w:hAnsi="Calibri" w:cs="Calibri"/>
-        </w:rPr>
-      </w:pPr>
-    </w:p>
-    <w:p>
-      <w:pPr>
-        <w:spacing w:line="360" w:lineRule="auto"/>
-        <w:rPr>
-          <w:rFonts w:ascii="Calibri" w:hAnsi="Calibri" w:cs="Calibri"/>
-        </w:rPr>
-      </w:pPr>
-      <w:r>
-        <w:rPr>
-          <w:rFonts w:ascii="Calibri" w:hAnsi="Calibri" w:cs="Calibri"/>
-        </w:rPr>
-        <w:t xml:space="preserve">The Presented </w:t>
-      </w:r>
-      <w:r>
-        <w:rPr>
-          <w:rFonts w:ascii="Calibri" w:hAnsi="Calibri" w:cs="Calibri"/>
-        </w:rPr>
-        <w:t>use cases</w:t>
-      </w:r>
-      <w:r>
-        <w:rPr>
-          <w:rFonts w:ascii="Calibri" w:hAnsi="Calibri" w:cs="Calibri"/>
-        </w:rPr>
-        <w:t xml:space="preserve"> illustrate the primary interaction flows withing the system, focusing on data capture and analytical processing. Additional use cases, </w:t>
-      </w:r>
-      <w:r>
-        <w:rPr>
-          <w:rFonts w:ascii="Calibri" w:hAnsi="Calibri" w:cs="Calibri"/>
-        </w:rPr>
-        <w:t>covering</w:t>
-      </w:r>
-      <w:r>
-        <w:rPr>
-          <w:rFonts w:ascii="Calibri" w:hAnsi="Calibri" w:cs="Calibri"/>
-        </w:rPr>
-        <w:t xml:space="preserve"> extended </w:t>
-      </w:r>
-      <w:r>
-        <w:rPr>
-          <w:rFonts w:ascii="Calibri" w:hAnsi="Calibri" w:cs="Calibri"/>
-        </w:rPr>
-        <w:t>functionality such</w:t>
-      </w:r>
-      <w:r>
-        <w:rPr>
-          <w:rFonts w:ascii="Calibri" w:hAnsi="Calibri" w:cs="Calibri"/>
-        </w:rPr>
-        <w:t xml:space="preserve"> as community interaction, account management</w:t>
-      </w:r>
-      <w:r>
-        <w:rPr>
-          <w:rFonts w:ascii="Calibri" w:hAnsi="Calibri" w:cs="Calibri"/>
-        </w:rPr>
-        <w:t xml:space="preserve"> etc are available in appendix B.</w:t>
-      </w:r>
-    </w:p>
-    <w:p>
-      <w:pPr>
-        <w:pStyle w:val="Heading2"/>
-        <w:spacing w:line="360" w:lineRule="auto"/>
-        <w:rPr>
-          <w:rFonts w:ascii="Calibri" w:hAnsi="Calibri" w:cs="Calibri"/>
           <w:b/>
           <w:bCs/>
         </w:rPr>
       </w:pPr>
-      <w:bookmarkStart w:id="14" w:name="_Toc227860121"/>
       <w:r>
         <w:rPr>
           <w:rFonts w:ascii="Calibri" w:hAnsi="Calibri" w:cs="Calibri"/>
           <w:b/>
           <w:bCs/>
         </w:rPr>
+        <w:t>Use Case 3: View Dashboard Insights</w:t>
+      </w:r>
+    </w:p>
+    <w:p>
+      <w:pPr>
+        <w:spacing w:line="360" w:lineRule="auto"/>
+        <w:rPr>
+          <w:rFonts w:ascii="Calibri" w:hAnsi="Calibri" w:cs="Calibri"/>
+        </w:rPr>
+      </w:pPr>
+      <w:r>
+        <w:rPr>
+          <w:rFonts w:ascii="Calibri" w:hAnsi="Calibri" w:cs="Calibri"/>
+          <w:b/>
+          <w:bCs/>
+        </w:rPr>
+        <w:t>Primary actor</w:t>
+      </w:r>
+      <w:r>
+        <w:rPr>
+          <w:rFonts w:ascii="Calibri" w:hAnsi="Calibri" w:cs="Calibri"/>
+        </w:rPr>
+        <w:t>: Authenticated User</w:t>
+      </w:r>
+    </w:p>
+    <w:p>
+      <w:pPr>
+        <w:spacing w:line="360" w:lineRule="auto"/>
+        <w:rPr>
+          <w:rFonts w:ascii="Calibri" w:hAnsi="Calibri" w:cs="Calibri"/>
+          <w:b/>
+          <w:bCs/>
+        </w:rPr>
+      </w:pPr>
+      <w:r>
+        <w:rPr>
+          <w:rFonts w:ascii="Calibri" w:hAnsi="Calibri" w:cs="Calibri"/>
+          <w:b/>
+          <w:bCs/>
+        </w:rPr>
+        <w:t xml:space="preserve">Preconditions: </w:t>
+      </w:r>
+    </w:p>
+    <w:p>
+      <w:pPr>
+        <w:pStyle w:val="ListParagraph"/>
+        <w:numPr>
+          <w:ilvl w:val="0"/>
+          <w:numId w:val="7"/>
+        </w:numPr>
+        <w:spacing w:line="360" w:lineRule="auto"/>
+        <w:rPr>
+          <w:rFonts w:ascii="Calibri" w:hAnsi="Calibri" w:cs="Calibri"/>
+        </w:rPr>
+      </w:pPr>
+      <w:r>
+        <w:rPr>
+          <w:rFonts w:ascii="Calibri" w:hAnsi="Calibri" w:cs="Calibri"/>
+        </w:rPr>
+        <w:t>The user must be logged into the system</w:t>
+      </w:r>
+    </w:p>
+    <w:p>
+      <w:pPr>
+        <w:pStyle w:val="ListParagraph"/>
+        <w:numPr>
+          <w:ilvl w:val="0"/>
+          <w:numId w:val="7"/>
+        </w:numPr>
+        <w:spacing w:line="360" w:lineRule="auto"/>
+        <w:rPr>
+          <w:rFonts w:ascii="Calibri" w:hAnsi="Calibri" w:cs="Calibri"/>
+        </w:rPr>
+      </w:pPr>
+      <w:r>
+        <w:rPr>
+          <w:rFonts w:ascii="Calibri" w:hAnsi="Calibri" w:cs="Calibri"/>
+        </w:rPr>
         <w:lastRenderedPageBreak/>
+        <w:t>User must have previously recorded some training sessions or nutritional data for meaningful results to be displayed.</w:t>
+      </w:r>
+    </w:p>
+    <w:p>
+      <w:pPr>
+        <w:pStyle w:val="ListParagraph"/>
+        <w:numPr>
+          <w:ilvl w:val="0"/>
+          <w:numId w:val="7"/>
+        </w:numPr>
+        <w:spacing w:line="360" w:lineRule="auto"/>
+        <w:rPr>
+          <w:rFonts w:ascii="Calibri" w:hAnsi="Calibri" w:cs="Calibri"/>
+        </w:rPr>
+      </w:pPr>
+      <w:r>
+        <w:rPr>
+          <w:rFonts w:ascii="Calibri" w:hAnsi="Calibri" w:cs="Calibri"/>
+        </w:rPr>
+        <w:t>The user must have a valid account profile</w:t>
+      </w:r>
+    </w:p>
+    <w:p>
+      <w:pPr>
+        <w:spacing w:line="360" w:lineRule="auto"/>
+        <w:rPr>
+          <w:rFonts w:ascii="Calibri" w:hAnsi="Calibri" w:cs="Calibri"/>
+          <w:b/>
+          <w:bCs/>
+        </w:rPr>
+      </w:pPr>
+      <w:r>
+        <w:rPr>
+          <w:rFonts w:ascii="Calibri" w:hAnsi="Calibri" w:cs="Calibri"/>
+          <w:b/>
+          <w:bCs/>
+        </w:rPr>
+        <w:t>Trigger:</w:t>
+      </w:r>
+    </w:p>
+    <w:p>
+      <w:pPr>
+        <w:pStyle w:val="ListParagraph"/>
+        <w:numPr>
+          <w:ilvl w:val="0"/>
+          <w:numId w:val="7"/>
+        </w:numPr>
+        <w:spacing w:line="360" w:lineRule="auto"/>
+        <w:rPr>
+          <w:rFonts w:ascii="Calibri" w:hAnsi="Calibri" w:cs="Calibri"/>
+        </w:rPr>
+      </w:pPr>
+      <w:r>
+        <w:rPr>
+          <w:rFonts w:ascii="Calibri" w:hAnsi="Calibri" w:cs="Calibri"/>
+        </w:rPr>
+        <w:t>The user navigates to the dashboard page.</w:t>
+      </w:r>
+    </w:p>
+    <w:p>
+      <w:pPr>
+        <w:spacing w:line="360" w:lineRule="auto"/>
+        <w:rPr>
+          <w:rFonts w:ascii="Calibri" w:hAnsi="Calibri" w:cs="Calibri"/>
+          <w:b/>
+          <w:bCs/>
+        </w:rPr>
+      </w:pPr>
+      <w:r>
+        <w:rPr>
+          <w:rFonts w:ascii="Calibri" w:hAnsi="Calibri" w:cs="Calibri"/>
+          <w:b/>
+          <w:bCs/>
+        </w:rPr>
+        <w:t>Main Success Scenario:</w:t>
+      </w:r>
+    </w:p>
+    <w:p>
+      <w:pPr>
+        <w:pStyle w:val="ListParagraph"/>
+        <w:numPr>
+          <w:ilvl w:val="0"/>
+          <w:numId w:val="11"/>
+        </w:numPr>
+        <w:spacing w:line="360" w:lineRule="auto"/>
+        <w:rPr>
+          <w:rFonts w:ascii="Calibri" w:hAnsi="Calibri" w:cs="Calibri"/>
+        </w:rPr>
+      </w:pPr>
+      <w:r>
+        <w:rPr>
+          <w:rFonts w:ascii="Calibri" w:hAnsi="Calibri" w:cs="Calibri"/>
+        </w:rPr>
+        <w:t>The system retrieves the user’s stored training and nutritional data.</w:t>
+      </w:r>
+    </w:p>
+    <w:p>
+      <w:pPr>
+        <w:pStyle w:val="ListParagraph"/>
+        <w:numPr>
+          <w:ilvl w:val="0"/>
+          <w:numId w:val="11"/>
+        </w:numPr>
+        <w:spacing w:line="360" w:lineRule="auto"/>
+        <w:rPr>
+          <w:rFonts w:ascii="Calibri" w:hAnsi="Calibri" w:cs="Calibri"/>
+        </w:rPr>
+      </w:pPr>
+      <w:r>
+        <w:rPr>
+          <w:rFonts w:ascii="Calibri" w:hAnsi="Calibri" w:cs="Calibri"/>
+        </w:rPr>
+        <w:t>The system details relevant metrics across such the defined time periods, such as the previous 7 or 30 days.</w:t>
+      </w:r>
+    </w:p>
+    <w:p>
+      <w:pPr>
+        <w:pStyle w:val="ListParagraph"/>
+        <w:numPr>
+          <w:ilvl w:val="0"/>
+          <w:numId w:val="11"/>
+        </w:numPr>
+        <w:spacing w:line="360" w:lineRule="auto"/>
+        <w:rPr>
+          <w:rFonts w:ascii="Calibri" w:hAnsi="Calibri" w:cs="Calibri"/>
+        </w:rPr>
+      </w:pPr>
+      <w:r>
+        <w:rPr>
+          <w:rFonts w:ascii="Calibri" w:hAnsi="Calibri" w:cs="Calibri"/>
+        </w:rPr>
+        <w:t>The system calculates summary values, including total sessions, total minutes, average intensity, calorie totals, and progress against personalised goals.</w:t>
+      </w:r>
+    </w:p>
+    <w:p>
+      <w:pPr>
+        <w:pStyle w:val="ListParagraph"/>
+        <w:numPr>
+          <w:ilvl w:val="0"/>
+          <w:numId w:val="11"/>
+        </w:numPr>
+        <w:spacing w:line="360" w:lineRule="auto"/>
+        <w:rPr>
+          <w:rFonts w:ascii="Calibri" w:hAnsi="Calibri" w:cs="Calibri"/>
+        </w:rPr>
+      </w:pPr>
+      <w:r>
+        <w:rPr>
+          <w:rFonts w:ascii="Calibri" w:hAnsi="Calibri" w:cs="Calibri"/>
+        </w:rPr>
+        <w:t>The system generates a session and nutritional chart, based on aggregated data.</w:t>
+      </w:r>
+    </w:p>
+    <w:p>
+      <w:pPr>
+        <w:pStyle w:val="ListParagraph"/>
+        <w:numPr>
+          <w:ilvl w:val="0"/>
+          <w:numId w:val="11"/>
+        </w:numPr>
+        <w:spacing w:line="360" w:lineRule="auto"/>
+        <w:rPr>
+          <w:rFonts w:ascii="Calibri" w:hAnsi="Calibri" w:cs="Calibri"/>
+        </w:rPr>
+      </w:pPr>
+      <w:r>
+        <w:rPr>
+          <w:rFonts w:ascii="Calibri" w:hAnsi="Calibri" w:cs="Calibri"/>
+        </w:rPr>
+        <w:t>Charts can be swapped between, and individual metrics can be shown or hidden.</w:t>
+      </w:r>
+    </w:p>
+    <w:p>
+      <w:pPr>
+        <w:pStyle w:val="ListParagraph"/>
+        <w:numPr>
+          <w:ilvl w:val="0"/>
+          <w:numId w:val="11"/>
+        </w:numPr>
+        <w:spacing w:line="360" w:lineRule="auto"/>
+        <w:rPr>
+          <w:rFonts w:ascii="Calibri" w:hAnsi="Calibri" w:cs="Calibri"/>
+        </w:rPr>
+      </w:pPr>
+      <w:r>
+        <w:rPr>
+          <w:rFonts w:ascii="Calibri" w:hAnsi="Calibri" w:cs="Calibri"/>
+        </w:rPr>
+        <w:t>The system evaluates the data against the predefined conditions and produces tailored rule-based insights.</w:t>
+      </w:r>
+    </w:p>
+    <w:p>
+      <w:pPr>
+        <w:pStyle w:val="ListParagraph"/>
+        <w:numPr>
+          <w:ilvl w:val="0"/>
+          <w:numId w:val="11"/>
+        </w:numPr>
+        <w:spacing w:line="360" w:lineRule="auto"/>
+        <w:rPr>
+          <w:rFonts w:ascii="Calibri" w:hAnsi="Calibri" w:cs="Calibri"/>
+        </w:rPr>
+      </w:pPr>
+      <w:r>
+        <w:rPr>
+          <w:rFonts w:ascii="Calibri" w:hAnsi="Calibri" w:cs="Calibri"/>
+        </w:rPr>
+        <w:t>Weekly goal progress indicators are available and bouldering totals.</w:t>
+      </w:r>
+    </w:p>
+    <w:p>
+      <w:pPr>
+        <w:pStyle w:val="ListParagraph"/>
+        <w:numPr>
+          <w:ilvl w:val="0"/>
+          <w:numId w:val="11"/>
+        </w:numPr>
+        <w:spacing w:line="360" w:lineRule="auto"/>
+        <w:rPr>
+          <w:rFonts w:ascii="Calibri" w:hAnsi="Calibri" w:cs="Calibri"/>
+        </w:rPr>
+      </w:pPr>
+      <w:r>
+        <w:rPr>
+          <w:rFonts w:ascii="Calibri" w:hAnsi="Calibri" w:cs="Calibri"/>
+        </w:rPr>
+        <w:t>The completed dashboard is presented to the user.</w:t>
+      </w:r>
+    </w:p>
+    <w:p>
+      <w:pPr>
+        <w:spacing w:line="360" w:lineRule="auto"/>
+        <w:rPr>
+          <w:rFonts w:ascii="Calibri" w:hAnsi="Calibri" w:cs="Calibri"/>
+          <w:b/>
+          <w:bCs/>
+        </w:rPr>
+      </w:pPr>
+      <w:r>
+        <w:rPr>
+          <w:rFonts w:ascii="Calibri" w:hAnsi="Calibri" w:cs="Calibri"/>
+          <w:b/>
+          <w:bCs/>
+        </w:rPr>
+        <w:t>Alternative/Exception Flows:</w:t>
+      </w:r>
+    </w:p>
+    <w:p>
+      <w:pPr>
+        <w:pStyle w:val="ListParagraph"/>
+        <w:numPr>
+          <w:ilvl w:val="0"/>
+          <w:numId w:val="7"/>
+        </w:numPr>
+        <w:spacing w:line="360" w:lineRule="auto"/>
+        <w:rPr>
+          <w:rFonts w:ascii="Calibri" w:hAnsi="Calibri" w:cs="Calibri"/>
+          <w:b/>
+          <w:bCs/>
+        </w:rPr>
+      </w:pPr>
+      <w:r>
+        <w:rPr>
+          <w:rFonts w:ascii="Calibri" w:hAnsi="Calibri" w:cs="Calibri"/>
+        </w:rPr>
+        <w:t>If insufficient training or nutritional data exists, then the system displays a dashboard with partial results and appropriate empty slate messaging.</w:t>
+      </w:r>
+    </w:p>
+    <w:p>
+      <w:pPr>
+        <w:pStyle w:val="ListParagraph"/>
+        <w:numPr>
+          <w:ilvl w:val="0"/>
+          <w:numId w:val="7"/>
+        </w:numPr>
+        <w:spacing w:line="360" w:lineRule="auto"/>
+        <w:rPr>
+          <w:rFonts w:ascii="Calibri" w:hAnsi="Calibri" w:cs="Calibri"/>
+          <w:b/>
+          <w:bCs/>
+        </w:rPr>
+      </w:pPr>
+      <w:r>
+        <w:rPr>
+          <w:rFonts w:ascii="Calibri" w:hAnsi="Calibri" w:cs="Calibri"/>
+        </w:rPr>
+        <w:t>If no nutrition targets are available from the user profile, then progress against dietary goals is shown as incomplete.</w:t>
+      </w:r>
+    </w:p>
+    <w:p>
+      <w:pPr>
+        <w:spacing w:line="360" w:lineRule="auto"/>
+        <w:rPr>
+          <w:rFonts w:ascii="Calibri" w:hAnsi="Calibri" w:cs="Calibri"/>
+          <w:b/>
+          <w:bCs/>
+        </w:rPr>
+      </w:pPr>
+      <w:r>
+        <w:rPr>
+          <w:rFonts w:ascii="Calibri" w:hAnsi="Calibri" w:cs="Calibri"/>
+          <w:b/>
+          <w:bCs/>
+        </w:rPr>
+        <w:t>Postconditions:</w:t>
+      </w:r>
+    </w:p>
+    <w:p>
+      <w:pPr>
+        <w:pStyle w:val="ListParagraph"/>
+        <w:numPr>
+          <w:ilvl w:val="0"/>
+          <w:numId w:val="9"/>
+        </w:numPr>
+        <w:spacing w:line="360" w:lineRule="auto"/>
+        <w:rPr>
+          <w:rFonts w:ascii="Calibri" w:hAnsi="Calibri" w:cs="Calibri"/>
+        </w:rPr>
+      </w:pPr>
+      <w:r>
+        <w:rPr>
+          <w:rFonts w:ascii="Calibri" w:hAnsi="Calibri" w:cs="Calibri"/>
+        </w:rPr>
+        <w:t>The user is presented with an analytical summary of their sessions, daily and weekly nutrition progress against goals.</w:t>
+      </w:r>
+    </w:p>
+    <w:p>
+      <w:pPr>
+        <w:pStyle w:val="ListParagraph"/>
+        <w:numPr>
+          <w:ilvl w:val="0"/>
+          <w:numId w:val="9"/>
+        </w:numPr>
+        <w:spacing w:line="360" w:lineRule="auto"/>
+        <w:rPr>
+          <w:rFonts w:ascii="Calibri" w:hAnsi="Calibri" w:cs="Calibri"/>
+        </w:rPr>
+      </w:pPr>
+      <w:r>
+        <w:rPr>
+          <w:rFonts w:ascii="Calibri" w:hAnsi="Calibri" w:cs="Calibri"/>
+        </w:rPr>
+        <w:t>No new data is made; it is all generated and displayed for interpretation</w:t>
+      </w:r>
+    </w:p>
+    <w:p>
+      <w:pPr>
+        <w:spacing w:line="360" w:lineRule="auto"/>
+        <w:rPr>
+          <w:rFonts w:ascii="Calibri" w:hAnsi="Calibri" w:cs="Calibri"/>
+        </w:rPr>
+      </w:pPr>
+    </w:p>
+    <w:p>
+      <w:pPr>
+        <w:spacing w:line="360" w:lineRule="auto"/>
+        <w:rPr>
+          <w:rFonts w:ascii="Calibri" w:hAnsi="Calibri" w:cs="Calibri"/>
+          <w:b/>
+          <w:bCs/>
+        </w:rPr>
+      </w:pPr>
+      <w:r>
+        <w:rPr>
+          <w:rFonts w:ascii="Calibri" w:hAnsi="Calibri" w:cs="Calibri"/>
+          <w:b/>
+          <w:bCs/>
+        </w:rPr>
+        <w:t xml:space="preserve">Use Case </w:t>
+      </w:r>
+      <w:r>
+        <w:rPr>
+          <w:rFonts w:ascii="Calibri" w:hAnsi="Calibri" w:cs="Calibri"/>
+          <w:b/>
+          <w:bCs/>
+        </w:rPr>
+        <w:t>4</w:t>
+      </w:r>
+      <w:r>
+        <w:rPr>
+          <w:rFonts w:ascii="Calibri" w:hAnsi="Calibri" w:cs="Calibri"/>
+          <w:b/>
+          <w:bCs/>
+        </w:rPr>
+        <w:t>: Manage account and Personal Settings</w:t>
+      </w:r>
+    </w:p>
+    <w:p>
+      <w:pPr>
+        <w:spacing w:line="360" w:lineRule="auto"/>
+        <w:rPr>
+          <w:rFonts w:ascii="Calibri" w:hAnsi="Calibri" w:cs="Calibri"/>
+        </w:rPr>
+      </w:pPr>
+      <w:r>
+        <w:rPr>
+          <w:rFonts w:ascii="Calibri" w:hAnsi="Calibri" w:cs="Calibri"/>
+          <w:b/>
+          <w:bCs/>
+        </w:rPr>
+        <w:t>Primary Actor:</w:t>
+      </w:r>
+      <w:r>
+        <w:rPr>
+          <w:rFonts w:ascii="Calibri" w:hAnsi="Calibri" w:cs="Calibri"/>
+        </w:rPr>
+        <w:t xml:space="preserve"> Authenticated User</w:t>
+      </w:r>
+    </w:p>
+    <w:p>
+      <w:pPr>
+        <w:spacing w:line="360" w:lineRule="auto"/>
+        <w:rPr>
+          <w:rFonts w:ascii="Calibri" w:hAnsi="Calibri" w:cs="Calibri"/>
+        </w:rPr>
+      </w:pPr>
+      <w:r>
+        <w:rPr>
+          <w:rFonts w:ascii="Calibri" w:hAnsi="Calibri" w:cs="Calibri"/>
+          <w:b/>
+          <w:bCs/>
+        </w:rPr>
+        <w:t>Preconditions:</w:t>
+      </w:r>
+    </w:p>
+    <w:p>
+      <w:pPr>
+        <w:numPr>
+          <w:ilvl w:val="0"/>
+          <w:numId w:val="19"/>
+        </w:numPr>
+        <w:spacing w:line="360" w:lineRule="auto"/>
+        <w:rPr>
+          <w:rFonts w:ascii="Calibri" w:hAnsi="Calibri" w:cs="Calibri"/>
+        </w:rPr>
+      </w:pPr>
+      <w:r>
+        <w:rPr>
+          <w:rFonts w:ascii="Calibri" w:hAnsi="Calibri" w:cs="Calibri"/>
+        </w:rPr>
+        <w:lastRenderedPageBreak/>
+        <w:t>The user must be logged into the system.</w:t>
+      </w:r>
+    </w:p>
+    <w:p>
+      <w:pPr>
+        <w:spacing w:line="360" w:lineRule="auto"/>
+        <w:rPr>
+          <w:rFonts w:ascii="Calibri" w:hAnsi="Calibri" w:cs="Calibri"/>
+        </w:rPr>
+      </w:pPr>
+      <w:r>
+        <w:rPr>
+          <w:rFonts w:ascii="Calibri" w:hAnsi="Calibri" w:cs="Calibri"/>
+          <w:b/>
+          <w:bCs/>
+        </w:rPr>
+        <w:t>Trigger:</w:t>
+      </w:r>
+    </w:p>
+    <w:p>
+      <w:pPr>
+        <w:numPr>
+          <w:ilvl w:val="0"/>
+          <w:numId w:val="20"/>
+        </w:numPr>
+        <w:spacing w:line="360" w:lineRule="auto"/>
+        <w:rPr>
+          <w:rFonts w:ascii="Calibri" w:hAnsi="Calibri" w:cs="Calibri"/>
+        </w:rPr>
+      </w:pPr>
+      <w:r>
+        <w:rPr>
+          <w:rFonts w:ascii="Calibri" w:hAnsi="Calibri" w:cs="Calibri"/>
+        </w:rPr>
+        <w:t>The user navigates to the Account page</w:t>
+      </w:r>
+    </w:p>
+    <w:p>
+      <w:pPr>
+        <w:spacing w:line="360" w:lineRule="auto"/>
+        <w:rPr>
+          <w:rFonts w:ascii="Calibri" w:hAnsi="Calibri" w:cs="Calibri"/>
+          <w:b/>
+          <w:bCs/>
+        </w:rPr>
+      </w:pPr>
+      <w:r>
+        <w:rPr>
+          <w:rFonts w:ascii="Calibri" w:hAnsi="Calibri" w:cs="Calibri"/>
+          <w:b/>
+          <w:bCs/>
+        </w:rPr>
+        <w:t>Main Success Scenario:</w:t>
+      </w:r>
+    </w:p>
+    <w:p>
+      <w:pPr>
+        <w:pStyle w:val="ListParagraph"/>
+        <w:numPr>
+          <w:ilvl w:val="0"/>
+          <w:numId w:val="24"/>
+        </w:numPr>
+        <w:spacing w:line="360" w:lineRule="auto"/>
+        <w:rPr>
+          <w:rFonts w:ascii="Calibri" w:hAnsi="Calibri" w:cs="Calibri"/>
+        </w:rPr>
+      </w:pPr>
+      <w:r>
+        <w:rPr>
+          <w:rFonts w:ascii="Calibri" w:hAnsi="Calibri" w:cs="Calibri"/>
+        </w:rPr>
+        <w:t>The system retrieves the user’s existing profile information, attributes and current settings</w:t>
+      </w:r>
+    </w:p>
+    <w:p>
+      <w:pPr>
+        <w:pStyle w:val="ListParagraph"/>
+        <w:numPr>
+          <w:ilvl w:val="0"/>
+          <w:numId w:val="24"/>
+        </w:numPr>
+        <w:spacing w:line="360" w:lineRule="auto"/>
+        <w:rPr>
+          <w:rFonts w:ascii="Calibri" w:hAnsi="Calibri" w:cs="Calibri"/>
+        </w:rPr>
+      </w:pPr>
+      <w:r>
+        <w:rPr>
+          <w:rFonts w:ascii="Calibri" w:hAnsi="Calibri" w:cs="Calibri"/>
+        </w:rPr>
+        <w:t>The user updates personal details such as height, weight, age, goal type or activity level.</w:t>
+      </w:r>
+    </w:p>
+    <w:p>
+      <w:pPr>
+        <w:pStyle w:val="ListParagraph"/>
+        <w:numPr>
+          <w:ilvl w:val="0"/>
+          <w:numId w:val="24"/>
+        </w:numPr>
+        <w:spacing w:line="360" w:lineRule="auto"/>
+        <w:rPr>
+          <w:rFonts w:ascii="Calibri" w:hAnsi="Calibri" w:cs="Calibri"/>
+        </w:rPr>
+      </w:pPr>
+      <w:r>
+        <w:rPr>
+          <w:rFonts w:ascii="Calibri" w:hAnsi="Calibri" w:cs="Calibri"/>
+        </w:rPr>
+        <w:t>The system recalculated the nutritional targets automatically based on when the updated data is saved.</w:t>
+      </w:r>
+    </w:p>
+    <w:p>
+      <w:pPr>
+        <w:pStyle w:val="ListParagraph"/>
+        <w:numPr>
+          <w:ilvl w:val="0"/>
+          <w:numId w:val="24"/>
+        </w:numPr>
+        <w:spacing w:line="360" w:lineRule="auto"/>
+        <w:rPr>
+          <w:rFonts w:ascii="Calibri" w:hAnsi="Calibri" w:cs="Calibri"/>
+        </w:rPr>
+      </w:pPr>
+      <w:r>
+        <w:rPr>
+          <w:rFonts w:ascii="Calibri" w:hAnsi="Calibri" w:cs="Calibri"/>
+        </w:rPr>
+        <w:t>The user optionally can swap to manual and define custom target goals.</w:t>
+      </w:r>
+    </w:p>
+    <w:p>
+      <w:pPr>
+        <w:pStyle w:val="ListParagraph"/>
+        <w:numPr>
+          <w:ilvl w:val="0"/>
+          <w:numId w:val="24"/>
+        </w:numPr>
+        <w:spacing w:line="360" w:lineRule="auto"/>
+        <w:rPr>
+          <w:rFonts w:ascii="Calibri" w:hAnsi="Calibri" w:cs="Calibri"/>
+        </w:rPr>
+      </w:pPr>
+      <w:r>
+        <w:rPr>
+          <w:rFonts w:ascii="Calibri" w:hAnsi="Calibri" w:cs="Calibri"/>
+        </w:rPr>
+        <w:t>The user updates their privacy settings, controlling visibility of their profile’s attributes.</w:t>
+      </w:r>
+    </w:p>
+    <w:p>
+      <w:pPr>
+        <w:pStyle w:val="ListParagraph"/>
+        <w:numPr>
+          <w:ilvl w:val="0"/>
+          <w:numId w:val="24"/>
+        </w:numPr>
+        <w:spacing w:line="360" w:lineRule="auto"/>
+        <w:rPr>
+          <w:rFonts w:ascii="Calibri" w:hAnsi="Calibri" w:cs="Calibri"/>
+        </w:rPr>
+      </w:pPr>
+      <w:r>
+        <w:rPr>
+          <w:rFonts w:ascii="Calibri" w:hAnsi="Calibri" w:cs="Calibri"/>
+        </w:rPr>
+        <w:t>The user manages social features such as sending friend request, accepting friend requests and viewing current friends.</w:t>
+      </w:r>
+    </w:p>
+    <w:p>
+      <w:pPr>
+        <w:pStyle w:val="ListParagraph"/>
+        <w:numPr>
+          <w:ilvl w:val="0"/>
+          <w:numId w:val="24"/>
+        </w:numPr>
+        <w:spacing w:line="360" w:lineRule="auto"/>
+        <w:rPr>
+          <w:rFonts w:ascii="Calibri" w:hAnsi="Calibri" w:cs="Calibri"/>
+        </w:rPr>
+      </w:pPr>
+      <w:r>
+        <w:rPr>
+          <w:rFonts w:ascii="Calibri" w:hAnsi="Calibri" w:cs="Calibri"/>
+        </w:rPr>
+        <w:t>The system validates and updates all information.</w:t>
+      </w:r>
+    </w:p>
+    <w:p>
+      <w:pPr>
+        <w:pStyle w:val="ListParagraph"/>
+        <w:numPr>
+          <w:ilvl w:val="0"/>
+          <w:numId w:val="24"/>
+        </w:numPr>
+        <w:spacing w:line="360" w:lineRule="auto"/>
+        <w:rPr>
+          <w:rFonts w:ascii="Calibri" w:hAnsi="Calibri" w:cs="Calibri"/>
+        </w:rPr>
+      </w:pPr>
+      <w:r>
+        <w:rPr>
+          <w:rFonts w:ascii="Calibri" w:hAnsi="Calibri" w:cs="Calibri"/>
+        </w:rPr>
+        <w:t xml:space="preserve">The updated account setting </w:t>
+      </w:r>
+      <w:proofErr w:type="spellStart"/>
+      <w:r>
+        <w:rPr>
+          <w:rFonts w:ascii="Calibri" w:hAnsi="Calibri" w:cs="Calibri"/>
+        </w:rPr>
+        <w:t>sare</w:t>
+      </w:r>
+      <w:proofErr w:type="spellEnd"/>
+      <w:r>
+        <w:rPr>
+          <w:rFonts w:ascii="Calibri" w:hAnsi="Calibri" w:cs="Calibri"/>
+        </w:rPr>
+        <w:t xml:space="preserve"> saved and applied.</w:t>
+      </w:r>
+    </w:p>
+    <w:p>
+      <w:pPr>
+        <w:spacing w:line="360" w:lineRule="auto"/>
+        <w:rPr>
+          <w:rFonts w:ascii="Calibri" w:hAnsi="Calibri" w:cs="Calibri"/>
+        </w:rPr>
+      </w:pPr>
+      <w:r>
+        <w:rPr>
+          <w:rFonts w:ascii="Calibri" w:hAnsi="Calibri" w:cs="Calibri"/>
+          <w:b/>
+          <w:bCs/>
+        </w:rPr>
+        <w:t>Alternative / Exception Flows:</w:t>
+      </w:r>
+    </w:p>
+    <w:p>
+      <w:pPr>
+        <w:numPr>
+          <w:ilvl w:val="0"/>
+          <w:numId w:val="22"/>
+        </w:numPr>
+        <w:spacing w:line="360" w:lineRule="auto"/>
+        <w:rPr>
+          <w:rFonts w:ascii="Calibri" w:hAnsi="Calibri" w:cs="Calibri"/>
+        </w:rPr>
+      </w:pPr>
+      <w:r>
+        <w:rPr>
+          <w:rFonts w:ascii="Calibri" w:hAnsi="Calibri" w:cs="Calibri"/>
+        </w:rPr>
+        <w:t>If invalid values are entered such as negative weight or height etc, the system prevents submission.</w:t>
+      </w:r>
+    </w:p>
+    <w:p>
+      <w:pPr>
+        <w:spacing w:line="360" w:lineRule="auto"/>
+        <w:rPr>
+          <w:rFonts w:ascii="Calibri" w:hAnsi="Calibri" w:cs="Calibri"/>
+        </w:rPr>
+      </w:pPr>
+      <w:r>
+        <w:rPr>
+          <w:rFonts w:ascii="Calibri" w:hAnsi="Calibri" w:cs="Calibri"/>
+          <w:b/>
+          <w:bCs/>
+        </w:rPr>
+        <w:t>Postconditions:</w:t>
+      </w:r>
+    </w:p>
+    <w:p>
+      <w:pPr>
+        <w:numPr>
+          <w:ilvl w:val="0"/>
+          <w:numId w:val="23"/>
+        </w:numPr>
+        <w:spacing w:line="360" w:lineRule="auto"/>
+        <w:rPr>
+          <w:rFonts w:ascii="Calibri" w:hAnsi="Calibri" w:cs="Calibri"/>
+        </w:rPr>
+      </w:pPr>
+      <w:r>
+        <w:rPr>
+          <w:rFonts w:ascii="Calibri" w:hAnsi="Calibri" w:cs="Calibri"/>
+        </w:rPr>
+        <w:t>The user’s profile and preferences are updates within the system</w:t>
+      </w:r>
+    </w:p>
+    <w:p>
+      <w:pPr>
+        <w:numPr>
+          <w:ilvl w:val="0"/>
+          <w:numId w:val="23"/>
+        </w:numPr>
+        <w:spacing w:line="360" w:lineRule="auto"/>
+        <w:rPr>
+          <w:rFonts w:ascii="Calibri" w:hAnsi="Calibri" w:cs="Calibri"/>
+        </w:rPr>
+      </w:pPr>
+      <w:r>
+        <w:rPr>
+          <w:rFonts w:ascii="Calibri" w:hAnsi="Calibri" w:cs="Calibri"/>
+        </w:rPr>
+        <w:t>Updated profile data influences other system components, such as insights on the dashboard and nutritional targets.</w:t>
+      </w:r>
+    </w:p>
+    <w:p>
+      <w:pPr>
+        <w:spacing w:line="360" w:lineRule="auto"/>
+        <w:rPr>
+          <w:rFonts w:ascii="Calibri" w:hAnsi="Calibri" w:cs="Calibri"/>
+        </w:rPr>
+      </w:pPr>
+    </w:p>
+    <w:p>
+      <w:pPr>
+        <w:spacing w:line="360" w:lineRule="auto"/>
+        <w:rPr>
+          <w:rFonts w:ascii="Calibri" w:hAnsi="Calibri" w:cs="Calibri"/>
+        </w:rPr>
+      </w:pPr>
+      <w:r>
+        <w:rPr>
+          <w:rFonts w:ascii="Calibri" w:hAnsi="Calibri" w:cs="Calibri"/>
+        </w:rPr>
+        <w:t xml:space="preserve">The Presented </w:t>
+      </w:r>
+      <w:r>
+        <w:rPr>
+          <w:rFonts w:ascii="Calibri" w:hAnsi="Calibri" w:cs="Calibri"/>
+        </w:rPr>
+        <w:t>use cases</w:t>
+      </w:r>
+      <w:r>
+        <w:rPr>
+          <w:rFonts w:ascii="Calibri" w:hAnsi="Calibri" w:cs="Calibri"/>
+        </w:rPr>
+        <w:t xml:space="preserve"> illustrate the primary interaction flows withing the system, focusing on data capture and analytical processing. Additional use cases, </w:t>
+      </w:r>
+      <w:r>
+        <w:rPr>
+          <w:rFonts w:ascii="Calibri" w:hAnsi="Calibri" w:cs="Calibri"/>
+        </w:rPr>
+        <w:t>covering</w:t>
+      </w:r>
+      <w:r>
+        <w:rPr>
+          <w:rFonts w:ascii="Calibri" w:hAnsi="Calibri" w:cs="Calibri"/>
+        </w:rPr>
+        <w:t xml:space="preserve"> extended </w:t>
+      </w:r>
+      <w:r>
+        <w:rPr>
+          <w:rFonts w:ascii="Calibri" w:hAnsi="Calibri" w:cs="Calibri"/>
+        </w:rPr>
+        <w:t>functionality such</w:t>
+      </w:r>
+      <w:r>
+        <w:rPr>
+          <w:rFonts w:ascii="Calibri" w:hAnsi="Calibri" w:cs="Calibri"/>
+        </w:rPr>
+        <w:t xml:space="preserve"> as community interaction</w:t>
+      </w:r>
+      <w:r>
+        <w:rPr>
+          <w:rFonts w:ascii="Calibri" w:hAnsi="Calibri" w:cs="Calibri"/>
+        </w:rPr>
+        <w:t xml:space="preserve"> and leaderboard interaction </w:t>
+      </w:r>
+      <w:r>
+        <w:rPr>
+          <w:rFonts w:ascii="Calibri" w:hAnsi="Calibri" w:cs="Calibri"/>
+        </w:rPr>
+        <w:t>are available in appendix B.</w:t>
+      </w:r>
+    </w:p>
+    <w:p>
+      <w:pPr>
+        <w:pStyle w:val="Heading2"/>
+        <w:spacing w:line="360" w:lineRule="auto"/>
+        <w:rPr>
+          <w:rFonts w:ascii="Calibri" w:hAnsi="Calibri" w:cs="Calibri"/>
+          <w:b/>
+          <w:bCs/>
+        </w:rPr>
+      </w:pPr>
+      <w:bookmarkStart w:id="14" w:name="_Toc227860121"/>
+      <w:r>
+        <w:rPr>
+          <w:rFonts w:ascii="Calibri" w:hAnsi="Calibri" w:cs="Calibri"/>
+          <w:b/>
+          <w:bCs/>
+        </w:rPr>
         <w:t>3.4 Non-Functional Specification</w:t>
       </w:r>
       <w:bookmarkEnd w:id="14"/>
@@ -8842,7 +9801,21 @@
         <w:rPr>
           <w:rFonts w:ascii="Calibri" w:hAnsi="Calibri" w:cs="Calibri"/>
         </w:rPr>
-        <w:t>All user passwords should be securely stored using industry standard-standard algorithms such as BCrypt.</w:t>
+        <w:t xml:space="preserve">All user passwords should be securely stored using industry standard-standard algorithms such as </w:t>
+      </w:r>
+      <w:proofErr w:type="spellStart"/>
+      <w:r>
+        <w:rPr>
+          <w:rFonts w:ascii="Calibri" w:hAnsi="Calibri" w:cs="Calibri"/>
+        </w:rPr>
+        <w:t>BCrypt</w:t>
+      </w:r>
+      <w:proofErr w:type="spellEnd"/>
+      <w:r>
+        <w:rPr>
+          <w:rFonts w:ascii="Calibri" w:hAnsi="Calibri" w:cs="Calibri"/>
+        </w:rPr>
+        <w:t>.</w:t>
       </w:r>
     </w:p>
     <w:p>
@@ -8861,6 +9834,7 @@
         <w:rPr>
           <w:rFonts w:ascii="Calibri" w:hAnsi="Calibri" w:cs="Calibri"/>
         </w:rPr>
+        <w:lastRenderedPageBreak/>
         <w:t>All communication between the client and server should be transmitted over HTTPS.</w:t>
       </w:r>
     </w:p>
@@ -9031,7 +10005,19 @@
         <w:rPr>
           <w:rFonts w:ascii="Calibri" w:hAnsi="Calibri" w:cs="Calibri"/>
         </w:rPr>
-        <w:t>Database queries should be optimised to mnimise data retrieval.</w:t>
+        <w:t xml:space="preserve">Database queries should be optimised to </w:t>
+      </w:r>
+      <w:r>
+        <w:rPr>
+          <w:rFonts w:ascii="Calibri" w:hAnsi="Calibri" w:cs="Calibri"/>
+        </w:rPr>
+        <w:t>minimise</w:t>
+      </w:r>
+      <w:r>
+        <w:rPr>
+          <w:rFonts w:ascii="Calibri" w:hAnsi="Calibri" w:cs="Calibri"/>
+        </w:rPr>
+        <w:t xml:space="preserve"> data retrieval.</w:t>
       </w:r>
     </w:p>
     <w:p>
@@ -9068,7 +10054,21 @@
         <w:rPr>
           <w:rFonts w:ascii="Calibri" w:hAnsi="Calibri" w:cs="Calibri"/>
         </w:rPr>
-        <w:t>The system should bea available at least 95% of the time.</w:t>
+        <w:t xml:space="preserve">The system should </w:t>
+      </w:r>
+      <w:proofErr w:type="spellStart"/>
+      <w:r>
+        <w:rPr>
+          <w:rFonts w:ascii="Calibri" w:hAnsi="Calibri" w:cs="Calibri"/>
+        </w:rPr>
+        <w:t>bea</w:t>
+      </w:r>
+      <w:proofErr w:type="spellEnd"/>
+      <w:r>
+        <w:rPr>
+          <w:rFonts w:ascii="Calibri" w:hAnsi="Calibri" w:cs="Calibri"/>
+        </w:rPr>
+        <w:t xml:space="preserve"> available at least 95% of the time.</w:t>
       </w:r>
     </w:p>
     <w:p>
@@ -9250,7 +10250,6 @@
         <w:rPr>
           <w:rFonts w:ascii="Calibri" w:hAnsi="Calibri" w:cs="Calibri"/>
         </w:rPr>
-        <w:lastRenderedPageBreak/>
         <w:t>Visual elements such as charts and summaries should be easy to interpret and should be clearly labelled and intuitive.</w:t>
       </w:r>
     </w:p>
@@ -9288,6 +10287,7 @@
           <w:b/>
           <w:bCs/>
         </w:rPr>
+        <w:lastRenderedPageBreak/>
         <w:t>Maintainability and sustainability:</w:t>
       </w:r>
     </w:p>
@@ -9414,11 +10414,19 @@
           <w:rFonts w:ascii="Calibri" w:hAnsi="Calibri" w:cs="Calibri"/>
         </w:rPr>
       </w:pPr>
-      <w:r>
-        <w:rPr>
-          <w:rFonts w:ascii="Calibri" w:hAnsi="Calibri" w:cs="Calibri"/>
-        </w:rPr>
-        <w:t>Main Focus: To provide the technical blueprints showing how the system was structured to satisfy the</w:t>
+      <w:proofErr w:type="gramStart"/>
+      <w:r>
+        <w:rPr>
+          <w:rFonts w:ascii="Calibri" w:hAnsi="Calibri" w:cs="Calibri"/>
+        </w:rPr>
+        <w:t>Main Focus</w:t>
+      </w:r>
+      <w:proofErr w:type="gramEnd"/>
+      <w:r>
+        <w:rPr>
+          <w:rFonts w:ascii="Calibri" w:hAnsi="Calibri" w:cs="Calibri"/>
+        </w:rPr>
+        <w:t>: To provide the technical blueprints showing how the system was structured to satisfy the</w:t>
       </w:r>
     </w:p>
     <w:p>
@@ -9600,49 +10608,49 @@
         <w:rPr>
           <w:rFonts w:ascii="Calibri" w:hAnsi="Calibri" w:cs="Calibri"/>
         </w:rPr>
+        <w:t>• User Interface (UI) Design: Provide a concise overview of the interface design. The focus should</w:t>
+      </w:r>
+    </w:p>
+    <w:p>
+      <w:pPr>
+        <w:spacing w:line="360" w:lineRule="auto"/>
+        <w:rPr>
+          <w:rFonts w:ascii="Calibri" w:hAnsi="Calibri" w:cs="Calibri"/>
+        </w:rPr>
+      </w:pPr>
+      <w:r>
+        <w:rPr>
+          <w:rFonts w:ascii="Calibri" w:hAnsi="Calibri" w:cs="Calibri"/>
+        </w:rPr>
+        <w:t>be on the UX (User Experience) logic rather than just aesthetic choices. Decisions should be</w:t>
+      </w:r>
+    </w:p>
+    <w:p>
+      <w:pPr>
+        <w:spacing w:line="360" w:lineRule="auto"/>
+        <w:rPr>
+          <w:rFonts w:ascii="Calibri" w:hAnsi="Calibri" w:cs="Calibri"/>
+        </w:rPr>
+      </w:pPr>
+      <w:r>
+        <w:rPr>
+          <w:rFonts w:ascii="Calibri" w:hAnsi="Calibri" w:cs="Calibri"/>
+        </w:rPr>
+        <w:t>justified in the context of the requirements defined in Chapter 3. Where considered relevant and</w:t>
+      </w:r>
+    </w:p>
+    <w:p>
+      <w:pPr>
+        <w:spacing w:line="360" w:lineRule="auto"/>
+        <w:rPr>
+          <w:rFonts w:ascii="Calibri" w:hAnsi="Calibri" w:cs="Calibri"/>
+        </w:rPr>
+      </w:pPr>
+      <w:r>
+        <w:rPr>
+          <w:rFonts w:ascii="Calibri" w:hAnsi="Calibri" w:cs="Calibri"/>
+        </w:rPr>
         <w:lastRenderedPageBreak/>
-        <w:t>• User Interface (UI) Design: Provide a concise overview of the interface design. The focus should</w:t>
-      </w:r>
-    </w:p>
-    <w:p>
-      <w:pPr>
-        <w:spacing w:line="360" w:lineRule="auto"/>
-        <w:rPr>
-          <w:rFonts w:ascii="Calibri" w:hAnsi="Calibri" w:cs="Calibri"/>
-        </w:rPr>
-      </w:pPr>
-      <w:r>
-        <w:rPr>
-          <w:rFonts w:ascii="Calibri" w:hAnsi="Calibri" w:cs="Calibri"/>
-        </w:rPr>
-        <w:t>be on the UX (User Experience) logic rather than just aesthetic choices. Decisions should be</w:t>
-      </w:r>
-    </w:p>
-    <w:p>
-      <w:pPr>
-        <w:spacing w:line="360" w:lineRule="auto"/>
-        <w:rPr>
-          <w:rFonts w:ascii="Calibri" w:hAnsi="Calibri" w:cs="Calibri"/>
-        </w:rPr>
-      </w:pPr>
-      <w:r>
-        <w:rPr>
-          <w:rFonts w:ascii="Calibri" w:hAnsi="Calibri" w:cs="Calibri"/>
-        </w:rPr>
-        <w:t>justified in the context of the requirements defined in Chapter 3. Where considered relevant and</w:t>
-      </w:r>
-    </w:p>
-    <w:p>
-      <w:pPr>
-        <w:spacing w:line="360" w:lineRule="auto"/>
-        <w:rPr>
-          <w:rFonts w:ascii="Calibri" w:hAnsi="Calibri" w:cs="Calibri"/>
-        </w:rPr>
-      </w:pPr>
-      <w:r>
-        <w:rPr>
-          <w:rFonts w:ascii="Calibri" w:hAnsi="Calibri" w:cs="Calibri"/>
-        </w:rPr>
         <w:t>appropriate this can include a navigation map/user flow diagram, a design rationale regarding</w:t>
       </w:r>
     </w:p>
@@ -9767,6 +10775,130 @@
     </w:p>
     <w:p>
       <w:pPr>
+        <w:spacing w:line="360" w:lineRule="auto"/>
+        <w:rPr>
+          <w:rFonts w:ascii="Calibri" w:hAnsi="Calibri" w:cs="Calibri"/>
+        </w:rPr>
+      </w:pPr>
+      <w:r>
+        <w:rPr>
+          <w:rFonts w:ascii="Calibri" w:hAnsi="Calibri" w:cs="Calibri"/>
+        </w:rPr>
+        <w:t xml:space="preserve">The system is implemented as a web-based client-server application using Model-View-Controller (MVC) architectural pattern. Users interact with the application through a web browser, where html pages are rendered using Thymeleaf templates. Requests from the browser are handled by Spring Boot controllers, which </w:t>
+      </w:r>
+      <w:proofErr w:type="gramStart"/>
+      <w:r>
+        <w:rPr>
+          <w:rFonts w:ascii="Calibri" w:hAnsi="Calibri" w:cs="Calibri"/>
+        </w:rPr>
+        <w:t>are in charge of</w:t>
+      </w:r>
+      <w:proofErr w:type="gramEnd"/>
+      <w:r>
+        <w:rPr>
+          <w:rFonts w:ascii="Calibri" w:hAnsi="Calibri" w:cs="Calibri"/>
+        </w:rPr>
+        <w:t xml:space="preserve"> processing user action, retrieving or updating data through repository interfaces, then returning the appropriate view to the user.</w:t>
+      </w:r>
+    </w:p>
+    <w:p>
+      <w:pPr>
+        <w:spacing w:line="360" w:lineRule="auto"/>
+        <w:rPr>
+          <w:rFonts w:ascii="Calibri" w:hAnsi="Calibri" w:cs="Calibri"/>
+        </w:rPr>
+      </w:pPr>
+      <w:r>
+        <w:rPr>
+          <w:rFonts w:ascii="Calibri" w:hAnsi="Calibri" w:cs="Calibri"/>
+        </w:rPr>
+        <w:t>The architecture can be generally viewed as a three-tiered system. The presentation tier of the system consists of Thymeleaf templates, HTML, CSS and JavaScript to display the user interface.</w:t>
+      </w:r>
+      <w:r>
+        <w:rPr>
+          <w:rFonts w:ascii="Calibri" w:hAnsi="Calibri" w:cs="Calibri"/>
+        </w:rPr>
+        <w:t xml:space="preserve"> The application tier consists of the Spring Boot controllers, services, models, dto’s, repositories and configs, that manage system logic and data access. </w:t>
+      </w:r>
+      <w:r>
+        <w:rPr>
+          <w:rFonts w:ascii="Calibri" w:hAnsi="Calibri" w:cs="Calibri"/>
+        </w:rPr>
+        <w:t>The last data tier is the relational database, which stores persistent user, session, nutrition, community and leaderboard-related data.</w:t>
+      </w:r>
+    </w:p>
+    <w:p>
+      <w:pPr>
+        <w:spacing w:line="360" w:lineRule="auto"/>
+        <w:rPr>
+          <w:rFonts w:ascii="Calibri" w:hAnsi="Calibri" w:cs="Calibri"/>
+        </w:rPr>
+      </w:pPr>
+      <w:r>
+        <w:rPr>
+          <w:rFonts w:ascii="Calibri" w:hAnsi="Calibri" w:cs="Calibri"/>
+        </w:rPr>
+        <w:t>This architecture was selected because it allows for a clear separation of concerns. User interfaces logic, application behaviour and persistent data storage make the system layered and allow for easier maintenance, testing and extendibility.</w:t>
+      </w:r>
+    </w:p>
+    <w:p>
+      <w:pPr>
+        <w:spacing w:line="360" w:lineRule="auto"/>
+        <w:rPr>
+          <w:rFonts w:ascii="Calibri" w:hAnsi="Calibri" w:cs="Calibri"/>
+        </w:rPr>
+      </w:pPr>
+      <w:r>
+        <w:rPr>
+          <w:rFonts w:ascii="Calibri" w:hAnsi="Calibri" w:cs="Calibri"/>
+        </w:rPr>
+        <w:drawing>
+          <wp:inline distT="0" distB="0" distL="0" distR="0" wp14:anchorId="3E43BFCD" wp14:editId="1F21CC40">
+            <wp:extent cx="5731510" cy="1809115"/>
+            <wp:effectExtent l="0" t="0" r="2540" b="635"/>
+            <wp:docPr id="1874016533" name="Picture 1"/>
+            <wp:cNvGraphicFramePr>
+              <a:graphicFrameLocks xmlns:a="http://schemas.openxmlformats.org/drawingml/2006/main" noChangeAspect="1"/>
+            </wp:cNvGraphicFramePr>
+            <a:graphic xmlns:a="http://schemas.openxmlformats.org/drawingml/2006/main">
+              <a:graphicData uri="http://schemas.openxmlformats.org/drawingml/2006/picture">
+                <pic:pic xmlns:pic="http://schemas.openxmlformats.org/drawingml/2006/picture">
+                  <pic:nvPicPr>
+                    <pic:cNvPr id="1874016533" name=""/>
+                    <pic:cNvPicPr/>
+                  </pic:nvPicPr>
+                  <pic:blipFill>
+                    <a:blip r:embed="rId9"/>
+                    <a:stretch>
+                      <a:fillRect/>
+                    </a:stretch>
+                  </pic:blipFill>
+                  <pic:spPr>
+                    <a:xfrm>
+                      <a:off x="0" y="0"/>
+                      <a:ext cx="5731510" cy="1809115"/>
+                    </a:xfrm>
+                    <a:prstGeom prst="rect">
+                      <a:avLst/>
+                    </a:prstGeom>
+                  </pic:spPr>
+                </pic:pic>
+              </a:graphicData>
+            </a:graphic>
+          </wp:inline>
+        </w:drawing>
+      </w:r>
+    </w:p>
+    <w:p>
+      <w:pPr>
+        <w:spacing w:line="360" w:lineRule="auto"/>
+        <w:rPr>
+          <w:rFonts w:ascii="Calibri" w:hAnsi="Calibri" w:cs="Calibri"/>
+        </w:rPr>
+      </w:pPr>
+    </w:p>
+    <w:p>
+      <w:pPr>
         <w:pStyle w:val="Heading2"/>
         <w:spacing w:line="360" w:lineRule="auto"/>
         <w:rPr>
@@ -9877,11 +11009,19 @@
           <w:rFonts w:ascii="Calibri" w:hAnsi="Calibri" w:cs="Calibri"/>
         </w:rPr>
       </w:pPr>
-      <w:r>
-        <w:rPr>
-          <w:rFonts w:ascii="Calibri" w:hAnsi="Calibri" w:cs="Calibri"/>
-        </w:rPr>
-        <w:t>Main Focus: To describe the development process and highlight the significant technical challenges</w:t>
+      <w:proofErr w:type="gramStart"/>
+      <w:r>
+        <w:rPr>
+          <w:rFonts w:ascii="Calibri" w:hAnsi="Calibri" w:cs="Calibri"/>
+        </w:rPr>
+        <w:t>Main Focus</w:t>
+      </w:r>
+      <w:proofErr w:type="gramEnd"/>
+      <w:r>
+        <w:rPr>
+          <w:rFonts w:ascii="Calibri" w:hAnsi="Calibri" w:cs="Calibri"/>
+        </w:rPr>
+        <w:t>: To describe the development process and highlight the significant technical challenges</w:t>
       </w:r>
     </w:p>
     <w:p>
@@ -9937,161 +11077,161 @@
         <w:rPr>
           <w:rFonts w:ascii="Calibri" w:hAnsi="Calibri" w:cs="Calibri"/>
         </w:rPr>
+        <w:t>development environment (IDE, version control, etc.), your approach to modularisation (how you</w:t>
+      </w:r>
+    </w:p>
+    <w:p>
+      <w:pPr>
+        <w:spacing w:line="360" w:lineRule="auto"/>
+        <w:rPr>
+          <w:rFonts w:ascii="Calibri" w:hAnsi="Calibri" w:cs="Calibri"/>
+        </w:rPr>
+      </w:pPr>
+      <w:r>
+        <w:rPr>
+          <w:rFonts w:ascii="Calibri" w:hAnsi="Calibri" w:cs="Calibri"/>
+        </w:rPr>
+        <w:t>broke the system down into manageable parts), any use of Design Patterns (e.g., Singleton,</w:t>
+      </w:r>
+    </w:p>
+    <w:p>
+      <w:pPr>
+        <w:spacing w:line="360" w:lineRule="auto"/>
+        <w:rPr>
+          <w:rFonts w:ascii="Calibri" w:hAnsi="Calibri" w:cs="Calibri"/>
+        </w:rPr>
+      </w:pPr>
+      <w:r>
+        <w:rPr>
+          <w:rFonts w:ascii="Calibri" w:hAnsi="Calibri" w:cs="Calibri"/>
+        </w:rPr>
+        <w:t>Factory, Observer) that were implemented to ensure code quality and maintainability.</w:t>
+      </w:r>
+    </w:p>
+    <w:p>
+      <w:pPr>
+        <w:spacing w:line="360" w:lineRule="auto"/>
+        <w:rPr>
+          <w:rFonts w:ascii="Calibri" w:hAnsi="Calibri" w:cs="Calibri"/>
+        </w:rPr>
+      </w:pPr>
+      <w:r>
+        <w:rPr>
+          <w:rFonts w:ascii="Calibri" w:hAnsi="Calibri" w:cs="Calibri"/>
+        </w:rPr>
+        <w:t>• Core Feature Implementation: Choose your most critical or complex features (e.g. 2 or 3) and for</w:t>
+      </w:r>
+    </w:p>
+    <w:p>
+      <w:pPr>
+        <w:spacing w:line="360" w:lineRule="auto"/>
+        <w:rPr>
+          <w:rFonts w:ascii="Calibri" w:hAnsi="Calibri" w:cs="Calibri"/>
+        </w:rPr>
+      </w:pPr>
+      <w:r>
+        <w:rPr>
+          <w:rFonts w:ascii="Calibri" w:hAnsi="Calibri" w:cs="Calibri"/>
+        </w:rPr>
+        <w:t>each, explain how you translated the Design (from Chapter 4) into working code. Include concise,</w:t>
+      </w:r>
+    </w:p>
+    <w:p>
+      <w:pPr>
+        <w:spacing w:line="360" w:lineRule="auto"/>
+        <w:rPr>
+          <w:rFonts w:ascii="Calibri" w:hAnsi="Calibri" w:cs="Calibri"/>
+        </w:rPr>
+      </w:pPr>
+      <w:r>
+        <w:rPr>
+          <w:rFonts w:ascii="Calibri" w:hAnsi="Calibri" w:cs="Calibri"/>
+        </w:rPr>
+        <w:t>well-commented code snippets (~20–30 lines max) that demonstrate your implementation of the</w:t>
+      </w:r>
+    </w:p>
+    <w:p>
+      <w:pPr>
+        <w:spacing w:line="360" w:lineRule="auto"/>
+        <w:rPr>
+          <w:rFonts w:ascii="Calibri" w:hAnsi="Calibri" w:cs="Calibri"/>
+        </w:rPr>
+      </w:pPr>
+      <w:r>
+        <w:rPr>
+          <w:rFonts w:ascii="Calibri" w:hAnsi="Calibri" w:cs="Calibri"/>
+        </w:rPr>
+        <w:t>core logic. Avoid "boilerplate" code (like imports or basic setup). Focus on the logic that makes the</w:t>
+      </w:r>
+    </w:p>
+    <w:p>
+      <w:pPr>
+        <w:spacing w:line="360" w:lineRule="auto"/>
+        <w:rPr>
+          <w:rFonts w:ascii="Calibri" w:hAnsi="Calibri" w:cs="Calibri"/>
+        </w:rPr>
+      </w:pPr>
+      <w:r>
+        <w:rPr>
+          <w:rFonts w:ascii="Calibri" w:hAnsi="Calibri" w:cs="Calibri"/>
+        </w:rPr>
+        <w:t>feature work. Do not include full source files in the main text, these belong in your repository.</w:t>
+      </w:r>
+    </w:p>
+    <w:p>
+      <w:pPr>
+        <w:spacing w:line="360" w:lineRule="auto"/>
+        <w:rPr>
+          <w:rFonts w:ascii="Calibri" w:hAnsi="Calibri" w:cs="Calibri"/>
+        </w:rPr>
+      </w:pPr>
+      <w:r>
+        <w:rPr>
+          <w:rFonts w:ascii="Calibri" w:hAnsi="Calibri" w:cs="Calibri"/>
+        </w:rPr>
+        <w:t>• Technical Challenges and Solutions: Describe the most significant technical "roadblocks" you</w:t>
+      </w:r>
+    </w:p>
+    <w:p>
+      <w:pPr>
+        <w:spacing w:line="360" w:lineRule="auto"/>
+        <w:rPr>
+          <w:rFonts w:ascii="Calibri" w:hAnsi="Calibri" w:cs="Calibri"/>
+        </w:rPr>
+      </w:pPr>
+      <w:r>
+        <w:rPr>
+          <w:rFonts w:ascii="Calibri" w:hAnsi="Calibri" w:cs="Calibri"/>
+        </w:rPr>
+        <w:t>encountered during the implementation. For each challenge, describe the problem (e.g. the bug,</w:t>
+      </w:r>
+    </w:p>
+    <w:p>
+      <w:pPr>
+        <w:spacing w:line="360" w:lineRule="auto"/>
+        <w:rPr>
+          <w:rFonts w:ascii="Calibri" w:hAnsi="Calibri" w:cs="Calibri"/>
+        </w:rPr>
+      </w:pPr>
+      <w:r>
+        <w:rPr>
+          <w:rFonts w:ascii="Calibri" w:hAnsi="Calibri" w:cs="Calibri"/>
+        </w:rPr>
+        <w:t>integration issue, or performance bottleneck), how you identified the root cause, how you fixed</w:t>
+      </w:r>
+    </w:p>
+    <w:p>
+      <w:pPr>
+        <w:spacing w:line="360" w:lineRule="auto"/>
+        <w:rPr>
+          <w:rFonts w:ascii="Calibri" w:hAnsi="Calibri" w:cs="Calibri"/>
+        </w:rPr>
+      </w:pPr>
+      <w:r>
+        <w:rPr>
+          <w:rFonts w:ascii="Calibri" w:hAnsi="Calibri" w:cs="Calibri"/>
+        </w:rPr>
         <w:lastRenderedPageBreak/>
-        <w:t>development environment (IDE, version control, etc.), your approach to modularisation (how you</w:t>
-      </w:r>
-    </w:p>
-    <w:p>
-      <w:pPr>
-        <w:spacing w:line="360" w:lineRule="auto"/>
-        <w:rPr>
-          <w:rFonts w:ascii="Calibri" w:hAnsi="Calibri" w:cs="Calibri"/>
-        </w:rPr>
-      </w:pPr>
-      <w:r>
-        <w:rPr>
-          <w:rFonts w:ascii="Calibri" w:hAnsi="Calibri" w:cs="Calibri"/>
-        </w:rPr>
-        <w:t>broke the system down into manageable parts), any use of Design Patterns (e.g., Singleton,</w:t>
-      </w:r>
-    </w:p>
-    <w:p>
-      <w:pPr>
-        <w:spacing w:line="360" w:lineRule="auto"/>
-        <w:rPr>
-          <w:rFonts w:ascii="Calibri" w:hAnsi="Calibri" w:cs="Calibri"/>
-        </w:rPr>
-      </w:pPr>
-      <w:r>
-        <w:rPr>
-          <w:rFonts w:ascii="Calibri" w:hAnsi="Calibri" w:cs="Calibri"/>
-        </w:rPr>
-        <w:t>Factory, Observer) that were implemented to ensure code quality and maintainability.</w:t>
-      </w:r>
-    </w:p>
-    <w:p>
-      <w:pPr>
-        <w:spacing w:line="360" w:lineRule="auto"/>
-        <w:rPr>
-          <w:rFonts w:ascii="Calibri" w:hAnsi="Calibri" w:cs="Calibri"/>
-        </w:rPr>
-      </w:pPr>
-      <w:r>
-        <w:rPr>
-          <w:rFonts w:ascii="Calibri" w:hAnsi="Calibri" w:cs="Calibri"/>
-        </w:rPr>
-        <w:t>• Core Feature Implementation: Choose your most critical or complex features (e.g. 2 or 3) and for</w:t>
-      </w:r>
-    </w:p>
-    <w:p>
-      <w:pPr>
-        <w:spacing w:line="360" w:lineRule="auto"/>
-        <w:rPr>
-          <w:rFonts w:ascii="Calibri" w:hAnsi="Calibri" w:cs="Calibri"/>
-        </w:rPr>
-      </w:pPr>
-      <w:r>
-        <w:rPr>
-          <w:rFonts w:ascii="Calibri" w:hAnsi="Calibri" w:cs="Calibri"/>
-        </w:rPr>
-        <w:t>each, explain how you translated the Design (from Chapter 4) into working code. Include concise,</w:t>
-      </w:r>
-    </w:p>
-    <w:p>
-      <w:pPr>
-        <w:spacing w:line="360" w:lineRule="auto"/>
-        <w:rPr>
-          <w:rFonts w:ascii="Calibri" w:hAnsi="Calibri" w:cs="Calibri"/>
-        </w:rPr>
-      </w:pPr>
-      <w:r>
-        <w:rPr>
-          <w:rFonts w:ascii="Calibri" w:hAnsi="Calibri" w:cs="Calibri"/>
-        </w:rPr>
-        <w:t>well-commented code snippets (~20–30 lines max) that demonstrate your implementation of the</w:t>
-      </w:r>
-    </w:p>
-    <w:p>
-      <w:pPr>
-        <w:spacing w:line="360" w:lineRule="auto"/>
-        <w:rPr>
-          <w:rFonts w:ascii="Calibri" w:hAnsi="Calibri" w:cs="Calibri"/>
-        </w:rPr>
-      </w:pPr>
-      <w:r>
-        <w:rPr>
-          <w:rFonts w:ascii="Calibri" w:hAnsi="Calibri" w:cs="Calibri"/>
-        </w:rPr>
-        <w:t>core logic. Avoid "boilerplate" code (like imports or basic setup). Focus on the logic that makes the</w:t>
-      </w:r>
-    </w:p>
-    <w:p>
-      <w:pPr>
-        <w:spacing w:line="360" w:lineRule="auto"/>
-        <w:rPr>
-          <w:rFonts w:ascii="Calibri" w:hAnsi="Calibri" w:cs="Calibri"/>
-        </w:rPr>
-      </w:pPr>
-      <w:r>
-        <w:rPr>
-          <w:rFonts w:ascii="Calibri" w:hAnsi="Calibri" w:cs="Calibri"/>
-        </w:rPr>
-        <w:t>feature work. Do not include full source files in the main text, these belong in your repository.</w:t>
-      </w:r>
-    </w:p>
-    <w:p>
-      <w:pPr>
-        <w:spacing w:line="360" w:lineRule="auto"/>
-        <w:rPr>
-          <w:rFonts w:ascii="Calibri" w:hAnsi="Calibri" w:cs="Calibri"/>
-        </w:rPr>
-      </w:pPr>
-      <w:r>
-        <w:rPr>
-          <w:rFonts w:ascii="Calibri" w:hAnsi="Calibri" w:cs="Calibri"/>
-        </w:rPr>
-        <w:t>• Technical Challenges and Solutions: Describe the most significant technical "roadblocks" you</w:t>
-      </w:r>
-    </w:p>
-    <w:p>
-      <w:pPr>
-        <w:spacing w:line="360" w:lineRule="auto"/>
-        <w:rPr>
-          <w:rFonts w:ascii="Calibri" w:hAnsi="Calibri" w:cs="Calibri"/>
-        </w:rPr>
-      </w:pPr>
-      <w:r>
-        <w:rPr>
-          <w:rFonts w:ascii="Calibri" w:hAnsi="Calibri" w:cs="Calibri"/>
-        </w:rPr>
-        <w:t>encountered during the implementation. For each challenge, describe the problem (e.g. the bug,</w:t>
-      </w:r>
-    </w:p>
-    <w:p>
-      <w:pPr>
-        <w:spacing w:line="360" w:lineRule="auto"/>
-        <w:rPr>
-          <w:rFonts w:ascii="Calibri" w:hAnsi="Calibri" w:cs="Calibri"/>
-        </w:rPr>
-      </w:pPr>
-      <w:r>
-        <w:rPr>
-          <w:rFonts w:ascii="Calibri" w:hAnsi="Calibri" w:cs="Calibri"/>
-        </w:rPr>
-        <w:t>integration issue, or performance bottleneck), how you identified the root cause, how you fixed</w:t>
-      </w:r>
-    </w:p>
-    <w:p>
-      <w:pPr>
-        <w:spacing w:line="360" w:lineRule="auto"/>
-        <w:rPr>
-          <w:rFonts w:ascii="Calibri" w:hAnsi="Calibri" w:cs="Calibri"/>
-        </w:rPr>
-      </w:pPr>
-      <w:r>
-        <w:rPr>
-          <w:rFonts w:ascii="Calibri" w:hAnsi="Calibri" w:cs="Calibri"/>
-        </w:rPr>
         <w:t>or bypassed the issue and how the solution affected the final system (e.g., improved performance</w:t>
       </w:r>
     </w:p>
@@ -10210,7 +11350,6 @@
           <w:b/>
           <w:bCs/>
         </w:rPr>
-        <w:lastRenderedPageBreak/>
         <w:t>5.1 Implementation Strategy</w:t>
       </w:r>
       <w:bookmarkEnd w:id="22"/>
@@ -10335,11 +11474,19 @@
           <w:rFonts w:ascii="Calibri" w:hAnsi="Calibri" w:cs="Calibri"/>
         </w:rPr>
       </w:pPr>
-      <w:r>
-        <w:rPr>
-          <w:rFonts w:ascii="Calibri" w:hAnsi="Calibri" w:cs="Calibri"/>
-        </w:rPr>
-        <w:t>Main Focus: To provide objective evidence of the system’s quality and to critically evaluate the final</w:t>
+      <w:proofErr w:type="gramStart"/>
+      <w:r>
+        <w:rPr>
+          <w:rFonts w:ascii="Calibri" w:hAnsi="Calibri" w:cs="Calibri"/>
+        </w:rPr>
+        <w:t>Main Focus</w:t>
+      </w:r>
+      <w:proofErr w:type="gramEnd"/>
+      <w:r>
+        <w:rPr>
+          <w:rFonts w:ascii="Calibri" w:hAnsi="Calibri" w:cs="Calibri"/>
+        </w:rPr>
+        <w:t>: To provide objective evidence of the system’s quality and to critically evaluate the final</w:t>
       </w:r>
     </w:p>
     <w:p>
@@ -10451,6 +11598,7 @@
         <w:rPr>
           <w:rFonts w:ascii="Calibri" w:hAnsi="Calibri" w:cs="Calibri"/>
         </w:rPr>
+        <w:lastRenderedPageBreak/>
         <w:t>• Evaluation of Non-Functional Attributes: Demonstrate how the system performs against the</w:t>
       </w:r>
     </w:p>
@@ -10563,7 +11711,6 @@
         <w:rPr>
           <w:rFonts w:ascii="Calibri" w:hAnsi="Calibri" w:cs="Calibri"/>
         </w:rPr>
-        <w:lastRenderedPageBreak/>
         <w:t>system.</w:t>
       </w:r>
     </w:p>
@@ -10679,11 +11826,19 @@
           <w:rFonts w:ascii="Calibri" w:hAnsi="Calibri" w:cs="Calibri"/>
         </w:rPr>
       </w:pPr>
-      <w:r>
-        <w:rPr>
-          <w:rFonts w:ascii="Calibri" w:hAnsi="Calibri" w:cs="Calibri"/>
-        </w:rPr>
-        <w:t>Main Focus: To provide a final summary of the project’s achievements and a critical roadmap for the</w:t>
+      <w:proofErr w:type="gramStart"/>
+      <w:r>
+        <w:rPr>
+          <w:rFonts w:ascii="Calibri" w:hAnsi="Calibri" w:cs="Calibri"/>
+        </w:rPr>
+        <w:t>Main Focus</w:t>
+      </w:r>
+      <w:proofErr w:type="gramEnd"/>
+      <w:r>
+        <w:rPr>
+          <w:rFonts w:ascii="Calibri" w:hAnsi="Calibri" w:cs="Calibri"/>
+        </w:rPr>
+        <w:t>: To provide a final summary of the project’s achievements and a critical roadmap for the</w:t>
       </w:r>
     </w:p>
     <w:p>
@@ -10809,6 +11964,7 @@
         <w:rPr>
           <w:rFonts w:ascii="Calibri" w:hAnsi="Calibri" w:cs="Calibri"/>
         </w:rPr>
+        <w:lastRenderedPageBreak/>
         <w:t>identified in the Evaluation (Chapter 6), emerging technologies or integrations that could enhance</w:t>
       </w:r>
     </w:p>
@@ -10843,7 +11999,6 @@
           <w:b/>
           <w:bCs/>
         </w:rPr>
-        <w:lastRenderedPageBreak/>
         <w:t>7.1 Project Summary</w:t>
       </w:r>
       <w:bookmarkEnd w:id="33"/>
@@ -10992,7 +12147,21 @@
         <w:rPr>
           <w:rFonts w:ascii="Calibri" w:hAnsi="Calibri" w:cs="Calibri"/>
         </w:rPr>
-        <w:t>• Official Documentation: "The system uses the React 'UseContext' hook for global state</w:t>
+        <w:t>• Official Documentation: "The system uses the React '</w:t>
+      </w:r>
+      <w:proofErr w:type="spellStart"/>
+      <w:r>
+        <w:rPr>
+          <w:rFonts w:ascii="Calibri" w:hAnsi="Calibri" w:cs="Calibri"/>
+        </w:rPr>
+        <w:t>UseContext</w:t>
+      </w:r>
+      <w:proofErr w:type="spellEnd"/>
+      <w:r>
+        <w:rPr>
+          <w:rFonts w:ascii="Calibri" w:hAnsi="Calibri" w:cs="Calibri"/>
+        </w:rPr>
+        <w:t>' hook for global state</w:t>
       </w:r>
     </w:p>
     <w:p>
@@ -11034,7 +12203,21 @@
         <w:rPr>
           <w:rFonts w:ascii="Calibri" w:hAnsi="Calibri" w:cs="Calibri"/>
         </w:rPr>
-        <w:t>solution by 'DevGuru' on Stack Overflow (2025)."</w:t>
+        <w:t>solution by '</w:t>
+      </w:r>
+      <w:proofErr w:type="spellStart"/>
+      <w:r>
+        <w:rPr>
+          <w:rFonts w:ascii="Calibri" w:hAnsi="Calibri" w:cs="Calibri"/>
+        </w:rPr>
+        <w:t>DevGuru</w:t>
+      </w:r>
+      <w:proofErr w:type="spellEnd"/>
+      <w:r>
+        <w:rPr>
+          <w:rFonts w:ascii="Calibri" w:hAnsi="Calibri" w:cs="Calibri"/>
+        </w:rPr>
+        <w:t>' on Stack Overflow (2025)."</w:t>
       </w:r>
     </w:p>
     <w:p>
@@ -11090,7 +12273,21 @@
         <w:rPr>
           <w:rFonts w:ascii="Calibri" w:hAnsi="Calibri" w:cs="Calibri"/>
         </w:rPr>
-        <w:t>• Meta. (2026). React Documentation: Scaling State. [Online]. Available at: react.dev/docs</w:t>
+        <w:t xml:space="preserve">• Meta. (2026). React Documentation: Scaling State. [Online]. Available at: </w:t>
+      </w:r>
+      <w:proofErr w:type="spellStart"/>
+      <w:r>
+        <w:rPr>
+          <w:rFonts w:ascii="Calibri" w:hAnsi="Calibri" w:cs="Calibri"/>
+        </w:rPr>
+        <w:t>react.dev</w:t>
+      </w:r>
+      <w:proofErr w:type="spellEnd"/>
+      <w:r>
+        <w:rPr>
+          <w:rFonts w:ascii="Calibri" w:hAnsi="Calibri" w:cs="Calibri"/>
+        </w:rPr>
+        <w:t>/docs</w:t>
       </w:r>
     </w:p>
     <w:p>
@@ -11146,6 +12343,7 @@
         <w:rPr>
           <w:rFonts w:ascii="Calibri" w:hAnsi="Calibri" w:cs="Calibri"/>
         </w:rPr>
+        <w:lastRenderedPageBreak/>
         <w:t>If you use a specific code snippet from the web or an AI tool, you must attribute it in the source code.</w:t>
       </w:r>
     </w:p>
@@ -11174,7 +12372,6 @@
         <w:rPr>
           <w:rFonts w:ascii="Calibri" w:hAnsi="Calibri" w:cs="Calibri"/>
         </w:rPr>
-        <w:lastRenderedPageBreak/>
         <w:t>Example of an attributed snippet:</w:t>
       </w:r>
     </w:p>
@@ -11259,7 +12456,35 @@
         <w:rPr>
           <w:rFonts w:ascii="Calibri" w:hAnsi="Calibri" w:cs="Calibri"/>
         </w:rPr>
-        <w:t>function validateEmail(email) { ... }</w:t>
+        <w:t xml:space="preserve">function </w:t>
+      </w:r>
+      <w:proofErr w:type="spellStart"/>
+      <w:r>
+        <w:rPr>
+          <w:rFonts w:ascii="Calibri" w:hAnsi="Calibri" w:cs="Calibri"/>
+        </w:rPr>
+        <w:t>validateEmail</w:t>
+      </w:r>
+      <w:proofErr w:type="spellEnd"/>
+      <w:r>
+        <w:rPr>
+          <w:rFonts w:ascii="Calibri" w:hAnsi="Calibri" w:cs="Calibri"/>
+        </w:rPr>
+        <w:t xml:space="preserve">(email) </w:t>
+      </w:r>
+      <w:proofErr w:type="gramStart"/>
+      <w:r>
+        <w:rPr>
+          <w:rFonts w:ascii="Calibri" w:hAnsi="Calibri" w:cs="Calibri"/>
+        </w:rPr>
+        <w:t>{ ...</w:t>
+      </w:r>
+      <w:proofErr w:type="gramEnd"/>
+      <w:r>
+        <w:rPr>
+          <w:rFonts w:ascii="Calibri" w:hAnsi="Calibri" w:cs="Calibri"/>
+        </w:rPr>
+        <w:t xml:space="preserve"> }</w:t>
       </w:r>
     </w:p>
     <w:p>
@@ -11285,56 +12510,47 @@
           <w:b/>
           <w:bCs/>
         </w:rPr>
-        <w:t>remember to reference th following that ive used for help,</w:t>
-      </w:r>
-    </w:p>
-    <w:p>
-      <w:pPr>
-        <w:spacing w:line="360" w:lineRule="auto"/>
+        <w:t xml:space="preserve">remember to reference </w:t>
+      </w:r>
+      <w:proofErr w:type="spellStart"/>
+      <w:r>
         <w:rPr>
           <w:rFonts w:ascii="Calibri" w:hAnsi="Calibri" w:cs="Calibri"/>
           <w:b/>
           <w:bCs/>
         </w:rPr>
-      </w:pPr>
+        <w:t>th</w:t>
+      </w:r>
+      <w:proofErr w:type="spellEnd"/>
       <w:r>
         <w:rPr>
           <w:rFonts w:ascii="Calibri" w:hAnsi="Calibri" w:cs="Calibri"/>
           <w:b/>
           <w:bCs/>
         </w:rPr>
-        <w:t>Phone responsiveness using @media</w:t>
-      </w:r>
-    </w:p>
-    <w:p>
-      <w:pPr>
-        <w:spacing w:line="360" w:lineRule="auto"/>
+        <w:t xml:space="preserve"> following that </w:t>
+      </w:r>
+      <w:proofErr w:type="spellStart"/>
+      <w:r>
         <w:rPr>
           <w:rFonts w:ascii="Calibri" w:hAnsi="Calibri" w:cs="Calibri"/>
           <w:b/>
           <w:bCs/>
         </w:rPr>
-      </w:pPr>
+        <w:t>ive</w:t>
+      </w:r>
+      <w:proofErr w:type="spellEnd"/>
       <w:r>
         <w:rPr>
           <w:rFonts w:ascii="Calibri" w:hAnsi="Calibri" w:cs="Calibri"/>
           <w:b/>
           <w:bCs/>
         </w:rPr>
-        <w:t xml:space="preserve">Html </w:t>
-      </w:r>
-    </w:p>
-    <w:p>
-      <w:pPr>
-        <w:spacing w:line="360" w:lineRule="auto"/>
-        <w:rPr>
-          <w:rFonts w:ascii="Calibri" w:hAnsi="Calibri" w:cs="Calibri"/>
-        </w:rPr>
-      </w:pPr>
-    </w:p>
-    <w:p>
-      <w:pPr>
-        <w:pStyle w:val="Heading1"/>
+        <w:t xml:space="preserve"> used for help,</w:t>
+      </w:r>
+    </w:p>
+    <w:p>
+      <w:pPr>
         <w:spacing w:line="360" w:lineRule="auto"/>
         <w:rPr>
           <w:rFonts w:ascii="Calibri" w:hAnsi="Calibri" w:cs="Calibri"/>
@@ -11342,13 +12558,58 @@
           <w:bCs/>
         </w:rPr>
       </w:pPr>
-      <w:bookmarkStart w:id="37" w:name="_Toc227860144"/>
       <w:r>
         <w:rPr>
           <w:rFonts w:ascii="Calibri" w:hAnsi="Calibri" w:cs="Calibri"/>
           <w:b/>
           <w:bCs/>
         </w:rPr>
+        <w:t>Phone responsiveness using @media</w:t>
+      </w:r>
+    </w:p>
+    <w:p>
+      <w:pPr>
+        <w:spacing w:line="360" w:lineRule="auto"/>
+        <w:rPr>
+          <w:rFonts w:ascii="Calibri" w:hAnsi="Calibri" w:cs="Calibri"/>
+          <w:b/>
+          <w:bCs/>
+        </w:rPr>
+      </w:pPr>
+      <w:r>
+        <w:rPr>
+          <w:rFonts w:ascii="Calibri" w:hAnsi="Calibri" w:cs="Calibri"/>
+          <w:b/>
+          <w:bCs/>
+        </w:rPr>
+        <w:t xml:space="preserve">Html </w:t>
+      </w:r>
+    </w:p>
+    <w:p>
+      <w:pPr>
+        <w:spacing w:line="360" w:lineRule="auto"/>
+        <w:rPr>
+          <w:rFonts w:ascii="Calibri" w:hAnsi="Calibri" w:cs="Calibri"/>
+        </w:rPr>
+      </w:pPr>
+    </w:p>
+    <w:p>
+      <w:pPr>
+        <w:pStyle w:val="Heading1"/>
+        <w:spacing w:line="360" w:lineRule="auto"/>
+        <w:rPr>
+          <w:rFonts w:ascii="Calibri" w:hAnsi="Calibri" w:cs="Calibri"/>
+          <w:b/>
+          <w:bCs/>
+        </w:rPr>
+      </w:pPr>
+      <w:bookmarkStart w:id="37" w:name="_Toc227860144"/>
+      <w:r>
+        <w:rPr>
+          <w:rFonts w:ascii="Calibri" w:hAnsi="Calibri" w:cs="Calibri"/>
+          <w:b/>
+          <w:bCs/>
+        </w:rPr>
         <w:t>Appendices</w:t>
       </w:r>
       <w:bookmarkEnd w:id="37"/>
@@ -11360,7 +12621,7 @@
           <w:rFonts w:ascii="Calibri" w:hAnsi="Calibri" w:cs="Calibri"/>
         </w:rPr>
       </w:pPr>
-      <w:hyperlink r:id="rId9" w:history="1">
+      <w:hyperlink r:id="rId10" w:history="1">
         <w:r>
           <w:rPr>
             <w:rStyle w:val="Hyperlink"/>
@@ -11498,6 +12759,7 @@
           <w:b/>
           <w:bCs/>
         </w:rPr>
+        <w:lastRenderedPageBreak/>
         <w:t>1.3 System Overview and User Profile:</w:t>
       </w:r>
     </w:p>
@@ -11531,7 +12793,6 @@
         <w:rPr>
           <w:rFonts w:ascii="Calibri" w:hAnsi="Calibri" w:cs="Calibri"/>
         </w:rPr>
-        <w:lastRenderedPageBreak/>
         <w:t>Log and monitor their training sessions and KPIs such as nutrition, climbing grade or finger strength.</w:t>
       </w:r>
     </w:p>
@@ -11695,7 +12956,35 @@
         <w:rPr>
           <w:rFonts w:ascii="Calibri" w:hAnsi="Calibri" w:cs="Calibri"/>
         </w:rPr>
-        <w:t>Many Bouldering and climbing communities are increasingly using more mobile and web applications to connect with other users; log climbs they’ve done and discover new routes in nearby areas. Some Examples of apps like this include TheCrag and TopLogger, these apps allow climbers to log their ascents, track their progress and engage with their communities.</w:t>
+        <w:t xml:space="preserve">Many Bouldering and climbing communities are increasingly using more mobile and web applications to connect with other users; log climbs they’ve done and discover new routes in nearby areas. Some Examples of apps like this include </w:t>
+      </w:r>
+      <w:proofErr w:type="spellStart"/>
+      <w:r>
+        <w:rPr>
+          <w:rFonts w:ascii="Calibri" w:hAnsi="Calibri" w:cs="Calibri"/>
+        </w:rPr>
+        <w:t>TheCrag</w:t>
+      </w:r>
+      <w:proofErr w:type="spellEnd"/>
+      <w:r>
+        <w:rPr>
+          <w:rFonts w:ascii="Calibri" w:hAnsi="Calibri" w:cs="Calibri"/>
+        </w:rPr>
+        <w:t xml:space="preserve"> and </w:t>
+      </w:r>
+      <w:proofErr w:type="spellStart"/>
+      <w:r>
+        <w:rPr>
+          <w:rFonts w:ascii="Calibri" w:hAnsi="Calibri" w:cs="Calibri"/>
+        </w:rPr>
+        <w:t>TopLogger</w:t>
+      </w:r>
+      <w:proofErr w:type="spellEnd"/>
+      <w:r>
+        <w:rPr>
+          <w:rFonts w:ascii="Calibri" w:hAnsi="Calibri" w:cs="Calibri"/>
+        </w:rPr>
+        <w:t>, these apps allow climbers to log their ascents, track their progress and engage with their communities.</w:t>
       </w:r>
     </w:p>
     <w:p>
@@ -11751,7 +13040,14 @@
         <w:rPr>
           <w:rFonts w:ascii="Calibri" w:hAnsi="Calibri" w:cs="Calibri"/>
         </w:rPr>
-        <w:t>Many climbers, particularly indoor boulderers, tend to visit their local gym without a structured training plan. Instead, they would often climb whichever routes appear most interesting at the time, completely neglecting targeted exercises or training plans. This type of mindset can future goals and performance of climbers and can make progress harder to measure without a baseline.</w:t>
+        <w:t xml:space="preserve">Many climbers, particularly indoor boulderers, tend to visit their local gym without a structured training plan. Instead, they would often climb whichever routes appear most interesting at the time, </w:t>
+      </w:r>
+      <w:r>
+        <w:rPr>
+          <w:rFonts w:ascii="Calibri" w:hAnsi="Calibri" w:cs="Calibri"/>
+        </w:rPr>
+        <w:lastRenderedPageBreak/>
+        <w:t>completely neglecting targeted exercises or training plans. This type of mindset can future goals and performance of climbers and can make progress harder to measure without a baseline.</w:t>
       </w:r>
     </w:p>
     <w:p>
@@ -12334,7 +13630,16 @@
                 <w:sz w:val="22"/>
                 <w:szCs w:val="22"/>
               </w:rPr>
-              <w:t>The system presents user progress data in an interactive dashboard which is intuitive to read, including charts, streaks, and leaderboard comparisons against friends or followers.</w:t>
+              <w:t xml:space="preserve">The system presents user progress data in an interactive dashboard which is intuitive to read, including charts, streaks, and </w:t>
+            </w:r>
+            <w:r>
+              <w:rPr>
+                <w:rFonts w:ascii="Calibri" w:hAnsi="Calibri" w:cs="Calibri"/>
+                <w:sz w:val="22"/>
+                <w:szCs w:val="22"/>
+              </w:rPr>
+              <w:lastRenderedPageBreak/>
+              <w:t>leaderboard comparisons against friends or followers.</w:t>
             </w:r>
           </w:p>
         </w:tc>
@@ -12357,7 +13662,17 @@
                 <w:sz w:val="22"/>
                 <w:szCs w:val="22"/>
               </w:rPr>
-              <w:t>Allow users to visualize their improvements and can drive engagement in the app through gamification.</w:t>
+              <w:lastRenderedPageBreak/>
+              <w:t xml:space="preserve">Allow users to visualize their improvements and can drive </w:t>
+            </w:r>
+            <w:r>
+              <w:rPr>
+                <w:rFonts w:ascii="Calibri" w:hAnsi="Calibri" w:cs="Calibri"/>
+                <w:sz w:val="22"/>
+                <w:szCs w:val="22"/>
+              </w:rPr>
+              <w:lastRenderedPageBreak/>
+              <w:t>engagement in the app through gamification.</w:t>
             </w:r>
           </w:p>
         </w:tc>
@@ -13057,7 +14372,16 @@
                 <w:sz w:val="22"/>
                 <w:szCs w:val="22"/>
               </w:rPr>
-              <w:t>I am Knowledgeable in java and object orientated programming, so Spring boot will help with building modularly. Handles user profiles (FR1), training log storage (FR2), Community posts (FR4).</w:t>
+              <w:t xml:space="preserve">I am Knowledgeable in java and object orientated programming, so Spring boot will help with building modularly. Handles user </w:t>
+            </w:r>
+            <w:r>
+              <w:rPr>
+                <w:rFonts w:ascii="Calibri" w:hAnsi="Calibri" w:cs="Calibri"/>
+                <w:sz w:val="22"/>
+                <w:szCs w:val="22"/>
+              </w:rPr>
+              <w:lastRenderedPageBreak/>
+              <w:t>profiles (FR1), training log storage (FR2), Community posts (FR4).</w:t>
             </w:r>
           </w:p>
         </w:tc>
@@ -13660,7 +14984,7 @@
         </w:rPr>
         <w:lastRenderedPageBreak/>
         <w:drawing>
-          <wp:inline distT="0" distB="0" distL="0" distR="0" wp14:anchorId="42BA402F" wp14:editId="4BCA2E87">
+          <wp:inline distT="0" distB="0" distL="0" distR="0" wp14:anchorId="42BA402F" wp14:editId="24EB7A52">
             <wp:extent cx="5731510" cy="1630018"/>
             <wp:effectExtent l="0" t="0" r="2540" b="8890"/>
             <wp:docPr id="895670306" name="Picture 1" descr="A graph with blue and gray bars&#10;&#10;AI-generated content may be incorrect."/>
@@ -13675,7 +14999,7 @@
                     <pic:cNvPicPr/>
                   </pic:nvPicPr>
                   <pic:blipFill>
-                    <a:blip r:embed="rId10" cstate="print">
+                    <a:blip r:embed="rId11" cstate="print">
                       <a:extLst>
                         <a:ext uri="{28A0092B-C50C-407E-A947-70E740481C1C}">
                           <a14:useLocalDpi xmlns:a14="http://schemas.microsoft.com/office/drawing/2010/main" val="0"/>
@@ -14888,7 +16212,25 @@
                 <w:sz w:val="22"/>
                 <w:szCs w:val="22"/>
               </w:rPr>
-              <w:t>As I user, I want access to my own unique and personaliseable account so that my progress can be saved.</w:t>
+              <w:t xml:space="preserve">As I user, I want access to my own unique and </w:t>
+            </w:r>
+            <w:proofErr w:type="spellStart"/>
+            <w:r>
+              <w:rPr>
+                <w:rFonts w:ascii="Calibri" w:hAnsi="Calibri" w:cs="Calibri"/>
+                <w:sz w:val="22"/>
+                <w:szCs w:val="22"/>
+              </w:rPr>
+              <w:t>personaliseable</w:t>
+            </w:r>
+            <w:proofErr w:type="spellEnd"/>
+            <w:r>
+              <w:rPr>
+                <w:rFonts w:ascii="Calibri" w:hAnsi="Calibri" w:cs="Calibri"/>
+                <w:sz w:val="22"/>
+                <w:szCs w:val="22"/>
+              </w:rPr>
+              <w:t xml:space="preserve"> account so that my progress can be saved.</w:t>
             </w:r>
           </w:p>
         </w:tc>
@@ -15815,14 +17157,6 @@
         <w:spacing w:line="360" w:lineRule="auto"/>
         <w:rPr>
           <w:rFonts w:ascii="Calibri" w:hAnsi="Calibri" w:cs="Calibri"/>
-        </w:rPr>
-      </w:pPr>
-    </w:p>
-    <w:p>
-      <w:pPr>
-        <w:spacing w:line="360" w:lineRule="auto"/>
-        <w:rPr>
-          <w:rFonts w:ascii="Calibri" w:hAnsi="Calibri" w:cs="Calibri"/>
           <w:b/>
           <w:bCs/>
         </w:rPr>
@@ -15833,466 +17167,23 @@
           <w:b/>
           <w:bCs/>
         </w:rPr>
-        <w:t>Use Case 3: View Dashboard Insights</w:t>
-      </w:r>
-    </w:p>
-    <w:p>
-      <w:pPr>
-        <w:spacing w:line="360" w:lineRule="auto"/>
-        <w:rPr>
-          <w:rFonts w:ascii="Calibri" w:hAnsi="Calibri" w:cs="Calibri"/>
-        </w:rPr>
-      </w:pPr>
+        <w:t xml:space="preserve">Use Case </w:t>
+      </w:r>
       <w:r>
         <w:rPr>
           <w:rFonts w:ascii="Calibri" w:hAnsi="Calibri" w:cs="Calibri"/>
           <w:b/>
           <w:bCs/>
         </w:rPr>
-        <w:t>Primary actor</w:t>
-      </w:r>
-      <w:r>
-        <w:rPr>
-          <w:rFonts w:ascii="Calibri" w:hAnsi="Calibri" w:cs="Calibri"/>
-        </w:rPr>
-        <w:t>: Authenticated User</w:t>
-      </w:r>
-    </w:p>
-    <w:p>
-      <w:pPr>
-        <w:spacing w:line="360" w:lineRule="auto"/>
+        <w:t>5</w:t>
+      </w:r>
+      <w:r>
         <w:rPr>
           <w:rFonts w:ascii="Calibri" w:hAnsi="Calibri" w:cs="Calibri"/>
           <w:b/>
           <w:bCs/>
         </w:rPr>
-      </w:pPr>
-      <w:r>
-        <w:rPr>
-          <w:rFonts w:ascii="Calibri" w:hAnsi="Calibri" w:cs="Calibri"/>
-          <w:b/>
-          <w:bCs/>
-        </w:rPr>
-        <w:t xml:space="preserve">Preconditions: </w:t>
-      </w:r>
-    </w:p>
-    <w:p>
-      <w:pPr>
-        <w:pStyle w:val="ListParagraph"/>
-        <w:numPr>
-          <w:ilvl w:val="0"/>
-          <w:numId w:val="7"/>
-        </w:numPr>
-        <w:spacing w:line="360" w:lineRule="auto"/>
-        <w:rPr>
-          <w:rFonts w:ascii="Calibri" w:hAnsi="Calibri" w:cs="Calibri"/>
-        </w:rPr>
-      </w:pPr>
-      <w:r>
-        <w:rPr>
-          <w:rFonts w:ascii="Calibri" w:hAnsi="Calibri" w:cs="Calibri"/>
-        </w:rPr>
-        <w:t>The user must be logged into the system</w:t>
-      </w:r>
-    </w:p>
-    <w:p>
-      <w:pPr>
-        <w:pStyle w:val="ListParagraph"/>
-        <w:numPr>
-          <w:ilvl w:val="0"/>
-          <w:numId w:val="7"/>
-        </w:numPr>
-        <w:spacing w:line="360" w:lineRule="auto"/>
-        <w:rPr>
-          <w:rFonts w:ascii="Calibri" w:hAnsi="Calibri" w:cs="Calibri"/>
-        </w:rPr>
-      </w:pPr>
-      <w:r>
-        <w:rPr>
-          <w:rFonts w:ascii="Calibri" w:hAnsi="Calibri" w:cs="Calibri"/>
-        </w:rPr>
-        <w:t>User must have previously recorded some training sessions or nutritional data for meaningful results to be displayed.</w:t>
-      </w:r>
-    </w:p>
-    <w:p>
-      <w:pPr>
-        <w:pStyle w:val="ListParagraph"/>
-        <w:numPr>
-          <w:ilvl w:val="0"/>
-          <w:numId w:val="7"/>
-        </w:numPr>
-        <w:spacing w:line="360" w:lineRule="auto"/>
-        <w:rPr>
-          <w:rFonts w:ascii="Calibri" w:hAnsi="Calibri" w:cs="Calibri"/>
-        </w:rPr>
-      </w:pPr>
-      <w:r>
-        <w:rPr>
-          <w:rFonts w:ascii="Calibri" w:hAnsi="Calibri" w:cs="Calibri"/>
-        </w:rPr>
-        <w:t>The user must have a valid account profile</w:t>
-      </w:r>
-    </w:p>
-    <w:p>
-      <w:pPr>
-        <w:spacing w:line="360" w:lineRule="auto"/>
-        <w:rPr>
-          <w:rFonts w:ascii="Calibri" w:hAnsi="Calibri" w:cs="Calibri"/>
-          <w:b/>
-          <w:bCs/>
-        </w:rPr>
-      </w:pPr>
-      <w:r>
-        <w:rPr>
-          <w:rFonts w:ascii="Calibri" w:hAnsi="Calibri" w:cs="Calibri"/>
-          <w:b/>
-          <w:bCs/>
-        </w:rPr>
-        <w:t>Trigger:</w:t>
-      </w:r>
-    </w:p>
-    <w:p>
-      <w:pPr>
-        <w:pStyle w:val="ListParagraph"/>
-        <w:numPr>
-          <w:ilvl w:val="0"/>
-          <w:numId w:val="7"/>
-        </w:numPr>
-        <w:spacing w:line="360" w:lineRule="auto"/>
-        <w:rPr>
-          <w:rFonts w:ascii="Calibri" w:hAnsi="Calibri" w:cs="Calibri"/>
-        </w:rPr>
-      </w:pPr>
-      <w:r>
-        <w:rPr>
-          <w:rFonts w:ascii="Calibri" w:hAnsi="Calibri" w:cs="Calibri"/>
-        </w:rPr>
-        <w:t>The user navigates to the dashboard page.</w:t>
-      </w:r>
-    </w:p>
-    <w:p>
-      <w:pPr>
-        <w:spacing w:line="360" w:lineRule="auto"/>
-        <w:rPr>
-          <w:rFonts w:ascii="Calibri" w:hAnsi="Calibri" w:cs="Calibri"/>
-          <w:b/>
-          <w:bCs/>
-        </w:rPr>
-      </w:pPr>
-      <w:r>
-        <w:rPr>
-          <w:rFonts w:ascii="Calibri" w:hAnsi="Calibri" w:cs="Calibri"/>
-          <w:b/>
-          <w:bCs/>
-        </w:rPr>
-        <w:t>Main Success Scenario:</w:t>
-      </w:r>
-    </w:p>
-    <w:p>
-      <w:pPr>
-        <w:pStyle w:val="ListParagraph"/>
-        <w:numPr>
-          <w:ilvl w:val="0"/>
-          <w:numId w:val="11"/>
-        </w:numPr>
-        <w:spacing w:line="360" w:lineRule="auto"/>
-        <w:rPr>
-          <w:rFonts w:ascii="Calibri" w:hAnsi="Calibri" w:cs="Calibri"/>
-        </w:rPr>
-      </w:pPr>
-      <w:r>
-        <w:rPr>
-          <w:rFonts w:ascii="Calibri" w:hAnsi="Calibri" w:cs="Calibri"/>
-        </w:rPr>
-        <w:t>The system retrieves the user’s stored training and nutritional data.</w:t>
-      </w:r>
-    </w:p>
-    <w:p>
-      <w:pPr>
-        <w:pStyle w:val="ListParagraph"/>
-        <w:numPr>
-          <w:ilvl w:val="0"/>
-          <w:numId w:val="11"/>
-        </w:numPr>
-        <w:spacing w:line="360" w:lineRule="auto"/>
-        <w:rPr>
-          <w:rFonts w:ascii="Calibri" w:hAnsi="Calibri" w:cs="Calibri"/>
-        </w:rPr>
-      </w:pPr>
-      <w:r>
-        <w:rPr>
-          <w:rFonts w:ascii="Calibri" w:hAnsi="Calibri" w:cs="Calibri"/>
-        </w:rPr>
-        <w:t>The system details relevant metrics across such the defined time periods, such as the previous 7 or 30 days.</w:t>
-      </w:r>
-    </w:p>
-    <w:p>
-      <w:pPr>
-        <w:pStyle w:val="ListParagraph"/>
-        <w:numPr>
-          <w:ilvl w:val="0"/>
-          <w:numId w:val="11"/>
-        </w:numPr>
-        <w:spacing w:line="360" w:lineRule="auto"/>
-        <w:rPr>
-          <w:rFonts w:ascii="Calibri" w:hAnsi="Calibri" w:cs="Calibri"/>
-        </w:rPr>
-      </w:pPr>
-      <w:r>
-        <w:rPr>
-          <w:rFonts w:ascii="Calibri" w:hAnsi="Calibri" w:cs="Calibri"/>
-        </w:rPr>
-        <w:lastRenderedPageBreak/>
-        <w:t>The system calculates summary values, including total sessions, total minutes, average intensity, calorie totals, and progress against personalised goals.</w:t>
-      </w:r>
-    </w:p>
-    <w:p>
-      <w:pPr>
-        <w:pStyle w:val="ListParagraph"/>
-        <w:numPr>
-          <w:ilvl w:val="0"/>
-          <w:numId w:val="11"/>
-        </w:numPr>
-        <w:spacing w:line="360" w:lineRule="auto"/>
-        <w:rPr>
-          <w:rFonts w:ascii="Calibri" w:hAnsi="Calibri" w:cs="Calibri"/>
-        </w:rPr>
-      </w:pPr>
-      <w:r>
-        <w:rPr>
-          <w:rFonts w:ascii="Calibri" w:hAnsi="Calibri" w:cs="Calibri"/>
-        </w:rPr>
-        <w:t>The system generates a session and nutritional chart, based on aggregated data.</w:t>
-      </w:r>
-    </w:p>
-    <w:p>
-      <w:pPr>
-        <w:pStyle w:val="ListParagraph"/>
-        <w:numPr>
-          <w:ilvl w:val="0"/>
-          <w:numId w:val="11"/>
-        </w:numPr>
-        <w:spacing w:line="360" w:lineRule="auto"/>
-        <w:rPr>
-          <w:rFonts w:ascii="Calibri" w:hAnsi="Calibri" w:cs="Calibri"/>
-        </w:rPr>
-      </w:pPr>
-      <w:r>
-        <w:rPr>
-          <w:rFonts w:ascii="Calibri" w:hAnsi="Calibri" w:cs="Calibri"/>
-        </w:rPr>
-        <w:t>Charts can be swapped between, and individual metrics can be shown or hidden.</w:t>
-      </w:r>
-    </w:p>
-    <w:p>
-      <w:pPr>
-        <w:pStyle w:val="ListParagraph"/>
-        <w:numPr>
-          <w:ilvl w:val="0"/>
-          <w:numId w:val="11"/>
-        </w:numPr>
-        <w:spacing w:line="360" w:lineRule="auto"/>
-        <w:rPr>
-          <w:rFonts w:ascii="Calibri" w:hAnsi="Calibri" w:cs="Calibri"/>
-        </w:rPr>
-      </w:pPr>
-      <w:r>
-        <w:rPr>
-          <w:rFonts w:ascii="Calibri" w:hAnsi="Calibri" w:cs="Calibri"/>
-        </w:rPr>
-        <w:t>The system evaluates the data against the predefined conditions and produces tailored rule-based insights.</w:t>
-      </w:r>
-    </w:p>
-    <w:p>
-      <w:pPr>
-        <w:pStyle w:val="ListParagraph"/>
-        <w:numPr>
-          <w:ilvl w:val="0"/>
-          <w:numId w:val="11"/>
-        </w:numPr>
-        <w:spacing w:line="360" w:lineRule="auto"/>
-        <w:rPr>
-          <w:rFonts w:ascii="Calibri" w:hAnsi="Calibri" w:cs="Calibri"/>
-        </w:rPr>
-      </w:pPr>
-      <w:r>
-        <w:rPr>
-          <w:rFonts w:ascii="Calibri" w:hAnsi="Calibri" w:cs="Calibri"/>
-        </w:rPr>
-        <w:t>Weekly goal progress indicators are available and bouldering totals.</w:t>
-      </w:r>
-    </w:p>
-    <w:p>
-      <w:pPr>
-        <w:pStyle w:val="ListParagraph"/>
-        <w:numPr>
-          <w:ilvl w:val="0"/>
-          <w:numId w:val="11"/>
-        </w:numPr>
-        <w:spacing w:line="360" w:lineRule="auto"/>
-        <w:rPr>
-          <w:rFonts w:ascii="Calibri" w:hAnsi="Calibri" w:cs="Calibri"/>
-        </w:rPr>
-      </w:pPr>
-      <w:r>
-        <w:rPr>
-          <w:rFonts w:ascii="Calibri" w:hAnsi="Calibri" w:cs="Calibri"/>
-        </w:rPr>
-        <w:t>The completed dashboard is presented to the user.</w:t>
-      </w:r>
-    </w:p>
-    <w:p>
-      <w:pPr>
-        <w:spacing w:line="360" w:lineRule="auto"/>
-        <w:rPr>
-          <w:rFonts w:ascii="Calibri" w:hAnsi="Calibri" w:cs="Calibri"/>
-          <w:b/>
-          <w:bCs/>
-        </w:rPr>
-      </w:pPr>
-      <w:r>
-        <w:rPr>
-          <w:rFonts w:ascii="Calibri" w:hAnsi="Calibri" w:cs="Calibri"/>
-          <w:b/>
-          <w:bCs/>
-        </w:rPr>
-        <w:t>Alternative/Exception Flows:</w:t>
-      </w:r>
-    </w:p>
-    <w:p>
-      <w:pPr>
-        <w:pStyle w:val="ListParagraph"/>
-        <w:numPr>
-          <w:ilvl w:val="0"/>
-          <w:numId w:val="7"/>
-        </w:numPr>
-        <w:spacing w:line="360" w:lineRule="auto"/>
-        <w:rPr>
-          <w:rFonts w:ascii="Calibri" w:hAnsi="Calibri" w:cs="Calibri"/>
-          <w:b/>
-          <w:bCs/>
-        </w:rPr>
-      </w:pPr>
-      <w:r>
-        <w:rPr>
-          <w:rFonts w:ascii="Calibri" w:hAnsi="Calibri" w:cs="Calibri"/>
-        </w:rPr>
-        <w:t xml:space="preserve">If </w:t>
-      </w:r>
-      <w:r>
-        <w:rPr>
-          <w:rFonts w:ascii="Calibri" w:hAnsi="Calibri" w:cs="Calibri"/>
-        </w:rPr>
-        <w:t>insufficient training or nutritional data exists, then the system displays a dashboard with partial results and appropriate empty slate messaging.</w:t>
-      </w:r>
-    </w:p>
-    <w:p>
-      <w:pPr>
-        <w:pStyle w:val="ListParagraph"/>
-        <w:numPr>
-          <w:ilvl w:val="0"/>
-          <w:numId w:val="7"/>
-        </w:numPr>
-        <w:spacing w:line="360" w:lineRule="auto"/>
-        <w:rPr>
-          <w:rFonts w:ascii="Calibri" w:hAnsi="Calibri" w:cs="Calibri"/>
-          <w:b/>
-          <w:bCs/>
-        </w:rPr>
-      </w:pPr>
-      <w:r>
-        <w:rPr>
-          <w:rFonts w:ascii="Calibri" w:hAnsi="Calibri" w:cs="Calibri"/>
-        </w:rPr>
-        <w:t>If no nutrition targets are available from the user profile, then progress against dietary goals is shown as incomplete.</w:t>
-      </w:r>
-    </w:p>
-    <w:p>
-      <w:pPr>
-        <w:spacing w:line="360" w:lineRule="auto"/>
-        <w:rPr>
-          <w:rFonts w:ascii="Calibri" w:hAnsi="Calibri" w:cs="Calibri"/>
-          <w:b/>
-          <w:bCs/>
-        </w:rPr>
-      </w:pPr>
-      <w:r>
-        <w:rPr>
-          <w:rFonts w:ascii="Calibri" w:hAnsi="Calibri" w:cs="Calibri"/>
-          <w:b/>
-          <w:bCs/>
-        </w:rPr>
-        <w:t>Postconditions:</w:t>
-      </w:r>
-    </w:p>
-    <w:p>
-      <w:pPr>
-        <w:pStyle w:val="ListParagraph"/>
-        <w:numPr>
-          <w:ilvl w:val="0"/>
-          <w:numId w:val="9"/>
-        </w:numPr>
-        <w:spacing w:line="360" w:lineRule="auto"/>
-        <w:rPr>
-          <w:rFonts w:ascii="Calibri" w:hAnsi="Calibri" w:cs="Calibri"/>
-        </w:rPr>
-      </w:pPr>
-      <w:r>
-        <w:rPr>
-          <w:rFonts w:ascii="Calibri" w:hAnsi="Calibri" w:cs="Calibri"/>
-        </w:rPr>
-        <w:t xml:space="preserve">The </w:t>
-      </w:r>
-      <w:r>
-        <w:rPr>
-          <w:rFonts w:ascii="Calibri" w:hAnsi="Calibri" w:cs="Calibri"/>
-        </w:rPr>
-        <w:t>user is presented with an analytical summary of their sessions, daily and weekly nutrition progress against goals.</w:t>
-      </w:r>
-    </w:p>
-    <w:p>
-      <w:pPr>
-        <w:pStyle w:val="ListParagraph"/>
-        <w:numPr>
-          <w:ilvl w:val="0"/>
-          <w:numId w:val="9"/>
-        </w:numPr>
-        <w:spacing w:line="360" w:lineRule="auto"/>
-        <w:rPr>
-          <w:rFonts w:ascii="Calibri" w:hAnsi="Calibri" w:cs="Calibri"/>
-        </w:rPr>
-      </w:pPr>
-      <w:r>
-        <w:rPr>
-          <w:rFonts w:ascii="Calibri" w:hAnsi="Calibri" w:cs="Calibri"/>
-        </w:rPr>
-        <w:t>No new data is made; it is all generated and displayed for interpretation</w:t>
-      </w:r>
-    </w:p>
-    <w:p>
-      <w:pPr>
-        <w:spacing w:line="360" w:lineRule="auto"/>
-        <w:rPr>
-          <w:rFonts w:ascii="Calibri" w:hAnsi="Calibri" w:cs="Calibri"/>
-        </w:rPr>
-      </w:pPr>
-    </w:p>
-    <w:p>
-      <w:pPr>
-        <w:spacing w:line="360" w:lineRule="auto"/>
-        <w:rPr>
-          <w:rFonts w:ascii="Calibri" w:hAnsi="Calibri" w:cs="Calibri"/>
-          <w:b/>
-          <w:bCs/>
-        </w:rPr>
-      </w:pPr>
-      <w:r>
-        <w:rPr>
-          <w:rFonts w:ascii="Calibri" w:hAnsi="Calibri" w:cs="Calibri"/>
-          <w:b/>
-          <w:bCs/>
-        </w:rPr>
-        <w:t>Use Case 4: Interact with the community forum</w:t>
+        <w:t>: Interact with the community forum</w:t>
       </w:r>
     </w:p>
     <w:p>
@@ -16476,7 +17367,6 @@
         <w:rPr>
           <w:rFonts w:ascii="Calibri" w:hAnsi="Calibri" w:cs="Calibri"/>
         </w:rPr>
-        <w:lastRenderedPageBreak/>
         <w:t>System validated the input, whether it was a like, favourite or comment and stores it.</w:t>
       </w:r>
     </w:p>
@@ -16560,6 +17450,7 @@
         <w:rPr>
           <w:rFonts w:ascii="Calibri" w:hAnsi="Calibri" w:cs="Calibri"/>
         </w:rPr>
+        <w:lastRenderedPageBreak/>
         <w:t xml:space="preserve">If </w:t>
       </w:r>
       <w:r>
@@ -16646,405 +17537,6 @@
           <w:b/>
           <w:bCs/>
         </w:rPr>
-        <w:t xml:space="preserve">Use Case 5: </w:t>
-      </w:r>
-      <w:r>
-        <w:rPr>
-          <w:rFonts w:ascii="Calibri" w:hAnsi="Calibri" w:cs="Calibri"/>
-          <w:b/>
-          <w:bCs/>
-        </w:rPr>
-        <w:t>Manage account and Personal Settings</w:t>
-      </w:r>
-    </w:p>
-    <w:p>
-      <w:pPr>
-        <w:spacing w:line="360" w:lineRule="auto"/>
-        <w:rPr>
-          <w:rFonts w:ascii="Calibri" w:hAnsi="Calibri" w:cs="Calibri"/>
-        </w:rPr>
-      </w:pPr>
-      <w:r>
-        <w:rPr>
-          <w:rFonts w:ascii="Calibri" w:hAnsi="Calibri" w:cs="Calibri"/>
-          <w:b/>
-          <w:bCs/>
-        </w:rPr>
-        <w:t>Primary Actor:</w:t>
-      </w:r>
-      <w:r>
-        <w:rPr>
-          <w:rFonts w:ascii="Calibri" w:hAnsi="Calibri" w:cs="Calibri"/>
-        </w:rPr>
-        <w:t xml:space="preserve"> Authenticated User</w:t>
-      </w:r>
-    </w:p>
-    <w:p>
-      <w:pPr>
-        <w:spacing w:line="360" w:lineRule="auto"/>
-        <w:rPr>
-          <w:rFonts w:ascii="Calibri" w:hAnsi="Calibri" w:cs="Calibri"/>
-        </w:rPr>
-      </w:pPr>
-      <w:r>
-        <w:rPr>
-          <w:rFonts w:ascii="Calibri" w:hAnsi="Calibri" w:cs="Calibri"/>
-          <w:b/>
-          <w:bCs/>
-        </w:rPr>
-        <w:t>Preconditions:</w:t>
-      </w:r>
-    </w:p>
-    <w:p>
-      <w:pPr>
-        <w:numPr>
-          <w:ilvl w:val="0"/>
-          <w:numId w:val="19"/>
-        </w:numPr>
-        <w:spacing w:line="360" w:lineRule="auto"/>
-        <w:rPr>
-          <w:rFonts w:ascii="Calibri" w:hAnsi="Calibri" w:cs="Calibri"/>
-        </w:rPr>
-      </w:pPr>
-      <w:r>
-        <w:rPr>
-          <w:rFonts w:ascii="Calibri" w:hAnsi="Calibri" w:cs="Calibri"/>
-        </w:rPr>
-        <w:t>The user must be logged into the system.</w:t>
-      </w:r>
-    </w:p>
-    <w:p>
-      <w:pPr>
-        <w:spacing w:line="360" w:lineRule="auto"/>
-        <w:rPr>
-          <w:rFonts w:ascii="Calibri" w:hAnsi="Calibri" w:cs="Calibri"/>
-        </w:rPr>
-      </w:pPr>
-      <w:r>
-        <w:rPr>
-          <w:rFonts w:ascii="Calibri" w:hAnsi="Calibri" w:cs="Calibri"/>
-          <w:b/>
-          <w:bCs/>
-        </w:rPr>
-        <w:t>Trigger:</w:t>
-      </w:r>
-    </w:p>
-    <w:p>
-      <w:pPr>
-        <w:numPr>
-          <w:ilvl w:val="0"/>
-          <w:numId w:val="20"/>
-        </w:numPr>
-        <w:spacing w:line="360" w:lineRule="auto"/>
-        <w:rPr>
-          <w:rFonts w:ascii="Calibri" w:hAnsi="Calibri" w:cs="Calibri"/>
-        </w:rPr>
-      </w:pPr>
-      <w:r>
-        <w:rPr>
-          <w:rFonts w:ascii="Calibri" w:hAnsi="Calibri" w:cs="Calibri"/>
-        </w:rPr>
-        <w:t xml:space="preserve">The user navigates to the </w:t>
-      </w:r>
-      <w:r>
-        <w:rPr>
-          <w:rFonts w:ascii="Calibri" w:hAnsi="Calibri" w:cs="Calibri"/>
-        </w:rPr>
-        <w:t>Account page</w:t>
-      </w:r>
-    </w:p>
-    <w:p>
-      <w:pPr>
-        <w:spacing w:line="360" w:lineRule="auto"/>
-        <w:rPr>
-          <w:rFonts w:ascii="Calibri" w:hAnsi="Calibri" w:cs="Calibri"/>
-          <w:b/>
-          <w:bCs/>
-        </w:rPr>
-      </w:pPr>
-      <w:r>
-        <w:rPr>
-          <w:rFonts w:ascii="Calibri" w:hAnsi="Calibri" w:cs="Calibri"/>
-          <w:b/>
-          <w:bCs/>
-        </w:rPr>
-        <w:t>Main Success Scenario:</w:t>
-      </w:r>
-    </w:p>
-    <w:p>
-      <w:pPr>
-        <w:pStyle w:val="ListParagraph"/>
-        <w:numPr>
-          <w:ilvl w:val="0"/>
-          <w:numId w:val="24"/>
-        </w:numPr>
-        <w:spacing w:line="360" w:lineRule="auto"/>
-        <w:rPr>
-          <w:rFonts w:ascii="Calibri" w:hAnsi="Calibri" w:cs="Calibri"/>
-        </w:rPr>
-      </w:pPr>
-      <w:r>
-        <w:rPr>
-          <w:rFonts w:ascii="Calibri" w:hAnsi="Calibri" w:cs="Calibri"/>
-        </w:rPr>
-        <w:t>The system retrives the user’s existing profile information, attributes and current settings</w:t>
-      </w:r>
-    </w:p>
-    <w:p>
-      <w:pPr>
-        <w:pStyle w:val="ListParagraph"/>
-        <w:numPr>
-          <w:ilvl w:val="0"/>
-          <w:numId w:val="24"/>
-        </w:numPr>
-        <w:spacing w:line="360" w:lineRule="auto"/>
-        <w:rPr>
-          <w:rFonts w:ascii="Calibri" w:hAnsi="Calibri" w:cs="Calibri"/>
-        </w:rPr>
-      </w:pPr>
-      <w:r>
-        <w:rPr>
-          <w:rFonts w:ascii="Calibri" w:hAnsi="Calibri" w:cs="Calibri"/>
-        </w:rPr>
-        <w:t>The user updates personal details such as height, weight, age, goal type or activity level.</w:t>
-      </w:r>
-    </w:p>
-    <w:p>
-      <w:pPr>
-        <w:pStyle w:val="ListParagraph"/>
-        <w:numPr>
-          <w:ilvl w:val="0"/>
-          <w:numId w:val="24"/>
-        </w:numPr>
-        <w:spacing w:line="360" w:lineRule="auto"/>
-        <w:rPr>
-          <w:rFonts w:ascii="Calibri" w:hAnsi="Calibri" w:cs="Calibri"/>
-        </w:rPr>
-      </w:pPr>
-      <w:r>
-        <w:rPr>
-          <w:rFonts w:ascii="Calibri" w:hAnsi="Calibri" w:cs="Calibri"/>
-        </w:rPr>
-        <w:t>The system recalculated the nutritional targets automatically based on when the updated data is saved.</w:t>
-      </w:r>
-    </w:p>
-    <w:p>
-      <w:pPr>
-        <w:pStyle w:val="ListParagraph"/>
-        <w:numPr>
-          <w:ilvl w:val="0"/>
-          <w:numId w:val="24"/>
-        </w:numPr>
-        <w:spacing w:line="360" w:lineRule="auto"/>
-        <w:rPr>
-          <w:rFonts w:ascii="Calibri" w:hAnsi="Calibri" w:cs="Calibri"/>
-        </w:rPr>
-      </w:pPr>
-      <w:r>
-        <w:rPr>
-          <w:rFonts w:ascii="Calibri" w:hAnsi="Calibri" w:cs="Calibri"/>
-        </w:rPr>
-        <w:t>The user optionally can swap to manual and define custom target goals.</w:t>
-      </w:r>
-    </w:p>
-    <w:p>
-      <w:pPr>
-        <w:pStyle w:val="ListParagraph"/>
-        <w:numPr>
-          <w:ilvl w:val="0"/>
-          <w:numId w:val="24"/>
-        </w:numPr>
-        <w:spacing w:line="360" w:lineRule="auto"/>
-        <w:rPr>
-          <w:rFonts w:ascii="Calibri" w:hAnsi="Calibri" w:cs="Calibri"/>
-        </w:rPr>
-      </w:pPr>
-      <w:r>
-        <w:rPr>
-          <w:rFonts w:ascii="Calibri" w:hAnsi="Calibri" w:cs="Calibri"/>
-        </w:rPr>
-        <w:t>The user updates their privacy settings, controlling visibility of their profile’s attributes.</w:t>
-      </w:r>
-    </w:p>
-    <w:p>
-      <w:pPr>
-        <w:pStyle w:val="ListParagraph"/>
-        <w:numPr>
-          <w:ilvl w:val="0"/>
-          <w:numId w:val="24"/>
-        </w:numPr>
-        <w:spacing w:line="360" w:lineRule="auto"/>
-        <w:rPr>
-          <w:rFonts w:ascii="Calibri" w:hAnsi="Calibri" w:cs="Calibri"/>
-        </w:rPr>
-      </w:pPr>
-      <w:r>
-        <w:rPr>
-          <w:rFonts w:ascii="Calibri" w:hAnsi="Calibri" w:cs="Calibri"/>
-        </w:rPr>
-        <w:t>The user manages social features such as sending friend request, accepting friend requests and viewing current friends.</w:t>
-      </w:r>
-    </w:p>
-    <w:p>
-      <w:pPr>
-        <w:pStyle w:val="ListParagraph"/>
-        <w:numPr>
-          <w:ilvl w:val="0"/>
-          <w:numId w:val="24"/>
-        </w:numPr>
-        <w:spacing w:line="360" w:lineRule="auto"/>
-        <w:rPr>
-          <w:rFonts w:ascii="Calibri" w:hAnsi="Calibri" w:cs="Calibri"/>
-        </w:rPr>
-      </w:pPr>
-      <w:r>
-        <w:rPr>
-          <w:rFonts w:ascii="Calibri" w:hAnsi="Calibri" w:cs="Calibri"/>
-        </w:rPr>
-        <w:t>The system validates and updates all information.</w:t>
-      </w:r>
-    </w:p>
-    <w:p>
-      <w:pPr>
-        <w:pStyle w:val="ListParagraph"/>
-        <w:numPr>
-          <w:ilvl w:val="0"/>
-          <w:numId w:val="24"/>
-        </w:numPr>
-        <w:spacing w:line="360" w:lineRule="auto"/>
-        <w:rPr>
-          <w:rFonts w:ascii="Calibri" w:hAnsi="Calibri" w:cs="Calibri"/>
-        </w:rPr>
-      </w:pPr>
-      <w:r>
-        <w:rPr>
-          <w:rFonts w:ascii="Calibri" w:hAnsi="Calibri" w:cs="Calibri"/>
-        </w:rPr>
-        <w:t>The updated account setting sare saved and applied.</w:t>
-      </w:r>
-    </w:p>
-    <w:p>
-      <w:pPr>
-        <w:spacing w:line="360" w:lineRule="auto"/>
-        <w:rPr>
-          <w:rFonts w:ascii="Calibri" w:hAnsi="Calibri" w:cs="Calibri"/>
-        </w:rPr>
-      </w:pPr>
-      <w:r>
-        <w:rPr>
-          <w:rFonts w:ascii="Calibri" w:hAnsi="Calibri" w:cs="Calibri"/>
-          <w:b/>
-          <w:bCs/>
-        </w:rPr>
-        <w:t>Alternative / Exception Flows:</w:t>
-      </w:r>
-    </w:p>
-    <w:p>
-      <w:pPr>
-        <w:numPr>
-          <w:ilvl w:val="0"/>
-          <w:numId w:val="22"/>
-        </w:numPr>
-        <w:spacing w:line="360" w:lineRule="auto"/>
-        <w:rPr>
-          <w:rFonts w:ascii="Calibri" w:hAnsi="Calibri" w:cs="Calibri"/>
-        </w:rPr>
-      </w:pPr>
-      <w:r>
-        <w:rPr>
-          <w:rFonts w:ascii="Calibri" w:hAnsi="Calibri" w:cs="Calibri"/>
-        </w:rPr>
-        <w:lastRenderedPageBreak/>
-        <w:t xml:space="preserve">If </w:t>
-      </w:r>
-      <w:r>
-        <w:rPr>
-          <w:rFonts w:ascii="Calibri" w:hAnsi="Calibri" w:cs="Calibri"/>
-        </w:rPr>
-        <w:t>invalid values are entered such as negative weight or height etc, the system prevents submission.</w:t>
-      </w:r>
-    </w:p>
-    <w:p>
-      <w:pPr>
-        <w:spacing w:line="360" w:lineRule="auto"/>
-        <w:rPr>
-          <w:rFonts w:ascii="Calibri" w:hAnsi="Calibri" w:cs="Calibri"/>
-        </w:rPr>
-      </w:pPr>
-      <w:r>
-        <w:rPr>
-          <w:rFonts w:ascii="Calibri" w:hAnsi="Calibri" w:cs="Calibri"/>
-          <w:b/>
-          <w:bCs/>
-        </w:rPr>
-        <w:t>Postconditions:</w:t>
-      </w:r>
-    </w:p>
-    <w:p>
-      <w:pPr>
-        <w:numPr>
-          <w:ilvl w:val="0"/>
-          <w:numId w:val="23"/>
-        </w:numPr>
-        <w:spacing w:line="360" w:lineRule="auto"/>
-        <w:rPr>
-          <w:rFonts w:ascii="Calibri" w:hAnsi="Calibri" w:cs="Calibri"/>
-        </w:rPr>
-      </w:pPr>
-      <w:r>
-        <w:rPr>
-          <w:rFonts w:ascii="Calibri" w:hAnsi="Calibri" w:cs="Calibri"/>
-        </w:rPr>
-        <w:t xml:space="preserve">The </w:t>
-      </w:r>
-      <w:r>
-        <w:rPr>
-          <w:rFonts w:ascii="Calibri" w:hAnsi="Calibri" w:cs="Calibri"/>
-        </w:rPr>
-        <w:t>user’s profile and preferences are updates within the system</w:t>
-      </w:r>
-    </w:p>
-    <w:p>
-      <w:pPr>
-        <w:numPr>
-          <w:ilvl w:val="0"/>
-          <w:numId w:val="23"/>
-        </w:numPr>
-        <w:spacing w:line="360" w:lineRule="auto"/>
-        <w:rPr>
-          <w:rFonts w:ascii="Calibri" w:hAnsi="Calibri" w:cs="Calibri"/>
-        </w:rPr>
-      </w:pPr>
-      <w:r>
-        <w:rPr>
-          <w:rFonts w:ascii="Calibri" w:hAnsi="Calibri" w:cs="Calibri"/>
-        </w:rPr>
-        <w:t>Updated profile data influences other system components, such as insights on the dashboard and nutritional targets.</w:t>
-      </w:r>
-    </w:p>
-    <w:p>
-      <w:pPr>
-        <w:spacing w:line="360" w:lineRule="auto"/>
-        <w:rPr>
-          <w:rFonts w:ascii="Calibri" w:hAnsi="Calibri" w:cs="Calibri"/>
-        </w:rPr>
-      </w:pPr>
-    </w:p>
-    <w:p>
-      <w:pPr>
-        <w:spacing w:line="360" w:lineRule="auto"/>
-        <w:rPr>
-          <w:rFonts w:ascii="Calibri" w:hAnsi="Calibri" w:cs="Calibri"/>
-          <w:b/>
-          <w:bCs/>
-        </w:rPr>
-      </w:pPr>
-      <w:r>
-        <w:rPr>
-          <w:rFonts w:ascii="Calibri" w:hAnsi="Calibri" w:cs="Calibri"/>
-          <w:b/>
-          <w:bCs/>
-        </w:rPr>
         <w:t xml:space="preserve">Use Case </w:t>
       </w:r>
       <w:r>
@@ -17244,7 +17736,21 @@
         <w:rPr>
           <w:rFonts w:ascii="Calibri" w:hAnsi="Calibri" w:cs="Calibri"/>
         </w:rPr>
-        <w:t>The user selects a metric to rank by, avg intensity, session duration, highest grade and number of sessions.</w:t>
+        <w:t xml:space="preserve">The user selects a metric to rank by, </w:t>
+      </w:r>
+      <w:proofErr w:type="spellStart"/>
+      <w:r>
+        <w:rPr>
+          <w:rFonts w:ascii="Calibri" w:hAnsi="Calibri" w:cs="Calibri"/>
+        </w:rPr>
+        <w:t>avg</w:t>
+      </w:r>
+      <w:proofErr w:type="spellEnd"/>
+      <w:r>
+        <w:rPr>
+          <w:rFonts w:ascii="Calibri" w:hAnsi="Calibri" w:cs="Calibri"/>
+        </w:rPr>
+        <w:t xml:space="preserve"> intensity, session duration, highest grade and number of sessions.</w:t>
       </w:r>
     </w:p>
     <w:p>
@@ -17388,7 +17894,6 @@
           <w:b/>
           <w:bCs/>
         </w:rPr>
-        <w:lastRenderedPageBreak/>
         <w:t>Postconditions:</w:t>
       </w:r>
     </w:p>
@@ -17425,6 +17930,7 @@
         <w:rPr>
           <w:rFonts w:ascii="Calibri" w:hAnsi="Calibri" w:cs="Calibri"/>
         </w:rPr>
+        <w:lastRenderedPageBreak/>
         <w:t>No new persistent data is created, but derived values are displayed for interpretation.</w:t>
       </w:r>
     </w:p>
@@ -17728,35 +18234,35 @@
         <w:rPr>
           <w:rFonts w:ascii="Calibri" w:hAnsi="Calibri" w:cs="Calibri"/>
         </w:rPr>
+        <w:t>10/01/26 Gemini Debugging a 'CORS'</w:t>
+      </w:r>
+    </w:p>
+    <w:p>
+      <w:pPr>
+        <w:spacing w:line="360" w:lineRule="auto"/>
+        <w:rPr>
+          <w:rFonts w:ascii="Calibri" w:hAnsi="Calibri" w:cs="Calibri"/>
+        </w:rPr>
+      </w:pPr>
+      <w:r>
+        <w:rPr>
+          <w:rFonts w:ascii="Calibri" w:hAnsi="Calibri" w:cs="Calibri"/>
+        </w:rPr>
+        <w:t>error.</w:t>
+      </w:r>
+    </w:p>
+    <w:p>
+      <w:pPr>
+        <w:spacing w:line="360" w:lineRule="auto"/>
+        <w:rPr>
+          <w:rFonts w:ascii="Calibri" w:hAnsi="Calibri" w:cs="Calibri"/>
+        </w:rPr>
+      </w:pPr>
+      <w:r>
+        <w:rPr>
+          <w:rFonts w:ascii="Calibri" w:hAnsi="Calibri" w:cs="Calibri"/>
+        </w:rPr>
         <w:lastRenderedPageBreak/>
-        <w:t>10/01/26 Gemini Debugging a 'CORS'</w:t>
-      </w:r>
-    </w:p>
-    <w:p>
-      <w:pPr>
-        <w:spacing w:line="360" w:lineRule="auto"/>
-        <w:rPr>
-          <w:rFonts w:ascii="Calibri" w:hAnsi="Calibri" w:cs="Calibri"/>
-        </w:rPr>
-      </w:pPr>
-      <w:r>
-        <w:rPr>
-          <w:rFonts w:ascii="Calibri" w:hAnsi="Calibri" w:cs="Calibri"/>
-        </w:rPr>
-        <w:t>error.</w:t>
-      </w:r>
-    </w:p>
-    <w:p>
-      <w:pPr>
-        <w:spacing w:line="360" w:lineRule="auto"/>
-        <w:rPr>
-          <w:rFonts w:ascii="Calibri" w:hAnsi="Calibri" w:cs="Calibri"/>
-        </w:rPr>
-      </w:pPr>
-      <w:r>
-        <w:rPr>
-          <w:rFonts w:ascii="Calibri" w:hAnsi="Calibri" w:cs="Calibri"/>
-        </w:rPr>
         <w:t>Explained headers; I implemented the fix manually.</w:t>
       </w:r>
     </w:p>
@@ -17781,11 +18287,19 @@
           <w:rFonts w:ascii="Calibri" w:hAnsi="Calibri" w:cs="Calibri"/>
         </w:rPr>
       </w:pPr>
-      <w:r>
-        <w:rPr>
-          <w:rFonts w:ascii="Calibri" w:hAnsi="Calibri" w:cs="Calibri"/>
-        </w:rPr>
-        <w:t>MoSCoW list.</w:t>
+      <w:proofErr w:type="spellStart"/>
+      <w:r>
+        <w:rPr>
+          <w:rFonts w:ascii="Calibri" w:hAnsi="Calibri" w:cs="Calibri"/>
+        </w:rPr>
+        <w:t>MoSCoW</w:t>
+      </w:r>
+      <w:proofErr w:type="spellEnd"/>
+      <w:r>
+        <w:rPr>
+          <w:rFonts w:ascii="Calibri" w:hAnsi="Calibri" w:cs="Calibri"/>
+        </w:rPr>
+        <w:t xml:space="preserve"> list.</w:t>
       </w:r>
     </w:p>
     <w:p>
@@ -17886,7 +18400,7 @@
           <w:rFonts w:ascii="Calibri" w:hAnsi="Calibri" w:cs="Calibri"/>
         </w:rPr>
       </w:pPr>
-      <w:hyperlink r:id="rId11" w:history="1">
+      <w:hyperlink r:id="rId12" w:history="1">
         <w:r>
           <w:rPr>
             <w:rStyle w:val="Hyperlink"/>
@@ -17939,7 +18453,7 @@
           <w:rFonts w:ascii="Calibri" w:hAnsi="Calibri" w:cs="Calibri"/>
         </w:rPr>
       </w:pPr>
-      <w:hyperlink r:id="rId12" w:history="1">
+      <w:hyperlink r:id="rId13" w:history="1">
         <w:r>
           <w:rPr>
             <w:rStyle w:val="Hyperlink"/>
@@ -17972,25 +18486,39 @@
         <w:rPr>
           <w:rFonts w:ascii="Calibri" w:hAnsi="Calibri" w:cs="Calibri"/>
         </w:rPr>
-        <w:t xml:space="preserve"> from Flaticon free icon website, I am using the free license with proper attribution.</w:t>
-      </w:r>
-    </w:p>
-    <w:p>
-      <w:pPr>
-        <w:spacing w:line="360" w:lineRule="auto"/>
-        <w:rPr>
-          <w:rFonts w:ascii="Calibri" w:hAnsi="Calibri" w:cs="Calibri"/>
-        </w:rPr>
-      </w:pPr>
-    </w:p>
-    <w:p>
-      <w:pPr>
-        <w:spacing w:line="360" w:lineRule="auto"/>
-        <w:rPr>
-          <w:rFonts w:ascii="Calibri" w:hAnsi="Calibri" w:cs="Calibri"/>
-        </w:rPr>
-      </w:pPr>
-      <w:hyperlink r:id="rId13" w:history="1">
+        <w:t xml:space="preserve"> from </w:t>
+      </w:r>
+      <w:proofErr w:type="spellStart"/>
+      <w:r>
+        <w:rPr>
+          <w:rFonts w:ascii="Calibri" w:hAnsi="Calibri" w:cs="Calibri"/>
+        </w:rPr>
+        <w:t>Flaticon</w:t>
+      </w:r>
+      <w:proofErr w:type="spellEnd"/>
+      <w:r>
+        <w:rPr>
+          <w:rFonts w:ascii="Calibri" w:hAnsi="Calibri" w:cs="Calibri"/>
+        </w:rPr>
+        <w:t xml:space="preserve"> free icon website, I am using the free license with proper attribution.</w:t>
+      </w:r>
+    </w:p>
+    <w:p>
+      <w:pPr>
+        <w:spacing w:line="360" w:lineRule="auto"/>
+        <w:rPr>
+          <w:rFonts w:ascii="Calibri" w:hAnsi="Calibri" w:cs="Calibri"/>
+        </w:rPr>
+      </w:pPr>
+    </w:p>
+    <w:p>
+      <w:pPr>
+        <w:spacing w:line="360" w:lineRule="auto"/>
+        <w:rPr>
+          <w:rFonts w:ascii="Calibri" w:hAnsi="Calibri" w:cs="Calibri"/>
+        </w:rPr>
+      </w:pPr>
+      <w:hyperlink r:id="rId14" w:history="1">
         <w:r>
           <w:rPr>
             <w:rStyle w:val="Hyperlink"/>
@@ -18011,7 +18539,21 @@
         <w:rPr>
           <w:rFonts w:ascii="Calibri" w:hAnsi="Calibri" w:cs="Calibri"/>
         </w:rPr>
-        <w:t>The homepage background image is taken from Ben Moreland on unsplash.com, I am using thr free license with proper attribution.</w:t>
+        <w:t xml:space="preserve">The homepage background image is taken from Ben Moreland on unsplash.com, I am using </w:t>
+      </w:r>
+      <w:proofErr w:type="spellStart"/>
+      <w:r>
+        <w:rPr>
+          <w:rFonts w:ascii="Calibri" w:hAnsi="Calibri" w:cs="Calibri"/>
+        </w:rPr>
+        <w:t>thr</w:t>
+      </w:r>
+      <w:proofErr w:type="spellEnd"/>
+      <w:r>
+        <w:rPr>
+          <w:rFonts w:ascii="Calibri" w:hAnsi="Calibri" w:cs="Calibri"/>
+        </w:rPr>
+        <w:t xml:space="preserve"> free license with proper attribution.</w:t>
       </w:r>
     </w:p>
     <w:sectPr>

</xml_diff>

<commit_message>
updating my dissertation doc again
</commit_message>
<xml_diff>
--- a/Documents/Final Dissertation Doc.docx
+++ b/Documents/Final Dissertation Doc.docx
@@ -5678,13 +5678,7 @@
         <w:rPr>
           <w:rFonts w:ascii="Calibri" w:hAnsi="Calibri" w:cs="Calibri"/>
         </w:rPr>
-        <w:t xml:space="preserve">Version control of the project was managed through GitLab, allowing changes to be tracked through git commits and enabling the project to maintain a clear development history. Features and </w:t>
-      </w:r>
-      <w:r>
-        <w:rPr>
-          <w:rFonts w:ascii="Calibri" w:hAnsi="Calibri" w:cs="Calibri"/>
-        </w:rPr>
-        <w:t>improvements to the system were developed incrementally, allowing changes to be isolated and if necessary, rolled back without impacting the entire system.</w:t>
+        <w:t>Version control of the project was managed through GitLab, allowing changes to be tracked through git commits and enabling the project to maintain a clear development history. Features and improvements to the system were developed incrementally, allowing changes to be isolated and if necessary, rolled back without impacting the entire system.</w:t>
       </w:r>
     </w:p>
     <w:p>
@@ -5712,13 +5706,7 @@
         <w:rPr>
           <w:rFonts w:ascii="Calibri" w:hAnsi="Calibri" w:cs="Calibri"/>
         </w:rPr>
-        <w:t xml:space="preserve"> organise the core features and establish an initial structure for project backlog. </w:t>
-      </w:r>
-      <w:r>
-        <w:rPr>
-          <w:rFonts w:ascii="Calibri" w:hAnsi="Calibri" w:cs="Calibri"/>
-        </w:rPr>
-        <w:t>As development progressed and time constraints increased, the workflow became more implementation focused, with features being developed and refined iteratively rather than manged through strict issue tracking. Despite this shift, initial issue tracking was key to helping define the core components of the system and system direction.</w:t>
+        <w:t xml:space="preserve"> organise the core features and establish an initial structure for project backlog. As development progressed and time constraints increased, the workflow became more implementation focused, with features being developed and refined iteratively rather than manged through strict issue tracking. Despite this shift, initial issue tracking was key to helping define the core components of the system and system direction.</w:t>
       </w:r>
     </w:p>
     <w:p>
@@ -9296,23 +9284,7 @@
           <w:b/>
           <w:bCs/>
         </w:rPr>
-        <w:t xml:space="preserve">Use Case </w:t>
-      </w:r>
-      <w:r>
-        <w:rPr>
-          <w:rFonts w:ascii="Calibri" w:hAnsi="Calibri" w:cs="Calibri"/>
-          <w:b/>
-          <w:bCs/>
-        </w:rPr>
-        <w:t>4</w:t>
-      </w:r>
-      <w:r>
-        <w:rPr>
-          <w:rFonts w:ascii="Calibri" w:hAnsi="Calibri" w:cs="Calibri"/>
-          <w:b/>
-          <w:bCs/>
-        </w:rPr>
-        <w:t>: Manage account and Personal Settings</w:t>
+        <w:t>Use Case 4: Manage account and Personal Settings</w:t>
       </w:r>
     </w:p>
     <w:p>
@@ -10784,7 +10756,19 @@
         <w:rPr>
           <w:rFonts w:ascii="Calibri" w:hAnsi="Calibri" w:cs="Calibri"/>
         </w:rPr>
-        <w:t xml:space="preserve">The system is implemented as a web-based client-server application using Model-View-Controller (MVC) architectural pattern. Users interact with the application through a web browser, where html pages are rendered using Thymeleaf templates. Requests from the browser are handled by Spring Boot controllers, which </w:t>
+        <w:t xml:space="preserve">The system is implemented as a web-based client-server application using Model-View-Controller (MVC) architectural pattern. Users interact with the application through a web browser, where </w:t>
+      </w:r>
+      <w:r>
+        <w:rPr>
+          <w:rFonts w:ascii="Calibri" w:hAnsi="Calibri" w:cs="Calibri"/>
+        </w:rPr>
+        <w:t>HTML</w:t>
+      </w:r>
+      <w:r>
+        <w:rPr>
+          <w:rFonts w:ascii="Calibri" w:hAnsi="Calibri" w:cs="Calibri"/>
+        </w:rPr>
+        <w:t xml:space="preserve"> pages are rendered using Thymeleaf templates. Requests from the browser are handled by Spring Boot controllers, which </w:t>
       </w:r>
       <w:proofErr w:type="gramStart"/>
       <w:r>
@@ -10818,7 +10802,49 @@
         <w:rPr>
           <w:rFonts w:ascii="Calibri" w:hAnsi="Calibri" w:cs="Calibri"/>
         </w:rPr>
-        <w:t xml:space="preserve"> The application tier consists of the Spring Boot controllers, services, models, dto’s, repositories and configs, that manage system logic and data access. </w:t>
+        <w:t xml:space="preserve"> The application tier consists of the Spring Boot controllers,</w:t>
+      </w:r>
+      <w:r>
+        <w:rPr>
+          <w:rFonts w:ascii="Calibri" w:hAnsi="Calibri" w:cs="Calibri"/>
+        </w:rPr>
+        <w:t xml:space="preserve"> entity</w:t>
+      </w:r>
+      <w:r>
+        <w:rPr>
+          <w:rFonts w:ascii="Calibri" w:hAnsi="Calibri" w:cs="Calibri"/>
+        </w:rPr>
+        <w:t xml:space="preserve"> models, dto’s, repositories </w:t>
+      </w:r>
+      <w:r>
+        <w:rPr>
+          <w:rFonts w:ascii="Calibri" w:hAnsi="Calibri" w:cs="Calibri"/>
+        </w:rPr>
+        <w:t>interfaces and</w:t>
+      </w:r>
+      <w:r>
+        <w:rPr>
+          <w:rFonts w:ascii="Calibri" w:hAnsi="Calibri" w:cs="Calibri"/>
+        </w:rPr>
+        <w:t xml:space="preserve"> </w:t>
+      </w:r>
+      <w:r>
+        <w:rPr>
+          <w:rFonts w:ascii="Calibri" w:hAnsi="Calibri" w:cs="Calibri"/>
+        </w:rPr>
+        <w:t xml:space="preserve">security </w:t>
+      </w:r>
+      <w:r>
+        <w:rPr>
+          <w:rFonts w:ascii="Calibri" w:hAnsi="Calibri" w:cs="Calibri"/>
+        </w:rPr>
+        <w:t>config</w:t>
+      </w:r>
+      <w:r>
+        <w:rPr>
+          <w:rFonts w:ascii="Calibri" w:hAnsi="Calibri" w:cs="Calibri"/>
+        </w:rPr>
+        <w:t xml:space="preserve">uration classes. Controllers handle incoming requests and coordinate overall system behaviour, whilst entity models represent core domain data such as users, training sessions, food entries and forum content etc. Service logic is used selectively where additional processing is required such as the nutritional-based calculations. </w:t>
       </w:r>
       <w:r>
         <w:rPr>
@@ -10852,11 +10878,12 @@
         <w:rPr>
           <w:rFonts w:ascii="Calibri" w:hAnsi="Calibri" w:cs="Calibri"/>
         </w:rPr>
+        <w:lastRenderedPageBreak/>
         <w:drawing>
-          <wp:inline distT="0" distB="0" distL="0" distR="0" wp14:anchorId="3E43BFCD" wp14:editId="1F21CC40">
-            <wp:extent cx="5731510" cy="1809115"/>
-            <wp:effectExtent l="0" t="0" r="2540" b="635"/>
-            <wp:docPr id="1874016533" name="Picture 1"/>
+          <wp:inline distT="0" distB="0" distL="0" distR="0" wp14:anchorId="41745626" wp14:editId="1A500174">
+            <wp:extent cx="5774871" cy="1549070"/>
+            <wp:effectExtent l="0" t="0" r="0" b="0"/>
+            <wp:docPr id="1059991232" name="Picture 1"/>
             <wp:cNvGraphicFramePr>
               <a:graphicFrameLocks xmlns:a="http://schemas.openxmlformats.org/drawingml/2006/main" noChangeAspect="1"/>
             </wp:cNvGraphicFramePr>
@@ -10864,11 +10891,216 @@
               <a:graphicData uri="http://schemas.openxmlformats.org/drawingml/2006/picture">
                 <pic:pic xmlns:pic="http://schemas.openxmlformats.org/drawingml/2006/picture">
                   <pic:nvPicPr>
-                    <pic:cNvPr id="1874016533" name=""/>
+                    <pic:cNvPr id="1059991232" name=""/>
+                    <pic:cNvPicPr/>
+                  </pic:nvPicPr>
+                  <pic:blipFill rotWithShape="1">
+                    <a:blip r:embed="rId9"/>
+                    <a:srcRect t="9547" r="1555" b="7491"/>
+                    <a:stretch>
+                      <a:fillRect/>
+                    </a:stretch>
+                  </pic:blipFill>
+                  <pic:spPr bwMode="auto">
+                    <a:xfrm>
+                      <a:off x="0" y="0"/>
+                      <a:ext cx="5803399" cy="1556723"/>
+                    </a:xfrm>
+                    <a:prstGeom prst="rect">
+                      <a:avLst/>
+                    </a:prstGeom>
+                    <a:ln>
+                      <a:noFill/>
+                    </a:ln>
+                    <a:extLst>
+                      <a:ext uri="{53640926-AAD7-44D8-BBD7-CCE9431645EC}">
+                        <a14:shadowObscured xmlns:a14="http://schemas.microsoft.com/office/drawing/2010/main"/>
+                      </a:ext>
+                    </a:extLst>
+                  </pic:spPr>
+                </pic:pic>
+              </a:graphicData>
+            </a:graphic>
+          </wp:inline>
+        </w:drawing>
+      </w:r>
+    </w:p>
+    <w:p>
+      <w:pPr>
+        <w:spacing w:line="360" w:lineRule="auto"/>
+        <w:rPr>
+          <w:rFonts w:ascii="Calibri" w:hAnsi="Calibri" w:cs="Calibri"/>
+        </w:rPr>
+      </w:pPr>
+      <w:r>
+        <w:rPr>
+          <w:rFonts w:ascii="Calibri" w:hAnsi="Calibri" w:cs="Calibri"/>
+        </w:rPr>
+        <w:t>When a user performs an action, such as logging a training session, a food entry or accessing the dashboard, an HTTP request is sent from the web browser to the backend application. This request is received by the Spring Boot controller, which then determines the appropriate processing logic.</w:t>
+      </w:r>
+    </w:p>
+    <w:p>
+      <w:pPr>
+        <w:spacing w:line="360" w:lineRule="auto"/>
+        <w:rPr>
+          <w:rFonts w:ascii="Calibri" w:hAnsi="Calibri" w:cs="Calibri"/>
+        </w:rPr>
+      </w:pPr>
+      <w:r>
+        <w:rPr>
+          <w:rFonts w:ascii="Calibri" w:hAnsi="Calibri" w:cs="Calibri"/>
+        </w:rPr>
+        <w:t>If additional computation is required, such as calculating summaries or validating input data supplied, selected service logic is used. The controller interacts with repository interfaces to retrieve data or update data from within the relational database.</w:t>
+      </w:r>
+    </w:p>
+    <w:p>
+      <w:pPr>
+        <w:spacing w:line="360" w:lineRule="auto"/>
+        <w:rPr>
+          <w:rFonts w:ascii="Calibri" w:hAnsi="Calibri" w:cs="Calibri"/>
+        </w:rPr>
+      </w:pPr>
+      <w:r>
+        <w:rPr>
+          <w:rFonts w:ascii="Calibri" w:hAnsi="Calibri" w:cs="Calibri"/>
+        </w:rPr>
+        <w:t xml:space="preserve">Once processing has been completed, a Thymeleaf templates is used to display corresponding HTML view to the user which is returned via an HTTP Response to the </w:t>
+      </w:r>
+      <w:r>
+        <w:rPr>
+          <w:rFonts w:ascii="Calibri" w:hAnsi="Calibri" w:cs="Calibri"/>
+        </w:rPr>
+        <w:t>user’s</w:t>
+      </w:r>
+      <w:r>
+        <w:rPr>
+          <w:rFonts w:ascii="Calibri" w:hAnsi="Calibri" w:cs="Calibri"/>
+        </w:rPr>
+        <w:t xml:space="preserve"> browser.</w:t>
+      </w:r>
+    </w:p>
+    <w:p>
+      <w:pPr>
+        <w:spacing w:line="360" w:lineRule="auto"/>
+        <w:rPr>
+          <w:rFonts w:ascii="Calibri" w:hAnsi="Calibri" w:cs="Calibri"/>
+        </w:rPr>
+      </w:pPr>
+      <w:r>
+        <w:rPr>
+          <w:rFonts w:ascii="Calibri" w:hAnsi="Calibri" w:cs="Calibri"/>
+        </w:rPr>
+        <w:t xml:space="preserve">Overall, this architecture directly supports the functional requirements defined in chapter 3. Specifically, </w:t>
+      </w:r>
+      <w:r>
+        <w:rPr>
+          <w:rFonts w:ascii="Calibri" w:hAnsi="Calibri" w:cs="Calibri"/>
+        </w:rPr>
+        <w:t>in regard to</w:t>
+      </w:r>
+      <w:r>
+        <w:rPr>
+          <w:rFonts w:ascii="Calibri" w:hAnsi="Calibri" w:cs="Calibri"/>
+        </w:rPr>
+        <w:t xml:space="preserve"> enabling data capture, efficient data processing for dashboard insights as well as scalable support for user specific features such as personalised nutritional tracking or community interaction.</w:t>
+      </w:r>
+    </w:p>
+    <w:p>
+      <w:pPr>
+        <w:pStyle w:val="Heading2"/>
+        <w:spacing w:line="360" w:lineRule="auto"/>
+        <w:rPr>
+          <w:rFonts w:ascii="Calibri" w:hAnsi="Calibri" w:cs="Calibri"/>
+          <w:b/>
+          <w:bCs/>
+        </w:rPr>
+      </w:pPr>
+      <w:bookmarkStart w:id="17" w:name="_Toc227860124"/>
+      <w:r>
+        <w:rPr>
+          <w:rFonts w:ascii="Calibri" w:hAnsi="Calibri" w:cs="Calibri"/>
+          <w:b/>
+          <w:bCs/>
+        </w:rPr>
+        <w:t>4.2 Database Design</w:t>
+      </w:r>
+      <w:bookmarkEnd w:id="17"/>
+    </w:p>
+    <w:p>
+      <w:pPr>
+        <w:spacing w:line="360" w:lineRule="auto"/>
+        <w:rPr>
+          <w:rFonts w:ascii="Calibri" w:hAnsi="Calibri" w:cs="Calibri"/>
+        </w:rPr>
+      </w:pPr>
+      <w:r>
+        <w:rPr>
+          <w:rFonts w:ascii="Calibri" w:hAnsi="Calibri" w:cs="Calibri"/>
+        </w:rPr>
+        <w:t xml:space="preserve">A relational database was selected for this system due to the application storing structured data with clear relationships between entities. This system required data to persist across user accounts, training sessions, nutritional entries, forum content, post interactions and friend requests. These entities are closely </w:t>
+      </w:r>
+      <w:r>
+        <w:rPr>
+          <w:rFonts w:ascii="Calibri" w:hAnsi="Calibri" w:cs="Calibri"/>
+        </w:rPr>
+        <w:t>related;</w:t>
+      </w:r>
+      <w:r>
+        <w:rPr>
+          <w:rFonts w:ascii="Calibri" w:hAnsi="Calibri" w:cs="Calibri"/>
+        </w:rPr>
+        <w:t xml:space="preserve"> </w:t>
+      </w:r>
+      <w:r>
+        <w:rPr>
+          <w:rFonts w:ascii="Calibri" w:hAnsi="Calibri" w:cs="Calibri"/>
+        </w:rPr>
+        <w:t>this makes the relational model appropriate because it supports primary keys and foreign keys and referential integrity.</w:t>
+      </w:r>
+    </w:p>
+    <w:p>
+      <w:pPr>
+        <w:spacing w:line="360" w:lineRule="auto"/>
+        <w:rPr>
+          <w:rFonts w:ascii="Calibri" w:hAnsi="Calibri" w:cs="Calibri"/>
+        </w:rPr>
+      </w:pPr>
+      <w:r>
+        <w:rPr>
+          <w:rFonts w:ascii="Calibri" w:hAnsi="Calibri" w:cs="Calibri"/>
+        </w:rPr>
+        <w:t>The approach was chosen over a NoSQL data store because the system depends on its relationship between users and their records. E.g. each food entry and training session must belong to a specific user, whilst forum comments, favourites and likes need to be linked to both a user and forum post. A relational database is therefore the most logical choice and provides a stable structure for data consistency across the system.</w:t>
+      </w:r>
+    </w:p>
+    <w:p>
+      <w:pPr>
+        <w:spacing w:line="360" w:lineRule="auto"/>
+        <w:rPr>
+          <w:rFonts w:ascii="Calibri" w:hAnsi="Calibri" w:cs="Calibri"/>
+        </w:rPr>
+      </w:pPr>
+      <w:r>
+        <w:rPr>
+          <w:rFonts w:ascii="Calibri" w:hAnsi="Calibri" w:cs="Calibri"/>
+        </w:rPr>
+        <w:lastRenderedPageBreak/>
+        <w:drawing>
+          <wp:inline distT="0" distB="0" distL="0" distR="0" wp14:anchorId="03136D57" wp14:editId="1A2586DD">
+            <wp:extent cx="5645183" cy="4668253"/>
+            <wp:effectExtent l="0" t="0" r="0" b="0"/>
+            <wp:docPr id="1125675063" name="Picture 1"/>
+            <wp:cNvGraphicFramePr>
+              <a:graphicFrameLocks xmlns:a="http://schemas.openxmlformats.org/drawingml/2006/main" noChangeAspect="1"/>
+            </wp:cNvGraphicFramePr>
+            <a:graphic xmlns:a="http://schemas.openxmlformats.org/drawingml/2006/main">
+              <a:graphicData uri="http://schemas.openxmlformats.org/drawingml/2006/picture">
+                <pic:pic xmlns:pic="http://schemas.openxmlformats.org/drawingml/2006/picture">
+                  <pic:nvPicPr>
+                    <pic:cNvPr id="1125675063" name=""/>
                     <pic:cNvPicPr/>
                   </pic:nvPicPr>
                   <pic:blipFill>
-                    <a:blip r:embed="rId9"/>
+                    <a:blip r:embed="rId10"/>
                     <a:stretch>
                       <a:fillRect/>
                     </a:stretch>
@@ -10876,7 +11108,7 @@
                   <pic:spPr>
                     <a:xfrm>
                       <a:off x="0" y="0"/>
-                      <a:ext cx="5731510" cy="1809115"/>
+                      <a:ext cx="5662089" cy="4682233"/>
                     </a:xfrm>
                     <a:prstGeom prst="rect">
                       <a:avLst/>
@@ -10896,6 +11128,81 @@
           <w:rFonts w:ascii="Calibri" w:hAnsi="Calibri" w:cs="Calibri"/>
         </w:rPr>
       </w:pPr>
+      <w:r>
+        <w:rPr>
+          <w:rFonts w:ascii="Calibri" w:hAnsi="Calibri" w:cs="Calibri"/>
+        </w:rPr>
+        <w:t>An Entity Relationship diagram of the main database entries has been provided. The user table here acts as the central entity; you cannot interact with anything in this system without being a user. Additionally, the user table has a one-many relationships with Friend_Request, Food_Entry, Training_Sessions, Forum_Comments, Forum_Posts, Forum_Likes and Forum_Favourites. This links back to the requirement for an authenticated user account.</w:t>
+      </w:r>
+    </w:p>
+    <w:p>
+      <w:pPr>
+        <w:spacing w:line="360" w:lineRule="auto"/>
+        <w:rPr>
+          <w:rFonts w:ascii="Calibri" w:hAnsi="Calibri" w:cs="Calibri"/>
+        </w:rPr>
+      </w:pPr>
+      <w:r>
+        <w:rPr>
+          <w:rFonts w:ascii="Calibri" w:hAnsi="Calibri" w:cs="Calibri"/>
+        </w:rPr>
+        <w:t>The training and nutrition tables support the tracking requirements defined in chapter 3. Training_Sessions store session type, duration, intensity and many other climbing specific metrics such as highest grade, attempts, tops and flashes. Food_Entry stores information about meals and their macronutrient data, allowing daily nutrition totals and dashboard summaries to be calculated.</w:t>
+      </w:r>
+    </w:p>
+    <w:p>
+      <w:pPr>
+        <w:spacing w:line="360" w:lineRule="auto"/>
+        <w:rPr>
+          <w:rFonts w:ascii="Calibri" w:hAnsi="Calibri" w:cs="Calibri"/>
+        </w:rPr>
+      </w:pPr>
+      <w:r>
+        <w:rPr>
+          <w:rFonts w:ascii="Calibri" w:hAnsi="Calibri" w:cs="Calibri"/>
+        </w:rPr>
+        <w:t>The community related tables support forum interaction as well as social features. Forum_Posts store user created posts, while Forum_Comments sores any comments liked to post as well as the user who crated them. Forum_Likes and Forum_Favourites are associative tables that allow many users to interact with forum posts while still maintaining a clear relational structure.</w:t>
+      </w:r>
+    </w:p>
+    <w:p>
+      <w:pPr>
+        <w:spacing w:line="360" w:lineRule="auto"/>
+        <w:rPr>
+          <w:rFonts w:ascii="Calibri" w:hAnsi="Calibri" w:cs="Calibri"/>
+        </w:rPr>
+      </w:pPr>
+      <w:r>
+        <w:rPr>
+          <w:rFonts w:ascii="Calibri" w:hAnsi="Calibri" w:cs="Calibri"/>
+        </w:rPr>
+        <w:lastRenderedPageBreak/>
+        <w:t>Finally, the Friend_Requests table supports social connection functionality. It references User table twice for both the sender field and for the receiver field, allowing incoming and outgoing friend requests to be represented within the database.</w:t>
+      </w:r>
+    </w:p>
+    <w:p>
+      <w:pPr>
+        <w:spacing w:line="360" w:lineRule="auto"/>
+        <w:rPr>
+          <w:rFonts w:ascii="Calibri" w:hAnsi="Calibri" w:cs="Calibri"/>
+        </w:rPr>
+      </w:pPr>
+      <w:r>
+        <w:rPr>
+          <w:rFonts w:ascii="Calibri" w:hAnsi="Calibri" w:cs="Calibri"/>
+        </w:rPr>
+        <w:t>To note, for readability, only key attributes are shown in the ERD. Additional implementation fields are existent within the codebase but are omitted from the diagram above as they are not necessar</w:t>
+      </w:r>
+      <w:r>
+        <w:rPr>
+          <w:rFonts w:ascii="Calibri" w:hAnsi="Calibri" w:cs="Calibri"/>
+        </w:rPr>
+        <w:t>ily</w:t>
+      </w:r>
+      <w:r>
+        <w:rPr>
+          <w:rFonts w:ascii="Calibri" w:hAnsi="Calibri" w:cs="Calibri"/>
+        </w:rPr>
+        <w:t xml:space="preserve"> essential to understanding the main database structure.</w:t>
+      </w:r>
     </w:p>
     <w:p>
       <w:pPr>
@@ -10907,16 +11214,24 @@
           <w:bCs/>
         </w:rPr>
       </w:pPr>
-      <w:bookmarkStart w:id="17" w:name="_Toc227860124"/>
+      <w:bookmarkStart w:id="18" w:name="_Toc227860125"/>
       <w:r>
         <w:rPr>
           <w:rFonts w:ascii="Calibri" w:hAnsi="Calibri" w:cs="Calibri"/>
           <w:b/>
           <w:bCs/>
         </w:rPr>
-        <w:t>4.2 Database Design</w:t>
-      </w:r>
-      <w:bookmarkEnd w:id="17"/>
+        <w:t>4.3 Detailed Design (UML)</w:t>
+      </w:r>
+      <w:bookmarkEnd w:id="18"/>
+    </w:p>
+    <w:p>
+      <w:pPr>
+        <w:spacing w:line="360" w:lineRule="auto"/>
+        <w:rPr>
+          <w:rFonts w:ascii="Calibri" w:hAnsi="Calibri" w:cs="Calibri"/>
+        </w:rPr>
+      </w:pPr>
     </w:p>
     <w:p>
       <w:pPr>
@@ -10928,16 +11243,24 @@
           <w:bCs/>
         </w:rPr>
       </w:pPr>
-      <w:bookmarkStart w:id="18" w:name="_Toc227860125"/>
+      <w:bookmarkStart w:id="19" w:name="_Toc227860126"/>
       <w:r>
         <w:rPr>
           <w:rFonts w:ascii="Calibri" w:hAnsi="Calibri" w:cs="Calibri"/>
           <w:b/>
           <w:bCs/>
         </w:rPr>
-        <w:t>4.3 Detailed Design (UML)</w:t>
-      </w:r>
-      <w:bookmarkEnd w:id="18"/>
+        <w:t>4.4 User Interface (UI) Design</w:t>
+      </w:r>
+      <w:bookmarkEnd w:id="19"/>
+    </w:p>
+    <w:p>
+      <w:pPr>
+        <w:spacing w:line="360" w:lineRule="auto"/>
+        <w:rPr>
+          <w:rFonts w:ascii="Calibri" w:hAnsi="Calibri" w:cs="Calibri"/>
+        </w:rPr>
+      </w:pPr>
     </w:p>
     <w:p>
       <w:pPr>
@@ -10949,20 +11272,28 @@
           <w:bCs/>
         </w:rPr>
       </w:pPr>
-      <w:bookmarkStart w:id="19" w:name="_Toc227860126"/>
+      <w:bookmarkStart w:id="20" w:name="_Toc227860127"/>
       <w:r>
         <w:rPr>
           <w:rFonts w:ascii="Calibri" w:hAnsi="Calibri" w:cs="Calibri"/>
           <w:b/>
           <w:bCs/>
         </w:rPr>
-        <w:t>4.4 User Interface (UI) Design</w:t>
-      </w:r>
-      <w:bookmarkEnd w:id="19"/>
-    </w:p>
-    <w:p>
-      <w:pPr>
-        <w:pStyle w:val="Heading2"/>
+        <w:t>4.5 Technical Justification</w:t>
+      </w:r>
+      <w:bookmarkEnd w:id="20"/>
+    </w:p>
+    <w:p>
+      <w:pPr>
+        <w:spacing w:line="360" w:lineRule="auto"/>
+        <w:rPr>
+          <w:rFonts w:ascii="Calibri" w:hAnsi="Calibri" w:cs="Calibri"/>
+        </w:rPr>
+      </w:pPr>
+    </w:p>
+    <w:p>
+      <w:pPr>
+        <w:pStyle w:val="Heading1"/>
         <w:spacing w:line="360" w:lineRule="auto"/>
         <w:rPr>
           <w:rFonts w:ascii="Calibri" w:hAnsi="Calibri" w:cs="Calibri"/>
@@ -10970,20 +11301,351 @@
           <w:bCs/>
         </w:rPr>
       </w:pPr>
-      <w:bookmarkStart w:id="20" w:name="_Toc227860127"/>
+      <w:bookmarkStart w:id="21" w:name="_Toc227860128"/>
       <w:r>
         <w:rPr>
           <w:rFonts w:ascii="Calibri" w:hAnsi="Calibri" w:cs="Calibri"/>
           <w:b/>
           <w:bCs/>
         </w:rPr>
-        <w:t>4.5 Technical Justification</w:t>
-      </w:r>
-      <w:bookmarkEnd w:id="20"/>
-    </w:p>
-    <w:p>
-      <w:pPr>
-        <w:pStyle w:val="Heading1"/>
+        <w:t>Chapter 5 Implementation and Technical Realisation (15%)</w:t>
+      </w:r>
+      <w:bookmarkEnd w:id="21"/>
+    </w:p>
+    <w:p>
+      <w:pPr>
+        <w:spacing w:line="360" w:lineRule="auto"/>
+        <w:rPr>
+          <w:rFonts w:ascii="Calibri" w:hAnsi="Calibri" w:cs="Calibri"/>
+        </w:rPr>
+      </w:pPr>
+      <w:proofErr w:type="gramStart"/>
+      <w:r>
+        <w:rPr>
+          <w:rFonts w:ascii="Calibri" w:hAnsi="Calibri" w:cs="Calibri"/>
+        </w:rPr>
+        <w:t>Main Focus</w:t>
+      </w:r>
+      <w:proofErr w:type="gramEnd"/>
+      <w:r>
+        <w:rPr>
+          <w:rFonts w:ascii="Calibri" w:hAnsi="Calibri" w:cs="Calibri"/>
+        </w:rPr>
+        <w:t>: To describe the development process and highlight the significant technical challenges</w:t>
+      </w:r>
+    </w:p>
+    <w:p>
+      <w:pPr>
+        <w:spacing w:line="360" w:lineRule="auto"/>
+        <w:rPr>
+          <w:rFonts w:ascii="Calibri" w:hAnsi="Calibri" w:cs="Calibri"/>
+        </w:rPr>
+      </w:pPr>
+      <w:r>
+        <w:rPr>
+          <w:rFonts w:ascii="Calibri" w:hAnsi="Calibri" w:cs="Calibri"/>
+        </w:rPr>
+        <w:t>encountered.</w:t>
+      </w:r>
+    </w:p>
+    <w:p>
+      <w:pPr>
+        <w:spacing w:line="360" w:lineRule="auto"/>
+        <w:rPr>
+          <w:rFonts w:ascii="Calibri" w:hAnsi="Calibri" w:cs="Calibri"/>
+        </w:rPr>
+      </w:pPr>
+      <w:r>
+        <w:rPr>
+          <w:rFonts w:ascii="Calibri" w:hAnsi="Calibri" w:cs="Calibri"/>
+        </w:rPr>
+        <w:t>• Implementation Strategy: Provide a brief overview of your development environment and the</w:t>
+      </w:r>
+    </w:p>
+    <w:p>
+      <w:pPr>
+        <w:spacing w:line="360" w:lineRule="auto"/>
+        <w:rPr>
+          <w:rFonts w:ascii="Calibri" w:hAnsi="Calibri" w:cs="Calibri"/>
+        </w:rPr>
+      </w:pPr>
+      <w:r>
+        <w:rPr>
+          <w:rFonts w:ascii="Calibri" w:hAnsi="Calibri" w:cs="Calibri"/>
+        </w:rPr>
+        <w:t>strategy used to build the system. This should include (but not be restricted to) things such as the</w:t>
+      </w:r>
+    </w:p>
+    <w:p>
+      <w:pPr>
+        <w:spacing w:line="360" w:lineRule="auto"/>
+        <w:rPr>
+          <w:rFonts w:ascii="Calibri" w:hAnsi="Calibri" w:cs="Calibri"/>
+        </w:rPr>
+      </w:pPr>
+      <w:r>
+        <w:rPr>
+          <w:rFonts w:ascii="Calibri" w:hAnsi="Calibri" w:cs="Calibri"/>
+        </w:rPr>
+        <w:t>development environment (IDE, version control, etc.), your approach to modularisation (how you</w:t>
+      </w:r>
+    </w:p>
+    <w:p>
+      <w:pPr>
+        <w:spacing w:line="360" w:lineRule="auto"/>
+        <w:rPr>
+          <w:rFonts w:ascii="Calibri" w:hAnsi="Calibri" w:cs="Calibri"/>
+        </w:rPr>
+      </w:pPr>
+      <w:r>
+        <w:rPr>
+          <w:rFonts w:ascii="Calibri" w:hAnsi="Calibri" w:cs="Calibri"/>
+        </w:rPr>
+        <w:t>broke the system down into manageable parts), any use of Design Patterns (e.g., Singleton,</w:t>
+      </w:r>
+    </w:p>
+    <w:p>
+      <w:pPr>
+        <w:spacing w:line="360" w:lineRule="auto"/>
+        <w:rPr>
+          <w:rFonts w:ascii="Calibri" w:hAnsi="Calibri" w:cs="Calibri"/>
+        </w:rPr>
+      </w:pPr>
+      <w:r>
+        <w:rPr>
+          <w:rFonts w:ascii="Calibri" w:hAnsi="Calibri" w:cs="Calibri"/>
+        </w:rPr>
+        <w:t>Factory, Observer) that were implemented to ensure code quality and maintainability.</w:t>
+      </w:r>
+    </w:p>
+    <w:p>
+      <w:pPr>
+        <w:spacing w:line="360" w:lineRule="auto"/>
+        <w:rPr>
+          <w:rFonts w:ascii="Calibri" w:hAnsi="Calibri" w:cs="Calibri"/>
+        </w:rPr>
+      </w:pPr>
+      <w:r>
+        <w:rPr>
+          <w:rFonts w:ascii="Calibri" w:hAnsi="Calibri" w:cs="Calibri"/>
+        </w:rPr>
+        <w:t>• Core Feature Implementation: Choose your most critical or complex features (e.g. 2 or 3) and for</w:t>
+      </w:r>
+    </w:p>
+    <w:p>
+      <w:pPr>
+        <w:spacing w:line="360" w:lineRule="auto"/>
+        <w:rPr>
+          <w:rFonts w:ascii="Calibri" w:hAnsi="Calibri" w:cs="Calibri"/>
+        </w:rPr>
+      </w:pPr>
+      <w:r>
+        <w:rPr>
+          <w:rFonts w:ascii="Calibri" w:hAnsi="Calibri" w:cs="Calibri"/>
+        </w:rPr>
+        <w:t>each, explain how you translated the Design (from Chapter 4) into working code. Include concise,</w:t>
+      </w:r>
+    </w:p>
+    <w:p>
+      <w:pPr>
+        <w:spacing w:line="360" w:lineRule="auto"/>
+        <w:rPr>
+          <w:rFonts w:ascii="Calibri" w:hAnsi="Calibri" w:cs="Calibri"/>
+        </w:rPr>
+      </w:pPr>
+      <w:r>
+        <w:rPr>
+          <w:rFonts w:ascii="Calibri" w:hAnsi="Calibri" w:cs="Calibri"/>
+        </w:rPr>
+        <w:t>well-commented code snippets (~20–30 lines max) that demonstrate your implementation of the</w:t>
+      </w:r>
+    </w:p>
+    <w:p>
+      <w:pPr>
+        <w:spacing w:line="360" w:lineRule="auto"/>
+        <w:rPr>
+          <w:rFonts w:ascii="Calibri" w:hAnsi="Calibri" w:cs="Calibri"/>
+        </w:rPr>
+      </w:pPr>
+      <w:r>
+        <w:rPr>
+          <w:rFonts w:ascii="Calibri" w:hAnsi="Calibri" w:cs="Calibri"/>
+        </w:rPr>
+        <w:lastRenderedPageBreak/>
+        <w:t>core logic. Avoid "boilerplate" code (like imports or basic setup). Focus on the logic that makes the</w:t>
+      </w:r>
+    </w:p>
+    <w:p>
+      <w:pPr>
+        <w:spacing w:line="360" w:lineRule="auto"/>
+        <w:rPr>
+          <w:rFonts w:ascii="Calibri" w:hAnsi="Calibri" w:cs="Calibri"/>
+        </w:rPr>
+      </w:pPr>
+      <w:r>
+        <w:rPr>
+          <w:rFonts w:ascii="Calibri" w:hAnsi="Calibri" w:cs="Calibri"/>
+        </w:rPr>
+        <w:t>feature work. Do not include full source files in the main text, these belong in your repository.</w:t>
+      </w:r>
+    </w:p>
+    <w:p>
+      <w:pPr>
+        <w:spacing w:line="360" w:lineRule="auto"/>
+        <w:rPr>
+          <w:rFonts w:ascii="Calibri" w:hAnsi="Calibri" w:cs="Calibri"/>
+        </w:rPr>
+      </w:pPr>
+      <w:r>
+        <w:rPr>
+          <w:rFonts w:ascii="Calibri" w:hAnsi="Calibri" w:cs="Calibri"/>
+        </w:rPr>
+        <w:t>• Technical Challenges and Solutions: Describe the most significant technical "roadblocks" you</w:t>
+      </w:r>
+    </w:p>
+    <w:p>
+      <w:pPr>
+        <w:spacing w:line="360" w:lineRule="auto"/>
+        <w:rPr>
+          <w:rFonts w:ascii="Calibri" w:hAnsi="Calibri" w:cs="Calibri"/>
+        </w:rPr>
+      </w:pPr>
+      <w:r>
+        <w:rPr>
+          <w:rFonts w:ascii="Calibri" w:hAnsi="Calibri" w:cs="Calibri"/>
+        </w:rPr>
+        <w:t>encountered during the implementation. For each challenge, describe the problem (e.g. the bug,</w:t>
+      </w:r>
+    </w:p>
+    <w:p>
+      <w:pPr>
+        <w:spacing w:line="360" w:lineRule="auto"/>
+        <w:rPr>
+          <w:rFonts w:ascii="Calibri" w:hAnsi="Calibri" w:cs="Calibri"/>
+        </w:rPr>
+      </w:pPr>
+      <w:r>
+        <w:rPr>
+          <w:rFonts w:ascii="Calibri" w:hAnsi="Calibri" w:cs="Calibri"/>
+        </w:rPr>
+        <w:t>integration issue, or performance bottleneck), how you identified the root cause, how you fixed</w:t>
+      </w:r>
+    </w:p>
+    <w:p>
+      <w:pPr>
+        <w:spacing w:line="360" w:lineRule="auto"/>
+        <w:rPr>
+          <w:rFonts w:ascii="Calibri" w:hAnsi="Calibri" w:cs="Calibri"/>
+        </w:rPr>
+      </w:pPr>
+      <w:r>
+        <w:rPr>
+          <w:rFonts w:ascii="Calibri" w:hAnsi="Calibri" w:cs="Calibri"/>
+        </w:rPr>
+        <w:t>or bypassed the issue and how the solution affected the final system (e.g., improved performance</w:t>
+      </w:r>
+    </w:p>
+    <w:p>
+      <w:pPr>
+        <w:spacing w:line="360" w:lineRule="auto"/>
+        <w:rPr>
+          <w:rFonts w:ascii="Calibri" w:hAnsi="Calibri" w:cs="Calibri"/>
+        </w:rPr>
+      </w:pPr>
+      <w:r>
+        <w:rPr>
+          <w:rFonts w:ascii="Calibri" w:hAnsi="Calibri" w:cs="Calibri"/>
+        </w:rPr>
+        <w:t>or better security)</w:t>
+      </w:r>
+    </w:p>
+    <w:p>
+      <w:pPr>
+        <w:spacing w:line="360" w:lineRule="auto"/>
+        <w:rPr>
+          <w:rFonts w:ascii="Calibri" w:hAnsi="Calibri" w:cs="Calibri"/>
+        </w:rPr>
+      </w:pPr>
+      <w:r>
+        <w:rPr>
+          <w:rFonts w:ascii="Calibri" w:hAnsi="Calibri" w:cs="Calibri"/>
+        </w:rPr>
+        <w:t>• Use of Third-Party Integration (where appropriate): Discuss how you integrated external libraries,</w:t>
+      </w:r>
+    </w:p>
+    <w:p>
+      <w:pPr>
+        <w:spacing w:line="360" w:lineRule="auto"/>
+        <w:rPr>
+          <w:rFonts w:ascii="Calibri" w:hAnsi="Calibri" w:cs="Calibri"/>
+        </w:rPr>
+      </w:pPr>
+      <w:r>
+        <w:rPr>
+          <w:rFonts w:ascii="Calibri" w:hAnsi="Calibri" w:cs="Calibri"/>
+        </w:rPr>
+        <w:t>APIs, or frameworks. Focus on the technical hurdles of getting disparate systems to communicate</w:t>
+      </w:r>
+    </w:p>
+    <w:p>
+      <w:pPr>
+        <w:spacing w:line="360" w:lineRule="auto"/>
+        <w:rPr>
+          <w:rFonts w:ascii="Calibri" w:hAnsi="Calibri" w:cs="Calibri"/>
+        </w:rPr>
+      </w:pPr>
+      <w:r>
+        <w:rPr>
+          <w:rFonts w:ascii="Calibri" w:hAnsi="Calibri" w:cs="Calibri"/>
+        </w:rPr>
+        <w:t>and how you handled things such as data mapping or authentication between them.</w:t>
+      </w:r>
+    </w:p>
+    <w:p>
+      <w:pPr>
+        <w:spacing w:line="360" w:lineRule="auto"/>
+        <w:rPr>
+          <w:rFonts w:ascii="Calibri" w:hAnsi="Calibri" w:cs="Calibri"/>
+        </w:rPr>
+      </w:pPr>
+      <w:r>
+        <w:rPr>
+          <w:rFonts w:ascii="Calibri" w:hAnsi="Calibri" w:cs="Calibri"/>
+        </w:rPr>
+        <w:t>• Refinement and Refactoring: Briefly describe how your implementation evolved or any refactoring</w:t>
+      </w:r>
+    </w:p>
+    <w:p>
+      <w:pPr>
+        <w:spacing w:line="360" w:lineRule="auto"/>
+        <w:rPr>
+          <w:rFonts w:ascii="Calibri" w:hAnsi="Calibri" w:cs="Calibri"/>
+        </w:rPr>
+      </w:pPr>
+      <w:r>
+        <w:rPr>
+          <w:rFonts w:ascii="Calibri" w:hAnsi="Calibri" w:cs="Calibri"/>
+        </w:rPr>
+        <w:t>that was required, e.g. refactoring required to meet Non-Functional Requirements (such as</w:t>
+      </w:r>
+    </w:p>
+    <w:p>
+      <w:pPr>
+        <w:spacing w:line="360" w:lineRule="auto"/>
+        <w:rPr>
+          <w:rFonts w:ascii="Calibri" w:hAnsi="Calibri" w:cs="Calibri"/>
+        </w:rPr>
+      </w:pPr>
+      <w:r>
+        <w:rPr>
+          <w:rFonts w:ascii="Calibri" w:hAnsi="Calibri" w:cs="Calibri"/>
+        </w:rPr>
+        <w:t>Performance or Maintainability).</w:t>
+      </w:r>
+    </w:p>
+    <w:p>
+      <w:pPr>
+        <w:pStyle w:val="Heading2"/>
         <w:spacing w:line="360" w:lineRule="auto"/>
         <w:rPr>
           <w:rFonts w:ascii="Calibri" w:hAnsi="Calibri" w:cs="Calibri"/>
@@ -10991,347 +11653,16 @@
           <w:bCs/>
         </w:rPr>
       </w:pPr>
-      <w:bookmarkStart w:id="21" w:name="_Toc227860128"/>
+      <w:bookmarkStart w:id="22" w:name="_Toc227860129"/>
       <w:r>
         <w:rPr>
           <w:rFonts w:ascii="Calibri" w:hAnsi="Calibri" w:cs="Calibri"/>
           <w:b/>
           <w:bCs/>
         </w:rPr>
-        <w:t>Chapter 5 Implementation and Technical Realisation (15%)</w:t>
-      </w:r>
-      <w:bookmarkEnd w:id="21"/>
-    </w:p>
-    <w:p>
-      <w:pPr>
-        <w:spacing w:line="360" w:lineRule="auto"/>
-        <w:rPr>
-          <w:rFonts w:ascii="Calibri" w:hAnsi="Calibri" w:cs="Calibri"/>
-        </w:rPr>
-      </w:pPr>
-      <w:proofErr w:type="gramStart"/>
-      <w:r>
-        <w:rPr>
-          <w:rFonts w:ascii="Calibri" w:hAnsi="Calibri" w:cs="Calibri"/>
-        </w:rPr>
-        <w:t>Main Focus</w:t>
-      </w:r>
-      <w:proofErr w:type="gramEnd"/>
-      <w:r>
-        <w:rPr>
-          <w:rFonts w:ascii="Calibri" w:hAnsi="Calibri" w:cs="Calibri"/>
-        </w:rPr>
-        <w:t>: To describe the development process and highlight the significant technical challenges</w:t>
-      </w:r>
-    </w:p>
-    <w:p>
-      <w:pPr>
-        <w:spacing w:line="360" w:lineRule="auto"/>
-        <w:rPr>
-          <w:rFonts w:ascii="Calibri" w:hAnsi="Calibri" w:cs="Calibri"/>
-        </w:rPr>
-      </w:pPr>
-      <w:r>
-        <w:rPr>
-          <w:rFonts w:ascii="Calibri" w:hAnsi="Calibri" w:cs="Calibri"/>
-        </w:rPr>
-        <w:t>encountered.</w:t>
-      </w:r>
-    </w:p>
-    <w:p>
-      <w:pPr>
-        <w:spacing w:line="360" w:lineRule="auto"/>
-        <w:rPr>
-          <w:rFonts w:ascii="Calibri" w:hAnsi="Calibri" w:cs="Calibri"/>
-        </w:rPr>
-      </w:pPr>
-      <w:r>
-        <w:rPr>
-          <w:rFonts w:ascii="Calibri" w:hAnsi="Calibri" w:cs="Calibri"/>
-        </w:rPr>
-        <w:t>• Implementation Strategy: Provide a brief overview of your development environment and the</w:t>
-      </w:r>
-    </w:p>
-    <w:p>
-      <w:pPr>
-        <w:spacing w:line="360" w:lineRule="auto"/>
-        <w:rPr>
-          <w:rFonts w:ascii="Calibri" w:hAnsi="Calibri" w:cs="Calibri"/>
-        </w:rPr>
-      </w:pPr>
-      <w:r>
-        <w:rPr>
-          <w:rFonts w:ascii="Calibri" w:hAnsi="Calibri" w:cs="Calibri"/>
-        </w:rPr>
-        <w:t>strategy used to build the system. This should include (but not be restricted to) things such as the</w:t>
-      </w:r>
-    </w:p>
-    <w:p>
-      <w:pPr>
-        <w:spacing w:line="360" w:lineRule="auto"/>
-        <w:rPr>
-          <w:rFonts w:ascii="Calibri" w:hAnsi="Calibri" w:cs="Calibri"/>
-        </w:rPr>
-      </w:pPr>
-      <w:r>
-        <w:rPr>
-          <w:rFonts w:ascii="Calibri" w:hAnsi="Calibri" w:cs="Calibri"/>
-        </w:rPr>
-        <w:t>development environment (IDE, version control, etc.), your approach to modularisation (how you</w:t>
-      </w:r>
-    </w:p>
-    <w:p>
-      <w:pPr>
-        <w:spacing w:line="360" w:lineRule="auto"/>
-        <w:rPr>
-          <w:rFonts w:ascii="Calibri" w:hAnsi="Calibri" w:cs="Calibri"/>
-        </w:rPr>
-      </w:pPr>
-      <w:r>
-        <w:rPr>
-          <w:rFonts w:ascii="Calibri" w:hAnsi="Calibri" w:cs="Calibri"/>
-        </w:rPr>
-        <w:t>broke the system down into manageable parts), any use of Design Patterns (e.g., Singleton,</w:t>
-      </w:r>
-    </w:p>
-    <w:p>
-      <w:pPr>
-        <w:spacing w:line="360" w:lineRule="auto"/>
-        <w:rPr>
-          <w:rFonts w:ascii="Calibri" w:hAnsi="Calibri" w:cs="Calibri"/>
-        </w:rPr>
-      </w:pPr>
-      <w:r>
-        <w:rPr>
-          <w:rFonts w:ascii="Calibri" w:hAnsi="Calibri" w:cs="Calibri"/>
-        </w:rPr>
-        <w:t>Factory, Observer) that were implemented to ensure code quality and maintainability.</w:t>
-      </w:r>
-    </w:p>
-    <w:p>
-      <w:pPr>
-        <w:spacing w:line="360" w:lineRule="auto"/>
-        <w:rPr>
-          <w:rFonts w:ascii="Calibri" w:hAnsi="Calibri" w:cs="Calibri"/>
-        </w:rPr>
-      </w:pPr>
-      <w:r>
-        <w:rPr>
-          <w:rFonts w:ascii="Calibri" w:hAnsi="Calibri" w:cs="Calibri"/>
-        </w:rPr>
-        <w:t>• Core Feature Implementation: Choose your most critical or complex features (e.g. 2 or 3) and for</w:t>
-      </w:r>
-    </w:p>
-    <w:p>
-      <w:pPr>
-        <w:spacing w:line="360" w:lineRule="auto"/>
-        <w:rPr>
-          <w:rFonts w:ascii="Calibri" w:hAnsi="Calibri" w:cs="Calibri"/>
-        </w:rPr>
-      </w:pPr>
-      <w:r>
-        <w:rPr>
-          <w:rFonts w:ascii="Calibri" w:hAnsi="Calibri" w:cs="Calibri"/>
-        </w:rPr>
-        <w:t>each, explain how you translated the Design (from Chapter 4) into working code. Include concise,</w:t>
-      </w:r>
-    </w:p>
-    <w:p>
-      <w:pPr>
-        <w:spacing w:line="360" w:lineRule="auto"/>
-        <w:rPr>
-          <w:rFonts w:ascii="Calibri" w:hAnsi="Calibri" w:cs="Calibri"/>
-        </w:rPr>
-      </w:pPr>
-      <w:r>
-        <w:rPr>
-          <w:rFonts w:ascii="Calibri" w:hAnsi="Calibri" w:cs="Calibri"/>
-        </w:rPr>
-        <w:t>well-commented code snippets (~20–30 lines max) that demonstrate your implementation of the</w:t>
-      </w:r>
-    </w:p>
-    <w:p>
-      <w:pPr>
-        <w:spacing w:line="360" w:lineRule="auto"/>
-        <w:rPr>
-          <w:rFonts w:ascii="Calibri" w:hAnsi="Calibri" w:cs="Calibri"/>
-        </w:rPr>
-      </w:pPr>
-      <w:r>
-        <w:rPr>
-          <w:rFonts w:ascii="Calibri" w:hAnsi="Calibri" w:cs="Calibri"/>
-        </w:rPr>
-        <w:t>core logic. Avoid "boilerplate" code (like imports or basic setup). Focus on the logic that makes the</w:t>
-      </w:r>
-    </w:p>
-    <w:p>
-      <w:pPr>
-        <w:spacing w:line="360" w:lineRule="auto"/>
-        <w:rPr>
-          <w:rFonts w:ascii="Calibri" w:hAnsi="Calibri" w:cs="Calibri"/>
-        </w:rPr>
-      </w:pPr>
-      <w:r>
-        <w:rPr>
-          <w:rFonts w:ascii="Calibri" w:hAnsi="Calibri" w:cs="Calibri"/>
-        </w:rPr>
-        <w:t>feature work. Do not include full source files in the main text, these belong in your repository.</w:t>
-      </w:r>
-    </w:p>
-    <w:p>
-      <w:pPr>
-        <w:spacing w:line="360" w:lineRule="auto"/>
-        <w:rPr>
-          <w:rFonts w:ascii="Calibri" w:hAnsi="Calibri" w:cs="Calibri"/>
-        </w:rPr>
-      </w:pPr>
-      <w:r>
-        <w:rPr>
-          <w:rFonts w:ascii="Calibri" w:hAnsi="Calibri" w:cs="Calibri"/>
-        </w:rPr>
-        <w:t>• Technical Challenges and Solutions: Describe the most significant technical "roadblocks" you</w:t>
-      </w:r>
-    </w:p>
-    <w:p>
-      <w:pPr>
-        <w:spacing w:line="360" w:lineRule="auto"/>
-        <w:rPr>
-          <w:rFonts w:ascii="Calibri" w:hAnsi="Calibri" w:cs="Calibri"/>
-        </w:rPr>
-      </w:pPr>
-      <w:r>
-        <w:rPr>
-          <w:rFonts w:ascii="Calibri" w:hAnsi="Calibri" w:cs="Calibri"/>
-        </w:rPr>
-        <w:t>encountered during the implementation. For each challenge, describe the problem (e.g. the bug,</w:t>
-      </w:r>
-    </w:p>
-    <w:p>
-      <w:pPr>
-        <w:spacing w:line="360" w:lineRule="auto"/>
-        <w:rPr>
-          <w:rFonts w:ascii="Calibri" w:hAnsi="Calibri" w:cs="Calibri"/>
-        </w:rPr>
-      </w:pPr>
-      <w:r>
-        <w:rPr>
-          <w:rFonts w:ascii="Calibri" w:hAnsi="Calibri" w:cs="Calibri"/>
-        </w:rPr>
-        <w:t>integration issue, or performance bottleneck), how you identified the root cause, how you fixed</w:t>
-      </w:r>
-    </w:p>
-    <w:p>
-      <w:pPr>
-        <w:spacing w:line="360" w:lineRule="auto"/>
-        <w:rPr>
-          <w:rFonts w:ascii="Calibri" w:hAnsi="Calibri" w:cs="Calibri"/>
-        </w:rPr>
-      </w:pPr>
-      <w:r>
-        <w:rPr>
-          <w:rFonts w:ascii="Calibri" w:hAnsi="Calibri" w:cs="Calibri"/>
-        </w:rPr>
-        <w:lastRenderedPageBreak/>
-        <w:t>or bypassed the issue and how the solution affected the final system (e.g., improved performance</w:t>
-      </w:r>
-    </w:p>
-    <w:p>
-      <w:pPr>
-        <w:spacing w:line="360" w:lineRule="auto"/>
-        <w:rPr>
-          <w:rFonts w:ascii="Calibri" w:hAnsi="Calibri" w:cs="Calibri"/>
-        </w:rPr>
-      </w:pPr>
-      <w:r>
-        <w:rPr>
-          <w:rFonts w:ascii="Calibri" w:hAnsi="Calibri" w:cs="Calibri"/>
-        </w:rPr>
-        <w:t>or better security)</w:t>
-      </w:r>
-    </w:p>
-    <w:p>
-      <w:pPr>
-        <w:spacing w:line="360" w:lineRule="auto"/>
-        <w:rPr>
-          <w:rFonts w:ascii="Calibri" w:hAnsi="Calibri" w:cs="Calibri"/>
-        </w:rPr>
-      </w:pPr>
-      <w:r>
-        <w:rPr>
-          <w:rFonts w:ascii="Calibri" w:hAnsi="Calibri" w:cs="Calibri"/>
-        </w:rPr>
-        <w:t>• Use of Third-Party Integration (where appropriate): Discuss how you integrated external libraries,</w:t>
-      </w:r>
-    </w:p>
-    <w:p>
-      <w:pPr>
-        <w:spacing w:line="360" w:lineRule="auto"/>
-        <w:rPr>
-          <w:rFonts w:ascii="Calibri" w:hAnsi="Calibri" w:cs="Calibri"/>
-        </w:rPr>
-      </w:pPr>
-      <w:r>
-        <w:rPr>
-          <w:rFonts w:ascii="Calibri" w:hAnsi="Calibri" w:cs="Calibri"/>
-        </w:rPr>
-        <w:t>APIs, or frameworks. Focus on the technical hurdles of getting disparate systems to communicate</w:t>
-      </w:r>
-    </w:p>
-    <w:p>
-      <w:pPr>
-        <w:spacing w:line="360" w:lineRule="auto"/>
-        <w:rPr>
-          <w:rFonts w:ascii="Calibri" w:hAnsi="Calibri" w:cs="Calibri"/>
-        </w:rPr>
-      </w:pPr>
-      <w:r>
-        <w:rPr>
-          <w:rFonts w:ascii="Calibri" w:hAnsi="Calibri" w:cs="Calibri"/>
-        </w:rPr>
-        <w:t>and how you handled things such as data mapping or authentication between them.</w:t>
-      </w:r>
-    </w:p>
-    <w:p>
-      <w:pPr>
-        <w:spacing w:line="360" w:lineRule="auto"/>
-        <w:rPr>
-          <w:rFonts w:ascii="Calibri" w:hAnsi="Calibri" w:cs="Calibri"/>
-        </w:rPr>
-      </w:pPr>
-      <w:r>
-        <w:rPr>
-          <w:rFonts w:ascii="Calibri" w:hAnsi="Calibri" w:cs="Calibri"/>
-        </w:rPr>
-        <w:t>• Refinement and Refactoring: Briefly describe how your implementation evolved or any refactoring</w:t>
-      </w:r>
-    </w:p>
-    <w:p>
-      <w:pPr>
-        <w:spacing w:line="360" w:lineRule="auto"/>
-        <w:rPr>
-          <w:rFonts w:ascii="Calibri" w:hAnsi="Calibri" w:cs="Calibri"/>
-        </w:rPr>
-      </w:pPr>
-      <w:r>
-        <w:rPr>
-          <w:rFonts w:ascii="Calibri" w:hAnsi="Calibri" w:cs="Calibri"/>
-        </w:rPr>
-        <w:t>that was required, e.g. refactoring required to meet Non-Functional Requirements (such as</w:t>
-      </w:r>
-    </w:p>
-    <w:p>
-      <w:pPr>
-        <w:spacing w:line="360" w:lineRule="auto"/>
-        <w:rPr>
-          <w:rFonts w:ascii="Calibri" w:hAnsi="Calibri" w:cs="Calibri"/>
-        </w:rPr>
-      </w:pPr>
-      <w:r>
-        <w:rPr>
-          <w:rFonts w:ascii="Calibri" w:hAnsi="Calibri" w:cs="Calibri"/>
-        </w:rPr>
-        <w:t>Performance or Maintainability).</w:t>
-      </w:r>
+        <w:t>5.1 Implementation Strategy</w:t>
+      </w:r>
+      <w:bookmarkEnd w:id="22"/>
     </w:p>
     <w:p>
       <w:pPr>
@@ -11343,16 +11674,16 @@
           <w:bCs/>
         </w:rPr>
       </w:pPr>
-      <w:bookmarkStart w:id="22" w:name="_Toc227860129"/>
+      <w:bookmarkStart w:id="23" w:name="_Toc227860130"/>
       <w:r>
         <w:rPr>
           <w:rFonts w:ascii="Calibri" w:hAnsi="Calibri" w:cs="Calibri"/>
           <w:b/>
           <w:bCs/>
         </w:rPr>
-        <w:t>5.1 Implementation Strategy</w:t>
-      </w:r>
-      <w:bookmarkEnd w:id="22"/>
+        <w:t>5.2 Core Feature Implementation</w:t>
+      </w:r>
+      <w:bookmarkEnd w:id="23"/>
     </w:p>
     <w:p>
       <w:pPr>
@@ -11364,16 +11695,16 @@
           <w:bCs/>
         </w:rPr>
       </w:pPr>
-      <w:bookmarkStart w:id="23" w:name="_Toc227860130"/>
+      <w:bookmarkStart w:id="24" w:name="_Toc227860131"/>
       <w:r>
         <w:rPr>
           <w:rFonts w:ascii="Calibri" w:hAnsi="Calibri" w:cs="Calibri"/>
           <w:b/>
           <w:bCs/>
         </w:rPr>
-        <w:t>5.2 Core Feature Implementation</w:t>
-      </w:r>
-      <w:bookmarkEnd w:id="23"/>
+        <w:t>5.3 Technical Challenges and Solutions</w:t>
+      </w:r>
+      <w:bookmarkEnd w:id="24"/>
     </w:p>
     <w:p>
       <w:pPr>
@@ -11385,16 +11716,16 @@
           <w:bCs/>
         </w:rPr>
       </w:pPr>
-      <w:bookmarkStart w:id="24" w:name="_Toc227860131"/>
+      <w:bookmarkStart w:id="25" w:name="_Toc227860132"/>
       <w:r>
         <w:rPr>
           <w:rFonts w:ascii="Calibri" w:hAnsi="Calibri" w:cs="Calibri"/>
           <w:b/>
           <w:bCs/>
         </w:rPr>
-        <w:t>5.3 Technical Challenges and Solutions</w:t>
-      </w:r>
-      <w:bookmarkEnd w:id="24"/>
+        <w:t>5.4 Use of Third-Party Integration</w:t>
+      </w:r>
+      <w:bookmarkEnd w:id="25"/>
     </w:p>
     <w:p>
       <w:pPr>
@@ -11406,20 +11737,28 @@
           <w:bCs/>
         </w:rPr>
       </w:pPr>
-      <w:bookmarkStart w:id="25" w:name="_Toc227860132"/>
+      <w:bookmarkStart w:id="26" w:name="_Toc227860133"/>
       <w:r>
         <w:rPr>
           <w:rFonts w:ascii="Calibri" w:hAnsi="Calibri" w:cs="Calibri"/>
           <w:b/>
           <w:bCs/>
         </w:rPr>
-        <w:t>5.4 Use of Third-Party Integration</w:t>
-      </w:r>
-      <w:bookmarkEnd w:id="25"/>
-    </w:p>
-    <w:p>
-      <w:pPr>
-        <w:pStyle w:val="Heading2"/>
+        <w:t>5.5 Refinement and Refactoring</w:t>
+      </w:r>
+      <w:bookmarkEnd w:id="26"/>
+    </w:p>
+    <w:p>
+      <w:pPr>
+        <w:spacing w:line="360" w:lineRule="auto"/>
+        <w:rPr>
+          <w:rFonts w:ascii="Calibri" w:hAnsi="Calibri" w:cs="Calibri"/>
+        </w:rPr>
+      </w:pPr>
+    </w:p>
+    <w:p>
+      <w:pPr>
+        <w:pStyle w:val="Heading1"/>
         <w:spacing w:line="360" w:lineRule="auto"/>
         <w:rPr>
           <w:rFonts w:ascii="Calibri" w:hAnsi="Calibri" w:cs="Calibri"/>
@@ -11427,28 +11766,267 @@
           <w:bCs/>
         </w:rPr>
       </w:pPr>
-      <w:bookmarkStart w:id="26" w:name="_Toc227860133"/>
+      <w:bookmarkStart w:id="27" w:name="_Toc227860134"/>
       <w:r>
         <w:rPr>
           <w:rFonts w:ascii="Calibri" w:hAnsi="Calibri" w:cs="Calibri"/>
           <w:b/>
           <w:bCs/>
         </w:rPr>
-        <w:t>5.5 Refinement and Refactoring</w:t>
-      </w:r>
-      <w:bookmarkEnd w:id="26"/>
-    </w:p>
-    <w:p>
-      <w:pPr>
-        <w:spacing w:line="360" w:lineRule="auto"/>
-        <w:rPr>
-          <w:rFonts w:ascii="Calibri" w:hAnsi="Calibri" w:cs="Calibri"/>
-        </w:rPr>
-      </w:pPr>
-    </w:p>
-    <w:p>
-      <w:pPr>
-        <w:pStyle w:val="Heading1"/>
+        <w:t>Chapter 6 Testing and Evaluation (15%)</w:t>
+      </w:r>
+      <w:bookmarkEnd w:id="27"/>
+    </w:p>
+    <w:p>
+      <w:pPr>
+        <w:spacing w:line="360" w:lineRule="auto"/>
+        <w:rPr>
+          <w:rFonts w:ascii="Calibri" w:hAnsi="Calibri" w:cs="Calibri"/>
+        </w:rPr>
+      </w:pPr>
+      <w:proofErr w:type="gramStart"/>
+      <w:r>
+        <w:rPr>
+          <w:rFonts w:ascii="Calibri" w:hAnsi="Calibri" w:cs="Calibri"/>
+        </w:rPr>
+        <w:t>Main Focus</w:t>
+      </w:r>
+      <w:proofErr w:type="gramEnd"/>
+      <w:r>
+        <w:rPr>
+          <w:rFonts w:ascii="Calibri" w:hAnsi="Calibri" w:cs="Calibri"/>
+        </w:rPr>
+        <w:t>: To provide objective evidence of the system’s quality and to critically evaluate the final</w:t>
+      </w:r>
+    </w:p>
+    <w:p>
+      <w:pPr>
+        <w:spacing w:line="360" w:lineRule="auto"/>
+        <w:rPr>
+          <w:rFonts w:ascii="Calibri" w:hAnsi="Calibri" w:cs="Calibri"/>
+        </w:rPr>
+      </w:pPr>
+      <w:r>
+        <w:rPr>
+          <w:rFonts w:ascii="Calibri" w:hAnsi="Calibri" w:cs="Calibri"/>
+        </w:rPr>
+        <w:t>product against the requirements.</w:t>
+      </w:r>
+    </w:p>
+    <w:p>
+      <w:pPr>
+        <w:spacing w:line="360" w:lineRule="auto"/>
+        <w:rPr>
+          <w:rFonts w:ascii="Calibri" w:hAnsi="Calibri" w:cs="Calibri"/>
+        </w:rPr>
+      </w:pPr>
+      <w:r>
+        <w:rPr>
+          <w:rFonts w:ascii="Calibri" w:hAnsi="Calibri" w:cs="Calibri"/>
+        </w:rPr>
+        <w:t>• Testing Methodology: Define and justify your chosen testing strategy. You should explain why your</w:t>
+      </w:r>
+    </w:p>
+    <w:p>
+      <w:pPr>
+        <w:spacing w:line="360" w:lineRule="auto"/>
+        <w:rPr>
+          <w:rFonts w:ascii="Calibri" w:hAnsi="Calibri" w:cs="Calibri"/>
+        </w:rPr>
+      </w:pPr>
+      <w:r>
+        <w:rPr>
+          <w:rFonts w:ascii="Calibri" w:hAnsi="Calibri" w:cs="Calibri"/>
+        </w:rPr>
+        <w:lastRenderedPageBreak/>
+        <w:t>chosen levels of testing (e.g. Unit, Integration, System, or others) were appropriate for your project</w:t>
+      </w:r>
+    </w:p>
+    <w:p>
+      <w:pPr>
+        <w:spacing w:line="360" w:lineRule="auto"/>
+        <w:rPr>
+          <w:rFonts w:ascii="Calibri" w:hAnsi="Calibri" w:cs="Calibri"/>
+        </w:rPr>
+      </w:pPr>
+      <w:r>
+        <w:rPr>
+          <w:rFonts w:ascii="Calibri" w:hAnsi="Calibri" w:cs="Calibri"/>
+        </w:rPr>
+        <w:t>and describe the tools/frameworks used.</w:t>
+      </w:r>
+    </w:p>
+    <w:p>
+      <w:pPr>
+        <w:spacing w:line="360" w:lineRule="auto"/>
+        <w:rPr>
+          <w:rFonts w:ascii="Calibri" w:hAnsi="Calibri" w:cs="Calibri"/>
+        </w:rPr>
+      </w:pPr>
+      <w:r>
+        <w:rPr>
+          <w:rFonts w:ascii="Calibri" w:hAnsi="Calibri" w:cs="Calibri"/>
+        </w:rPr>
+        <w:t>• Verification of Requirements: Provide evidence that the functional requirements and acceptance</w:t>
+      </w:r>
+    </w:p>
+    <w:p>
+      <w:pPr>
+        <w:spacing w:line="360" w:lineRule="auto"/>
+        <w:rPr>
+          <w:rFonts w:ascii="Calibri" w:hAnsi="Calibri" w:cs="Calibri"/>
+        </w:rPr>
+      </w:pPr>
+      <w:r>
+        <w:rPr>
+          <w:rFonts w:ascii="Calibri" w:hAnsi="Calibri" w:cs="Calibri"/>
+        </w:rPr>
+        <w:t>criteria established in Chapter 3 have all been evaluated. You should present this data in a</w:t>
+      </w:r>
+    </w:p>
+    <w:p>
+      <w:pPr>
+        <w:spacing w:line="360" w:lineRule="auto"/>
+        <w:rPr>
+          <w:rFonts w:ascii="Calibri" w:hAnsi="Calibri" w:cs="Calibri"/>
+        </w:rPr>
+      </w:pPr>
+      <w:r>
+        <w:rPr>
+          <w:rFonts w:ascii="Calibri" w:hAnsi="Calibri" w:cs="Calibri"/>
+        </w:rPr>
+        <w:t>structured format that allows for clear traceability between the requirements and the test results.</w:t>
+      </w:r>
+    </w:p>
+    <w:p>
+      <w:pPr>
+        <w:spacing w:line="360" w:lineRule="auto"/>
+        <w:rPr>
+          <w:rFonts w:ascii="Calibri" w:hAnsi="Calibri" w:cs="Calibri"/>
+        </w:rPr>
+      </w:pPr>
+      <w:r>
+        <w:rPr>
+          <w:rFonts w:ascii="Calibri" w:hAnsi="Calibri" w:cs="Calibri"/>
+        </w:rPr>
+        <w:t>• Evaluation of Non-Functional Attributes: Demonstrate how the system performs against the</w:t>
+      </w:r>
+    </w:p>
+    <w:p>
+      <w:pPr>
+        <w:spacing w:line="360" w:lineRule="auto"/>
+        <w:rPr>
+          <w:rFonts w:ascii="Calibri" w:hAnsi="Calibri" w:cs="Calibri"/>
+        </w:rPr>
+      </w:pPr>
+      <w:r>
+        <w:rPr>
+          <w:rFonts w:ascii="Calibri" w:hAnsi="Calibri" w:cs="Calibri"/>
+        </w:rPr>
+        <w:t>quality attributes and constraints defined in your Non-Functional Specification. Use appropriate</w:t>
+      </w:r>
+    </w:p>
+    <w:p>
+      <w:pPr>
+        <w:spacing w:line="360" w:lineRule="auto"/>
+        <w:rPr>
+          <w:rFonts w:ascii="Calibri" w:hAnsi="Calibri" w:cs="Calibri"/>
+        </w:rPr>
+      </w:pPr>
+      <w:r>
+        <w:rPr>
+          <w:rFonts w:ascii="Calibri" w:hAnsi="Calibri" w:cs="Calibri"/>
+        </w:rPr>
+        <w:t>metrics to evaluate areas such as security, performance, or accessibility.</w:t>
+      </w:r>
+    </w:p>
+    <w:p>
+      <w:pPr>
+        <w:spacing w:line="360" w:lineRule="auto"/>
+        <w:rPr>
+          <w:rFonts w:ascii="Calibri" w:hAnsi="Calibri" w:cs="Calibri"/>
+        </w:rPr>
+      </w:pPr>
+      <w:r>
+        <w:rPr>
+          <w:rFonts w:ascii="Calibri" w:hAnsi="Calibri" w:cs="Calibri"/>
+        </w:rPr>
+        <w:t>• Critical Evaluation and Reflection: Provide a rigorous appraisal of the final system. Evaluate the</w:t>
+      </w:r>
+    </w:p>
+    <w:p>
+      <w:pPr>
+        <w:spacing w:line="360" w:lineRule="auto"/>
+        <w:rPr>
+          <w:rFonts w:ascii="Calibri" w:hAnsi="Calibri" w:cs="Calibri"/>
+        </w:rPr>
+      </w:pPr>
+      <w:r>
+        <w:rPr>
+          <w:rFonts w:ascii="Calibri" w:hAnsi="Calibri" w:cs="Calibri"/>
+        </w:rPr>
+        <w:t>extent to which the system addresses the original problem, the technical strengths and limitations</w:t>
+      </w:r>
+    </w:p>
+    <w:p>
+      <w:pPr>
+        <w:spacing w:line="360" w:lineRule="auto"/>
+        <w:rPr>
+          <w:rFonts w:ascii="Calibri" w:hAnsi="Calibri" w:cs="Calibri"/>
+        </w:rPr>
+      </w:pPr>
+      <w:r>
+        <w:rPr>
+          <w:rFonts w:ascii="Calibri" w:hAnsi="Calibri" w:cs="Calibri"/>
+        </w:rPr>
+        <w:t>of your implementation and the engineering trade-offs made during the project (e.g. why a specific</w:t>
+      </w:r>
+    </w:p>
+    <w:p>
+      <w:pPr>
+        <w:spacing w:line="360" w:lineRule="auto"/>
+        <w:rPr>
+          <w:rFonts w:ascii="Calibri" w:hAnsi="Calibri" w:cs="Calibri"/>
+        </w:rPr>
+      </w:pPr>
+      <w:r>
+        <w:rPr>
+          <w:rFonts w:ascii="Calibri" w:hAnsi="Calibri" w:cs="Calibri"/>
+        </w:rPr>
+        <w:t>quality attribute was prioritised over another). Remember that marks are awarded for the rigour</w:t>
+      </w:r>
+    </w:p>
+    <w:p>
+      <w:pPr>
+        <w:spacing w:line="360" w:lineRule="auto"/>
+        <w:rPr>
+          <w:rFonts w:ascii="Calibri" w:hAnsi="Calibri" w:cs="Calibri"/>
+        </w:rPr>
+      </w:pPr>
+      <w:r>
+        <w:rPr>
+          <w:rFonts w:ascii="Calibri" w:hAnsi="Calibri" w:cs="Calibri"/>
+        </w:rPr>
+        <w:t>of the testing process and the honesty of the evaluation, not just for having a perfect, bug-free</w:t>
+      </w:r>
+    </w:p>
+    <w:p>
+      <w:pPr>
+        <w:spacing w:line="360" w:lineRule="auto"/>
+        <w:rPr>
+          <w:rFonts w:ascii="Calibri" w:hAnsi="Calibri" w:cs="Calibri"/>
+        </w:rPr>
+      </w:pPr>
+      <w:r>
+        <w:rPr>
+          <w:rFonts w:ascii="Calibri" w:hAnsi="Calibri" w:cs="Calibri"/>
+        </w:rPr>
+        <w:t>system.</w:t>
+      </w:r>
+    </w:p>
+    <w:p>
+      <w:pPr>
+        <w:pStyle w:val="Heading2"/>
         <w:spacing w:line="360" w:lineRule="auto"/>
         <w:rPr>
           <w:rFonts w:ascii="Calibri" w:hAnsi="Calibri" w:cs="Calibri"/>
@@ -11456,263 +12034,16 @@
           <w:bCs/>
         </w:rPr>
       </w:pPr>
-      <w:bookmarkStart w:id="27" w:name="_Toc227860134"/>
+      <w:bookmarkStart w:id="28" w:name="_Toc227860135"/>
       <w:r>
         <w:rPr>
           <w:rFonts w:ascii="Calibri" w:hAnsi="Calibri" w:cs="Calibri"/>
           <w:b/>
           <w:bCs/>
         </w:rPr>
-        <w:t>Chapter 6 Testing and Evaluation (15%)</w:t>
-      </w:r>
-      <w:bookmarkEnd w:id="27"/>
-    </w:p>
-    <w:p>
-      <w:pPr>
-        <w:spacing w:line="360" w:lineRule="auto"/>
-        <w:rPr>
-          <w:rFonts w:ascii="Calibri" w:hAnsi="Calibri" w:cs="Calibri"/>
-        </w:rPr>
-      </w:pPr>
-      <w:proofErr w:type="gramStart"/>
-      <w:r>
-        <w:rPr>
-          <w:rFonts w:ascii="Calibri" w:hAnsi="Calibri" w:cs="Calibri"/>
-        </w:rPr>
-        <w:t>Main Focus</w:t>
-      </w:r>
-      <w:proofErr w:type="gramEnd"/>
-      <w:r>
-        <w:rPr>
-          <w:rFonts w:ascii="Calibri" w:hAnsi="Calibri" w:cs="Calibri"/>
-        </w:rPr>
-        <w:t>: To provide objective evidence of the system’s quality and to critically evaluate the final</w:t>
-      </w:r>
-    </w:p>
-    <w:p>
-      <w:pPr>
-        <w:spacing w:line="360" w:lineRule="auto"/>
-        <w:rPr>
-          <w:rFonts w:ascii="Calibri" w:hAnsi="Calibri" w:cs="Calibri"/>
-        </w:rPr>
-      </w:pPr>
-      <w:r>
-        <w:rPr>
-          <w:rFonts w:ascii="Calibri" w:hAnsi="Calibri" w:cs="Calibri"/>
-        </w:rPr>
-        <w:t>product against the requirements.</w:t>
-      </w:r>
-    </w:p>
-    <w:p>
-      <w:pPr>
-        <w:spacing w:line="360" w:lineRule="auto"/>
-        <w:rPr>
-          <w:rFonts w:ascii="Calibri" w:hAnsi="Calibri" w:cs="Calibri"/>
-        </w:rPr>
-      </w:pPr>
-      <w:r>
-        <w:rPr>
-          <w:rFonts w:ascii="Calibri" w:hAnsi="Calibri" w:cs="Calibri"/>
-        </w:rPr>
-        <w:t>• Testing Methodology: Define and justify your chosen testing strategy. You should explain why your</w:t>
-      </w:r>
-    </w:p>
-    <w:p>
-      <w:pPr>
-        <w:spacing w:line="360" w:lineRule="auto"/>
-        <w:rPr>
-          <w:rFonts w:ascii="Calibri" w:hAnsi="Calibri" w:cs="Calibri"/>
-        </w:rPr>
-      </w:pPr>
-      <w:r>
-        <w:rPr>
-          <w:rFonts w:ascii="Calibri" w:hAnsi="Calibri" w:cs="Calibri"/>
-        </w:rPr>
-        <w:t>chosen levels of testing (e.g. Unit, Integration, System, or others) were appropriate for your project</w:t>
-      </w:r>
-    </w:p>
-    <w:p>
-      <w:pPr>
-        <w:spacing w:line="360" w:lineRule="auto"/>
-        <w:rPr>
-          <w:rFonts w:ascii="Calibri" w:hAnsi="Calibri" w:cs="Calibri"/>
-        </w:rPr>
-      </w:pPr>
-      <w:r>
-        <w:rPr>
-          <w:rFonts w:ascii="Calibri" w:hAnsi="Calibri" w:cs="Calibri"/>
-        </w:rPr>
-        <w:t>and describe the tools/frameworks used.</w:t>
-      </w:r>
-    </w:p>
-    <w:p>
-      <w:pPr>
-        <w:spacing w:line="360" w:lineRule="auto"/>
-        <w:rPr>
-          <w:rFonts w:ascii="Calibri" w:hAnsi="Calibri" w:cs="Calibri"/>
-        </w:rPr>
-      </w:pPr>
-      <w:r>
-        <w:rPr>
-          <w:rFonts w:ascii="Calibri" w:hAnsi="Calibri" w:cs="Calibri"/>
-        </w:rPr>
-        <w:t>• Verification of Requirements: Provide evidence that the functional requirements and acceptance</w:t>
-      </w:r>
-    </w:p>
-    <w:p>
-      <w:pPr>
-        <w:spacing w:line="360" w:lineRule="auto"/>
-        <w:rPr>
-          <w:rFonts w:ascii="Calibri" w:hAnsi="Calibri" w:cs="Calibri"/>
-        </w:rPr>
-      </w:pPr>
-      <w:r>
-        <w:rPr>
-          <w:rFonts w:ascii="Calibri" w:hAnsi="Calibri" w:cs="Calibri"/>
-        </w:rPr>
-        <w:t>criteria established in Chapter 3 have all been evaluated. You should present this data in a</w:t>
-      </w:r>
-    </w:p>
-    <w:p>
-      <w:pPr>
-        <w:spacing w:line="360" w:lineRule="auto"/>
-        <w:rPr>
-          <w:rFonts w:ascii="Calibri" w:hAnsi="Calibri" w:cs="Calibri"/>
-        </w:rPr>
-      </w:pPr>
-      <w:r>
-        <w:rPr>
-          <w:rFonts w:ascii="Calibri" w:hAnsi="Calibri" w:cs="Calibri"/>
-        </w:rPr>
-        <w:t>structured format that allows for clear traceability between the requirements and the test results.</w:t>
-      </w:r>
-    </w:p>
-    <w:p>
-      <w:pPr>
-        <w:spacing w:line="360" w:lineRule="auto"/>
-        <w:rPr>
-          <w:rFonts w:ascii="Calibri" w:hAnsi="Calibri" w:cs="Calibri"/>
-        </w:rPr>
-      </w:pPr>
-      <w:r>
-        <w:rPr>
-          <w:rFonts w:ascii="Calibri" w:hAnsi="Calibri" w:cs="Calibri"/>
-        </w:rPr>
-        <w:lastRenderedPageBreak/>
-        <w:t>• Evaluation of Non-Functional Attributes: Demonstrate how the system performs against the</w:t>
-      </w:r>
-    </w:p>
-    <w:p>
-      <w:pPr>
-        <w:spacing w:line="360" w:lineRule="auto"/>
-        <w:rPr>
-          <w:rFonts w:ascii="Calibri" w:hAnsi="Calibri" w:cs="Calibri"/>
-        </w:rPr>
-      </w:pPr>
-      <w:r>
-        <w:rPr>
-          <w:rFonts w:ascii="Calibri" w:hAnsi="Calibri" w:cs="Calibri"/>
-        </w:rPr>
-        <w:t>quality attributes and constraints defined in your Non-Functional Specification. Use appropriate</w:t>
-      </w:r>
-    </w:p>
-    <w:p>
-      <w:pPr>
-        <w:spacing w:line="360" w:lineRule="auto"/>
-        <w:rPr>
-          <w:rFonts w:ascii="Calibri" w:hAnsi="Calibri" w:cs="Calibri"/>
-        </w:rPr>
-      </w:pPr>
-      <w:r>
-        <w:rPr>
-          <w:rFonts w:ascii="Calibri" w:hAnsi="Calibri" w:cs="Calibri"/>
-        </w:rPr>
-        <w:t>metrics to evaluate areas such as security, performance, or accessibility.</w:t>
-      </w:r>
-    </w:p>
-    <w:p>
-      <w:pPr>
-        <w:spacing w:line="360" w:lineRule="auto"/>
-        <w:rPr>
-          <w:rFonts w:ascii="Calibri" w:hAnsi="Calibri" w:cs="Calibri"/>
-        </w:rPr>
-      </w:pPr>
-      <w:r>
-        <w:rPr>
-          <w:rFonts w:ascii="Calibri" w:hAnsi="Calibri" w:cs="Calibri"/>
-        </w:rPr>
-        <w:t>• Critical Evaluation and Reflection: Provide a rigorous appraisal of the final system. Evaluate the</w:t>
-      </w:r>
-    </w:p>
-    <w:p>
-      <w:pPr>
-        <w:spacing w:line="360" w:lineRule="auto"/>
-        <w:rPr>
-          <w:rFonts w:ascii="Calibri" w:hAnsi="Calibri" w:cs="Calibri"/>
-        </w:rPr>
-      </w:pPr>
-      <w:r>
-        <w:rPr>
-          <w:rFonts w:ascii="Calibri" w:hAnsi="Calibri" w:cs="Calibri"/>
-        </w:rPr>
-        <w:t>extent to which the system addresses the original problem, the technical strengths and limitations</w:t>
-      </w:r>
-    </w:p>
-    <w:p>
-      <w:pPr>
-        <w:spacing w:line="360" w:lineRule="auto"/>
-        <w:rPr>
-          <w:rFonts w:ascii="Calibri" w:hAnsi="Calibri" w:cs="Calibri"/>
-        </w:rPr>
-      </w:pPr>
-      <w:r>
-        <w:rPr>
-          <w:rFonts w:ascii="Calibri" w:hAnsi="Calibri" w:cs="Calibri"/>
-        </w:rPr>
-        <w:t>of your implementation and the engineering trade-offs made during the project (e.g. why a specific</w:t>
-      </w:r>
-    </w:p>
-    <w:p>
-      <w:pPr>
-        <w:spacing w:line="360" w:lineRule="auto"/>
-        <w:rPr>
-          <w:rFonts w:ascii="Calibri" w:hAnsi="Calibri" w:cs="Calibri"/>
-        </w:rPr>
-      </w:pPr>
-      <w:r>
-        <w:rPr>
-          <w:rFonts w:ascii="Calibri" w:hAnsi="Calibri" w:cs="Calibri"/>
-        </w:rPr>
-        <w:t>quality attribute was prioritised over another). Remember that marks are awarded for the rigour</w:t>
-      </w:r>
-    </w:p>
-    <w:p>
-      <w:pPr>
-        <w:spacing w:line="360" w:lineRule="auto"/>
-        <w:rPr>
-          <w:rFonts w:ascii="Calibri" w:hAnsi="Calibri" w:cs="Calibri"/>
-        </w:rPr>
-      </w:pPr>
-      <w:r>
-        <w:rPr>
-          <w:rFonts w:ascii="Calibri" w:hAnsi="Calibri" w:cs="Calibri"/>
-        </w:rPr>
-        <w:t>of the testing process and the honesty of the evaluation, not just for having a perfect, bug-free</w:t>
-      </w:r>
-    </w:p>
-    <w:p>
-      <w:pPr>
-        <w:spacing w:line="360" w:lineRule="auto"/>
-        <w:rPr>
-          <w:rFonts w:ascii="Calibri" w:hAnsi="Calibri" w:cs="Calibri"/>
-        </w:rPr>
-      </w:pPr>
-      <w:r>
-        <w:rPr>
-          <w:rFonts w:ascii="Calibri" w:hAnsi="Calibri" w:cs="Calibri"/>
-        </w:rPr>
-        <w:t>system.</w:t>
-      </w:r>
+        <w:t>6.1 Testing Methodology</w:t>
+      </w:r>
+      <w:bookmarkEnd w:id="28"/>
     </w:p>
     <w:p>
       <w:pPr>
@@ -11724,16 +12055,16 @@
           <w:bCs/>
         </w:rPr>
       </w:pPr>
-      <w:bookmarkStart w:id="28" w:name="_Toc227860135"/>
+      <w:bookmarkStart w:id="29" w:name="_Toc227860136"/>
       <w:r>
         <w:rPr>
           <w:rFonts w:ascii="Calibri" w:hAnsi="Calibri" w:cs="Calibri"/>
           <w:b/>
           <w:bCs/>
         </w:rPr>
-        <w:t>6.1 Testing Methodology</w:t>
-      </w:r>
-      <w:bookmarkEnd w:id="28"/>
+        <w:t>6.2 Verification of Requirements</w:t>
+      </w:r>
+      <w:bookmarkEnd w:id="29"/>
     </w:p>
     <w:p>
       <w:pPr>
@@ -11745,16 +12076,16 @@
           <w:bCs/>
         </w:rPr>
       </w:pPr>
-      <w:bookmarkStart w:id="29" w:name="_Toc227860136"/>
+      <w:bookmarkStart w:id="30" w:name="_Toc227860137"/>
       <w:r>
         <w:rPr>
           <w:rFonts w:ascii="Calibri" w:hAnsi="Calibri" w:cs="Calibri"/>
           <w:b/>
           <w:bCs/>
         </w:rPr>
-        <w:t>6.2 Verification of Requirements</w:t>
-      </w:r>
-      <w:bookmarkEnd w:id="29"/>
+        <w:t>6.3 Evaluation of Non-Functional Attributes</w:t>
+      </w:r>
+      <w:bookmarkEnd w:id="30"/>
     </w:p>
     <w:p>
       <w:pPr>
@@ -11766,20 +12097,20 @@
           <w:bCs/>
         </w:rPr>
       </w:pPr>
-      <w:bookmarkStart w:id="30" w:name="_Toc227860137"/>
+      <w:bookmarkStart w:id="31" w:name="_Toc227860138"/>
       <w:r>
         <w:rPr>
           <w:rFonts w:ascii="Calibri" w:hAnsi="Calibri" w:cs="Calibri"/>
           <w:b/>
           <w:bCs/>
         </w:rPr>
-        <w:t>6.3 Evaluation of Non-Functional Attributes</w:t>
-      </w:r>
-      <w:bookmarkEnd w:id="30"/>
-    </w:p>
-    <w:p>
-      <w:pPr>
-        <w:pStyle w:val="Heading2"/>
+        <w:t>6.4 Critical Evaluation and Reflection</w:t>
+      </w:r>
+      <w:bookmarkEnd w:id="31"/>
+    </w:p>
+    <w:p>
+      <w:pPr>
+        <w:pStyle w:val="Heading1"/>
         <w:spacing w:line="360" w:lineRule="auto"/>
         <w:rPr>
           <w:rFonts w:ascii="Calibri" w:hAnsi="Calibri" w:cs="Calibri"/>
@@ -11787,20 +12118,183 @@
           <w:bCs/>
         </w:rPr>
       </w:pPr>
-      <w:bookmarkStart w:id="31" w:name="_Toc227860138"/>
+      <w:bookmarkStart w:id="32" w:name="_Toc227860139"/>
       <w:r>
         <w:rPr>
           <w:rFonts w:ascii="Calibri" w:hAnsi="Calibri" w:cs="Calibri"/>
           <w:b/>
           <w:bCs/>
         </w:rPr>
-        <w:t>6.4 Critical Evaluation and Reflection</w:t>
-      </w:r>
-      <w:bookmarkEnd w:id="31"/>
-    </w:p>
-    <w:p>
-      <w:pPr>
-        <w:pStyle w:val="Heading1"/>
+        <w:t>Chapter 7 Conclusion and Future Work (5%)</w:t>
+      </w:r>
+      <w:bookmarkEnd w:id="32"/>
+    </w:p>
+    <w:p>
+      <w:pPr>
+        <w:spacing w:line="360" w:lineRule="auto"/>
+        <w:rPr>
+          <w:rFonts w:ascii="Calibri" w:hAnsi="Calibri" w:cs="Calibri"/>
+        </w:rPr>
+      </w:pPr>
+      <w:proofErr w:type="gramStart"/>
+      <w:r>
+        <w:rPr>
+          <w:rFonts w:ascii="Calibri" w:hAnsi="Calibri" w:cs="Calibri"/>
+        </w:rPr>
+        <w:t>Main Focus</w:t>
+      </w:r>
+      <w:proofErr w:type="gramEnd"/>
+      <w:r>
+        <w:rPr>
+          <w:rFonts w:ascii="Calibri" w:hAnsi="Calibri" w:cs="Calibri"/>
+        </w:rPr>
+        <w:t>: To provide a final summary of the project’s achievements and a critical roadmap for the</w:t>
+      </w:r>
+    </w:p>
+    <w:p>
+      <w:pPr>
+        <w:spacing w:line="360" w:lineRule="auto"/>
+        <w:rPr>
+          <w:rFonts w:ascii="Calibri" w:hAnsi="Calibri" w:cs="Calibri"/>
+        </w:rPr>
+      </w:pPr>
+      <w:r>
+        <w:rPr>
+          <w:rFonts w:ascii="Calibri" w:hAnsi="Calibri" w:cs="Calibri"/>
+        </w:rPr>
+        <w:t>system’s future.</w:t>
+      </w:r>
+    </w:p>
+    <w:p>
+      <w:pPr>
+        <w:spacing w:line="360" w:lineRule="auto"/>
+        <w:rPr>
+          <w:rFonts w:ascii="Calibri" w:hAnsi="Calibri" w:cs="Calibri"/>
+        </w:rPr>
+      </w:pPr>
+      <w:r>
+        <w:rPr>
+          <w:rFonts w:ascii="Calibri" w:hAnsi="Calibri" w:cs="Calibri"/>
+        </w:rPr>
+        <w:t>• Project Summary: Briefly summarise the project's journey from the initial vision to the final</w:t>
+      </w:r>
+    </w:p>
+    <w:p>
+      <w:pPr>
+        <w:spacing w:line="360" w:lineRule="auto"/>
+        <w:rPr>
+          <w:rFonts w:ascii="Calibri" w:hAnsi="Calibri" w:cs="Calibri"/>
+        </w:rPr>
+      </w:pPr>
+      <w:r>
+        <w:rPr>
+          <w:rFonts w:ascii="Calibri" w:hAnsi="Calibri" w:cs="Calibri"/>
+        </w:rPr>
+        <w:t>delivered system. Reflect on the extent to which the original aims and objectives were achieved.</w:t>
+      </w:r>
+    </w:p>
+    <w:p>
+      <w:pPr>
+        <w:spacing w:line="360" w:lineRule="auto"/>
+        <w:rPr>
+          <w:rFonts w:ascii="Calibri" w:hAnsi="Calibri" w:cs="Calibri"/>
+        </w:rPr>
+      </w:pPr>
+      <w:r>
+        <w:rPr>
+          <w:rFonts w:ascii="Calibri" w:hAnsi="Calibri" w:cs="Calibri"/>
+        </w:rPr>
+        <w:lastRenderedPageBreak/>
+        <w:t>• Critical Reflection: Provide a candid assessment of the project from a professional perspective.</w:t>
+      </w:r>
+    </w:p>
+    <w:p>
+      <w:pPr>
+        <w:spacing w:line="360" w:lineRule="auto"/>
+        <w:rPr>
+          <w:rFonts w:ascii="Calibri" w:hAnsi="Calibri" w:cs="Calibri"/>
+        </w:rPr>
+      </w:pPr>
+      <w:r>
+        <w:rPr>
+          <w:rFonts w:ascii="Calibri" w:hAnsi="Calibri" w:cs="Calibri"/>
+        </w:rPr>
+        <w:t>This should include what was learned about the software engineering process, and what you</w:t>
+      </w:r>
+    </w:p>
+    <w:p>
+      <w:pPr>
+        <w:spacing w:line="360" w:lineRule="auto"/>
+        <w:rPr>
+          <w:rFonts w:ascii="Calibri" w:hAnsi="Calibri" w:cs="Calibri"/>
+        </w:rPr>
+      </w:pPr>
+      <w:r>
+        <w:rPr>
+          <w:rFonts w:ascii="Calibri" w:hAnsi="Calibri" w:cs="Calibri"/>
+        </w:rPr>
+        <w:t>would do differently if you were to start the project again with the benefit of hindsight.</w:t>
+      </w:r>
+    </w:p>
+    <w:p>
+      <w:pPr>
+        <w:spacing w:line="360" w:lineRule="auto"/>
+        <w:rPr>
+          <w:rFonts w:ascii="Calibri" w:hAnsi="Calibri" w:cs="Calibri"/>
+        </w:rPr>
+      </w:pPr>
+      <w:r>
+        <w:rPr>
+          <w:rFonts w:ascii="Calibri" w:hAnsi="Calibri" w:cs="Calibri"/>
+        </w:rPr>
+        <w:t>• Future Work: Identify the logical next steps for the system. Rather than just listing "more features,"</w:t>
+      </w:r>
+    </w:p>
+    <w:p>
+      <w:pPr>
+        <w:spacing w:line="360" w:lineRule="auto"/>
+        <w:rPr>
+          <w:rFonts w:ascii="Calibri" w:hAnsi="Calibri" w:cs="Calibri"/>
+        </w:rPr>
+      </w:pPr>
+      <w:r>
+        <w:rPr>
+          <w:rFonts w:ascii="Calibri" w:hAnsi="Calibri" w:cs="Calibri"/>
+        </w:rPr>
+        <w:t>suggest how the system could be evolved or scaled. This might include addressing limitations</w:t>
+      </w:r>
+    </w:p>
+    <w:p>
+      <w:pPr>
+        <w:spacing w:line="360" w:lineRule="auto"/>
+        <w:rPr>
+          <w:rFonts w:ascii="Calibri" w:hAnsi="Calibri" w:cs="Calibri"/>
+        </w:rPr>
+      </w:pPr>
+      <w:r>
+        <w:rPr>
+          <w:rFonts w:ascii="Calibri" w:hAnsi="Calibri" w:cs="Calibri"/>
+        </w:rPr>
+        <w:t>identified in the Evaluation (Chapter 6), emerging technologies or integrations that could enhance</w:t>
+      </w:r>
+    </w:p>
+    <w:p>
+      <w:pPr>
+        <w:spacing w:line="360" w:lineRule="auto"/>
+        <w:rPr>
+          <w:rFonts w:ascii="Calibri" w:hAnsi="Calibri" w:cs="Calibri"/>
+        </w:rPr>
+      </w:pPr>
+      <w:r>
+        <w:rPr>
+          <w:rFonts w:ascii="Calibri" w:hAnsi="Calibri" w:cs="Calibri"/>
+        </w:rPr>
+        <w:t>the product or strategies for long-term maintenance or deployment.</w:t>
+      </w:r>
+    </w:p>
+    <w:p>
+      <w:pPr>
+        <w:pStyle w:val="Heading2"/>
         <w:spacing w:line="360" w:lineRule="auto"/>
         <w:rPr>
           <w:rFonts w:ascii="Calibri" w:hAnsi="Calibri" w:cs="Calibri"/>
@@ -11808,179 +12302,16 @@
           <w:bCs/>
         </w:rPr>
       </w:pPr>
-      <w:bookmarkStart w:id="32" w:name="_Toc227860139"/>
+      <w:bookmarkStart w:id="33" w:name="_Toc227860140"/>
       <w:r>
         <w:rPr>
           <w:rFonts w:ascii="Calibri" w:hAnsi="Calibri" w:cs="Calibri"/>
           <w:b/>
           <w:bCs/>
         </w:rPr>
-        <w:t>Chapter 7 Conclusion and Future Work (5%)</w:t>
-      </w:r>
-      <w:bookmarkEnd w:id="32"/>
-    </w:p>
-    <w:p>
-      <w:pPr>
-        <w:spacing w:line="360" w:lineRule="auto"/>
-        <w:rPr>
-          <w:rFonts w:ascii="Calibri" w:hAnsi="Calibri" w:cs="Calibri"/>
-        </w:rPr>
-      </w:pPr>
-      <w:proofErr w:type="gramStart"/>
-      <w:r>
-        <w:rPr>
-          <w:rFonts w:ascii="Calibri" w:hAnsi="Calibri" w:cs="Calibri"/>
-        </w:rPr>
-        <w:t>Main Focus</w:t>
-      </w:r>
-      <w:proofErr w:type="gramEnd"/>
-      <w:r>
-        <w:rPr>
-          <w:rFonts w:ascii="Calibri" w:hAnsi="Calibri" w:cs="Calibri"/>
-        </w:rPr>
-        <w:t>: To provide a final summary of the project’s achievements and a critical roadmap for the</w:t>
-      </w:r>
-    </w:p>
-    <w:p>
-      <w:pPr>
-        <w:spacing w:line="360" w:lineRule="auto"/>
-        <w:rPr>
-          <w:rFonts w:ascii="Calibri" w:hAnsi="Calibri" w:cs="Calibri"/>
-        </w:rPr>
-      </w:pPr>
-      <w:r>
-        <w:rPr>
-          <w:rFonts w:ascii="Calibri" w:hAnsi="Calibri" w:cs="Calibri"/>
-        </w:rPr>
-        <w:t>system’s future.</w:t>
-      </w:r>
-    </w:p>
-    <w:p>
-      <w:pPr>
-        <w:spacing w:line="360" w:lineRule="auto"/>
-        <w:rPr>
-          <w:rFonts w:ascii="Calibri" w:hAnsi="Calibri" w:cs="Calibri"/>
-        </w:rPr>
-      </w:pPr>
-      <w:r>
-        <w:rPr>
-          <w:rFonts w:ascii="Calibri" w:hAnsi="Calibri" w:cs="Calibri"/>
-        </w:rPr>
-        <w:t>• Project Summary: Briefly summarise the project's journey from the initial vision to the final</w:t>
-      </w:r>
-    </w:p>
-    <w:p>
-      <w:pPr>
-        <w:spacing w:line="360" w:lineRule="auto"/>
-        <w:rPr>
-          <w:rFonts w:ascii="Calibri" w:hAnsi="Calibri" w:cs="Calibri"/>
-        </w:rPr>
-      </w:pPr>
-      <w:r>
-        <w:rPr>
-          <w:rFonts w:ascii="Calibri" w:hAnsi="Calibri" w:cs="Calibri"/>
-        </w:rPr>
-        <w:t>delivered system. Reflect on the extent to which the original aims and objectives were achieved.</w:t>
-      </w:r>
-    </w:p>
-    <w:p>
-      <w:pPr>
-        <w:spacing w:line="360" w:lineRule="auto"/>
-        <w:rPr>
-          <w:rFonts w:ascii="Calibri" w:hAnsi="Calibri" w:cs="Calibri"/>
-        </w:rPr>
-      </w:pPr>
-      <w:r>
-        <w:rPr>
-          <w:rFonts w:ascii="Calibri" w:hAnsi="Calibri" w:cs="Calibri"/>
-        </w:rPr>
-        <w:t>• Critical Reflection: Provide a candid assessment of the project from a professional perspective.</w:t>
-      </w:r>
-    </w:p>
-    <w:p>
-      <w:pPr>
-        <w:spacing w:line="360" w:lineRule="auto"/>
-        <w:rPr>
-          <w:rFonts w:ascii="Calibri" w:hAnsi="Calibri" w:cs="Calibri"/>
-        </w:rPr>
-      </w:pPr>
-      <w:r>
-        <w:rPr>
-          <w:rFonts w:ascii="Calibri" w:hAnsi="Calibri" w:cs="Calibri"/>
-        </w:rPr>
-        <w:t>This should include what was learned about the software engineering process, and what you</w:t>
-      </w:r>
-    </w:p>
-    <w:p>
-      <w:pPr>
-        <w:spacing w:line="360" w:lineRule="auto"/>
-        <w:rPr>
-          <w:rFonts w:ascii="Calibri" w:hAnsi="Calibri" w:cs="Calibri"/>
-        </w:rPr>
-      </w:pPr>
-      <w:r>
-        <w:rPr>
-          <w:rFonts w:ascii="Calibri" w:hAnsi="Calibri" w:cs="Calibri"/>
-        </w:rPr>
-        <w:t>would do differently if you were to start the project again with the benefit of hindsight.</w:t>
-      </w:r>
-    </w:p>
-    <w:p>
-      <w:pPr>
-        <w:spacing w:line="360" w:lineRule="auto"/>
-        <w:rPr>
-          <w:rFonts w:ascii="Calibri" w:hAnsi="Calibri" w:cs="Calibri"/>
-        </w:rPr>
-      </w:pPr>
-      <w:r>
-        <w:rPr>
-          <w:rFonts w:ascii="Calibri" w:hAnsi="Calibri" w:cs="Calibri"/>
-        </w:rPr>
-        <w:t>• Future Work: Identify the logical next steps for the system. Rather than just listing "more features,"</w:t>
-      </w:r>
-    </w:p>
-    <w:p>
-      <w:pPr>
-        <w:spacing w:line="360" w:lineRule="auto"/>
-        <w:rPr>
-          <w:rFonts w:ascii="Calibri" w:hAnsi="Calibri" w:cs="Calibri"/>
-        </w:rPr>
-      </w:pPr>
-      <w:r>
-        <w:rPr>
-          <w:rFonts w:ascii="Calibri" w:hAnsi="Calibri" w:cs="Calibri"/>
-        </w:rPr>
-        <w:t>suggest how the system could be evolved or scaled. This might include addressing limitations</w:t>
-      </w:r>
-    </w:p>
-    <w:p>
-      <w:pPr>
-        <w:spacing w:line="360" w:lineRule="auto"/>
-        <w:rPr>
-          <w:rFonts w:ascii="Calibri" w:hAnsi="Calibri" w:cs="Calibri"/>
-        </w:rPr>
-      </w:pPr>
-      <w:r>
-        <w:rPr>
-          <w:rFonts w:ascii="Calibri" w:hAnsi="Calibri" w:cs="Calibri"/>
-        </w:rPr>
-        <w:lastRenderedPageBreak/>
-        <w:t>identified in the Evaluation (Chapter 6), emerging technologies or integrations that could enhance</w:t>
-      </w:r>
-    </w:p>
-    <w:p>
-      <w:pPr>
-        <w:spacing w:line="360" w:lineRule="auto"/>
-        <w:rPr>
-          <w:rFonts w:ascii="Calibri" w:hAnsi="Calibri" w:cs="Calibri"/>
-        </w:rPr>
-      </w:pPr>
-      <w:r>
-        <w:rPr>
-          <w:rFonts w:ascii="Calibri" w:hAnsi="Calibri" w:cs="Calibri"/>
-        </w:rPr>
-        <w:t>the product or strategies for long-term maintenance or deployment.</w:t>
-      </w:r>
+        <w:t>7.1 Project Summary</w:t>
+      </w:r>
+      <w:bookmarkEnd w:id="33"/>
     </w:p>
     <w:p>
       <w:pPr>
@@ -11992,16 +12323,16 @@
           <w:bCs/>
         </w:rPr>
       </w:pPr>
-      <w:bookmarkStart w:id="33" w:name="_Toc227860140"/>
+      <w:bookmarkStart w:id="34" w:name="_Toc227860141"/>
       <w:r>
         <w:rPr>
           <w:rFonts w:ascii="Calibri" w:hAnsi="Calibri" w:cs="Calibri"/>
           <w:b/>
           <w:bCs/>
         </w:rPr>
-        <w:t>7.1 Project Summary</w:t>
-      </w:r>
-      <w:bookmarkEnd w:id="33"/>
+        <w:t>7.2 Critical Reflection</w:t>
+      </w:r>
+      <w:bookmarkEnd w:id="34"/>
     </w:p>
     <w:p>
       <w:pPr>
@@ -12013,20 +12344,20 @@
           <w:bCs/>
         </w:rPr>
       </w:pPr>
-      <w:bookmarkStart w:id="34" w:name="_Toc227860141"/>
+      <w:bookmarkStart w:id="35" w:name="_Toc227860142"/>
       <w:r>
         <w:rPr>
           <w:rFonts w:ascii="Calibri" w:hAnsi="Calibri" w:cs="Calibri"/>
           <w:b/>
           <w:bCs/>
         </w:rPr>
-        <w:t>7.2 Critical Reflection</w:t>
-      </w:r>
-      <w:bookmarkEnd w:id="34"/>
-    </w:p>
-    <w:p>
-      <w:pPr>
-        <w:pStyle w:val="Heading2"/>
+        <w:t>7.3 Future Work</w:t>
+      </w:r>
+      <w:bookmarkEnd w:id="35"/>
+    </w:p>
+    <w:p>
+      <w:pPr>
+        <w:pStyle w:val="Heading1"/>
         <w:spacing w:line="360" w:lineRule="auto"/>
         <w:rPr>
           <w:rFonts w:ascii="Calibri" w:hAnsi="Calibri" w:cs="Calibri"/>
@@ -12034,20 +12365,448 @@
           <w:bCs/>
         </w:rPr>
       </w:pPr>
-      <w:bookmarkStart w:id="35" w:name="_Toc227860142"/>
+      <w:bookmarkStart w:id="36" w:name="_Toc227860143"/>
       <w:r>
         <w:rPr>
           <w:rFonts w:ascii="Calibri" w:hAnsi="Calibri" w:cs="Calibri"/>
           <w:b/>
           <w:bCs/>
         </w:rPr>
-        <w:t>7.3 Future Work</w:t>
-      </w:r>
-      <w:bookmarkEnd w:id="35"/>
-    </w:p>
-    <w:p>
-      <w:pPr>
-        <w:pStyle w:val="Heading1"/>
+        <w:t>References</w:t>
+      </w:r>
+      <w:bookmarkEnd w:id="36"/>
+    </w:p>
+    <w:p>
+      <w:pPr>
+        <w:spacing w:line="360" w:lineRule="auto"/>
+        <w:rPr>
+          <w:rFonts w:ascii="Calibri" w:hAnsi="Calibri" w:cs="Calibri"/>
+        </w:rPr>
+      </w:pPr>
+      <w:r>
+        <w:rPr>
+          <w:rFonts w:ascii="Calibri" w:hAnsi="Calibri" w:cs="Calibri"/>
+        </w:rPr>
+        <w:t>In Software Engineering, documenting where your code and ideas come from is essential for academic</w:t>
+      </w:r>
+    </w:p>
+    <w:p>
+      <w:pPr>
+        <w:spacing w:line="360" w:lineRule="auto"/>
+        <w:rPr>
+          <w:rFonts w:ascii="Calibri" w:hAnsi="Calibri" w:cs="Calibri"/>
+        </w:rPr>
+      </w:pPr>
+      <w:r>
+        <w:rPr>
+          <w:rFonts w:ascii="Calibri" w:hAnsi="Calibri" w:cs="Calibri"/>
+        </w:rPr>
+        <w:t>integrity and professional ethics.</w:t>
+      </w:r>
+    </w:p>
+    <w:p>
+      <w:pPr>
+        <w:spacing w:line="360" w:lineRule="auto"/>
+        <w:rPr>
+          <w:rFonts w:ascii="Calibri" w:hAnsi="Calibri" w:cs="Calibri"/>
+        </w:rPr>
+      </w:pPr>
+      <w:r>
+        <w:rPr>
+          <w:rFonts w:ascii="Calibri" w:hAnsi="Calibri" w:cs="Calibri"/>
+        </w:rPr>
+        <w:t>You must cite any external knowledge used in your dissertation. This includes textbooks, academic</w:t>
+      </w:r>
+    </w:p>
+    <w:p>
+      <w:pPr>
+        <w:spacing w:line="360" w:lineRule="auto"/>
+        <w:rPr>
+          <w:rFonts w:ascii="Calibri" w:hAnsi="Calibri" w:cs="Calibri"/>
+        </w:rPr>
+      </w:pPr>
+      <w:r>
+        <w:rPr>
+          <w:rFonts w:ascii="Calibri" w:hAnsi="Calibri" w:cs="Calibri"/>
+        </w:rPr>
+        <w:t>papers, official documentation, and community tutorials.</w:t>
+      </w:r>
+    </w:p>
+    <w:p>
+      <w:pPr>
+        <w:spacing w:line="360" w:lineRule="auto"/>
+        <w:rPr>
+          <w:rFonts w:ascii="Calibri" w:hAnsi="Calibri" w:cs="Calibri"/>
+        </w:rPr>
+      </w:pPr>
+      <w:r>
+        <w:rPr>
+          <w:rFonts w:ascii="Calibri" w:hAnsi="Calibri" w:cs="Calibri"/>
+        </w:rPr>
+        <w:t>Common Technical Examples of referencing:</w:t>
+      </w:r>
+    </w:p>
+    <w:p>
+      <w:pPr>
+        <w:spacing w:line="360" w:lineRule="auto"/>
+        <w:rPr>
+          <w:rFonts w:ascii="Calibri" w:hAnsi="Calibri" w:cs="Calibri"/>
+        </w:rPr>
+      </w:pPr>
+      <w:r>
+        <w:rPr>
+          <w:rFonts w:ascii="Calibri" w:hAnsi="Calibri" w:cs="Calibri"/>
+        </w:rPr>
+        <w:t>• Official Documentation: "The system uses the React '</w:t>
+      </w:r>
+      <w:proofErr w:type="spellStart"/>
+      <w:r>
+        <w:rPr>
+          <w:rFonts w:ascii="Calibri" w:hAnsi="Calibri" w:cs="Calibri"/>
+        </w:rPr>
+        <w:t>UseContext</w:t>
+      </w:r>
+      <w:proofErr w:type="spellEnd"/>
+      <w:r>
+        <w:rPr>
+          <w:rFonts w:ascii="Calibri" w:hAnsi="Calibri" w:cs="Calibri"/>
+        </w:rPr>
+        <w:t>' hook for global state</w:t>
+      </w:r>
+    </w:p>
+    <w:p>
+      <w:pPr>
+        <w:spacing w:line="360" w:lineRule="auto"/>
+        <w:rPr>
+          <w:rFonts w:ascii="Calibri" w:hAnsi="Calibri" w:cs="Calibri"/>
+        </w:rPr>
+      </w:pPr>
+      <w:r>
+        <w:rPr>
+          <w:rFonts w:ascii="Calibri" w:hAnsi="Calibri" w:cs="Calibri"/>
+        </w:rPr>
+        <w:t>management (Meta, 2026)."</w:t>
+      </w:r>
+    </w:p>
+    <w:p>
+      <w:pPr>
+        <w:spacing w:line="360" w:lineRule="auto"/>
+        <w:rPr>
+          <w:rFonts w:ascii="Calibri" w:hAnsi="Calibri" w:cs="Calibri"/>
+        </w:rPr>
+      </w:pPr>
+      <w:r>
+        <w:rPr>
+          <w:rFonts w:ascii="Calibri" w:hAnsi="Calibri" w:cs="Calibri"/>
+        </w:rPr>
+        <w:t>• Community Solutions: "The recursive logic for the tree-view component was adapted from a</w:t>
+      </w:r>
+    </w:p>
+    <w:p>
+      <w:pPr>
+        <w:spacing w:line="360" w:lineRule="auto"/>
+        <w:rPr>
+          <w:rFonts w:ascii="Calibri" w:hAnsi="Calibri" w:cs="Calibri"/>
+        </w:rPr>
+      </w:pPr>
+      <w:r>
+        <w:rPr>
+          <w:rFonts w:ascii="Calibri" w:hAnsi="Calibri" w:cs="Calibri"/>
+        </w:rPr>
+        <w:t>solution by '</w:t>
+      </w:r>
+      <w:proofErr w:type="spellStart"/>
+      <w:r>
+        <w:rPr>
+          <w:rFonts w:ascii="Calibri" w:hAnsi="Calibri" w:cs="Calibri"/>
+        </w:rPr>
+        <w:t>DevGuru</w:t>
+      </w:r>
+      <w:proofErr w:type="spellEnd"/>
+      <w:r>
+        <w:rPr>
+          <w:rFonts w:ascii="Calibri" w:hAnsi="Calibri" w:cs="Calibri"/>
+        </w:rPr>
+        <w:t>' on Stack Overflow (2025)."</w:t>
+      </w:r>
+    </w:p>
+    <w:p>
+      <w:pPr>
+        <w:spacing w:line="360" w:lineRule="auto"/>
+        <w:rPr>
+          <w:rFonts w:ascii="Calibri" w:hAnsi="Calibri" w:cs="Calibri"/>
+        </w:rPr>
+      </w:pPr>
+      <w:r>
+        <w:rPr>
+          <w:rFonts w:ascii="Calibri" w:hAnsi="Calibri" w:cs="Calibri"/>
+        </w:rPr>
+        <w:t>• Technical Books: "Following the Factory Design Pattern (Gamma et al., 1994), the system..."</w:t>
+      </w:r>
+    </w:p>
+    <w:p>
+      <w:pPr>
+        <w:spacing w:line="360" w:lineRule="auto"/>
+        <w:rPr>
+          <w:rFonts w:ascii="Calibri" w:hAnsi="Calibri" w:cs="Calibri"/>
+        </w:rPr>
+      </w:pPr>
+      <w:r>
+        <w:rPr>
+          <w:rFonts w:ascii="Calibri" w:hAnsi="Calibri" w:cs="Calibri"/>
+        </w:rPr>
+        <w:t>The Reference List:</w:t>
+      </w:r>
+    </w:p>
+    <w:p>
+      <w:pPr>
+        <w:spacing w:line="360" w:lineRule="auto"/>
+        <w:rPr>
+          <w:rFonts w:ascii="Calibri" w:hAnsi="Calibri" w:cs="Calibri"/>
+        </w:rPr>
+      </w:pPr>
+      <w:r>
+        <w:rPr>
+          <w:rFonts w:ascii="Calibri" w:hAnsi="Calibri" w:cs="Calibri"/>
+        </w:rPr>
+        <w:lastRenderedPageBreak/>
+        <w:t>At the end of your document, list your sources alphabetically.</w:t>
+      </w:r>
+    </w:p>
+    <w:p>
+      <w:pPr>
+        <w:spacing w:line="360" w:lineRule="auto"/>
+        <w:rPr>
+          <w:rFonts w:ascii="Calibri" w:hAnsi="Calibri" w:cs="Calibri"/>
+        </w:rPr>
+      </w:pPr>
+      <w:r>
+        <w:rPr>
+          <w:rFonts w:ascii="Calibri" w:hAnsi="Calibri" w:cs="Calibri"/>
+        </w:rPr>
+        <w:t xml:space="preserve">• Meta. (2026). React Documentation: Scaling State. [Online]. Available at: </w:t>
+      </w:r>
+      <w:proofErr w:type="spellStart"/>
+      <w:r>
+        <w:rPr>
+          <w:rFonts w:ascii="Calibri" w:hAnsi="Calibri" w:cs="Calibri"/>
+        </w:rPr>
+        <w:t>react.dev</w:t>
+      </w:r>
+      <w:proofErr w:type="spellEnd"/>
+      <w:r>
+        <w:rPr>
+          <w:rFonts w:ascii="Calibri" w:hAnsi="Calibri" w:cs="Calibri"/>
+        </w:rPr>
+        <w:t>/docs</w:t>
+      </w:r>
+    </w:p>
+    <w:p>
+      <w:pPr>
+        <w:spacing w:line="360" w:lineRule="auto"/>
+        <w:rPr>
+          <w:rFonts w:ascii="Calibri" w:hAnsi="Calibri" w:cs="Calibri"/>
+        </w:rPr>
+      </w:pPr>
+      <w:r>
+        <w:rPr>
+          <w:rFonts w:ascii="Calibri" w:hAnsi="Calibri" w:cs="Calibri"/>
+        </w:rPr>
+        <w:t>• Gamma, E. et al. (1994). Design Patterns: Elements of Reusable Object-Oriented Software.</w:t>
+      </w:r>
+    </w:p>
+    <w:p>
+      <w:pPr>
+        <w:spacing w:line="360" w:lineRule="auto"/>
+        <w:rPr>
+          <w:rFonts w:ascii="Calibri" w:hAnsi="Calibri" w:cs="Calibri"/>
+        </w:rPr>
+      </w:pPr>
+      <w:r>
+        <w:rPr>
+          <w:rFonts w:ascii="Calibri" w:hAnsi="Calibri" w:cs="Calibri"/>
+        </w:rPr>
+        <w:t>Addison-Wesley.</w:t>
+      </w:r>
+    </w:p>
+    <w:p>
+      <w:pPr>
+        <w:spacing w:line="360" w:lineRule="auto"/>
+        <w:rPr>
+          <w:rFonts w:ascii="Calibri" w:hAnsi="Calibri" w:cs="Calibri"/>
+        </w:rPr>
+      </w:pPr>
+      <w:r>
+        <w:rPr>
+          <w:rFonts w:ascii="Calibri" w:hAnsi="Calibri" w:cs="Calibri"/>
+        </w:rPr>
+        <w:t>Source Code Attribution</w:t>
+      </w:r>
+    </w:p>
+    <w:p>
+      <w:pPr>
+        <w:spacing w:line="360" w:lineRule="auto"/>
+        <w:rPr>
+          <w:rFonts w:ascii="Calibri" w:hAnsi="Calibri" w:cs="Calibri"/>
+        </w:rPr>
+      </w:pPr>
+      <w:r>
+        <w:rPr>
+          <w:rFonts w:ascii="Calibri" w:hAnsi="Calibri" w:cs="Calibri"/>
+        </w:rPr>
+        <w:t>If you use a specific code snippet from the web or an AI tool, you must attribute it in the source code.</w:t>
+      </w:r>
+    </w:p>
+    <w:p>
+      <w:pPr>
+        <w:spacing w:line="360" w:lineRule="auto"/>
+        <w:rPr>
+          <w:rFonts w:ascii="Calibri" w:hAnsi="Calibri" w:cs="Calibri"/>
+        </w:rPr>
+      </w:pPr>
+      <w:r>
+        <w:rPr>
+          <w:rFonts w:ascii="Calibri" w:hAnsi="Calibri" w:cs="Calibri"/>
+        </w:rPr>
+        <w:t>This prevents plagiarism flags.</w:t>
+      </w:r>
+    </w:p>
+    <w:p>
+      <w:pPr>
+        <w:spacing w:line="360" w:lineRule="auto"/>
+        <w:rPr>
+          <w:rFonts w:ascii="Calibri" w:hAnsi="Calibri" w:cs="Calibri"/>
+        </w:rPr>
+      </w:pPr>
+      <w:r>
+        <w:rPr>
+          <w:rFonts w:ascii="Calibri" w:hAnsi="Calibri" w:cs="Calibri"/>
+        </w:rPr>
+        <w:t>Example of an attributed snippet:</w:t>
+      </w:r>
+    </w:p>
+    <w:p>
+      <w:pPr>
+        <w:spacing w:line="360" w:lineRule="auto"/>
+        <w:rPr>
+          <w:rFonts w:ascii="Calibri" w:hAnsi="Calibri" w:cs="Calibri"/>
+        </w:rPr>
+      </w:pPr>
+      <w:r>
+        <w:rPr>
+          <w:rFonts w:ascii="Calibri" w:hAnsi="Calibri" w:cs="Calibri"/>
+        </w:rPr>
+        <w:t>/* * ATTRIBUTION:</w:t>
+      </w:r>
+    </w:p>
+    <w:p>
+      <w:pPr>
+        <w:spacing w:line="360" w:lineRule="auto"/>
+        <w:rPr>
+          <w:rFonts w:ascii="Calibri" w:hAnsi="Calibri" w:cs="Calibri"/>
+        </w:rPr>
+      </w:pPr>
+      <w:r>
+        <w:rPr>
+          <w:rFonts w:ascii="Calibri" w:hAnsi="Calibri" w:cs="Calibri"/>
+        </w:rPr>
+        <w:t>* This validation logic was adapted from a solution on Stack Overflow.</w:t>
+      </w:r>
+    </w:p>
+    <w:p>
+      <w:pPr>
+        <w:spacing w:line="360" w:lineRule="auto"/>
+        <w:rPr>
+          <w:rFonts w:ascii="Calibri" w:hAnsi="Calibri" w:cs="Calibri"/>
+        </w:rPr>
+      </w:pPr>
+      <w:r>
+        <w:rPr>
+          <w:rFonts w:ascii="Calibri" w:hAnsi="Calibri" w:cs="Calibri"/>
+        </w:rPr>
+        <w:t>* URL: https://stackoverflow.com/questions/xxxxxx</w:t>
+      </w:r>
+    </w:p>
+    <w:p>
+      <w:pPr>
+        <w:spacing w:line="360" w:lineRule="auto"/>
+        <w:rPr>
+          <w:rFonts w:ascii="Calibri" w:hAnsi="Calibri" w:cs="Calibri"/>
+        </w:rPr>
+      </w:pPr>
+      <w:r>
+        <w:rPr>
+          <w:rFonts w:ascii="Calibri" w:hAnsi="Calibri" w:cs="Calibri"/>
+        </w:rPr>
+        <w:t>* Purpose: Handling complex email regex validation.</w:t>
+      </w:r>
+    </w:p>
+    <w:p>
+      <w:pPr>
+        <w:spacing w:line="360" w:lineRule="auto"/>
+        <w:rPr>
+          <w:rFonts w:ascii="Calibri" w:hAnsi="Calibri" w:cs="Calibri"/>
+        </w:rPr>
+      </w:pPr>
+      <w:r>
+        <w:rPr>
+          <w:rFonts w:ascii="Calibri" w:hAnsi="Calibri" w:cs="Calibri"/>
+        </w:rPr>
+        <w:t>*/</w:t>
+      </w:r>
+    </w:p>
+    <w:p>
+      <w:pPr>
+        <w:spacing w:line="360" w:lineRule="auto"/>
+        <w:rPr>
+          <w:rFonts w:ascii="Calibri" w:hAnsi="Calibri" w:cs="Calibri"/>
+        </w:rPr>
+      </w:pPr>
+      <w:r>
+        <w:rPr>
+          <w:rFonts w:ascii="Calibri" w:hAnsi="Calibri" w:cs="Calibri"/>
+        </w:rPr>
+        <w:t xml:space="preserve">function </w:t>
+      </w:r>
+      <w:proofErr w:type="spellStart"/>
+      <w:r>
+        <w:rPr>
+          <w:rFonts w:ascii="Calibri" w:hAnsi="Calibri" w:cs="Calibri"/>
+        </w:rPr>
+        <w:t>validateEmail</w:t>
+      </w:r>
+      <w:proofErr w:type="spellEnd"/>
+      <w:r>
+        <w:rPr>
+          <w:rFonts w:ascii="Calibri" w:hAnsi="Calibri" w:cs="Calibri"/>
+        </w:rPr>
+        <w:t xml:space="preserve">(email) </w:t>
+      </w:r>
+      <w:proofErr w:type="gramStart"/>
+      <w:r>
+        <w:rPr>
+          <w:rFonts w:ascii="Calibri" w:hAnsi="Calibri" w:cs="Calibri"/>
+        </w:rPr>
+        <w:t>{ ...</w:t>
+      </w:r>
+      <w:proofErr w:type="gramEnd"/>
+      <w:r>
+        <w:rPr>
+          <w:rFonts w:ascii="Calibri" w:hAnsi="Calibri" w:cs="Calibri"/>
+        </w:rPr>
+        <w:t xml:space="preserve"> }</w:t>
+      </w:r>
+    </w:p>
+    <w:p>
+      <w:pPr>
+        <w:spacing w:line="360" w:lineRule="auto"/>
+        <w:rPr>
+          <w:rFonts w:ascii="Calibri" w:hAnsi="Calibri" w:cs="Calibri"/>
+        </w:rPr>
+      </w:pPr>
+    </w:p>
+    <w:p>
+      <w:pPr>
         <w:spacing w:line="360" w:lineRule="auto"/>
         <w:rPr>
           <w:rFonts w:ascii="Calibri" w:hAnsi="Calibri" w:cs="Calibri"/>
@@ -12055,462 +12814,31 @@
           <w:bCs/>
         </w:rPr>
       </w:pPr>
-      <w:bookmarkStart w:id="36" w:name="_Toc227860143"/>
       <w:r>
         <w:rPr>
           <w:rFonts w:ascii="Calibri" w:hAnsi="Calibri" w:cs="Calibri"/>
           <w:b/>
           <w:bCs/>
         </w:rPr>
-        <w:t>References</w:t>
-      </w:r>
-      <w:bookmarkEnd w:id="36"/>
-    </w:p>
-    <w:p>
-      <w:pPr>
-        <w:spacing w:line="360" w:lineRule="auto"/>
-        <w:rPr>
-          <w:rFonts w:ascii="Calibri" w:hAnsi="Calibri" w:cs="Calibri"/>
-        </w:rPr>
-      </w:pPr>
-      <w:r>
-        <w:rPr>
-          <w:rFonts w:ascii="Calibri" w:hAnsi="Calibri" w:cs="Calibri"/>
-        </w:rPr>
-        <w:t>In Software Engineering, documenting where your code and ideas come from is essential for academic</w:t>
-      </w:r>
-    </w:p>
-    <w:p>
-      <w:pPr>
-        <w:spacing w:line="360" w:lineRule="auto"/>
-        <w:rPr>
-          <w:rFonts w:ascii="Calibri" w:hAnsi="Calibri" w:cs="Calibri"/>
-        </w:rPr>
-      </w:pPr>
-      <w:r>
-        <w:rPr>
-          <w:rFonts w:ascii="Calibri" w:hAnsi="Calibri" w:cs="Calibri"/>
-        </w:rPr>
-        <w:t>integrity and professional ethics.</w:t>
-      </w:r>
-    </w:p>
-    <w:p>
-      <w:pPr>
-        <w:spacing w:line="360" w:lineRule="auto"/>
-        <w:rPr>
-          <w:rFonts w:ascii="Calibri" w:hAnsi="Calibri" w:cs="Calibri"/>
-        </w:rPr>
-      </w:pPr>
-      <w:r>
-        <w:rPr>
-          <w:rFonts w:ascii="Calibri" w:hAnsi="Calibri" w:cs="Calibri"/>
-        </w:rPr>
-        <w:t>You must cite any external knowledge used in your dissertation. This includes textbooks, academic</w:t>
-      </w:r>
-    </w:p>
-    <w:p>
-      <w:pPr>
-        <w:spacing w:line="360" w:lineRule="auto"/>
-        <w:rPr>
-          <w:rFonts w:ascii="Calibri" w:hAnsi="Calibri" w:cs="Calibri"/>
-        </w:rPr>
-      </w:pPr>
-      <w:r>
-        <w:rPr>
-          <w:rFonts w:ascii="Calibri" w:hAnsi="Calibri" w:cs="Calibri"/>
-        </w:rPr>
-        <w:t>papers, official documentation, and community tutorials.</w:t>
-      </w:r>
-    </w:p>
-    <w:p>
-      <w:pPr>
-        <w:spacing w:line="360" w:lineRule="auto"/>
-        <w:rPr>
-          <w:rFonts w:ascii="Calibri" w:hAnsi="Calibri" w:cs="Calibri"/>
-        </w:rPr>
-      </w:pPr>
-      <w:r>
-        <w:rPr>
-          <w:rFonts w:ascii="Calibri" w:hAnsi="Calibri" w:cs="Calibri"/>
-        </w:rPr>
-        <w:t>Common Technical Examples of referencing:</w:t>
-      </w:r>
-    </w:p>
-    <w:p>
-      <w:pPr>
-        <w:spacing w:line="360" w:lineRule="auto"/>
-        <w:rPr>
-          <w:rFonts w:ascii="Calibri" w:hAnsi="Calibri" w:cs="Calibri"/>
-        </w:rPr>
-      </w:pPr>
-      <w:r>
-        <w:rPr>
-          <w:rFonts w:ascii="Calibri" w:hAnsi="Calibri" w:cs="Calibri"/>
-        </w:rPr>
-        <w:t>• Official Documentation: "The system uses the React '</w:t>
+        <w:t xml:space="preserve">remember to reference </w:t>
       </w:r>
       <w:proofErr w:type="spellStart"/>
       <w:r>
-        <w:rPr>
-          <w:rFonts w:ascii="Calibri" w:hAnsi="Calibri" w:cs="Calibri"/>
-        </w:rPr>
-        <w:t>UseContext</w:t>
-      </w:r>
-      <w:proofErr w:type="spellEnd"/>
-      <w:r>
-        <w:rPr>
-          <w:rFonts w:ascii="Calibri" w:hAnsi="Calibri" w:cs="Calibri"/>
-        </w:rPr>
-        <w:t>' hook for global state</w:t>
-      </w:r>
-    </w:p>
-    <w:p>
-      <w:pPr>
-        <w:spacing w:line="360" w:lineRule="auto"/>
-        <w:rPr>
-          <w:rFonts w:ascii="Calibri" w:hAnsi="Calibri" w:cs="Calibri"/>
-        </w:rPr>
-      </w:pPr>
-      <w:r>
-        <w:rPr>
-          <w:rFonts w:ascii="Calibri" w:hAnsi="Calibri" w:cs="Calibri"/>
-        </w:rPr>
-        <w:t>management (Meta, 2026)."</w:t>
-      </w:r>
-    </w:p>
-    <w:p>
-      <w:pPr>
-        <w:spacing w:line="360" w:lineRule="auto"/>
-        <w:rPr>
-          <w:rFonts w:ascii="Calibri" w:hAnsi="Calibri" w:cs="Calibri"/>
-        </w:rPr>
-      </w:pPr>
-      <w:r>
-        <w:rPr>
-          <w:rFonts w:ascii="Calibri" w:hAnsi="Calibri" w:cs="Calibri"/>
-        </w:rPr>
-        <w:t>• Community Solutions: "The recursive logic for the tree-view component was adapted from a</w:t>
-      </w:r>
-    </w:p>
-    <w:p>
-      <w:pPr>
-        <w:spacing w:line="360" w:lineRule="auto"/>
-        <w:rPr>
-          <w:rFonts w:ascii="Calibri" w:hAnsi="Calibri" w:cs="Calibri"/>
-        </w:rPr>
-      </w:pPr>
-      <w:r>
-        <w:rPr>
-          <w:rFonts w:ascii="Calibri" w:hAnsi="Calibri" w:cs="Calibri"/>
-        </w:rPr>
-        <w:t>solution by '</w:t>
-      </w:r>
-      <w:proofErr w:type="spellStart"/>
-      <w:r>
-        <w:rPr>
-          <w:rFonts w:ascii="Calibri" w:hAnsi="Calibri" w:cs="Calibri"/>
-        </w:rPr>
-        <w:t>DevGuru</w:t>
-      </w:r>
-      <w:proofErr w:type="spellEnd"/>
-      <w:r>
-        <w:rPr>
-          <w:rFonts w:ascii="Calibri" w:hAnsi="Calibri" w:cs="Calibri"/>
-        </w:rPr>
-        <w:t>' on Stack Overflow (2025)."</w:t>
-      </w:r>
-    </w:p>
-    <w:p>
-      <w:pPr>
-        <w:spacing w:line="360" w:lineRule="auto"/>
-        <w:rPr>
-          <w:rFonts w:ascii="Calibri" w:hAnsi="Calibri" w:cs="Calibri"/>
-        </w:rPr>
-      </w:pPr>
-      <w:r>
-        <w:rPr>
-          <w:rFonts w:ascii="Calibri" w:hAnsi="Calibri" w:cs="Calibri"/>
-        </w:rPr>
-        <w:t>• Technical Books: "Following the Factory Design Pattern (Gamma et al., 1994), the system..."</w:t>
-      </w:r>
-    </w:p>
-    <w:p>
-      <w:pPr>
-        <w:spacing w:line="360" w:lineRule="auto"/>
-        <w:rPr>
-          <w:rFonts w:ascii="Calibri" w:hAnsi="Calibri" w:cs="Calibri"/>
-        </w:rPr>
-      </w:pPr>
-      <w:r>
-        <w:rPr>
-          <w:rFonts w:ascii="Calibri" w:hAnsi="Calibri" w:cs="Calibri"/>
-        </w:rPr>
-        <w:t>The Reference List:</w:t>
-      </w:r>
-    </w:p>
-    <w:p>
-      <w:pPr>
-        <w:spacing w:line="360" w:lineRule="auto"/>
-        <w:rPr>
-          <w:rFonts w:ascii="Calibri" w:hAnsi="Calibri" w:cs="Calibri"/>
-        </w:rPr>
-      </w:pPr>
-      <w:r>
-        <w:rPr>
-          <w:rFonts w:ascii="Calibri" w:hAnsi="Calibri" w:cs="Calibri"/>
-        </w:rPr>
-        <w:t>At the end of your document, list your sources alphabetically.</w:t>
-      </w:r>
-    </w:p>
-    <w:p>
-      <w:pPr>
-        <w:spacing w:line="360" w:lineRule="auto"/>
-        <w:rPr>
-          <w:rFonts w:ascii="Calibri" w:hAnsi="Calibri" w:cs="Calibri"/>
-        </w:rPr>
-      </w:pPr>
-      <w:r>
-        <w:rPr>
-          <w:rFonts w:ascii="Calibri" w:hAnsi="Calibri" w:cs="Calibri"/>
-        </w:rPr>
-        <w:t xml:space="preserve">• Meta. (2026). React Documentation: Scaling State. [Online]. Available at: </w:t>
-      </w:r>
-      <w:proofErr w:type="spellStart"/>
-      <w:r>
-        <w:rPr>
-          <w:rFonts w:ascii="Calibri" w:hAnsi="Calibri" w:cs="Calibri"/>
-        </w:rPr>
-        <w:t>react.dev</w:t>
-      </w:r>
-      <w:proofErr w:type="spellEnd"/>
-      <w:r>
-        <w:rPr>
-          <w:rFonts w:ascii="Calibri" w:hAnsi="Calibri" w:cs="Calibri"/>
-        </w:rPr>
-        <w:t>/docs</w:t>
-      </w:r>
-    </w:p>
-    <w:p>
-      <w:pPr>
-        <w:spacing w:line="360" w:lineRule="auto"/>
-        <w:rPr>
-          <w:rFonts w:ascii="Calibri" w:hAnsi="Calibri" w:cs="Calibri"/>
-        </w:rPr>
-      </w:pPr>
-      <w:r>
-        <w:rPr>
-          <w:rFonts w:ascii="Calibri" w:hAnsi="Calibri" w:cs="Calibri"/>
-        </w:rPr>
-        <w:t>• Gamma, E. et al. (1994). Design Patterns: Elements of Reusable Object-Oriented Software.</w:t>
-      </w:r>
-    </w:p>
-    <w:p>
-      <w:pPr>
-        <w:spacing w:line="360" w:lineRule="auto"/>
-        <w:rPr>
-          <w:rFonts w:ascii="Calibri" w:hAnsi="Calibri" w:cs="Calibri"/>
-        </w:rPr>
-      </w:pPr>
-      <w:r>
-        <w:rPr>
-          <w:rFonts w:ascii="Calibri" w:hAnsi="Calibri" w:cs="Calibri"/>
-        </w:rPr>
-        <w:t>Addison-Wesley.</w:t>
-      </w:r>
-    </w:p>
-    <w:p>
-      <w:pPr>
-        <w:spacing w:line="360" w:lineRule="auto"/>
-        <w:rPr>
-          <w:rFonts w:ascii="Calibri" w:hAnsi="Calibri" w:cs="Calibri"/>
-        </w:rPr>
-      </w:pPr>
-      <w:r>
-        <w:rPr>
-          <w:rFonts w:ascii="Calibri" w:hAnsi="Calibri" w:cs="Calibri"/>
-        </w:rPr>
-        <w:t>Source Code Attribution</w:t>
-      </w:r>
-    </w:p>
-    <w:p>
-      <w:pPr>
-        <w:spacing w:line="360" w:lineRule="auto"/>
-        <w:rPr>
-          <w:rFonts w:ascii="Calibri" w:hAnsi="Calibri" w:cs="Calibri"/>
-        </w:rPr>
-      </w:pPr>
-      <w:r>
-        <w:rPr>
-          <w:rFonts w:ascii="Calibri" w:hAnsi="Calibri" w:cs="Calibri"/>
-        </w:rPr>
-        <w:lastRenderedPageBreak/>
-        <w:t>If you use a specific code snippet from the web or an AI tool, you must attribute it in the source code.</w:t>
-      </w:r>
-    </w:p>
-    <w:p>
-      <w:pPr>
-        <w:spacing w:line="360" w:lineRule="auto"/>
-        <w:rPr>
-          <w:rFonts w:ascii="Calibri" w:hAnsi="Calibri" w:cs="Calibri"/>
-        </w:rPr>
-      </w:pPr>
-      <w:r>
-        <w:rPr>
-          <w:rFonts w:ascii="Calibri" w:hAnsi="Calibri" w:cs="Calibri"/>
-        </w:rPr>
-        <w:t>This prevents plagiarism flags.</w:t>
-      </w:r>
-    </w:p>
-    <w:p>
-      <w:pPr>
-        <w:spacing w:line="360" w:lineRule="auto"/>
-        <w:rPr>
-          <w:rFonts w:ascii="Calibri" w:hAnsi="Calibri" w:cs="Calibri"/>
-        </w:rPr>
-      </w:pPr>
-      <w:r>
-        <w:rPr>
-          <w:rFonts w:ascii="Calibri" w:hAnsi="Calibri" w:cs="Calibri"/>
-        </w:rPr>
-        <w:t>Example of an attributed snippet:</w:t>
-      </w:r>
-    </w:p>
-    <w:p>
-      <w:pPr>
-        <w:spacing w:line="360" w:lineRule="auto"/>
-        <w:rPr>
-          <w:rFonts w:ascii="Calibri" w:hAnsi="Calibri" w:cs="Calibri"/>
-        </w:rPr>
-      </w:pPr>
-      <w:r>
-        <w:rPr>
-          <w:rFonts w:ascii="Calibri" w:hAnsi="Calibri" w:cs="Calibri"/>
-        </w:rPr>
-        <w:t>/* * ATTRIBUTION:</w:t>
-      </w:r>
-    </w:p>
-    <w:p>
-      <w:pPr>
-        <w:spacing w:line="360" w:lineRule="auto"/>
-        <w:rPr>
-          <w:rFonts w:ascii="Calibri" w:hAnsi="Calibri" w:cs="Calibri"/>
-        </w:rPr>
-      </w:pPr>
-      <w:r>
-        <w:rPr>
-          <w:rFonts w:ascii="Calibri" w:hAnsi="Calibri" w:cs="Calibri"/>
-        </w:rPr>
-        <w:t>* This validation logic was adapted from a solution on Stack Overflow.</w:t>
-      </w:r>
-    </w:p>
-    <w:p>
-      <w:pPr>
-        <w:spacing w:line="360" w:lineRule="auto"/>
-        <w:rPr>
-          <w:rFonts w:ascii="Calibri" w:hAnsi="Calibri" w:cs="Calibri"/>
-        </w:rPr>
-      </w:pPr>
-      <w:r>
-        <w:rPr>
-          <w:rFonts w:ascii="Calibri" w:hAnsi="Calibri" w:cs="Calibri"/>
-        </w:rPr>
-        <w:t>* URL: https://stackoverflow.com/questions/xxxxxx</w:t>
-      </w:r>
-    </w:p>
-    <w:p>
-      <w:pPr>
-        <w:spacing w:line="360" w:lineRule="auto"/>
-        <w:rPr>
-          <w:rFonts w:ascii="Calibri" w:hAnsi="Calibri" w:cs="Calibri"/>
-        </w:rPr>
-      </w:pPr>
-      <w:r>
-        <w:rPr>
-          <w:rFonts w:ascii="Calibri" w:hAnsi="Calibri" w:cs="Calibri"/>
-        </w:rPr>
-        <w:t>* Purpose: Handling complex email regex validation.</w:t>
-      </w:r>
-    </w:p>
-    <w:p>
-      <w:pPr>
-        <w:spacing w:line="360" w:lineRule="auto"/>
-        <w:rPr>
-          <w:rFonts w:ascii="Calibri" w:hAnsi="Calibri" w:cs="Calibri"/>
-        </w:rPr>
-      </w:pPr>
-      <w:r>
-        <w:rPr>
-          <w:rFonts w:ascii="Calibri" w:hAnsi="Calibri" w:cs="Calibri"/>
-        </w:rPr>
-        <w:t>*/</w:t>
-      </w:r>
-    </w:p>
-    <w:p>
-      <w:pPr>
-        <w:spacing w:line="360" w:lineRule="auto"/>
-        <w:rPr>
-          <w:rFonts w:ascii="Calibri" w:hAnsi="Calibri" w:cs="Calibri"/>
-        </w:rPr>
-      </w:pPr>
-      <w:r>
-        <w:rPr>
-          <w:rFonts w:ascii="Calibri" w:hAnsi="Calibri" w:cs="Calibri"/>
-        </w:rPr>
-        <w:t xml:space="preserve">function </w:t>
-      </w:r>
-      <w:proofErr w:type="spellStart"/>
-      <w:r>
-        <w:rPr>
-          <w:rFonts w:ascii="Calibri" w:hAnsi="Calibri" w:cs="Calibri"/>
-        </w:rPr>
-        <w:t>validateEmail</w:t>
-      </w:r>
-      <w:proofErr w:type="spellEnd"/>
-      <w:r>
-        <w:rPr>
-          <w:rFonts w:ascii="Calibri" w:hAnsi="Calibri" w:cs="Calibri"/>
-        </w:rPr>
-        <w:t xml:space="preserve">(email) </w:t>
-      </w:r>
-      <w:proofErr w:type="gramStart"/>
-      <w:r>
-        <w:rPr>
-          <w:rFonts w:ascii="Calibri" w:hAnsi="Calibri" w:cs="Calibri"/>
-        </w:rPr>
-        <w:t>{ ...</w:t>
-      </w:r>
-      <w:proofErr w:type="gramEnd"/>
-      <w:r>
-        <w:rPr>
-          <w:rFonts w:ascii="Calibri" w:hAnsi="Calibri" w:cs="Calibri"/>
-        </w:rPr>
-        <w:t xml:space="preserve"> }</w:t>
-      </w:r>
-    </w:p>
-    <w:p>
-      <w:pPr>
-        <w:spacing w:line="360" w:lineRule="auto"/>
-        <w:rPr>
-          <w:rFonts w:ascii="Calibri" w:hAnsi="Calibri" w:cs="Calibri"/>
-        </w:rPr>
-      </w:pPr>
-    </w:p>
-    <w:p>
-      <w:pPr>
-        <w:spacing w:line="360" w:lineRule="auto"/>
         <w:rPr>
           <w:rFonts w:ascii="Calibri" w:hAnsi="Calibri" w:cs="Calibri"/>
           <w:b/>
           <w:bCs/>
         </w:rPr>
-      </w:pPr>
+        <w:t>th</w:t>
+      </w:r>
+      <w:proofErr w:type="spellEnd"/>
       <w:r>
         <w:rPr>
           <w:rFonts w:ascii="Calibri" w:hAnsi="Calibri" w:cs="Calibri"/>
           <w:b/>
           <w:bCs/>
         </w:rPr>
-        <w:t xml:space="preserve">remember to reference </w:t>
+        <w:t xml:space="preserve"> following that </w:t>
       </w:r>
       <w:proofErr w:type="spellStart"/>
       <w:r>
@@ -12519,7 +12847,7 @@
           <w:b/>
           <w:bCs/>
         </w:rPr>
-        <w:t>th</w:t>
+        <w:t>ive</w:t>
       </w:r>
       <w:proofErr w:type="spellEnd"/>
       <w:r>
@@ -12528,25 +12856,25 @@
           <w:b/>
           <w:bCs/>
         </w:rPr>
-        <w:t xml:space="preserve"> following that </w:t>
-      </w:r>
-      <w:proofErr w:type="spellStart"/>
-      <w:r>
+        <w:t xml:space="preserve"> used for help,</w:t>
+      </w:r>
+    </w:p>
+    <w:p>
+      <w:pPr>
+        <w:spacing w:line="360" w:lineRule="auto"/>
         <w:rPr>
           <w:rFonts w:ascii="Calibri" w:hAnsi="Calibri" w:cs="Calibri"/>
           <w:b/>
           <w:bCs/>
         </w:rPr>
-        <w:t>ive</w:t>
-      </w:r>
-      <w:proofErr w:type="spellEnd"/>
+      </w:pPr>
       <w:r>
         <w:rPr>
           <w:rFonts w:ascii="Calibri" w:hAnsi="Calibri" w:cs="Calibri"/>
           <w:b/>
           <w:bCs/>
         </w:rPr>
-        <w:t xml:space="preserve"> used for help,</w:t>
+        <w:t>Phone responsiveness using @media</w:t>
       </w:r>
     </w:p>
     <w:p>
@@ -12564,11 +12892,20 @@
           <w:b/>
           <w:bCs/>
         </w:rPr>
-        <w:t>Phone responsiveness using @media</w:t>
-      </w:r>
-    </w:p>
-    <w:p>
-      <w:pPr>
+        <w:t xml:space="preserve">Html </w:t>
+      </w:r>
+    </w:p>
+    <w:p>
+      <w:pPr>
+        <w:spacing w:line="360" w:lineRule="auto"/>
+        <w:rPr>
+          <w:rFonts w:ascii="Calibri" w:hAnsi="Calibri" w:cs="Calibri"/>
+        </w:rPr>
+      </w:pPr>
+    </w:p>
+    <w:p>
+      <w:pPr>
+        <w:pStyle w:val="Heading1"/>
         <w:spacing w:line="360" w:lineRule="auto"/>
         <w:rPr>
           <w:rFonts w:ascii="Calibri" w:hAnsi="Calibri" w:cs="Calibri"/>
@@ -12576,40 +12913,13 @@
           <w:bCs/>
         </w:rPr>
       </w:pPr>
+      <w:bookmarkStart w:id="37" w:name="_Toc227860144"/>
       <w:r>
         <w:rPr>
           <w:rFonts w:ascii="Calibri" w:hAnsi="Calibri" w:cs="Calibri"/>
           <w:b/>
           <w:bCs/>
         </w:rPr>
-        <w:t xml:space="preserve">Html </w:t>
-      </w:r>
-    </w:p>
-    <w:p>
-      <w:pPr>
-        <w:spacing w:line="360" w:lineRule="auto"/>
-        <w:rPr>
-          <w:rFonts w:ascii="Calibri" w:hAnsi="Calibri" w:cs="Calibri"/>
-        </w:rPr>
-      </w:pPr>
-    </w:p>
-    <w:p>
-      <w:pPr>
-        <w:pStyle w:val="Heading1"/>
-        <w:spacing w:line="360" w:lineRule="auto"/>
-        <w:rPr>
-          <w:rFonts w:ascii="Calibri" w:hAnsi="Calibri" w:cs="Calibri"/>
-          <w:b/>
-          <w:bCs/>
-        </w:rPr>
-      </w:pPr>
-      <w:bookmarkStart w:id="37" w:name="_Toc227860144"/>
-      <w:r>
-        <w:rPr>
-          <w:rFonts w:ascii="Calibri" w:hAnsi="Calibri" w:cs="Calibri"/>
-          <w:b/>
-          <w:bCs/>
-        </w:rPr>
         <w:t>Appendices</w:t>
       </w:r>
       <w:bookmarkEnd w:id="37"/>
@@ -12621,7 +12931,7 @@
           <w:rFonts w:ascii="Calibri" w:hAnsi="Calibri" w:cs="Calibri"/>
         </w:rPr>
       </w:pPr>
-      <w:hyperlink r:id="rId10" w:history="1">
+      <w:hyperlink r:id="rId11" w:history="1">
         <w:r>
           <w:rPr>
             <w:rStyle w:val="Hyperlink"/>
@@ -12704,6 +13014,7 @@
           <w:b/>
           <w:bCs/>
         </w:rPr>
+        <w:lastRenderedPageBreak/>
         <w:t xml:space="preserve">Project Title: Crux Conqueror </w:t>
       </w:r>
     </w:p>
@@ -12759,7 +13070,6 @@
           <w:b/>
           <w:bCs/>
         </w:rPr>
-        <w:lastRenderedPageBreak/>
         <w:t>1.3 System Overview and User Profile:</w:t>
       </w:r>
     </w:p>
@@ -13012,6 +13322,7 @@
         <w:rPr>
           <w:rFonts w:ascii="Calibri" w:hAnsi="Calibri" w:cs="Calibri"/>
         </w:rPr>
+        <w:lastRenderedPageBreak/>
         <w:t xml:space="preserve">Additionally, A lot of climbing apps tend to separate training data and metrics from community data, which requires climbers to jump between sometimes 2/3 different platforms or apps to properly track workouts, nutrition, set goals, and receive feedback on their progress. </w:t>
       </w:r>
     </w:p>
@@ -13040,14 +13351,7 @@
         <w:rPr>
           <w:rFonts w:ascii="Calibri" w:hAnsi="Calibri" w:cs="Calibri"/>
         </w:rPr>
-        <w:t xml:space="preserve">Many climbers, particularly indoor boulderers, tend to visit their local gym without a structured training plan. Instead, they would often climb whichever routes appear most interesting at the time, </w:t>
-      </w:r>
-      <w:r>
-        <w:rPr>
-          <w:rFonts w:ascii="Calibri" w:hAnsi="Calibri" w:cs="Calibri"/>
-        </w:rPr>
-        <w:lastRenderedPageBreak/>
-        <w:t>completely neglecting targeted exercises or training plans. This type of mindset can future goals and performance of climbers and can make progress harder to measure without a baseline.</w:t>
+        <w:t>Many climbers, particularly indoor boulderers, tend to visit their local gym without a structured training plan. Instead, they would often climb whichever routes appear most interesting at the time, completely neglecting targeted exercises or training plans. This type of mindset can future goals and performance of climbers and can make progress harder to measure without a baseline.</w:t>
       </w:r>
     </w:p>
     <w:p>
@@ -13459,6 +13763,7 @@
                 <w:sz w:val="22"/>
                 <w:szCs w:val="22"/>
               </w:rPr>
+              <w:lastRenderedPageBreak/>
               <w:t>FR 1</w:t>
             </w:r>
           </w:p>
@@ -13630,16 +13935,7 @@
                 <w:sz w:val="22"/>
                 <w:szCs w:val="22"/>
               </w:rPr>
-              <w:t xml:space="preserve">The system presents user progress data in an interactive dashboard which is intuitive to read, including charts, streaks, and </w:t>
-            </w:r>
-            <w:r>
-              <w:rPr>
-                <w:rFonts w:ascii="Calibri" w:hAnsi="Calibri" w:cs="Calibri"/>
-                <w:sz w:val="22"/>
-                <w:szCs w:val="22"/>
-              </w:rPr>
-              <w:lastRenderedPageBreak/>
-              <w:t>leaderboard comparisons against friends or followers.</w:t>
+              <w:t>The system presents user progress data in an interactive dashboard which is intuitive to read, including charts, streaks, and leaderboard comparisons against friends or followers.</w:t>
             </w:r>
           </w:p>
         </w:tc>
@@ -13662,17 +13958,7 @@
                 <w:sz w:val="22"/>
                 <w:szCs w:val="22"/>
               </w:rPr>
-              <w:lastRenderedPageBreak/>
-              <w:t xml:space="preserve">Allow users to visualize their improvements and can drive </w:t>
-            </w:r>
-            <w:r>
-              <w:rPr>
-                <w:rFonts w:ascii="Calibri" w:hAnsi="Calibri" w:cs="Calibri"/>
-                <w:sz w:val="22"/>
-                <w:szCs w:val="22"/>
-              </w:rPr>
-              <w:lastRenderedPageBreak/>
-              <w:t>engagement in the app through gamification.</w:t>
+              <w:t>Allow users to visualize their improvements and can drive engagement in the app through gamification.</w:t>
             </w:r>
           </w:p>
         </w:tc>
@@ -13700,7 +13986,6 @@
                 <w:sz w:val="22"/>
                 <w:szCs w:val="22"/>
               </w:rPr>
-              <w:lastRenderedPageBreak/>
               <w:t>FR 4</w:t>
             </w:r>
           </w:p>
@@ -14176,6 +14461,7 @@
                 <w:sz w:val="22"/>
                 <w:szCs w:val="22"/>
               </w:rPr>
+              <w:lastRenderedPageBreak/>
               <w:t>Technology/Tool (e.g., Python, React, MySQL, Unity</w:t>
             </w:r>
           </w:p>
@@ -14372,16 +14658,7 @@
                 <w:sz w:val="22"/>
                 <w:szCs w:val="22"/>
               </w:rPr>
-              <w:t xml:space="preserve">I am Knowledgeable in java and object orientated programming, so Spring boot will help with building modularly. Handles user </w:t>
-            </w:r>
-            <w:r>
-              <w:rPr>
-                <w:rFonts w:ascii="Calibri" w:hAnsi="Calibri" w:cs="Calibri"/>
-                <w:sz w:val="22"/>
-                <w:szCs w:val="22"/>
-              </w:rPr>
-              <w:lastRenderedPageBreak/>
-              <w:t>profiles (FR1), training log storage (FR2), Community posts (FR4).</w:t>
+              <w:t>I am Knowledgeable in java and object orientated programming, so Spring boot will help with building modularly. Handles user profiles (FR1), training log storage (FR2), Community posts (FR4).</w:t>
             </w:r>
           </w:p>
         </w:tc>
@@ -14409,7 +14686,6 @@
                 <w:sz w:val="22"/>
                 <w:szCs w:val="22"/>
               </w:rPr>
-              <w:lastRenderedPageBreak/>
               <w:t>Java</w:t>
             </w:r>
           </w:p>
@@ -14982,7 +15258,6 @@
           <w:rFonts w:ascii="Calibri" w:hAnsi="Calibri" w:cs="Calibri"/>
           <w:noProof/>
         </w:rPr>
-        <w:lastRenderedPageBreak/>
         <w:drawing>
           <wp:inline distT="0" distB="0" distL="0" distR="0" wp14:anchorId="42BA402F" wp14:editId="24EB7A52">
             <wp:extent cx="5731510" cy="1630018"/>
@@ -14999,7 +15274,7 @@
                     <pic:cNvPicPr/>
                   </pic:nvPicPr>
                   <pic:blipFill>
-                    <a:blip r:embed="rId11" cstate="print">
+                    <a:blip r:embed="rId12" cstate="print">
                       <a:extLst>
                         <a:ext uri="{28A0092B-C50C-407E-A947-70E740481C1C}">
                           <a14:useLocalDpi xmlns:a14="http://schemas.microsoft.com/office/drawing/2010/main" val="0"/>
@@ -15768,6 +16043,7 @@
                 <w:sz w:val="22"/>
                 <w:szCs w:val="22"/>
               </w:rPr>
+              <w:lastRenderedPageBreak/>
               <w:t>Testing and Evaluation</w:t>
             </w:r>
           </w:p>
@@ -15998,7 +16274,6 @@
                 <w:sz w:val="22"/>
                 <w:szCs w:val="22"/>
               </w:rPr>
-              <w:lastRenderedPageBreak/>
               <w:t>Final Submission</w:t>
             </w:r>
           </w:p>
@@ -16587,6 +16862,7 @@
                 <w:sz w:val="22"/>
                 <w:szCs w:val="22"/>
               </w:rPr>
+              <w:lastRenderedPageBreak/>
               <w:t>I want there to be built in notifications or pop ups when people interact with my posts or profile.</w:t>
             </w:r>
           </w:p>
@@ -16791,7 +17067,6 @@
                 <w:sz w:val="22"/>
                 <w:szCs w:val="22"/>
               </w:rPr>
-              <w:lastRenderedPageBreak/>
               <w:t>I struggle to understand climbing metrics and would appreciate information about each one.</w:t>
             </w:r>
           </w:p>
@@ -17310,6 +17585,7 @@
         <w:rPr>
           <w:rFonts w:ascii="Calibri" w:hAnsi="Calibri" w:cs="Calibri"/>
         </w:rPr>
+        <w:lastRenderedPageBreak/>
         <w:t>The system displays the create post form at the top of the page.</w:t>
       </w:r>
     </w:p>
@@ -17450,7 +17726,6 @@
         <w:rPr>
           <w:rFonts w:ascii="Calibri" w:hAnsi="Calibri" w:cs="Calibri"/>
         </w:rPr>
-        <w:lastRenderedPageBreak/>
         <w:t xml:space="preserve">If </w:t>
       </w:r>
       <w:r>
@@ -17842,6 +18117,7 @@
           <w:b/>
           <w:bCs/>
         </w:rPr>
+        <w:lastRenderedPageBreak/>
         <w:t>Alternative / Exception Flows:</w:t>
       </w:r>
     </w:p>
@@ -17930,7 +18206,6 @@
         <w:rPr>
           <w:rFonts w:ascii="Calibri" w:hAnsi="Calibri" w:cs="Calibri"/>
         </w:rPr>
-        <w:lastRenderedPageBreak/>
         <w:t>No new persistent data is created, but derived values are displayed for interpretation.</w:t>
       </w:r>
     </w:p>
@@ -18164,6 +18439,7 @@
         <w:rPr>
           <w:rFonts w:ascii="Calibri" w:hAnsi="Calibri" w:cs="Calibri"/>
         </w:rPr>
+        <w:lastRenderedPageBreak/>
         <w:t>o Final Deliverable Generation (e.g., writing parts of your report).</w:t>
       </w:r>
     </w:p>
@@ -18262,7 +18538,6 @@
         <w:rPr>
           <w:rFonts w:ascii="Calibri" w:hAnsi="Calibri" w:cs="Calibri"/>
         </w:rPr>
-        <w:lastRenderedPageBreak/>
         <w:t>Explained headers; I implemented the fix manually.</w:t>
       </w:r>
     </w:p>
@@ -18400,7 +18675,7 @@
           <w:rFonts w:ascii="Calibri" w:hAnsi="Calibri" w:cs="Calibri"/>
         </w:rPr>
       </w:pPr>
-      <w:hyperlink r:id="rId12" w:history="1">
+      <w:hyperlink r:id="rId13" w:history="1">
         <w:r>
           <w:rPr>
             <w:rStyle w:val="Hyperlink"/>
@@ -18453,7 +18728,7 @@
           <w:rFonts w:ascii="Calibri" w:hAnsi="Calibri" w:cs="Calibri"/>
         </w:rPr>
       </w:pPr>
-      <w:hyperlink r:id="rId13" w:history="1">
+      <w:hyperlink r:id="rId14" w:history="1">
         <w:r>
           <w:rPr>
             <w:rStyle w:val="Hyperlink"/>
@@ -18518,7 +18793,7 @@
           <w:rFonts w:ascii="Calibri" w:hAnsi="Calibri" w:cs="Calibri"/>
         </w:rPr>
       </w:pPr>
-      <w:hyperlink r:id="rId14" w:history="1">
+      <w:hyperlink r:id="rId15" w:history="1">
         <w:r>
           <w:rPr>
             <w:rStyle w:val="Hyperlink"/>
@@ -18539,6 +18814,7 @@
         <w:rPr>
           <w:rFonts w:ascii="Calibri" w:hAnsi="Calibri" w:cs="Calibri"/>
         </w:rPr>
+        <w:lastRenderedPageBreak/>
         <w:t xml:space="preserve">The homepage background image is taken from Ben Moreland on unsplash.com, I am using </w:t>
       </w:r>
       <w:proofErr w:type="spellStart"/>

</xml_diff>